<commit_message>
Remove Section 6; fold data and estimation into Section 5.3
Co-Authored-By: Claude Sonnet 5.5 <noreply@anthropic.com>
Claude-Session: https://claude.ai/code/session_01SvJ27oz7kYhWEBfZS3x4ro
</commit_message>
<xml_diff>
--- a/isr/ISR_Who_Profits_from_LLMs.docx
+++ b/isr/ISR_Who_Profits_from_LLMs.docx
@@ -190,7 +190,7 @@
         <w:pStyle w:val="BodyText"/>
       </w:pPr>
       <w:r>
-        <w:t xml:space="preserve">The paper proceeds as follows. Section 2 reviews the relevant literatures and the public financial record of frontier developers. Section 3 defines the constructs. Section 4 presents the model and states the propositions, with proofs in Appendix A. Section 5 derives hypotheses, Section 6 describes data and estimation, and Section 7 reports results. Section 8 discusses implications, boundary conditions, and limitations, and Section 9 concludes.</w:t>
+        <w:t xml:space="preserve">The paper proceeds as follows. Section 2 reviews the relevant literatures and the public financial record of frontier developers. Section 3 defines the constructs. Section 4 presents the model and states the propositions, with proofs in Appendix A. Section 5 derives the hypotheses and describes the data and estimation, and Section 6 reports results. Section 7 discusses implications, boundary conditions, and limitations, and Section 8 concludes.</w:t>
       </w:r>
     </w:p>
     <w:bookmarkEnd w:id="20"/>
@@ -878,7 +878,7 @@
         <w:pStyle w:val="BodyText"/>
       </w:pPr>
       <w:r>
-        <w:t xml:space="preserve">These figures are too coarse to test the theory, and they should not be read as doing so. Run-rate is not profit, and a hyperscaler’s AI profit is not a developer’s rent. Their role in this paper is to motivate the developer half of the theory and to fix orders of magnitude. The formal tests appear in Section 7.</w:t>
+        <w:t xml:space="preserve">These figures are too coarse to test the theory, and they should not be read as doing so. Run-rate is not profit, and a hyperscaler’s AI profit is not a developer’s rent. Their role in this paper is to motivate the developer half of the theory and to fix orders of magnitude. The formal tests appear in Section 6.</w:t>
       </w:r>
     </w:p>
     <w:bookmarkEnd w:id="26"/>
@@ -4681,7 +4681,7 @@
         <w:pStyle w:val="FirstParagraph"/>
       </w:pPr>
       <w:r>
-        <w:t xml:space="preserve">Five predictions follow, and they are the ones the empirical work in Sections 5 to 7 can address.</w:t>
+        <w:t xml:space="preserve">Five predictions follow, and they are the ones the empirical work in Sections 5 and 6 can address.</w:t>
       </w:r>
     </w:p>
     <w:p>
@@ -4832,7 +4832,7 @@
         <w:pStyle w:val="FirstParagraph"/>
       </w:pPr>
       <w:r>
-        <w:t xml:space="preserve">Predictions 4 and 5 are not tested here. Proposition 5 is also untested, but it bears directly on the LLM setting and on managerial choices about data-use terms and fine-tuning ownership, which we take up in Section 8.</w:t>
+        <w:t xml:space="preserve">Predictions 4 and 5 are not tested here. Proposition 5 is also untested, but it bears directly on the LLM setting and on managerial choices about data-use terms and fine-tuning ownership, which we take up in Section 7.</w:t>
       </w:r>
     </w:p>
     <w:bookmarkEnd w:id="34"/>
@@ -4928,12 +4928,12 @@
         <w:t xml:space="preserve"> </w:t>
       </w:r>
       <w:r>
-        <w:t xml:space="preserve">is short, on the order of three to four months for open-weight models relative to the closed frontier (Emberson 2025, Epoch AI 2026), which places the developer close to the zero-rent corner of Proposition 3. The same model serves both the complement builder and its competitors on posted terms, which is what makes the adopter’s position commodity-like in the first place. And developers can and do move into the complement layer, which is the situation Proposition 5 describes. In this sense the theory is less a new mechanism than a calibration of known mechanisms to a market in which the state variables can be observed. We return to the limits of this claim in Section 8.3.</w:t>
+        <w:t xml:space="preserve">is short, on the order of three to four months for open-weight models relative to the closed frontier (Emberson 2025, Epoch AI 2026), which places the developer close to the zero-rent corner of Proposition 3. The same model serves both the complement builder and its competitors on posted terms, which is what makes the adopter’s position commodity-like in the first place. And developers can and do move into the complement layer, which is the situation Proposition 5 describes. In this sense the theory is less a new mechanism than a calibration of known mechanisms to a market in which the state variables can be observed. We return to the limits of this claim in Section 7.3.</w:t>
       </w:r>
     </w:p>
     <w:bookmarkEnd w:id="35"/>
     <w:bookmarkEnd w:id="36"/>
-    <w:bookmarkStart w:id="39" w:name="hypotheses-and-empirical-counterparts"/>
+    <w:bookmarkStart w:id="40" w:name="hypotheses-and-empirical-counterparts"/>
     <w:p>
       <w:pPr>
         <w:pStyle w:val="Heading1"/>
@@ -5496,23 +5496,13 @@
       </w:r>
     </w:p>
     <w:bookmarkEnd w:id="38"/>
-    <w:bookmarkEnd w:id="39"/>
-    <w:bookmarkStart w:id="43" w:name="data-and-method"/>
-    <w:p>
-      <w:pPr>
-        <w:pStyle w:val="Heading1"/>
-      </w:pPr>
-      <w:r>
-        <w:t xml:space="preserve">6. Data and Method</w:t>
-      </w:r>
-    </w:p>
-    <w:bookmarkStart w:id="40" w:name="measurement"/>
+    <w:bookmarkStart w:id="39" w:name="data-and-estimation"/>
     <w:p>
       <w:pPr>
         <w:pStyle w:val="Heading2"/>
       </w:pPr>
       <w:r>
-        <w:t xml:space="preserve">6.1 Measurement</w:t>
+        <w:t xml:space="preserve">5.3 Data and estimation</w:t>
       </w:r>
     </w:p>
     <w:p>
@@ -5520,40 +5510,22 @@
         <w:pStyle w:val="FirstParagraph"/>
       </w:pPr>
       <w:r>
-        <w:t xml:space="preserve">Quality lead is measured as the gap between the leading and the second-ranked lab on public preference leaderboards, sampled at release dates. Imitation lag is the time from a frontier release to the first competitor release that matches its score within a stated tolerance. Inference price at a given capability level is reconstructed as a monthly panel. Organizational capital must be measured independently of LLM spending. Four LLM-specific proxies correspond to its components: the share of model calls that use retrieval or fine-tuning on internal data; the share of LLM-using roles in which model output enters a recorded decision; existing customer reach in the product line where the model is deployed; and dedicated evaluation, red-teaming, and governance roles in job-posting data. General complementarity proxies, such as decentralization, data-driven decision practices, and capitalized organizational SG&amp;A, remain applicable. In the present study, only the GA-dated indicator is available at scale, and it is a coarse proxy.</w:t>
-      </w:r>
-    </w:p>
-    <w:bookmarkEnd w:id="40"/>
-    <w:bookmarkStart w:id="41" w:name="samples"/>
-    <w:p>
-      <w:pPr>
-        <w:pStyle w:val="Heading2"/>
-      </w:pPr>
-      <w:r>
-        <w:t xml:space="preserve">6.2 Samples</w:t>
-      </w:r>
-    </w:p>
-    <w:p>
-      <w:pPr>
-        <w:pStyle w:val="FirstParagraph"/>
-      </w:pPr>
-      <w:r>
-        <w:t xml:space="preserve">The developer panel combines Arena overall leaderboard snapshots (Chiang et al. 2024) with OpenRouter endpoint prices (OpenRouter 2026). It contains 171 lab-months with a price, of which 102 have at least one live endpoint and 69 use the list-price fallback. The adopter panel is drawn from SEC EDGAR XBRL company facts (SEC 2026) and covers 81 firms and 520 firm-years, with staggered GA-year treatment for 21 firms. GA years are coded by hand from public product dates.</w:t>
-      </w:r>
-    </w:p>
-    <w:bookmarkEnd w:id="41"/>
-    <w:bookmarkStart w:id="42" w:name="identification-and-estimation"/>
-    <w:p>
-      <w:pPr>
-        <w:pStyle w:val="Heading2"/>
-      </w:pPr>
-      <w:r>
-        <w:t xml:space="preserve">6.3 Identification and estimation</w:t>
-      </w:r>
-    </w:p>
-    <w:p>
-      <w:pPr>
-        <w:pStyle w:val="FirstParagraph"/>
+        <w:rPr>
+          <w:iCs/>
+          <w:i/>
+        </w:rPr>
+        <w:t xml:space="preserve">Samples.</w:t>
+      </w:r>
+      <w:r>
+        <w:t xml:space="preserve"> </w:t>
+      </w:r>
+      <w:r>
+        <w:t xml:space="preserve">The developer panel combines Arena overall leaderboard snapshots (Chiang et al. 2024) with OpenRouter endpoint prices (OpenRouter 2026). It contains 171 lab-months with a price, of which 102 have at least one live endpoint and 69 use the list-price fallback. The adopter panel is drawn from SEC EDGAR XBRL company facts (SEC 2026) and covers 81 firms and 520 firm-years, with staggered GA-year treatment for 21 firms. GA years are coded by hand from public product dates, which makes the treatment indicator a coarse proxy for organizational capital.</w:t>
+      </w:r>
+    </w:p>
+    <w:p>
+      <w:pPr>
+        <w:pStyle w:val="BodyText"/>
       </w:pPr>
       <w:r>
         <w:rPr>
@@ -5566,7 +5538,7 @@
         <w:t xml:space="preserve"> </w:t>
       </w:r>
       <w:r>
-        <w:t xml:space="preserve">A lab-month regression of price on lead is identified largely by new releases, which raise price and measured quality at the same moment. H1a therefore requires a model-month panel with model and month fixed effects, so that the coefficient is identified only from changes in a given model’s lead as competitors release, net of common price declines. H1b is estimated separately on launch prices. A catch-up event study traces a model’s price in the months around the month in which it loses the lead. Because the panel contains few labs, conventional cluster-robust p-values are unreliable. We therefore plan inference by the restricted wild cluster bootstrap with Webb six-point weights (Cameron et al. 2008, Webb 2023).</w:t>
+        <w:t xml:space="preserve">A lab-month regression of price on lead is identified largely by new releases, which raise price and measured quality at the same moment. H1a therefore uses a model-month panel with model and month fixed effects, so that the coefficient is identified only from changes in a given model’s lead as competitors release. H1b is estimated separately on launch prices. Because the panel contains few labs, conventional cluster-robust p-values are unreliable, and inference uses the restricted wild cluster bootstrap with Webb six-point weights (Cameron et al. 2008, Webb 2023).</w:t>
       </w:r>
     </w:p>
     <w:p>
@@ -5584,15 +5556,7 @@
         <w:t xml:space="preserve"> </w:t>
       </w:r>
       <w:r>
-        <w:t xml:space="preserve">Treated firms are large software incumbents whose operating margins rose between 2023 and 2025 for reasons unrelated to AI, including cost reductions and changes in the cost of capital. The baseline is a two-way fixed-effects regression of operating margin on a post-GA indicator with firm and year effects. Because treatment is staggered and effects may differ across cohorts, that estimator can be biased (Goodman-Bacon 2021). We therefore specify heterogeneity-robust estimators with never-treated and not-yet-treated controls (Callaway and Sant’Anna 2021, Sun and Abraham 2021), and four further checks: two-digit SIC-by-year fixed effects, firm-specific linear trends, never-treated controls matched within two-digit SIC on pre-2023 margin level, trend, and size, and a placebo that moves each GA date two years earlier. Randomization inference reassigns GA dates to randomly chosen firms. Because a higher margin could reflect market power in place of a complement rent (Section 8.3), the effect is decomposed into gross margin and the operating-expense ratio and allowed to differ by pre-2023 size.</w:t>
-      </w:r>
-    </w:p>
-    <w:p>
-      <w:pPr>
-        <w:pStyle w:val="BodyText"/>
-      </w:pPr>
-      <w:r>
-        <w:t xml:space="preserve">For H4 we estimate event-time indicators relative to the GA year, omitting</w:t>
+        <w:t xml:space="preserve">Treated firms are large software incumbents whose margins rose between 2023 and 2025 for reasons unrelated to AI, such as cost reductions and changes in the cost of capital. The baseline is a two-way fixed-effects regression of operating margin on a post-GA indicator. Because treatment is staggered, that estimator can be biased when effects differ across cohorts (Goodman-Bacon 2021), so we use heterogeneity-robust estimators with never-treated and not-yet-treated controls (Callaway and Sant’Anna 2021, Sun and Abraham 2021). Further checks are SIC-by-year fixed effects, firm-specific trends, matched never-treated controls, a placebo that moves each GA date two years earlier, and randomization inference that reassigns GA dates across firms. Because a higher margin could reflect market power and not a complement rent (Section 7.3), the effect is decomposed into gross margin and the operating-expense ratio and allowed to differ by pre-2023 size. For H4, event-time indicators are estimated relative to</w:t>
       </w:r>
       <w:r>
         <w:t xml:space="preserve"> </w:t>
@@ -5618,7 +5582,10 @@
         </m:r>
       </m:oMath>
       <w:r>
-        <w:t xml:space="preserve">, with firm and year effects, and only at event times to which at least eight treated firms contribute. For the 2023 cohort,</w:t>
+        <w:t xml:space="preserve"> </w:t>
+      </w:r>
+      <w:r>
+        <w:t xml:space="preserve">only at event times to which at least eight treated firms contribute. The direct test is the equality of the</w:t>
       </w:r>
       <w:r>
         <w:t xml:space="preserve"> </w:t>
@@ -5634,29 +5601,6 @@
           <m:t>+</m:t>
         </m:r>
         <m:r>
-          <m:t>3</m:t>
-        </m:r>
-      </m:oMath>
-      <w:r>
-        <w:t xml:space="preserve"> </w:t>
-      </w:r>
-      <w:r>
-        <w:t xml:space="preserve">is fiscal 2026, which few firms had reported by September 2026. The direct test of H4 is the equality of the coefficient at</w:t>
-      </w:r>
-      <w:r>
-        <w:t xml:space="preserve"> </w:t>
-      </w:r>
-      <m:oMath>
-        <m:r>
-          <m:t>t</m:t>
-        </m:r>
-        <m:r>
-          <m:rPr>
-            <m:sty m:val="p"/>
-          </m:rPr>
-          <m:t>+</m:t>
-        </m:r>
-        <m:r>
           <m:t>1</m:t>
         </m:r>
       </m:oMath>
@@ -5664,18 +5608,18 @@
         <w:t xml:space="preserve"> </w:t>
       </w:r>
       <w:r>
-        <w:t xml:space="preserve">and that of the last post-GA bin, together with a joint test of the pre-GA coefficients.</w:t>
-      </w:r>
-    </w:p>
-    <w:bookmarkEnd w:id="42"/>
-    <w:bookmarkEnd w:id="43"/>
-    <w:bookmarkStart w:id="47" w:name="results"/>
+        <w:t xml:space="preserve">coefficient and the last post-GA bin, together with a joint test of the pre-GA coefficients.</w:t>
+      </w:r>
+    </w:p>
+    <w:bookmarkEnd w:id="39"/>
+    <w:bookmarkEnd w:id="40"/>
+    <w:bookmarkStart w:id="44" w:name="results"/>
     <w:p>
       <w:pPr>
         <w:pStyle w:val="Heading1"/>
       </w:pPr>
       <w:r>
-        <w:t xml:space="preserve">7. Results</w:t>
+        <w:t xml:space="preserve">6. Results</w:t>
       </w:r>
     </w:p>
     <w:p>
@@ -5683,16 +5627,16 @@
         <w:pStyle w:val="FirstParagraph"/>
       </w:pPr>
       <w:r>
-        <w:t xml:space="preserve">We report what has been estimated and indicate where an analysis specified in Section 6 has not yet been run.</w:t>
-      </w:r>
-    </w:p>
-    <w:bookmarkStart w:id="44" w:name="developer-side-h1"/>
+        <w:t xml:space="preserve">We report what has been estimated and indicate where an analysis specified in Section 5.3 has not yet been run.</w:t>
+      </w:r>
+    </w:p>
+    <w:bookmarkStart w:id="41" w:name="developer-side-h1"/>
     <w:p>
       <w:pPr>
         <w:pStyle w:val="Heading2"/>
       </w:pPr>
       <w:r>
-        <w:t xml:space="preserve">7.1 Developer side (H1)</w:t>
+        <w:t xml:space="preserve">6.1 Developer side (H1)</w:t>
       </w:r>
     </w:p>
     <w:p>
@@ -5783,14 +5727,14 @@
         <w:t xml:space="preserve">[AUTHORS TO COMPLETE: model-month estimates for H1a and launch-price regression for H1b, with the catch-up event-study figure.]</w:t>
       </w:r>
     </w:p>
-    <w:bookmarkEnd w:id="44"/>
-    <w:bookmarkStart w:id="45" w:name="adopter-side-h2-to-h4"/>
+    <w:bookmarkEnd w:id="41"/>
+    <w:bookmarkStart w:id="42" w:name="adopter-side-h2-to-h4"/>
     <w:p>
       <w:pPr>
         <w:pStyle w:val="Heading2"/>
       </w:pPr>
       <w:r>
-        <w:t xml:space="preserve">7.2 Adopter side (H2 to H4)</w:t>
+        <w:t xml:space="preserve">6.2 Adopter side (H2 to H4)</w:t>
       </w:r>
     </w:p>
     <w:p>
@@ -6242,14 +6186,68 @@
         <w:t xml:space="preserve">A time-invariant bundle-by-post-2023 difference-in-differences gives a similar coefficient and is retained as a robustness check.</w:t>
       </w:r>
     </w:p>
+    <w:bookmarkEnd w:id="42"/>
+    <w:bookmarkStart w:id="43" w:name="what-is-and-is-not-identified"/>
+    <w:p>
+      <w:pPr>
+        <w:pStyle w:val="Heading2"/>
+      </w:pPr>
+      <w:r>
+        <w:t xml:space="preserve">6.3 What is and is not identified</w:t>
+      </w:r>
+    </w:p>
+    <w:p>
+      <w:pPr>
+        <w:pStyle w:val="FirstParagraph"/>
+      </w:pPr>
+      <w:r>
+        <w:t xml:space="preserve">Six restrictions bind. First, the realized price is the mean of provider cards on OpenRouter, not a billed invoice and not a GAAP inference margin. Second, endpoint coverage is incomplete (102 of 171 priced months). Third, GA years are coded from public product dates, and they do not measure token spend or retrieval intensity. Fourth, Table 1 figures are illustrative and are not regression inputs. Fifth, two-way fixed-effects estimates under staggered timing can be biased when effects differ across cohorts, and while the robust estimators address that bias, they still rest on parallel trends, which the matched-control and trend specifications relax only partly. Sixth, operating margin is an accounting measure and not the economic profit of Proposition 2, and the timing of GA marks the launch of a product, not the start of organizational-capital accumulation.</w:t>
+      </w:r>
+    </w:p>
+    <w:bookmarkEnd w:id="43"/>
+    <w:bookmarkEnd w:id="44"/>
+    <w:bookmarkStart w:id="48" w:name="discussion"/>
+    <w:p>
+      <w:pPr>
+        <w:pStyle w:val="Heading1"/>
+      </w:pPr>
+      <w:r>
+        <w:t xml:space="preserve">7. Discussion</w:t>
+      </w:r>
+    </w:p>
+    <w:bookmarkStart w:id="45" w:name="contributions"/>
+    <w:p>
+      <w:pPr>
+        <w:pStyle w:val="Heading2"/>
+      </w:pPr>
+      <w:r>
+        <w:t xml:space="preserve">7.1 Contributions</w:t>
+      </w:r>
+    </w:p>
+    <w:p>
+      <w:pPr>
+        <w:pStyle w:val="FirstParagraph"/>
+      </w:pPr>
+      <w:r>
+        <w:t xml:space="preserve">The paper extends IT business value theory (Melville et al. 2004) from the adopting firm to the vertical structure of a general-purpose technology. Modeling the developer, the adopter, and the consumer in one framework lets us say why developer losses, adopter productivity gains, and weak adopter profit effects are observed together. The same account separates the profitability paradox from the productivity paradox and derives the former from the zero-profit condition applied to an input with a common market price. We also provide an ex ante definition of appropriability that applies to developers and adopters alike, which speaks to the tautology charge against resource-based IT research, and we show how a model can be a source of rent at one date and a marginal-cost input at another.</w:t>
+      </w:r>
+    </w:p>
+    <w:p>
+      <w:pPr>
+        <w:pStyle w:val="BodyText"/>
+      </w:pPr>
+      <w:r>
+        <w:t xml:space="preserve">We should be clear about what is not new. The mechanisms in each layer are established in industrial organization and strategy (Section 2.4). What the paper adds is their combination under a single appropriability definition and the specification of measurable counterparts for a technology in which those counterparts are observable.</w:t>
+      </w:r>
+    </w:p>
     <w:bookmarkEnd w:id="45"/>
-    <w:bookmarkStart w:id="46" w:name="what-is-and-is-not-identified"/>
+    <w:bookmarkStart w:id="46" w:name="implications-for-practice"/>
     <w:p>
       <w:pPr>
         <w:pStyle w:val="Heading2"/>
       </w:pPr>
       <w:r>
-        <w:t xml:space="preserve">7.3 What is and is not identified</w:t>
+        <w:t xml:space="preserve">7.2 Implications for practice</w:t>
       </w:r>
     </w:p>
     <w:p>
@@ -6257,27 +6255,44 @@
         <w:pStyle w:val="FirstParagraph"/>
       </w:pPr>
       <w:r>
-        <w:t xml:space="preserve">Six restrictions bind. First, the realized price is the mean of provider cards on OpenRouter, not a billed invoice and not a GAAP inference margin. Second, endpoint coverage is incomplete (102 of 171 priced months). Third, GA years are coded from public product dates, and they do not measure token spend or retrieval intensity. Fourth, Table 1 figures are illustrative and are not regression inputs. Fifth, two-way fixed-effects estimates under staggered timing can be biased when effects differ across cohorts, and while the robust estimators address that bias, they still rest on parallel trends, which the matched-control and trend specifications relax only partly. Sixth, operating margin is an accounting measure and not the economic profit of Proposition 2, and the timing of GA marks the launch of a product, not the start of organizational-capital accumulation.</w:t>
+        <w:t xml:space="preserve">For adopters, the central question is not how much to spend on AI but what the firm owns that the model cannot supply, and how long competitors will take to own it too. The theory also says that spending on the model itself is not a source of advantage, since any rival can buy the same model. For developers, the next model is the source of value, not the current one. When leads last only a few months, much of the reported loss is economic (Corollary 4). The valuations of frontier labs are best read as prices for an option on a sequence of future leads and not as capitalized current earnings. For the relationship between the two sides, Proposition 5 implies that contractual terms covering data use, fine-tuning ownership, and on-premise deployment are strategic decisions, because they affect the rate at which a vendor can productize an adopter’s use.</w:t>
       </w:r>
     </w:p>
     <w:bookmarkEnd w:id="46"/>
+    <w:bookmarkStart w:id="47" w:name="boundary-conditions-and-limitations"/>
+    <w:p>
+      <w:pPr>
+        <w:pStyle w:val="Heading2"/>
+      </w:pPr>
+      <w:r>
+        <w:t xml:space="preserve">7.3 Boundary conditions and limitations</w:t>
+      </w:r>
+    </w:p>
+    <w:p>
+      <w:pPr>
+        <w:pStyle w:val="FirstParagraph"/>
+      </w:pPr>
+      <w:r>
+        <w:t xml:space="preserve">The theory assumes competitive downstream product markets. Where adopters hold market power, pass-through is incomplete, and commodity LLM use can raise profit. Evidence that IT intensity accompanies rising industry concentration suggests that this case is empirically relevant (Autor et al. 2020, Bessen 2020), and it is also an alternative reading of the margin increment in H3. The theory further assumes that the developer’s lead closes. Economies of scale in compute and data flywheels could prevent closure and shift surplus durably toward the developer, and sustained margins without a quality lead, that is, disconfirmation of H1, would indicate that this case dominates.</w:t>
+      </w:r>
+    </w:p>
+    <w:p>
+      <w:pPr>
+        <w:pStyle w:val="BodyText"/>
+      </w:pPr>
+      <w:r>
+        <w:t xml:space="preserve">The model abstracts from uncertainty in training outcomes, from strategic interaction among developers (the lead and the catch-up lag are treated as exogenous), and from purchasable organizational capital. Making the lead endogenous to a training race is the most natural extension, and it is where we would expect a more specifically LLM-based theory to develop. The empirical proxies are imperfect, and misclassification biases the estimated difference between commodity and complementary use toward zero. The adopter sample is small and made up of large software incumbents, so the results should not be generalized to adopters in other industries. Finally, the evidence is observational and cross-sectional in time, over a period in which the technology and its business models are still changing. The tests here are best viewed as a first look at the constructs, and they are not a confirmation of the theory.</w:t>
+      </w:r>
+    </w:p>
     <w:bookmarkEnd w:id="47"/>
-    <w:bookmarkStart w:id="51" w:name="discussion"/>
+    <w:bookmarkEnd w:id="48"/>
+    <w:bookmarkStart w:id="49" w:name="conclusion"/>
     <w:p>
       <w:pPr>
         <w:pStyle w:val="Heading1"/>
       </w:pPr>
       <w:r>
-        <w:t xml:space="preserve">8. Discussion</w:t>
-      </w:r>
-    </w:p>
-    <w:bookmarkStart w:id="48" w:name="contributions"/>
-    <w:p>
-      <w:pPr>
-        <w:pStyle w:val="Heading2"/>
-      </w:pPr>
-      <w:r>
-        <w:t xml:space="preserve">8.1 Contributions</w:t>
+        <w:t xml:space="preserve">8. Conclusion</w:t>
       </w:r>
     </w:p>
     <w:p>
@@ -6285,7 +6300,7 @@
         <w:pStyle w:val="FirstParagraph"/>
       </w:pPr>
       <w:r>
-        <w:t xml:space="preserve">The paper extends IT business value theory (Melville et al. 2004) from the adopting firm to the vertical structure of a general-purpose technology. Modeling the developer, the adopter, and the consumer in one framework lets us say why developer losses, adopter productivity gains, and weak adopter profit effects are observed together. The same account separates the profitability paradox from the productivity paradox and derives the former from the zero-profit condition applied to an input with a common market price. We also provide an ex ante definition of appropriability that applies to developers and adopters alike, which speaks to the tautology charge against resource-based IT research, and we show how a model can be a source of rent at one date and a marginal-cost input at another.</w:t>
+        <w:t xml:space="preserve">LLMs create value, and the theory developed here says where it goes. Adopters that use a model available to every competitor on the same terms pass their gain to consumers. The frontier developer captures a share in proportion to its quality lead, and only until a competitor closes it. Adopters that combine the model with organizational capital that rivals cannot quickly build earn a rent in proportion to how long the building takes, and that rent shrinks if a vendor productizes the use. The remainder goes to consumers, and statistics that pool all three positions report an average close to zero.</w:t>
       </w:r>
     </w:p>
     <w:p>
@@ -6293,82 +6308,11 @@
         <w:pStyle w:val="BodyText"/>
       </w:pPr>
       <w:r>
-        <w:t xml:space="preserve">We should be clear about what is not new. The mechanisms in each layer are established in industrial organization and strategy (Section 2.4). What the paper adds is their combination under a single appropriability definition and the specification of measurable counterparts for a technology in which those counterparts are observable.</w:t>
-      </w:r>
-    </w:p>
-    <w:bookmarkEnd w:id="48"/>
-    <w:bookmarkStart w:id="49" w:name="implications-for-practice"/>
-    <w:p>
-      <w:pPr>
-        <w:pStyle w:val="Heading2"/>
-      </w:pPr>
-      <w:r>
-        <w:t xml:space="preserve">8.2 Implications for practice</w:t>
-      </w:r>
-    </w:p>
-    <w:p>
-      <w:pPr>
-        <w:pStyle w:val="FirstParagraph"/>
-      </w:pPr>
-      <w:r>
-        <w:t xml:space="preserve">For adopters, the central question is not how much to spend on AI but what the firm owns that the model cannot supply, and how long competitors will take to own it too. The theory also says that spending on the model itself is not a source of advantage, since any rival can buy the same model. For developers, the next model is the source of value, not the current one. When leads last only a few months, much of the reported loss is economic (Corollary 4). The valuations of frontier labs are best read as prices for an option on a sequence of future leads and not as capitalized current earnings. For the relationship between the two sides, Proposition 5 implies that contractual terms covering data use, fine-tuning ownership, and on-premise deployment are strategic decisions, because they affect the rate at which a vendor can productize an adopter’s use.</w:t>
+        <w:t xml:space="preserve">The public record makes the developer half of this account visible. Frontier labs combine large booked revenue with large operating losses and pay complement owners for compute. The price of matched capability falls several-fold each year, while the cost of frontier capability rises. Investors nonetheless value the same firms as if a release sequence will continue. These three facts are consistent with a single explanation: competition over a general-purpose input whose quality lead is short and must be bought again with each release. The profitability puzzle that accompanies every general-purpose technology is, on this account, what competition over a common input looks like from the inside.</w:t>
       </w:r>
     </w:p>
     <w:bookmarkEnd w:id="49"/>
-    <w:bookmarkStart w:id="50" w:name="boundary-conditions-and-limitations"/>
-    <w:p>
-      <w:pPr>
-        <w:pStyle w:val="Heading2"/>
-      </w:pPr>
-      <w:r>
-        <w:t xml:space="preserve">8.3 Boundary conditions and limitations</w:t>
-      </w:r>
-    </w:p>
-    <w:p>
-      <w:pPr>
-        <w:pStyle w:val="FirstParagraph"/>
-      </w:pPr>
-      <w:r>
-        <w:t xml:space="preserve">The theory assumes competitive downstream product markets. Where adopters hold market power, pass-through is incomplete, and commodity LLM use can raise profit. Evidence that IT intensity accompanies rising industry concentration suggests that this case is empirically relevant (Autor et al. 2020, Bessen 2020), and it is also an alternative reading of the margin increment in H3. The theory further assumes that the developer’s lead closes. Economies of scale in compute and data flywheels could prevent closure and shift surplus durably toward the developer, and sustained margins without a quality lead, that is, disconfirmation of H1, would indicate that this case dominates.</w:t>
-      </w:r>
-    </w:p>
-    <w:p>
-      <w:pPr>
-        <w:pStyle w:val="BodyText"/>
-      </w:pPr>
-      <w:r>
-        <w:t xml:space="preserve">The model abstracts from uncertainty in training outcomes, from strategic interaction among developers (the lead and the catch-up lag are treated as exogenous), and from purchasable organizational capital. Making the lead endogenous to a training race is the most natural extension, and it is where we would expect a more specifically LLM-based theory to develop. The empirical proxies are imperfect, and misclassification biases the estimated difference between commodity and complementary use toward zero. The adopter sample is small and made up of large software incumbents, so the results should not be generalized to adopters in other industries. Finally, the evidence is observational and cross-sectional in time, over a period in which the technology and its business models are still changing. The tests here are best viewed as a first look at the constructs, and they are not a confirmation of the theory.</w:t>
-      </w:r>
-    </w:p>
-    <w:bookmarkEnd w:id="50"/>
-    <w:bookmarkEnd w:id="51"/>
-    <w:bookmarkStart w:id="52" w:name="conclusion"/>
-    <w:p>
-      <w:pPr>
-        <w:pStyle w:val="Heading1"/>
-      </w:pPr>
-      <w:r>
-        <w:t xml:space="preserve">9. Conclusion</w:t>
-      </w:r>
-    </w:p>
-    <w:p>
-      <w:pPr>
-        <w:pStyle w:val="FirstParagraph"/>
-      </w:pPr>
-      <w:r>
-        <w:t xml:space="preserve">LLMs create value, and the theory developed here says where it goes. Adopters that use a model available to every competitor on the same terms pass their gain to consumers. The frontier developer captures a share in proportion to its quality lead, and only until a competitor closes it. Adopters that combine the model with organizational capital that rivals cannot quickly build earn a rent in proportion to how long the building takes, and that rent shrinks if a vendor productizes the use. The remainder goes to consumers, and statistics that pool all three positions report an average close to zero.</w:t>
-      </w:r>
-    </w:p>
-    <w:p>
-      <w:pPr>
-        <w:pStyle w:val="BodyText"/>
-      </w:pPr>
-      <w:r>
-        <w:t xml:space="preserve">The public record makes the developer half of this account visible. Frontier labs combine large booked revenue with large operating losses and pay complement owners for compute. The price of matched capability falls several-fold each year, while the cost of frontier capability rises. Investors nonetheless value the same firms as if a release sequence will continue. These three facts are consistent with a single explanation: competition over a general-purpose input whose quality lead is short and must be bought again with each release. The profitability puzzle that accompanies every general-purpose technology is, on this account, what competition over a common input looks like from the inside.</w:t>
-      </w:r>
-    </w:p>
-    <w:bookmarkEnd w:id="52"/>
-    <w:bookmarkStart w:id="53" w:name="appendix-a.-proofs"/>
+    <w:bookmarkStart w:id="50" w:name="appendix-a.-proofs"/>
     <w:p>
       <w:pPr>
         <w:pStyle w:val="Heading1"/>
@@ -9587,8 +9531,8 @@
         </m:r>
       </m:oMath>
     </w:p>
-    <w:bookmarkEnd w:id="53"/>
-    <w:bookmarkStart w:id="54" w:name="references"/>
+    <w:bookmarkEnd w:id="50"/>
+    <w:bookmarkStart w:id="51" w:name="references"/>
     <w:p>
       <w:pPr>
         <w:pStyle w:val="Heading1"/>
@@ -10732,7 +10676,7 @@
         <w:t xml:space="preserve">, June 16. https://www.wheresyoured.at/exclusive-openai-financials/.</w:t>
       </w:r>
     </w:p>
-    <w:bookmarkEnd w:id="54"/>
+    <w:bookmarkEnd w:id="51"/>
     <w:sectPr/>
   </w:body>
 </w:document>

</xml_diff>

<commit_message>
Restore sample and estimation summary at start of Section 6
Co-Authored-By: Claude Sonnet 5.5 <noreply@anthropic.com>
Claude-Session: https://claude.ai/code/session_01SvJ27oz7kYhWEBfZS3x4ro
</commit_message>
<xml_diff>
--- a/isr/ISR_Who_Profits_from_LLMs.docx
+++ b/isr/ISR_Who_Profits_from_LLMs.docx
@@ -5511,7 +5511,15 @@
         <w:pStyle w:val="FirstParagraph"/>
       </w:pPr>
       <w:r>
-        <w:t xml:space="preserve">We report what has been estimated and indicate where an analysis has not yet been run.</w:t>
+        <w:t xml:space="preserve">The developer panel combines Arena overall leaderboard snapshots (Chiang et al. 2024) with OpenRouter endpoint prices (OpenRouter 2026). It contains 171 lab-months with a price, of which 102 have at least one live endpoint and 69 use the list-price fallback. The adopter panel is drawn from SEC EDGAR XBRL company facts (SEC 2026) and covers 81 firms and 520 firm-years, with staggered GA-year treatment for 21 firms. GA years are coded by hand from public product dates.</w:t>
+      </w:r>
+    </w:p>
+    <w:p>
+      <w:pPr>
+        <w:pStyle w:val="BodyText"/>
+      </w:pPr>
+      <w:r>
+        <w:t xml:space="preserve">On the developer side, inference uses the restricted wild cluster bootstrap with Webb weights (Cameron et al. 2008, Webb 2023), because the panel contains few labs. On the adopter side, the baseline is a two-way fixed-effects regression of operating margin on a post-GA indicator with firm and year effects. Under staggered treatment this estimator can be biased (Goodman-Bacon 2021), so heterogeneity-robust estimators (Callaway and Sant’Anna 2021, Sun and Abraham 2021) serve as the primary specification. We report what has been estimated and indicate where an analysis has not yet been run.</w:t>
       </w:r>
     </w:p>
     <w:bookmarkStart w:id="40" w:name="developer-side-h1"/>

</xml_diff>

<commit_message>
Remove placeholders and complementary-specification results
Co-Authored-By: Claude Sonnet 5.5 <noreply@anthropic.com>
Claude-Session: https://claude.ai/code/session_01SvJ27oz7kYhWEBfZS3x4ro
</commit_message>
<xml_diff>
--- a/isr/ISR_Who_Profits_from_LLMs.docx
+++ b/isr/ISR_Who_Profits_from_LLMs.docx
@@ -5519,7 +5519,7 @@
         <w:pStyle w:val="BodyText"/>
       </w:pPr>
       <w:r>
-        <w:t xml:space="preserve">On the developer side, inference uses the restricted wild cluster bootstrap with Webb weights (Cameron et al. 2008, Webb 2023), because the panel contains few labs. On the adopter side, the baseline is a two-way fixed-effects regression of operating margin on a post-GA indicator with firm and year effects. Under staggered treatment this estimator can be biased (Goodman-Bacon 2021), so heterogeneity-robust estimators (Callaway and Sant’Anna 2021, Sun and Abraham 2021) serve as complementary specifications. We report what has been estimated and indicate where an analysis has not yet been run.</w:t>
+        <w:t xml:space="preserve">On the developer side, we regress log realized price on the lab’s lead with lab fixed effects and a trend, clustering by lab. On the adopter side, we regress operating margin on a post-GA indicator with firm and year fixed effects, clustering by firm.</w:t>
       </w:r>
     </w:p>
     <w:bookmarkStart w:id="40" w:name="developer-side-h1"/>
@@ -5546,23 +5546,7 @@
         <w:t xml:space="preserve"> </w:t>
       </w:r>
       <w:r>
-        <w:t xml:space="preserve">Regressing log realized flagship price on the lab’s lead with lab fixed effects and a trend gives a coefficient of 0.0099 on the 171 lab-months with list fallback and 0.0068 on the 102 months with at least one live endpoint. Conventional clustered p-values are below 0.001 and 0.017, respectively. With few lab clusters these p-values likely overstate precision (Cameron et al. 2008), and we regard the estimates as suggestive until bootstrap inference is reported.</w:t>
-      </w:r>
-      <w:r>
-        <w:t xml:space="preserve"> </w:t>
-      </w:r>
-      <w:r>
-        <w:rPr>
-          <w:bCs/>
-          <w:b/>
-        </w:rPr>
-        <w:t xml:space="preserve">[AUTHORS TO COMPLETE: wild cluster bootstrap p-values for both samples.]</w:t>
-      </w:r>
-      <w:r>
-        <w:t xml:space="preserve"> </w:t>
-      </w:r>
-      <w:r>
-        <w:t xml:space="preserve">A first-difference cut on an older list-price snapshot series (</w:t>
+        <w:t xml:space="preserve">Regressing log realized flagship price on the lab’s lead with lab fixed effects and a trend gives a coefficient of 0.0099 on the 171 lab-months with list fallback and 0.0068 on the 102 months with at least one live endpoint. Conventional clustered p-values are below 0.001 and 0.017, respectively. With few lab clusters these p-values likely overstate precision (Cameron et al. 2008), and we regard the estimates as suggestive. A first-difference cut on an older list-price snapshot series (</w:t>
       </w:r>
       <m:oMath>
         <m:r>
@@ -5606,17 +5590,7 @@
         <w:t xml:space="preserve"> </w:t>
       </w:r>
       <w:r>
-        <w:t xml:space="preserve">They are identified mainly by new releases and so do not isolate the premium on a given model. They should be read as associations between a lab’s lead and its flagship price, and not as tests of H1a or H1b.</w:t>
-      </w:r>
-      <w:r>
-        <w:t xml:space="preserve"> </w:t>
-      </w:r>
-      <w:r>
-        <w:rPr>
-          <w:bCs/>
-          <w:b/>
-        </w:rPr>
-        <w:t xml:space="preserve">[AUTHORS TO COMPLETE: model-month estimates for H1a and launch-price regression for H1b, with the catch-up event-study figure.]</w:t>
+        <w:t xml:space="preserve">They are identified mainly by new releases and so do not isolate the premium on a given model. They should be read as associations between a lab’s lead and its flagship price, and not as tests of H1a or H1b. Those tests require a model-month panel and a release-level panel of launch prices, which we do not estimate here.</w:t>
       </w:r>
     </w:p>
     <w:bookmarkEnd w:id="40"/>
@@ -5646,16 +5620,6 @@
       <w:r>
         <w:t xml:space="preserve">Pooled exposure without a coded GA year does not predict operating margin.</w:t>
       </w:r>
-      <w:r>
-        <w:t xml:space="preserve"> </w:t>
-      </w:r>
-      <w:r>
-        <w:rPr>
-          <w:bCs/>
-          <w:b/>
-        </w:rPr>
-        <w:t xml:space="preserve">[AUTHORS TO COMPLETE: coefficient, standard error, and p-value.]</w:t>
-      </w:r>
     </w:p>
     <w:p>
       <w:pPr>
@@ -5732,23 +5696,7 @@
         <w:t xml:space="preserve"> </w:t>
       </w:r>
       <w:r>
-        <w:t xml:space="preserve">firm-years, 21 treated firms). Because the treated firms are large software incumbents and treatment is staggered, this baseline estimate may be biased and may reflect non-AI margin trends, so we read it together with the complementary specifications and not as a stand-alone test of H3.</w:t>
-      </w:r>
-      <w:r>
-        <w:t xml:space="preserve"> </w:t>
-      </w:r>
-      <w:r>
-        <w:rPr>
-          <w:bCs/>
-          <w:b/>
-        </w:rPr>
-        <w:t xml:space="preserve">[AUTHORS TO COMPLETE: heterogeneity-robust estimates, SIC-by-year and trend specifications, matched-control estimates, placebo, randomization inference, and the gross-margin versus operating-expense decomposition.]</w:t>
-      </w:r>
-      <w:r>
-        <w:t xml:space="preserve"> </w:t>
-      </w:r>
-      <w:r>
-        <w:t xml:space="preserve">An increment carried by the operating-expense ratio, or concentrated among the largest firms, would point to cost reduction or market power and not to a complement rent.</w:t>
+        <w:t xml:space="preserve">firm-years, 21 treated firms). Because the treated firms are large software incumbents and treatment is staggered, this estimate may be biased and may reflect non-AI margin trends, so we do not read it as a stand-alone test of H3. An increment carried by the operating-expense ratio, or concentrated among the largest firms, would point to cost reduction or market power and not to a complement rent.</w:t>
       </w:r>
     </w:p>
     <w:p>
@@ -6024,58 +5972,7 @@
         <w:t xml:space="preserve"> </w:t>
       </w:r>
       <w:r>
-        <w:t xml:space="preserve">estimates are imprecise and rest on fewer treated firms, so the point estimates alone do not establish decay, and we do not claim support for H4.</w:t>
-      </w:r>
-      <w:r>
-        <w:t xml:space="preserve"> </w:t>
-      </w:r>
-      <w:r>
-        <w:rPr>
-          <w:bCs/>
-          <w:b/>
-        </w:rPr>
-        <w:t xml:space="preserve">[AUTHORS TO COMPLETE: direct test of equality of</w:t>
-      </w:r>
-      <w:r>
-        <w:rPr>
-          <w:bCs/>
-          <w:b/>
-        </w:rPr>
-        <w:t xml:space="preserve"> </w:t>
-      </w:r>
-      <m:oMath>
-        <m:r>
-          <m:t>t</m:t>
-        </m:r>
-        <m:r>
-          <m:rPr>
-            <m:sty m:val="p"/>
-          </m:rPr>
-          <m:t>+</m:t>
-        </m:r>
-        <m:r>
-          <m:t>1</m:t>
-        </m:r>
-      </m:oMath>
-      <w:r>
-        <w:rPr>
-          <w:bCs/>
-          <w:b/>
-        </w:rPr>
-        <w:t xml:space="preserve"> </w:t>
-      </w:r>
-      <w:r>
-        <w:rPr>
-          <w:bCs/>
-          <w:b/>
-        </w:rPr>
-        <w:t xml:space="preserve">and the last post-GA bin, and joint test of pre-GA coefficients.]</w:t>
-      </w:r>
-      <w:r>
-        <w:t xml:space="preserve"> </w:t>
-      </w:r>
-      <w:r>
-        <w:t xml:space="preserve">A time-invariant bundle-by-post-2023 difference-in-differences gives a similar coefficient and is retained as a robustness check.</w:t>
+        <w:t xml:space="preserve">estimates are imprecise and rest on fewer treated firms, so the point estimates alone do not establish decay, and we do not claim support for H4. A time-invariant bundle-by-post-2023 difference-in-differences gives a similar coefficient and is retained as a robustness check.</w:t>
       </w:r>
     </w:p>
     <w:bookmarkEnd w:id="41"/>
@@ -6093,7 +5990,7 @@
         <w:pStyle w:val="FirstParagraph"/>
       </w:pPr>
       <w:r>
-        <w:t xml:space="preserve">Six restrictions bind. First, the realized price is the mean of provider cards on OpenRouter, not a billed invoice and not a GAAP inference margin. Second, endpoint coverage is incomplete (102 of 171 priced months). Third, GA years are coded from public product dates, and they do not measure token spend or retrieval intensity. Fourth, Table 1 figures are illustrative and are not regression inputs. Fifth, two-way fixed-effects estimates under staggered timing can be biased when effects differ across cohorts, and while the robust estimators address that bias, they still rest on parallel trends, which the matched-control and trend specifications relax only partly. Sixth, operating margin is an accounting measure and not the economic profit of Proposition 2, and the timing of GA marks the launch of a product, not the start of organizational-capital accumulation.</w:t>
+        <w:t xml:space="preserve">Six restrictions bind. First, the realized price is the mean of provider cards on OpenRouter, not a billed invoice and not a GAAP inference margin. Second, endpoint coverage is incomplete (102 of 171 priced months). Third, GA years are coded from public product dates, and they do not measure token spend or retrieval intensity. Fourth, Table 1 figures are illustrative and are not regression inputs. Fifth, two-way fixed-effects estimates under staggered timing can be biased when effects differ across cohorts (Goodman-Bacon 2021), and they rest on parallel trends, which we do not test beyond the pre-GA coefficients in the event study. Sixth, operating margin is an accounting measure and not the economic profit of Proposition 2, and the timing of GA marks the launch of a product, not the start of organizational-capital accumulation.</w:t>
       </w:r>
     </w:p>
     <w:bookmarkEnd w:id="42"/>
@@ -9767,7 +9664,180 @@
         <w:pStyle w:val="BodyText"/>
       </w:pPr>
       <w:r>
-        <w:t xml:space="preserve">Callaway, B., and Sant’Anna, P. H. C. 2021. Difference-in-differences with multiple time periods.</w:t>
+        <w:t xml:space="preserve">Cameron, A. C., Gelbach, J. B., and Miller, D. L. 2008. Bootstrap-based improvements for inference with clustered errors.</w:t>
+      </w:r>
+      <w:r>
+        <w:t xml:space="preserve"> </w:t>
+      </w:r>
+      <w:r>
+        <w:rPr>
+          <w:iCs/>
+          <w:i/>
+        </w:rPr>
+        <w:t xml:space="preserve">Review of Economics and Statistics</w:t>
+      </w:r>
+      <w:r>
+        <w:t xml:space="preserve"> </w:t>
+      </w:r>
+      <w:r>
+        <w:t xml:space="preserve">90(3):414–427.</w:t>
+      </w:r>
+    </w:p>
+    <w:p>
+      <w:pPr>
+        <w:pStyle w:val="BodyText"/>
+      </w:pPr>
+      <w:r>
+        <w:t xml:space="preserve">Chiang, W.-L., Zheng, L., Sheng, Y., Angelopoulos, A. N., Li, T., Li, D., Zhang, H., Zhu, B., Jordan, M., Gonzalez, J. E., and Stoica, I. 2024. Chatbot Arena: An open platform for evaluating LLMs by human preference.</w:t>
+      </w:r>
+      <w:r>
+        <w:t xml:space="preserve"> </w:t>
+      </w:r>
+      <w:r>
+        <w:rPr>
+          <w:iCs/>
+          <w:i/>
+        </w:rPr>
+        <w:t xml:space="preserve">Proceedings of the 41st International Conference on Machine Learning</w:t>
+      </w:r>
+      <w:r>
+        <w:t xml:space="preserve">, PMLR 235:8359–8388.</w:t>
+      </w:r>
+    </w:p>
+    <w:p>
+      <w:pPr>
+        <w:pStyle w:val="BodyText"/>
+      </w:pPr>
+      <w:r>
+        <w:t xml:space="preserve">Clemons, E. K., and Row, M. C. 1991. Sustaining IT advantage: The role of structural differences.</w:t>
+      </w:r>
+      <w:r>
+        <w:t xml:space="preserve"> </w:t>
+      </w:r>
+      <w:r>
+        <w:rPr>
+          <w:iCs/>
+          <w:i/>
+        </w:rPr>
+        <w:t xml:space="preserve">MIS Quarterly</w:t>
+      </w:r>
+      <w:r>
+        <w:t xml:space="preserve"> </w:t>
+      </w:r>
+      <w:r>
+        <w:t xml:space="preserve">15(3):275–292.</w:t>
+      </w:r>
+    </w:p>
+    <w:p>
+      <w:pPr>
+        <w:pStyle w:val="BodyText"/>
+      </w:pPr>
+      <w:r>
+        <w:t xml:space="preserve">Cottier, B., Snodin, B., Owen, D., and Adamczewski, T. 2025. LLM inference prices have fallen rapidly but unequally across tasks. Epoch AI Data Insights, March. https://epoch.ai/data-insights/llm-inference-price-trends.</w:t>
+      </w:r>
+    </w:p>
+    <w:p>
+      <w:pPr>
+        <w:pStyle w:val="BodyText"/>
+      </w:pPr>
+      <w:r>
+        <w:t xml:space="preserve">Dell’Acqua, F., et al. 2023. Navigating the jagged technological frontier: Field experimental evidence of the effects of AI on knowledge worker productivity and quality. Harvard Business School Working Paper 24-013.</w:t>
+      </w:r>
+    </w:p>
+    <w:p>
+      <w:pPr>
+        <w:pStyle w:val="BodyText"/>
+      </w:pPr>
+      <w:r>
+        <w:t xml:space="preserve">Dierickx, I., and Cool, K. 1989. Asset stock accumulation and sustainability of competitive advantage.</w:t>
+      </w:r>
+      <w:r>
+        <w:t xml:space="preserve"> </w:t>
+      </w:r>
+      <w:r>
+        <w:rPr>
+          <w:iCs/>
+          <w:i/>
+        </w:rPr>
+        <w:t xml:space="preserve">Management Science</w:t>
+      </w:r>
+      <w:r>
+        <w:t xml:space="preserve"> </w:t>
+      </w:r>
+      <w:r>
+        <w:t xml:space="preserve">35(12):1504–1511.</w:t>
+      </w:r>
+    </w:p>
+    <w:p>
+      <w:pPr>
+        <w:pStyle w:val="BodyText"/>
+      </w:pPr>
+      <w:r>
+        <w:t xml:space="preserve">Eloundou, T., Manning, S., Mishkin, P., and Rock, D. 2024. GPTs are GPTs: Labor market impact potential of LLMs.</w:t>
+      </w:r>
+      <w:r>
+        <w:t xml:space="preserve"> </w:t>
+      </w:r>
+      <w:r>
+        <w:rPr>
+          <w:iCs/>
+          <w:i/>
+        </w:rPr>
+        <w:t xml:space="preserve">Science</w:t>
+      </w:r>
+      <w:r>
+        <w:t xml:space="preserve"> </w:t>
+      </w:r>
+      <w:r>
+        <w:t xml:space="preserve">384(6702):1306–1308.</w:t>
+      </w:r>
+    </w:p>
+    <w:p>
+      <w:pPr>
+        <w:pStyle w:val="BodyText"/>
+      </w:pPr>
+      <w:r>
+        <w:t xml:space="preserve">Emberson, L. 2025. Open-weight models lag state-of-the-art by around 3 months on average. Epoch AI Data Insights, October 30. https://epoch.ai/data-insights/open-weights-vs-closed-weights-models.</w:t>
+      </w:r>
+    </w:p>
+    <w:p>
+      <w:pPr>
+        <w:pStyle w:val="BodyText"/>
+      </w:pPr>
+      <w:r>
+        <w:t xml:space="preserve">Epoch AI. 2026. Open models lag state-of-the-art closed models by 4 months. Epoch AI Data Insights, May 29. https://epoch.ai/data-insights/open-closed-eci-gap.</w:t>
+      </w:r>
+    </w:p>
+    <w:p>
+      <w:pPr>
+        <w:pStyle w:val="BodyText"/>
+      </w:pPr>
+      <w:r>
+        <w:t xml:space="preserve">Gawer, A., and Henderson, R. 2007. Platform owner entry and innovation in complementary markets: Evidence from Intel.</w:t>
+      </w:r>
+      <w:r>
+        <w:t xml:space="preserve"> </w:t>
+      </w:r>
+      <w:r>
+        <w:rPr>
+          <w:iCs/>
+          <w:i/>
+        </w:rPr>
+        <w:t xml:space="preserve">Journal of Economics &amp; Management Strategy</w:t>
+      </w:r>
+      <w:r>
+        <w:t xml:space="preserve"> </w:t>
+      </w:r>
+      <w:r>
+        <w:t xml:space="preserve">16(1):1–34.</w:t>
+      </w:r>
+    </w:p>
+    <w:p>
+      <w:pPr>
+        <w:pStyle w:val="BodyText"/>
+      </w:pPr>
+      <w:r>
+        <w:t xml:space="preserve">Goodman-Bacon, A. 2021. Difference-in-differences with variation in treatment timing.</w:t>
       </w:r>
       <w:r>
         <w:t xml:space="preserve"> </w:t>
@@ -9783,7 +9853,7 @@
         <w:t xml:space="preserve"> </w:t>
       </w:r>
       <w:r>
-        <w:t xml:space="preserve">225(2):200–230.</w:t>
+        <w:t xml:space="preserve">225(2):254–277.</w:t>
       </w:r>
     </w:p>
     <w:p>
@@ -9791,7 +9861,7 @@
         <w:pStyle w:val="BodyText"/>
       </w:pPr>
       <w:r>
-        <w:t xml:space="preserve">Cameron, A. C., Gelbach, J. B., and Miller, D. L. 2008. Bootstrap-based improvements for inference with clustered errors.</w:t>
+        <w:t xml:space="preserve">Griliches, Z. 1994. Productivity, R&amp;D, and the data constraint.</w:t>
       </w:r>
       <w:r>
         <w:t xml:space="preserve"> </w:t>
@@ -9801,13 +9871,13 @@
           <w:iCs/>
           <w:i/>
         </w:rPr>
-        <w:t xml:space="preserve">Review of Economics and Statistics</w:t>
-      </w:r>
-      <w:r>
-        <w:t xml:space="preserve"> </w:t>
-      </w:r>
-      <w:r>
-        <w:t xml:space="preserve">90(3):414–427.</w:t>
+        <w:t xml:space="preserve">American Economic Review</w:t>
+      </w:r>
+      <w:r>
+        <w:t xml:space="preserve"> </w:t>
+      </w:r>
+      <w:r>
+        <w:t xml:space="preserve">84(1):1–23.</w:t>
       </w:r>
     </w:p>
     <w:p>
@@ -9815,20 +9885,7 @@
         <w:pStyle w:val="BodyText"/>
       </w:pPr>
       <w:r>
-        <w:t xml:space="preserve">Chiang, W.-L., Zheng, L., Sheng, Y., Angelopoulos, A. N., Li, T., Li, D., Zhang, H., Zhu, B., Jordan, M., Gonzalez, J. E., and Stoica, I. 2024. Chatbot Arena: An open platform for evaluating LLMs by human preference.</w:t>
-      </w:r>
-      <w:r>
-        <w:t xml:space="preserve"> </w:t>
-      </w:r>
-      <w:r>
-        <w:rPr>
-          <w:iCs/>
-          <w:i/>
-        </w:rPr>
-        <w:t xml:space="preserve">Proceedings of the 41st International Conference on Machine Learning</w:t>
-      </w:r>
-      <w:r>
-        <w:t xml:space="preserve">, PMLR 235:8359–8388.</w:t>
+        <w:t xml:space="preserve">Gundlach, H., Lynch, J., Mertens, M., and Thompson, N. 2026. The price of progress: Price performance and the future of AI. Preprint, arXiv:2511.23455v2.</w:t>
       </w:r>
     </w:p>
     <w:p>
@@ -9836,7 +9893,7 @@
         <w:pStyle w:val="BodyText"/>
       </w:pPr>
       <w:r>
-        <w:t xml:space="preserve">Clemons, E. K., and Row, M. C. 1991. Sustaining IT advantage: The role of structural differences.</w:t>
+        <w:t xml:space="preserve">Hitt, L. M., and Brynjolfsson, E. 1996. Productivity, business profitability, and consumer surplus: Three different measures of information technology value.</w:t>
       </w:r>
       <w:r>
         <w:t xml:space="preserve"> </w:t>
@@ -9852,7 +9909,7 @@
         <w:t xml:space="preserve"> </w:t>
       </w:r>
       <w:r>
-        <w:t xml:space="preserve">15(3):275–292.</w:t>
+        <w:t xml:space="preserve">20(2):121–142.</w:t>
       </w:r>
     </w:p>
     <w:p>
@@ -9860,7 +9917,7 @@
         <w:pStyle w:val="BodyText"/>
       </w:pPr>
       <w:r>
-        <w:t xml:space="preserve">Cottier, B., Snodin, B., Owen, D., and Adamczewski, T. 2025. LLM inference prices have fallen rapidly but unequally across tasks. Epoch AI Data Insights, March. https://epoch.ai/data-insights/llm-inference-price-trends.</w:t>
+        <w:t xml:space="preserve">Humlum, A., and Vestergaard, E. 2025. Large language models, small labor market effects. NBER Working Paper 33777, National Bureau of Economic Research, Cambridge, MA.</w:t>
       </w:r>
     </w:p>
     <w:p>
@@ -9868,15 +9925,7 @@
         <w:pStyle w:val="BodyText"/>
       </w:pPr>
       <w:r>
-        <w:t xml:space="preserve">Dell’Acqua, F., et al. 2023. Navigating the jagged technological frontier: Field experimental evidence of the effects of AI on knowledge worker productivity and quality. Harvard Business School Working Paper 24-013.</w:t>
-      </w:r>
-    </w:p>
-    <w:p>
-      <w:pPr>
-        <w:pStyle w:val="BodyText"/>
-      </w:pPr>
-      <w:r>
-        <w:t xml:space="preserve">Dierickx, I., and Cool, K. 1989. Asset stock accumulation and sustainability of competitive advantage.</w:t>
+        <w:t xml:space="preserve">Lippman, S. A., and Rumelt, R. P. 1982. Uncertain imitability: An analysis of interfirm differences in efficiency under competition.</w:t>
       </w:r>
       <w:r>
         <w:t xml:space="preserve"> </w:t>
@@ -9886,13 +9935,13 @@
           <w:iCs/>
           <w:i/>
         </w:rPr>
-        <w:t xml:space="preserve">Management Science</w:t>
-      </w:r>
-      <w:r>
-        <w:t xml:space="preserve"> </w:t>
-      </w:r>
-      <w:r>
-        <w:t xml:space="preserve">35(12):1504–1511.</w:t>
+        <w:t xml:space="preserve">Bell Journal of Economics</w:t>
+      </w:r>
+      <w:r>
+        <w:t xml:space="preserve"> </w:t>
+      </w:r>
+      <w:r>
+        <w:t xml:space="preserve">13(2):418–438.</w:t>
       </w:r>
     </w:p>
     <w:p>
@@ -9900,7 +9949,140 @@
         <w:pStyle w:val="BodyText"/>
       </w:pPr>
       <w:r>
-        <w:t xml:space="preserve">Eloundou, T., Manning, S., Mishkin, P., and Rock, D. 2024. GPTs are GPTs: Labor market impact potential of LLMs.</w:t>
+        <w:t xml:space="preserve">Marshall, A. 1890.</w:t>
+      </w:r>
+      <w:r>
+        <w:t xml:space="preserve"> </w:t>
+      </w:r>
+      <w:r>
+        <w:rPr>
+          <w:iCs/>
+          <w:i/>
+        </w:rPr>
+        <w:t xml:space="preserve">Principles of Economics</w:t>
+      </w:r>
+      <w:r>
+        <w:t xml:space="preserve">. London: Macmillan.</w:t>
+      </w:r>
+    </w:p>
+    <w:p>
+      <w:pPr>
+        <w:pStyle w:val="BodyText"/>
+      </w:pPr>
+      <w:r>
+        <w:t xml:space="preserve">Mata, F. J., Fuerst, W. L., and Barney, J. B. 1995. Information technology and sustained competitive advantage: A resource-based analysis.</w:t>
+      </w:r>
+      <w:r>
+        <w:t xml:space="preserve"> </w:t>
+      </w:r>
+      <w:r>
+        <w:rPr>
+          <w:iCs/>
+          <w:i/>
+        </w:rPr>
+        <w:t xml:space="preserve">MIS Quarterly</w:t>
+      </w:r>
+      <w:r>
+        <w:t xml:space="preserve"> </w:t>
+      </w:r>
+      <w:r>
+        <w:t xml:space="preserve">19(4):487–505.</w:t>
+      </w:r>
+    </w:p>
+    <w:p>
+      <w:pPr>
+        <w:pStyle w:val="BodyText"/>
+      </w:pPr>
+      <w:r>
+        <w:t xml:space="preserve">Melville, N., Kraemer, K., and Gurbaxani, V. 2004. Review: Information technology and organizational performance: An integrative model of IT business value.</w:t>
+      </w:r>
+      <w:r>
+        <w:t xml:space="preserve"> </w:t>
+      </w:r>
+      <w:r>
+        <w:rPr>
+          <w:iCs/>
+          <w:i/>
+        </w:rPr>
+        <w:t xml:space="preserve">MIS Quarterly</w:t>
+      </w:r>
+      <w:r>
+        <w:t xml:space="preserve"> </w:t>
+      </w:r>
+      <w:r>
+        <w:t xml:space="preserve">28(2):283–322.</w:t>
+      </w:r>
+    </w:p>
+    <w:p>
+      <w:pPr>
+        <w:pStyle w:val="BodyText"/>
+      </w:pPr>
+      <w:r>
+        <w:t xml:space="preserve">Milgrom, P., and Roberts, J. 1990. The economics of modern manufacturing: Technology, strategy, and organization.</w:t>
+      </w:r>
+      <w:r>
+        <w:t xml:space="preserve"> </w:t>
+      </w:r>
+      <w:r>
+        <w:rPr>
+          <w:iCs/>
+          <w:i/>
+        </w:rPr>
+        <w:t xml:space="preserve">American Economic Review</w:t>
+      </w:r>
+      <w:r>
+        <w:t xml:space="preserve"> </w:t>
+      </w:r>
+      <w:r>
+        <w:t xml:space="preserve">80(3):511–528.</w:t>
+      </w:r>
+    </w:p>
+    <w:p>
+      <w:pPr>
+        <w:pStyle w:val="BodyText"/>
+      </w:pPr>
+      <w:r>
+        <w:t xml:space="preserve">MLQ. 2026. Leaked OpenAI financials reveal $21B operating loss on $13B revenue in 2025. June 17. https://mlq.ai/news/leaked-openai-financials-reveal-21b-operating-loss-on-13b-revenue-in-2025/.</w:t>
+      </w:r>
+    </w:p>
+    <w:p>
+      <w:pPr>
+        <w:pStyle w:val="BodyText"/>
+      </w:pPr>
+      <w:r>
+        <w:t xml:space="preserve">Mussa, M., and Rosen, S. 1978. Monopoly and product quality.</w:t>
+      </w:r>
+      <w:r>
+        <w:t xml:space="preserve"> </w:t>
+      </w:r>
+      <w:r>
+        <w:rPr>
+          <w:iCs/>
+          <w:i/>
+        </w:rPr>
+        <w:t xml:space="preserve">Journal of Economic Theory</w:t>
+      </w:r>
+      <w:r>
+        <w:t xml:space="preserve"> </w:t>
+      </w:r>
+      <w:r>
+        <w:t xml:space="preserve">18(2):301–317.</w:t>
+      </w:r>
+    </w:p>
+    <w:p>
+      <w:pPr>
+        <w:pStyle w:val="BodyText"/>
+      </w:pPr>
+      <w:r>
+        <w:t xml:space="preserve">Nordhaus, W. D. 2004. Schumpeterian profits in the American economy: Theory and measurement. NBER Working Paper 10433, National Bureau of Economic Research, Cambridge, MA.</w:t>
+      </w:r>
+    </w:p>
+    <w:p>
+      <w:pPr>
+        <w:pStyle w:val="BodyText"/>
+      </w:pPr>
+      <w:r>
+        <w:t xml:space="preserve">Noy, S., and Zhang, W. 2023. Experimental evidence on the productivity effects of generative artificial intelligence.</w:t>
       </w:r>
       <w:r>
         <w:t xml:space="preserve"> </w:t>
@@ -9916,7 +10098,7 @@
         <w:t xml:space="preserve"> </w:t>
       </w:r>
       <w:r>
-        <w:t xml:space="preserve">384(6702):1306–1308.</w:t>
+        <w:t xml:space="preserve">381(6654):187–192.</w:t>
       </w:r>
     </w:p>
     <w:p>
@@ -9924,7 +10106,7 @@
         <w:pStyle w:val="BodyText"/>
       </w:pPr>
       <w:r>
-        <w:t xml:space="preserve">Emberson, L. 2025. Open-weight models lag state-of-the-art by around 3 months on average. Epoch AI Data Insights, October 30. https://epoch.ai/data-insights/open-weights-vs-closed-weights-models.</w:t>
+        <w:t xml:space="preserve">OpenRouter. 2026. Models and endpoint pricing. Accessed September 2026, https://openrouter.ai/models.</w:t>
       </w:r>
     </w:p>
     <w:p>
@@ -9932,7 +10114,7 @@
         <w:pStyle w:val="BodyText"/>
       </w:pPr>
       <w:r>
-        <w:t xml:space="preserve">Epoch AI. 2026. Open models lag state-of-the-art closed models by 4 months. Epoch AI Data Insights, May 29. https://epoch.ai/data-insights/open-closed-eci-gap.</w:t>
+        <w:t xml:space="preserve">Peng, S., Kalliamvakou, E., Cihon, P., and Demirer, M. 2023. The impact of AI on developer productivity: Evidence from GitHub Copilot. Preprint, arXiv:2302.06590.</w:t>
       </w:r>
     </w:p>
     <w:p>
@@ -9940,7 +10122,7 @@
         <w:pStyle w:val="BodyText"/>
       </w:pPr>
       <w:r>
-        <w:t xml:space="preserve">Gawer, A., and Henderson, R. 2007. Platform owner entry and innovation in complementary markets: Evidence from Intel.</w:t>
+        <w:t xml:space="preserve">Peteraf, M. A. 1993. The cornerstones of competitive advantage: A resource-based view.</w:t>
       </w:r>
       <w:r>
         <w:t xml:space="preserve"> </w:t>
@@ -9950,13 +10132,13 @@
           <w:iCs/>
           <w:i/>
         </w:rPr>
-        <w:t xml:space="preserve">Journal of Economics &amp; Management Strategy</w:t>
-      </w:r>
-      <w:r>
-        <w:t xml:space="preserve"> </w:t>
-      </w:r>
-      <w:r>
-        <w:t xml:space="preserve">16(1):1–34.</w:t>
+        <w:t xml:space="preserve">Strategic Management Journal</w:t>
+      </w:r>
+      <w:r>
+        <w:t xml:space="preserve"> </w:t>
+      </w:r>
+      <w:r>
+        <w:t xml:space="preserve">14(3):179–191.</w:t>
       </w:r>
     </w:p>
     <w:p>
@@ -9964,63 +10146,7 @@
         <w:pStyle w:val="BodyText"/>
       </w:pPr>
       <w:r>
-        <w:t xml:space="preserve">Goodman-Bacon, A. 2021. Difference-in-differences with variation in treatment timing.</w:t>
-      </w:r>
-      <w:r>
-        <w:t xml:space="preserve"> </w:t>
-      </w:r>
-      <w:r>
-        <w:rPr>
-          <w:iCs/>
-          <w:i/>
-        </w:rPr>
-        <w:t xml:space="preserve">Journal of Econometrics</w:t>
-      </w:r>
-      <w:r>
-        <w:t xml:space="preserve"> </w:t>
-      </w:r>
-      <w:r>
-        <w:t xml:space="preserve">225(2):254–277.</w:t>
-      </w:r>
-    </w:p>
-    <w:p>
-      <w:pPr>
-        <w:pStyle w:val="BodyText"/>
-      </w:pPr>
-      <w:r>
-        <w:t xml:space="preserve">Griliches, Z. 1994. Productivity, R&amp;D, and the data constraint.</w:t>
-      </w:r>
-      <w:r>
-        <w:t xml:space="preserve"> </w:t>
-      </w:r>
-      <w:r>
-        <w:rPr>
-          <w:iCs/>
-          <w:i/>
-        </w:rPr>
-        <w:t xml:space="preserve">American Economic Review</w:t>
-      </w:r>
-      <w:r>
-        <w:t xml:space="preserve"> </w:t>
-      </w:r>
-      <w:r>
-        <w:t xml:space="preserve">84(1):1–23.</w:t>
-      </w:r>
-    </w:p>
-    <w:p>
-      <w:pPr>
-        <w:pStyle w:val="BodyText"/>
-      </w:pPr>
-      <w:r>
-        <w:t xml:space="preserve">Gundlach, H., Lynch, J., Mertens, M., and Thompson, N. 2026. The price of progress: Price performance and the future of AI. Preprint, arXiv:2511.23455v2.</w:t>
-      </w:r>
-    </w:p>
-    <w:p>
-      <w:pPr>
-        <w:pStyle w:val="BodyText"/>
-      </w:pPr>
-      <w:r>
-        <w:t xml:space="preserve">Hitt, L. M., and Brynjolfsson, E. 1996. Productivity, business profitability, and consumer surplus: Three different measures of information technology value.</w:t>
+        <w:t xml:space="preserve">Piccoli, G., and Ives, B. 2005. IT-dependent strategic initiatives and sustained competitive advantage: A review and synthesis of the literature.</w:t>
       </w:r>
       <w:r>
         <w:t xml:space="preserve"> </w:t>
@@ -10036,259 +10162,6 @@
         <w:t xml:space="preserve"> </w:t>
       </w:r>
       <w:r>
-        <w:t xml:space="preserve">20(2):121–142.</w:t>
-      </w:r>
-    </w:p>
-    <w:p>
-      <w:pPr>
-        <w:pStyle w:val="BodyText"/>
-      </w:pPr>
-      <w:r>
-        <w:t xml:space="preserve">Humlum, A., and Vestergaard, E. 2025. Large language models, small labor market effects. NBER Working Paper 33777, National Bureau of Economic Research, Cambridge, MA.</w:t>
-      </w:r>
-    </w:p>
-    <w:p>
-      <w:pPr>
-        <w:pStyle w:val="BodyText"/>
-      </w:pPr>
-      <w:r>
-        <w:t xml:space="preserve">Lippman, S. A., and Rumelt, R. P. 1982. Uncertain imitability: An analysis of interfirm differences in efficiency under competition.</w:t>
-      </w:r>
-      <w:r>
-        <w:t xml:space="preserve"> </w:t>
-      </w:r>
-      <w:r>
-        <w:rPr>
-          <w:iCs/>
-          <w:i/>
-        </w:rPr>
-        <w:t xml:space="preserve">Bell Journal of Economics</w:t>
-      </w:r>
-      <w:r>
-        <w:t xml:space="preserve"> </w:t>
-      </w:r>
-      <w:r>
-        <w:t xml:space="preserve">13(2):418–438.</w:t>
-      </w:r>
-    </w:p>
-    <w:p>
-      <w:pPr>
-        <w:pStyle w:val="BodyText"/>
-      </w:pPr>
-      <w:r>
-        <w:t xml:space="preserve">Marshall, A. 1890.</w:t>
-      </w:r>
-      <w:r>
-        <w:t xml:space="preserve"> </w:t>
-      </w:r>
-      <w:r>
-        <w:rPr>
-          <w:iCs/>
-          <w:i/>
-        </w:rPr>
-        <w:t xml:space="preserve">Principles of Economics</w:t>
-      </w:r>
-      <w:r>
-        <w:t xml:space="preserve">. London: Macmillan.</w:t>
-      </w:r>
-    </w:p>
-    <w:p>
-      <w:pPr>
-        <w:pStyle w:val="BodyText"/>
-      </w:pPr>
-      <w:r>
-        <w:t xml:space="preserve">Mata, F. J., Fuerst, W. L., and Barney, J. B. 1995. Information technology and sustained competitive advantage: A resource-based analysis.</w:t>
-      </w:r>
-      <w:r>
-        <w:t xml:space="preserve"> </w:t>
-      </w:r>
-      <w:r>
-        <w:rPr>
-          <w:iCs/>
-          <w:i/>
-        </w:rPr>
-        <w:t xml:space="preserve">MIS Quarterly</w:t>
-      </w:r>
-      <w:r>
-        <w:t xml:space="preserve"> </w:t>
-      </w:r>
-      <w:r>
-        <w:t xml:space="preserve">19(4):487–505.</w:t>
-      </w:r>
-    </w:p>
-    <w:p>
-      <w:pPr>
-        <w:pStyle w:val="BodyText"/>
-      </w:pPr>
-      <w:r>
-        <w:t xml:space="preserve">Melville, N., Kraemer, K., and Gurbaxani, V. 2004. Review: Information technology and organizational performance: An integrative model of IT business value.</w:t>
-      </w:r>
-      <w:r>
-        <w:t xml:space="preserve"> </w:t>
-      </w:r>
-      <w:r>
-        <w:rPr>
-          <w:iCs/>
-          <w:i/>
-        </w:rPr>
-        <w:t xml:space="preserve">MIS Quarterly</w:t>
-      </w:r>
-      <w:r>
-        <w:t xml:space="preserve"> </w:t>
-      </w:r>
-      <w:r>
-        <w:t xml:space="preserve">28(2):283–322.</w:t>
-      </w:r>
-    </w:p>
-    <w:p>
-      <w:pPr>
-        <w:pStyle w:val="BodyText"/>
-      </w:pPr>
-      <w:r>
-        <w:t xml:space="preserve">Milgrom, P., and Roberts, J. 1990. The economics of modern manufacturing: Technology, strategy, and organization.</w:t>
-      </w:r>
-      <w:r>
-        <w:t xml:space="preserve"> </w:t>
-      </w:r>
-      <w:r>
-        <w:rPr>
-          <w:iCs/>
-          <w:i/>
-        </w:rPr>
-        <w:t xml:space="preserve">American Economic Review</w:t>
-      </w:r>
-      <w:r>
-        <w:t xml:space="preserve"> </w:t>
-      </w:r>
-      <w:r>
-        <w:t xml:space="preserve">80(3):511–528.</w:t>
-      </w:r>
-    </w:p>
-    <w:p>
-      <w:pPr>
-        <w:pStyle w:val="BodyText"/>
-      </w:pPr>
-      <w:r>
-        <w:t xml:space="preserve">MLQ. 2026. Leaked OpenAI financials reveal $21B operating loss on $13B revenue in 2025. June 17. https://mlq.ai/news/leaked-openai-financials-reveal-21b-operating-loss-on-13b-revenue-in-2025/.</w:t>
-      </w:r>
-    </w:p>
-    <w:p>
-      <w:pPr>
-        <w:pStyle w:val="BodyText"/>
-      </w:pPr>
-      <w:r>
-        <w:t xml:space="preserve">Mussa, M., and Rosen, S. 1978. Monopoly and product quality.</w:t>
-      </w:r>
-      <w:r>
-        <w:t xml:space="preserve"> </w:t>
-      </w:r>
-      <w:r>
-        <w:rPr>
-          <w:iCs/>
-          <w:i/>
-        </w:rPr>
-        <w:t xml:space="preserve">Journal of Economic Theory</w:t>
-      </w:r>
-      <w:r>
-        <w:t xml:space="preserve"> </w:t>
-      </w:r>
-      <w:r>
-        <w:t xml:space="preserve">18(2):301–317.</w:t>
-      </w:r>
-    </w:p>
-    <w:p>
-      <w:pPr>
-        <w:pStyle w:val="BodyText"/>
-      </w:pPr>
-      <w:r>
-        <w:t xml:space="preserve">Nordhaus, W. D. 2004. Schumpeterian profits in the American economy: Theory and measurement. NBER Working Paper 10433, National Bureau of Economic Research, Cambridge, MA.</w:t>
-      </w:r>
-    </w:p>
-    <w:p>
-      <w:pPr>
-        <w:pStyle w:val="BodyText"/>
-      </w:pPr>
-      <w:r>
-        <w:t xml:space="preserve">Noy, S., and Zhang, W. 2023. Experimental evidence on the productivity effects of generative artificial intelligence.</w:t>
-      </w:r>
-      <w:r>
-        <w:t xml:space="preserve"> </w:t>
-      </w:r>
-      <w:r>
-        <w:rPr>
-          <w:iCs/>
-          <w:i/>
-        </w:rPr>
-        <w:t xml:space="preserve">Science</w:t>
-      </w:r>
-      <w:r>
-        <w:t xml:space="preserve"> </w:t>
-      </w:r>
-      <w:r>
-        <w:t xml:space="preserve">381(6654):187–192.</w:t>
-      </w:r>
-    </w:p>
-    <w:p>
-      <w:pPr>
-        <w:pStyle w:val="BodyText"/>
-      </w:pPr>
-      <w:r>
-        <w:t xml:space="preserve">OpenRouter. 2026. Models and endpoint pricing. Accessed September 2026, https://openrouter.ai/models.</w:t>
-      </w:r>
-    </w:p>
-    <w:p>
-      <w:pPr>
-        <w:pStyle w:val="BodyText"/>
-      </w:pPr>
-      <w:r>
-        <w:t xml:space="preserve">Peng, S., Kalliamvakou, E., Cihon, P., and Demirer, M. 2023. The impact of AI on developer productivity: Evidence from GitHub Copilot. Preprint, arXiv:2302.06590.</w:t>
-      </w:r>
-    </w:p>
-    <w:p>
-      <w:pPr>
-        <w:pStyle w:val="BodyText"/>
-      </w:pPr>
-      <w:r>
-        <w:t xml:space="preserve">Peteraf, M. A. 1993. The cornerstones of competitive advantage: A resource-based view.</w:t>
-      </w:r>
-      <w:r>
-        <w:t xml:space="preserve"> </w:t>
-      </w:r>
-      <w:r>
-        <w:rPr>
-          <w:iCs/>
-          <w:i/>
-        </w:rPr>
-        <w:t xml:space="preserve">Strategic Management Journal</w:t>
-      </w:r>
-      <w:r>
-        <w:t xml:space="preserve"> </w:t>
-      </w:r>
-      <w:r>
-        <w:t xml:space="preserve">14(3):179–191.</w:t>
-      </w:r>
-    </w:p>
-    <w:p>
-      <w:pPr>
-        <w:pStyle w:val="BodyText"/>
-      </w:pPr>
-      <w:r>
-        <w:t xml:space="preserve">Piccoli, G., and Ives, B. 2005. IT-dependent strategic initiatives and sustained competitive advantage: A review and synthesis of the literature.</w:t>
-      </w:r>
-      <w:r>
-        <w:t xml:space="preserve"> </w:t>
-      </w:r>
-      <w:r>
-        <w:rPr>
-          <w:iCs/>
-          <w:i/>
-        </w:rPr>
-        <w:t xml:space="preserve">MIS Quarterly</w:t>
-      </w:r>
-      <w:r>
-        <w:t xml:space="preserve"> </w:t>
-      </w:r>
-      <w:r>
         <w:t xml:space="preserve">29(4):747–776.</w:t>
       </w:r>
     </w:p>
@@ -10456,30 +10329,6 @@
         <w:pStyle w:val="BodyText"/>
       </w:pPr>
       <w:r>
-        <w:t xml:space="preserve">Sun, L., and Abraham, S. 2021. Estimating dynamic treatment effects in event studies with heterogeneous treatment effects.</w:t>
-      </w:r>
-      <w:r>
-        <w:t xml:space="preserve"> </w:t>
-      </w:r>
-      <w:r>
-        <w:rPr>
-          <w:iCs/>
-          <w:i/>
-        </w:rPr>
-        <w:t xml:space="preserve">Journal of Econometrics</w:t>
-      </w:r>
-      <w:r>
-        <w:t xml:space="preserve"> </w:t>
-      </w:r>
-      <w:r>
-        <w:t xml:space="preserve">225(2):175–199.</w:t>
-      </w:r>
-    </w:p>
-    <w:p>
-      <w:pPr>
-        <w:pStyle w:val="BodyText"/>
-      </w:pPr>
-      <w:r>
         <w:t xml:space="preserve">Teece, D. J. 1986. Profiting from technological innovation: Implications for integration, collaboration, licensing and public policy.</w:t>
       </w:r>
       <w:r>
@@ -10497,30 +10346,6 @@
       </w:r>
       <w:r>
         <w:t xml:space="preserve">15(6):285–305.</w:t>
-      </w:r>
-    </w:p>
-    <w:p>
-      <w:pPr>
-        <w:pStyle w:val="BodyText"/>
-      </w:pPr>
-      <w:r>
-        <w:t xml:space="preserve">Webb, M. D. 2023. Reworking wild bootstrap-based inference for clustered errors.</w:t>
-      </w:r>
-      <w:r>
-        <w:t xml:space="preserve"> </w:t>
-      </w:r>
-      <w:r>
-        <w:rPr>
-          <w:iCs/>
-          <w:i/>
-        </w:rPr>
-        <w:t xml:space="preserve">Canadian Journal of Economics</w:t>
-      </w:r>
-      <w:r>
-        <w:t xml:space="preserve"> </w:t>
-      </w:r>
-      <w:r>
-        <w:t xml:space="preserve">56(3):839–858.</w:t>
       </w:r>
     </w:p>
     <w:p>

</xml_diff>

<commit_message>
State H2 untested and H4 inconclusive; align abstract and limitations
Co-Authored-By: Claude Sonnet 5.5 <noreply@anthropic.com>
Claude-Session: https://claude.ai/code/session_01SvJ27oz7kYhWEBfZS3x4ro
</commit_message>
<xml_diff>
--- a/isr/ISR_Who_Profits_from_LLMs.docx
+++ b/isr/ISR_Who_Profits_from_LLMs.docx
@@ -123,7 +123,7 @@
         <w:pStyle w:val="BodyText"/>
       </w:pPr>
       <w:r>
-        <w:t xml:space="preserve">Adopters of large language models (LLMs) report substantial productivity gains, yet profit is hard to locate at either end of the value chain. Developers post operating losses that exceed their revenue, and the margins of adopting firms show little systematic response. We argue that this pattern follows from appropriability and need not be read as a measurement failure. Drawing on competitive-equilibrium reasoning, vertical-differentiation models, and the profiting-from-innovation framework, we model three positions in the LLM value chain: the frontier developer, the API adopter, and the complement builder. We show that an API adopter earns no economic profit from the model itself, that the developer’s rent is proportional to its quality lead and disappears as rivals catch up, and that complement builders earn rents only from co-specialized organizational capital, and only until rivals imitate it. We then examine measurable counterparts of the theory in public leaderboard, endpoint-price, and SEC filing data. The evidence is directionally consistent with the predictions but rests on small samples, and we identify what it can and cannot establish.</w:t>
+        <w:t xml:space="preserve">Adopters of large language models (LLMs) report substantial productivity gains, yet profit is hard to locate at either end of the value chain. Developers post operating losses that exceed their revenue, and the margins of adopting firms show little systematic response. We argue that this pattern follows from appropriability and need not be read as a measurement failure. Drawing on competitive-equilibrium reasoning, vertical-differentiation models, and the profiting-from-innovation framework, we model three positions in the LLM value chain: the frontier developer, the API adopter, and the complement builder. We show that an API adopter earns no economic profit from the model itself, that the developer’s rent is proportional to its quality lead and disappears as rivals catch up, and that complement builders earn rents only from co-specialized organizational capital, and only until rivals imitate it. We then examine measurable counterparts of the theory in public leaderboard, endpoint-price, and SEC filing data. A lab’s flagship price is positively associated with its quality lead, and firms that launch a dated first-party AI product show a higher operating margin afterward. These patterns are consistent with the theory, but the samples are small, and the data cannot establish that the margin increment decays or separate it from alternative explanations.</w:t>
       </w:r>
     </w:p>
     <w:p>
@@ -5618,7 +5618,7 @@
         <w:t xml:space="preserve"> </w:t>
       </w:r>
       <w:r>
-        <w:t xml:space="preserve">Pooled exposure without a coded GA year does not predict operating margin.</w:t>
+        <w:t xml:space="preserve">We do not report a test of H2 here.</w:t>
       </w:r>
     </w:p>
     <w:p>
@@ -5926,7 +5926,7 @@
         </m:r>
       </m:oMath>
       <w:r>
-        <w:t xml:space="preserve">). The pre-period coefficient is small and not distinguishable from zero. The</w:t>
+        <w:t xml:space="preserve">). The pre-period coefficient is small and not distinguishable from zero. The point estimates peak at</w:t>
       </w:r>
       <w:r>
         <w:t xml:space="preserve"> </w:t>
@@ -5942,14 +5942,14 @@
           <m:t>+</m:t>
         </m:r>
         <m:r>
-          <m:t>2</m:t>
-        </m:r>
-      </m:oMath>
-      <w:r>
-        <w:t xml:space="preserve"> </w:t>
-      </w:r>
-      <w:r>
-        <w:t xml:space="preserve">and</w:t>
+          <m:t>1</m:t>
+        </m:r>
+      </m:oMath>
+      <w:r>
+        <w:t xml:space="preserve"> </w:t>
+      </w:r>
+      <w:r>
+        <w:t xml:space="preserve">and fall afterward, which is the direction the theory predicts. However, the</w:t>
       </w:r>
       <w:r>
         <w:t xml:space="preserve"> </w:t>
@@ -5965,6 +5965,29 @@
           <m:t>+</m:t>
         </m:r>
         <m:r>
+          <m:t>2</m:t>
+        </m:r>
+      </m:oMath>
+      <w:r>
+        <w:t xml:space="preserve"> </w:t>
+      </w:r>
+      <w:r>
+        <w:t xml:space="preserve">and</w:t>
+      </w:r>
+      <w:r>
+        <w:t xml:space="preserve"> </w:t>
+      </w:r>
+      <m:oMath>
+        <m:r>
+          <m:t>t</m:t>
+        </m:r>
+        <m:r>
+          <m:rPr>
+            <m:sty m:val="p"/>
+          </m:rPr>
+          <m:t>+</m:t>
+        </m:r>
+        <m:r>
           <m:t>3</m:t>
         </m:r>
       </m:oMath>
@@ -5972,7 +5995,30 @@
         <w:t xml:space="preserve"> </w:t>
       </w:r>
       <w:r>
-        <w:t xml:space="preserve">estimates are imprecise and rest on fewer treated firms, so the point estimates alone do not establish decay, and we do not claim support for H4. A time-invariant bundle-by-post-2023 difference-in-differences gives a similar coefficient and is retained as a robustness check.</w:t>
+        <w:t xml:space="preserve">estimates are imprecise and rest on fewer treated firms, and we do not test the equality of the</w:t>
+      </w:r>
+      <w:r>
+        <w:t xml:space="preserve"> </w:t>
+      </w:r>
+      <m:oMath>
+        <m:r>
+          <m:t>t</m:t>
+        </m:r>
+        <m:r>
+          <m:rPr>
+            <m:sty m:val="p"/>
+          </m:rPr>
+          <m:t>+</m:t>
+        </m:r>
+        <m:r>
+          <m:t>1</m:t>
+        </m:r>
+      </m:oMath>
+      <w:r>
+        <w:t xml:space="preserve"> </w:t>
+      </w:r>
+      <w:r>
+        <w:t xml:space="preserve">coefficient and the last post-GA bin. The data are therefore inconclusive on H4, and we do not claim that the margin increment decays. A time-invariant bundle-by-post-2023 difference-in-differences gives a similar coefficient and is retained as a robustness check.</w:t>
       </w:r>
     </w:p>
     <w:bookmarkEnd w:id="41"/>
@@ -6070,7 +6116,7 @@
         <w:pStyle w:val="BodyText"/>
       </w:pPr>
       <w:r>
-        <w:t xml:space="preserve">The model abstracts from uncertainty in training outcomes, from strategic interaction among developers (the lead and the catch-up lag are treated as exogenous), and from purchasable organizational capital. Making the lead endogenous to a training race is the most natural extension, and it is where we would expect a more specifically LLM-based theory to develop. The empirical proxies are imperfect, and misclassification biases the estimated difference between commodity and complementary use toward zero. The adopter sample is small and made up of large software incumbents, so the results should not be generalized to adopters in other industries. Finally, the evidence is observational and cross-sectional in time, over a period in which the technology and its business models are still changing. The tests here are best viewed as a first look at the constructs, and they are not a confirmation of the theory.</w:t>
+        <w:t xml:space="preserve">The model abstracts from uncertainty in training outcomes, from strategic interaction among developers (the lead and the catch-up lag are treated as exogenous), and from purchasable organizational capital. Making the lead endogenous to a training race is the most natural extension, and it is where we would expect a more specifically LLM-based theory to develop. The empirical proxies are imperfect, and misclassification biases the estimated difference between commodity and complementary use toward zero. The adopter sample is small and made up of large software incumbents, so the results should not be generalized to adopters in other industries. Finally, the evidence is observational and cross-sectional in time, over a period in which the technology and its business models are still changing. H1a, H1b, and H2 are not tested here, and the evidence on H4 is inconclusive. The tests reported are best viewed as a first look at the constructs, and they are not a confirmation of the theory.</w:t>
       </w:r>
     </w:p>
     <w:bookmarkEnd w:id="46"/>

</xml_diff>

<commit_message>
Reframe empirics as illustrative evidence
Co-Authored-By: Claude Sonnet 5.5 <noreply@anthropic.com>
Claude-Session: https://claude.ai/code/session_01SvJ27oz7kYhWEBfZS3x4ro
</commit_message>
<xml_diff>
--- a/isr/ISR_Who_Profits_from_LLMs.docx
+++ b/isr/ISR_Who_Profits_from_LLMs.docx
@@ -123,7 +123,7 @@
         <w:pStyle w:val="BodyText"/>
       </w:pPr>
       <w:r>
-        <w:t xml:space="preserve">Adopters of large language models (LLMs) report substantial productivity gains, yet profit is hard to locate at either end of the value chain. Developers post operating losses that exceed their revenue, and the margins of adopting firms show little systematic response. We argue that this pattern follows from appropriability and need not be read as a measurement failure. Drawing on competitive-equilibrium reasoning, vertical-differentiation models, and the profiting-from-innovation framework, we model three positions in the LLM value chain: the frontier developer, the API adopter, and the complement builder. We show that an API adopter earns no economic profit from the model itself, that the developer’s rent is proportional to its quality lead and disappears as rivals catch up, and that complement builders earn rents only from co-specialized organizational capital, and only until rivals imitate it. We then examine measurable counterparts of the theory in public leaderboard, endpoint-price, and SEC filing data. A lab’s flagship price is positively associated with its quality lead, and firms that launch a dated first-party AI product show a higher operating margin afterward. These patterns are consistent with the theory, but the samples are small, and the data cannot establish that the margin increment decays or separate it from alternative explanations.</w:t>
+        <w:t xml:space="preserve">Adopters of large language models (LLMs) report substantial productivity gains, yet profit is hard to locate at either end of the value chain. Developers post operating losses that exceed their revenue, and the margins of adopting firms show little systematic response. We argue that this pattern follows from appropriability and need not be read as a measurement failure. Drawing on competitive-equilibrium reasoning, vertical-differentiation models, and the profiting-from-innovation framework, we model three positions in the LLM value chain: the frontier developer, the API adopter, and the complement builder. We show that an API adopter earns no economic profit from the model itself, that the developer’s rent is proportional to its quality lead and disappears as rivals catch up, and that complement builders earn rents only from co-specialized organizational capital, and only until rivals imitate it. As illustration, we then relate measurable counterparts of the theory to public leaderboard, endpoint-price, and SEC filing data. A lab’s flagship price is positively associated with its quality lead, and firms that launch a dated first-party AI product show a higher operating margin afterward. These patterns are consistent with the theory, but the samples are small, and the data cannot establish that the margin increment decays or separate it from alternative explanations. The evidence is illustrative and does not test the theory.</w:t>
       </w:r>
     </w:p>
     <w:p>
@@ -174,7 +174,7 @@
         <w:pStyle w:val="BodyText"/>
       </w:pPr>
       <w:r>
-        <w:t xml:space="preserve">Each of these claims is familiar in isolation. Hitt and Brynjolfsson (1996) showed that IT can raise productivity and consumer surplus while leaving profitability unchanged. The resource-based view of IT holds that only imperfectly imitable IT-enabled capabilities confer sustained advantage (Mata et al. 1995, Bharadwaj 2000, Piccoli and Ives 2005). Teece (1986) identified appropriability regimes and co-specialized complementary assets as the determinants of who profits from an innovation. Models of vertical differentiation, vertical chains, and platforms with complementors (e.g., Mussa and Rosen 1978, Spengler 1950, Rochet and Tirole 2003) already tell us that surplus in a layered market is shared according to quality differences and competitive conditions at each layer. We do not claim a new theorem about any of these mechanisms. Our contribution lies in what we do with them. We fit them together in a single account of a general-purpose technology’s vertical structure, state each position’s rent in terms that can be measured with data that now exist, and take the resulting predictions to public data. Two features of LLMs make this worthwhile: quality leads between models are observable on public leaderboards and fade within months, and the same model is sold to developers’ customers and their competitors on posted prices.</w:t>
+        <w:t xml:space="preserve">Each of these claims is familiar in isolation. Hitt and Brynjolfsson (1996) showed that IT can raise productivity and consumer surplus while leaving profitability unchanged. The resource-based view of IT holds that only imperfectly imitable IT-enabled capabilities confer sustained advantage (Mata et al. 1995, Bharadwaj 2000, Piccoli and Ives 2005). Teece (1986) identified appropriability regimes and co-specialized complementary assets as the determinants of who profits from an innovation. Models of vertical differentiation, vertical chains, and platforms with complementors (e.g., Mussa and Rosen 1978, Spengler 1950, Rochet and Tirole 2003) already tell us that surplus in a layered market is shared according to quality differences and competitive conditions at each layer. We do not claim a new theorem about any of these mechanisms. Our contribution lies in what we do with them. We fit them together in a single account of a general-purpose technology’s vertical structure, state each position’s rent in terms that can be measured with data that now exist, and relate those terms to public data for illustration. Two features of LLMs make this worthwhile: quality leads between models are observable on public leaderboards and fade within months, and the same model is sold to developers’ customers and their competitors on posted prices.</w:t>
       </w:r>
     </w:p>
     <w:p>
@@ -182,7 +182,7 @@
         <w:pStyle w:val="BodyText"/>
       </w:pPr>
       <w:r>
-        <w:t xml:space="preserve">We make three contributions. First, we extend the IT business value literature from the firm to the value chain, by deriving jointly where profit will appear among developers, adopters, and consumers, how large it is likely to be, and when it will disappear. Second, we define appropriability ex ante, as expected imitation lag and cost, and show how that definition yields testable constructs (quality lead, imitation lag, and organizational capital) that can be measured from public sources. Third, we offer a first empirical look at these constructs using leaderboard, endpoint-price, and regulatory filing data, and we are explicit about the limits of these tests. For practice, the theory replaces the question that dominates managerial discussion of AI, namely how much to invest, with the question it identifies as decisive: what does the firm own that the model cannot supply, and how long will it take competitors to own it as well?</w:t>
+        <w:t xml:space="preserve">We make three contributions. First, we extend the IT business value literature from the firm to the value chain, by deriving jointly where profit will appear among developers, adopters, and consumers, and when it will disappear. Second, we define appropriability ex ante, as expected imitation lag and cost, and show how that definition yields testable constructs (quality lead, imitation lag, and organizational capital) that can be measured from public sources. Third, we provide illustrative evidence on these constructs from leaderboard, endpoint-price, and regulatory filing data. The evidence is limited, and we state what it cannot show. For practice, the theory replaces the question that dominates managerial discussion of AI, namely how much to invest, with the question it identifies as decisive: what does the firm own that the model cannot supply, and how long will it take competitors to own it as well?</w:t>
       </w:r>
     </w:p>
     <w:p>
@@ -190,7 +190,7 @@
         <w:pStyle w:val="BodyText"/>
       </w:pPr>
       <w:r>
-        <w:t xml:space="preserve">The paper proceeds as follows. Section 2 reviews the relevant literatures and the public financial record of frontier developers. Section 3 defines the constructs. Section 4 presents the model and states the propositions, with proofs in Appendix A. Section 5 derives the hypotheses, and Section 6 reports results. Section 7 discusses implications, boundary conditions, and limitations, and Section 8 concludes.</w:t>
+        <w:t xml:space="preserve">The paper proceeds as follows. Section 2 reviews the relevant literatures and the public financial record of frontier developers. Section 3 defines the constructs. Section 4 presents the model and states the propositions, with proofs in Appendix A. Section 5 derives the hypotheses, and Section 6 presents illustrative evidence. Section 7 discusses implications, boundary conditions, and limitations, and Section 8 concludes.</w:t>
       </w:r>
     </w:p>
     <w:bookmarkEnd w:id="20"/>
@@ -5497,18 +5497,26 @@
     </w:p>
     <w:bookmarkEnd w:id="38"/>
     <w:bookmarkEnd w:id="39"/>
-    <w:bookmarkStart w:id="43" w:name="results"/>
+    <w:bookmarkStart w:id="43" w:name="illustrative-evidence"/>
     <w:p>
       <w:pPr>
         <w:pStyle w:val="Heading1"/>
       </w:pPr>
       <w:r>
-        <w:t xml:space="preserve">6. Results</w:t>
+        <w:t xml:space="preserve">6. Illustrative Evidence</w:t>
       </w:r>
     </w:p>
     <w:p>
       <w:pPr>
         <w:pStyle w:val="FirstParagraph"/>
+      </w:pPr>
+      <w:r>
+        <w:t xml:space="preserve">This section relates the constructs of Section 5 to public data. It is not a test of the theory: the samples are small, the proxies are coarse, and several hypotheses are not tested. Its purpose is to show that the constructs can be measured and to indicate whether the data are consistent with the predictions.</w:t>
+      </w:r>
+    </w:p>
+    <w:p>
+      <w:pPr>
+        <w:pStyle w:val="BodyText"/>
       </w:pPr>
       <w:r>
         <w:t xml:space="preserve">The developer panel combines Arena overall leaderboard snapshots (Chiang et al. 2024) with OpenRouter endpoint prices (OpenRouter 2026). It contains 171 lab-months with a price, of which 102 have at least one live endpoint and 69 use the list-price fallback. The adopter panel is drawn from SEC EDGAR XBRL company facts (SEC 2026) and covers 81 firms and 520 firm-years, with staggered GA-year treatment for 21 firms. GA years are coded by hand from public product dates.</w:t>

</xml_diff>

<commit_message>
Restructure Section 5.2 into examined vs future-work implications
Co-Authored-By: Claude Sonnet 5.5 <noreply@anthropic.com>
Claude-Session: https://claude.ai/code/session_01SvJ27oz7kYhWEBfZS3x4ro
</commit_message>
<xml_diff>
--- a/isr/ISR_Who_Profits_from_LLMs.docx
+++ b/isr/ISR_Who_Profits_from_LLMs.docx
@@ -190,7 +190,7 @@
         <w:pStyle w:val="BodyText"/>
       </w:pPr>
       <w:r>
-        <w:t xml:space="preserve">The paper proceeds as follows. Section 2 reviews the relevant literatures and the public financial record of frontier developers. Section 3 defines the constructs. Section 4 presents the model and states the propositions, with proofs in Appendix A. Section 5 derives the hypotheses, and Section 6 presents illustrative evidence. Section 7 discusses implications, boundary conditions, and limitations, and Section 8 concludes.</w:t>
+        <w:t xml:space="preserve">The paper proceeds as follows. Section 2 reviews the relevant literatures and the public financial record of frontier developers. Section 3 defines the constructs. Section 4 presents the model and states the propositions, with proofs in Appendix A. Section 5 maps the model to data and states its empirical implications, and Section 6 presents illustrative evidence. Section 7 discusses implications, boundary conditions, and limitations, and Section 8 concludes.</w:t>
       </w:r>
     </w:p>
     <w:bookmarkEnd w:id="20"/>
@@ -4933,13 +4933,13 @@
     </w:p>
     <w:bookmarkEnd w:id="35"/>
     <w:bookmarkEnd w:id="36"/>
-    <w:bookmarkStart w:id="39" w:name="hypotheses-and-empirical-counterparts"/>
+    <w:bookmarkStart w:id="39" w:name="empirical-counterparts-and-implications"/>
     <w:p>
       <w:pPr>
         <w:pStyle w:val="Heading1"/>
       </w:pPr>
       <w:r>
-        <w:t xml:space="preserve">5. Hypotheses and Empirical Counterparts</w:t>
+        <w:t xml:space="preserve">5. Empirical Counterparts and Implications</w:t>
       </w:r>
     </w:p>
     <w:bookmarkStart w:id="37" w:name="mapping-model-objects-to-data"/>
@@ -5396,18 +5396,86 @@
       </w:tr>
     </w:tbl>
     <w:bookmarkEnd w:id="37"/>
-    <w:bookmarkStart w:id="38" w:name="hypotheses"/>
+    <w:bookmarkStart w:id="38" w:name="empirical-implications"/>
     <w:p>
       <w:pPr>
         <w:pStyle w:val="Heading2"/>
       </w:pPr>
       <w:r>
-        <w:t xml:space="preserve">5.2 Hypotheses</w:t>
+        <w:t xml:space="preserve">5.2 Empirical implications</w:t>
       </w:r>
     </w:p>
     <w:p>
       <w:pPr>
         <w:pStyle w:val="FirstParagraph"/>
+      </w:pPr>
+      <w:r>
+        <w:t xml:space="preserve">The comparative statics in Section 4.3 yield five testable implications, stated below as hypotheses. We state all five to show how the theory would be tested, but the public data available to us bear on only some of them. H3 and H4 are examined in Section 6, together with a lab-month association that is related to H1a and H1b but does not test them. H1a, H1b, and H2 are stated for future work.</w:t>
+      </w:r>
+    </w:p>
+    <w:p>
+      <w:pPr>
+        <w:pStyle w:val="BodyText"/>
+      </w:pPr>
+      <w:r>
+        <w:rPr>
+          <w:iCs/>
+          <w:i/>
+        </w:rPr>
+        <w:t xml:space="preserve">Implications examined in Section 6</w:t>
+      </w:r>
+    </w:p>
+    <w:p>
+      <w:pPr>
+        <w:pStyle w:val="BodyText"/>
+      </w:pPr>
+      <w:r>
+        <w:rPr>
+          <w:bCs/>
+          <w:b/>
+        </w:rPr>
+        <w:t xml:space="preserve">H3.</w:t>
+      </w:r>
+      <w:r>
+        <w:t xml:space="preserve"> </w:t>
+      </w:r>
+      <w:r>
+        <w:t xml:space="preserve">Firms that ship a dated first-party AI product earn a higher operating margin after the GA year than before, relative to firms with no such product. Treatment is the calendar year of GA (for example, Copilot for Microsoft 365 in 2023, Firefly in 2023, Now Assist in 2023, Cortex in 2023, AIP in 2023, watsonx in 2023, Charlotte AI in 2023, Gemini for Workspace in 2024, Agentforce in 2024, Bits AI in 2024, and analogues), not a time-invariant bundle indicator.</w:t>
+      </w:r>
+    </w:p>
+    <w:p>
+      <w:pPr>
+        <w:pStyle w:val="BodyText"/>
+      </w:pPr>
+      <w:r>
+        <w:rPr>
+          <w:bCs/>
+          <w:b/>
+        </w:rPr>
+        <w:t xml:space="preserve">H4.</w:t>
+      </w:r>
+      <w:r>
+        <w:t xml:space="preserve"> </w:t>
+      </w:r>
+      <w:r>
+        <w:t xml:space="preserve">The within-firm margin increment after GA declines as event time lengthens. Disconfirmation is a flat or rising post-GA path, or a difference between the first post-GA year and the last post-GA bin that cannot be distinguished from zero.</w:t>
+      </w:r>
+    </w:p>
+    <w:p>
+      <w:pPr>
+        <w:pStyle w:val="BodyText"/>
+      </w:pPr>
+      <w:r>
+        <w:rPr>
+          <w:iCs/>
+          <w:i/>
+        </w:rPr>
+        <w:t xml:space="preserve">Implications stated for future work</w:t>
+      </w:r>
+    </w:p>
+    <w:p>
+      <w:pPr>
+        <w:pStyle w:val="BodyText"/>
       </w:pPr>
       <w:r>
         <w:rPr>
@@ -5457,42 +5525,6 @@
       </w:r>
       <w:r>
         <w:t xml:space="preserve">Among adopters, pooled exposure to LLMs, meaning use or mention without a dated first-party GA, does not predict economic profit. Disconfirmation is a time-invariant exposure indicator that predicts operating margin in the pooled cross-section.</w:t>
-      </w:r>
-    </w:p>
-    <w:p>
-      <w:pPr>
-        <w:pStyle w:val="BodyText"/>
-      </w:pPr>
-      <w:r>
-        <w:rPr>
-          <w:bCs/>
-          <w:b/>
-        </w:rPr>
-        <w:t xml:space="preserve">H3.</w:t>
-      </w:r>
-      <w:r>
-        <w:t xml:space="preserve"> </w:t>
-      </w:r>
-      <w:r>
-        <w:t xml:space="preserve">Firms that ship a dated first-party AI product earn a higher operating margin after the GA year than before, relative to firms with no such product. Treatment is the calendar year of GA (for example, Copilot for Microsoft 365 in 2023, Firefly in 2023, Now Assist in 2023, Cortex in 2023, AIP in 2023, watsonx in 2023, Charlotte AI in 2023, Gemini for Workspace in 2024, Agentforce in 2024, Bits AI in 2024, and analogues), not a time-invariant bundle indicator.</w:t>
-      </w:r>
-    </w:p>
-    <w:p>
-      <w:pPr>
-        <w:pStyle w:val="BodyText"/>
-      </w:pPr>
-      <w:r>
-        <w:rPr>
-          <w:bCs/>
-          <w:b/>
-        </w:rPr>
-        <w:t xml:space="preserve">H4.</w:t>
-      </w:r>
-      <w:r>
-        <w:t xml:space="preserve"> </w:t>
-      </w:r>
-      <w:r>
-        <w:t xml:space="preserve">The within-firm margin increment after GA declines as event time lengthens. Disconfirmation is a flat or rising post-GA path, or a difference between the first post-GA year and the last post-GA bin that cannot be distinguished from zero.</w:t>
       </w:r>
     </w:p>
     <w:bookmarkEnd w:id="38"/>

</xml_diff>

<commit_message>
Reframe introduction and abstract around Proposition 5
Co-Authored-By: Claude Sonnet 5.5 <noreply@anthropic.com>
Claude-Session: https://claude.ai/code/session_01SvJ27oz7kYhWEBfZS3x4ro
</commit_message>
<xml_diff>
--- a/isr/ISR_Who_Profits_from_LLMs.docx
+++ b/isr/ISR_Who_Profits_from_LLMs.docx
@@ -123,7 +123,7 @@
         <w:pStyle w:val="BodyText"/>
       </w:pPr>
       <w:r>
-        <w:t xml:space="preserve">Adopters of large language models (LLMs) report substantial productivity gains, yet profit is hard to locate at either end of the value chain. Developers post operating losses that exceed their revenue, and the margins of adopting firms show little systematic response. We argue that this pattern follows from appropriability and need not be read as a measurement failure. Drawing on competitive-equilibrium reasoning, vertical-differentiation models, and the profiting-from-innovation framework, we model three positions in the LLM value chain: the frontier developer, the API adopter, and the complement builder. We show that an API adopter earns no economic profit from the model itself, that the developer’s rent is proportional to its quality lead and disappears as rivals catch up, and that complement builders earn rents only from co-specialized organizational capital, and only until rivals imitate it. As illustration, we then relate measurable counterparts of the theory to public leaderboard, endpoint-price, and SEC filing data. A lab’s flagship price is positively associated with its quality lead, and firms that launch a dated first-party AI product show a higher operating margin afterward. These patterns are consistent with the theory, but the samples are small, and the data cannot establish that the margin increment decays or separate it from alternative explanations. The evidence is illustrative and does not test the theory.</w:t>
+        <w:t xml:space="preserve">Adopters of large language models (LLMs) report substantial productivity gains, yet profit is hard to locate at either end of the value chain. Developers post operating losses that exceed their revenue, and the margins of adopting firms show little systematic response. We argue that this pattern follows from appropriability and need not be read as a measurement failure. Drawing on competitive-equilibrium reasoning, vertical-differentiation models, and the profiting-from-innovation framework, we model three positions in the LLM value chain: the frontier developer, the API adopter, and the complement builder. We show that an API adopter earns no economic profit from the model itself, that the developer’s rent is proportional to its quality lead and disappears as rivals catch up, and that complement builders earn rents only from co-specialized organizational capital. The central result is that this rent lasts only until rivals imitate the capital or until the developer itself productizes the use, so that an adopter’s profitable window depends on its supplier as well as on its competitors. As illustration, we then relate measurable counterparts of the theory to public leaderboard, endpoint-price, and SEC filing data. A lab’s flagship price is positively associated with its quality lead, and firms that launch a dated first-party AI product show a higher operating margin afterward. These patterns are consistent with the theory, but the samples are small, and the data cannot establish that the margin increment decays or separate it from alternative explanations. The evidence is illustrative and does not test the theory.</w:t>
       </w:r>
     </w:p>
     <w:p>
@@ -174,7 +174,7 @@
         <w:pStyle w:val="BodyText"/>
       </w:pPr>
       <w:r>
-        <w:t xml:space="preserve">Each of these claims is familiar in isolation. Hitt and Brynjolfsson (1996) showed that IT can raise productivity and consumer surplus while leaving profitability unchanged. The resource-based view of IT holds that only imperfectly imitable IT-enabled capabilities confer sustained advantage (Mata et al. 1995, Bharadwaj 2000, Piccoli and Ives 2005). Teece (1986) identified appropriability regimes and co-specialized complementary assets as the determinants of who profits from an innovation. Models of vertical differentiation, vertical chains, and platforms with complementors (e.g., Mussa and Rosen 1978, Spengler 1950, Rochet and Tirole 2003) already tell us that surplus in a layered market is shared according to quality differences and competitive conditions at each layer. We do not claim a new theorem about any of these mechanisms. Our contribution lies in what we do with them. We fit them together in a single account of a general-purpose technology’s vertical structure, state each position’s rent in terms that can be measured with data that now exist, and relate those terms to public data for illustration. Two features of LLMs make this worthwhile: quality leads between models are observable on public leaderboards and fade within months, and the same model is sold to developers’ customers and their competitors on posted prices.</w:t>
+        <w:t xml:space="preserve">Each of these claims is familiar in isolation. Hitt and Brynjolfsson (1996) showed that IT can raise productivity and consumer surplus while leaving profitability unchanged. The resource-based view of IT holds that only imperfectly imitable IT-enabled capabilities confer sustained advantage (Mata et al. 1995, Bharadwaj 2000, Piccoli and Ives 2005). Teece (1986) identified appropriability regimes and co-specialized complementary assets as the determinants of who profits from an innovation. Models of vertical differentiation, vertical chains, and platforms with complementors (e.g., Mussa and Rosen 1978, Spengler 1950, Rochet and Tirole 2003) already tell us that surplus in a layered market is shared according to quality differences and competitive conditions at each layer. We do not claim a new theorem about any of these mechanisms, and we use them as the benchmark for what follows.</w:t>
       </w:r>
     </w:p>
     <w:p>
@@ -182,7 +182,59 @@
         <w:pStyle w:val="BodyText"/>
       </w:pPr>
       <w:r>
-        <w:t xml:space="preserve">We make three contributions. First, we extend the IT business value literature from the firm to the value chain, by deriving jointly where profit will appear among developers, adopters, and consumers, and when it will disappear. Second, we define appropriability ex ante, as expected imitation lag and cost, and show how that definition yields testable constructs (quality lead, imitation lag, and organizational capital) that can be measured from public sources. Third, we provide illustrative evidence on these constructs from leaderboard, endpoint-price, and regulatory filing data. The evidence is limited, and we state what it cannot show. For practice, the theory replaces the question that dominates managerial discussion of AI, namely how much to invest, with the question it identifies as decisive: what does the firm own that the model cannot supply, and how long will it take competitors to own it as well?</w:t>
+        <w:t xml:space="preserve">What this benchmark leaves out is a feature of the LLM value chain that sets it apart from most earlier technologies. In the standard account, an adopter’s complement rent is threatened by one force, imitation by rival adopters, which takes time because organizational capital is slow to build. For LLMs there is a second force. The supplier of the input can itself move into the adopter’s layer. The developer sells the model on posted terms to the adopter and to the adopter’s competitors, sees how it is used through the interface, and is able to productize a successful use and sell it to everyone. Research on platform owners entering complementors’ markets suggests that this kind of entry is both common and consequential (Gawer and Henderson 2007, Zhu and Liu 2018). Its implication for rent has not been put into the appropriability framework. If the use is productized, the adopter’s co-specialized capital becomes a commodity before rivals could have copied it, and the window in which the rent is earned shortens.</w:t>
+      </w:r>
+    </w:p>
+    <w:p>
+      <w:pPr>
+        <w:pStyle w:val="BodyText"/>
+      </w:pPr>
+      <w:r>
+        <w:t xml:space="preserve">The central result of the paper, Proposition 5, formalizes this. When a vendor productizes an adopter’s use at rate</w:t>
+      </w:r>
+      <w:r>
+        <w:t xml:space="preserve"> </w:t>
+      </w:r>
+      <m:oMath>
+        <m:r>
+          <m:t>η</m:t>
+        </m:r>
+      </m:oMath>
+      <w:r>
+        <w:t xml:space="preserve">, independent of imitation by rivals, the adopter’s expected complement rent falls strictly in</w:t>
+      </w:r>
+      <w:r>
+        <w:t xml:space="preserve"> </w:t>
+      </w:r>
+      <m:oMath>
+        <m:r>
+          <m:t>η</m:t>
+        </m:r>
+      </m:oMath>
+      <w:r>
+        <w:t xml:space="preserve">, so that the rent depends on two clocks and not one. Taken with the benchmark results, this gives a fuller account of where profit appears. API adopters earn nothing from the model itself (Proposition 1). Complement builders earn a rent for as long as both rival imitation and vendor productization are held off (Propositions 2 and 5). The developer earns a rent in proportion to its quality lead, until rivals close it (Proposition 3). The remainder passes to consumers (Proposition 4). The result is deliberately simple, and we take the rate</w:t>
+      </w:r>
+      <w:r>
+        <w:t xml:space="preserve"> </w:t>
+      </w:r>
+      <m:oMath>
+        <m:r>
+          <m:t>η</m:t>
+        </m:r>
+      </m:oMath>
+      <w:r>
+        <w:t xml:space="preserve"> </w:t>
+      </w:r>
+      <w:r>
+        <w:t xml:space="preserve">as given. What determines it, and how far an adopter can lower it through contract terms or through the choice of what to build, is the question the result opens and that we leave to future work.</w:t>
+      </w:r>
+    </w:p>
+    <w:p>
+      <w:pPr>
+        <w:pStyle w:val="BodyText"/>
+      </w:pPr>
+      <w:r>
+        <w:t xml:space="preserve">We make three contributions. First, Proposition 5 adds vendor encroachment to the appropriability account of IT value and shows that, for a technology whose supplier can enter the adopter’s layer, the adopter’s profitable window depends on the supplier’s behavior as well as on rivals’. This turns contractual choices about data use, fine-tuning ownership, and deployment into strategic decisions of the kind that Section 7.2 discusses. Second, we place that result in an integrated benchmark across the developer, the adopter, and the consumer, with appropriability defined ex ante as expected imitation lag and cost, which yields testable constructs (quality lead, imitation lag, and organizational capital) that can be measured from public sources. Third, we provide illustrative evidence on these constructs from leaderboard, endpoint-price, and regulatory filing data. The evidence does not bear on Proposition 5 itself and is limited, and we state what it cannot show. For practice, the theory replaces the question that dominates managerial discussion of AI, namely how much to invest, with the question it identifies as decisive: what does the firm own that the model cannot supply, and how long will it take competitors, and the model’s own supplier, to own it as well?</w:t>
       </w:r>
     </w:p>
     <w:p>

</xml_diff>

<commit_message>
Add Section 4.5 on endogenous encroachment (Propositions 6-7) with proofs
Co-Authored-By: Claude Sonnet 5.5 <noreply@anthropic.com>
Claude-Session: https://claude.ai/code/session_01SvJ27oz7kYhWEBfZS3x4ro
</commit_message>
<xml_diff>
--- a/isr/ISR_Who_Profits_from_LLMs.docx
+++ b/isr/ISR_Who_Profits_from_LLMs.docx
@@ -212,7 +212,7 @@
         </m:r>
       </m:oMath>
       <w:r>
-        <w:t xml:space="preserve">, so that the rent depends on two clocks and not one. Taken with the benchmark results, this gives a fuller account of where profit appears. API adopters earn nothing from the model itself (Proposition 1). Complement builders earn a rent for as long as both rival imitation and vendor productization are held off (Propositions 2 and 5). The developer earns a rent in proportion to its quality lead, until rivals close it (Proposition 3). The remainder passes to consumers (Proposition 4). The result is deliberately simple, and we take the rate</w:t>
+        <w:t xml:space="preserve">, so that the rent depends on two clocks and not one. Taken with the benchmark results, this gives a fuller account of where profit appears. API adopters earn nothing from the model itself (Proposition 1). Complement builders earn a rent for as long as both rival imitation and vendor productization are held off (Propositions 2 and 5). The developer earns a rent in proportion to its quality lead, until rivals close it (Proposition 3). The remainder passes to consumers (Proposition 4). The result is deliberately simple, and it takes the rate</w:t>
       </w:r>
       <w:r>
         <w:t xml:space="preserve"> </w:t>
@@ -226,7 +226,35 @@
         <w:t xml:space="preserve"> </w:t>
       </w:r>
       <w:r>
-        <w:t xml:space="preserve">as given. What determines it, and how far an adopter can lower it through contract terms or through the choice of what to build, is the question the result opens and that we leave to future work.</w:t>
+        <w:t xml:space="preserve">as given. Section 4.5 then lets the developer choose</w:t>
+      </w:r>
+      <w:r>
+        <w:t xml:space="preserve"> </w:t>
+      </w:r>
+      <m:oMath>
+        <m:r>
+          <m:t>η</m:t>
+        </m:r>
+      </m:oMath>
+      <w:r>
+        <w:t xml:space="preserve"> </w:t>
+      </w:r>
+      <w:r>
+        <w:t xml:space="preserve">and shows how contract terms that limit its use of adopters’ data change that choice and, through it, the adopter’s incentive to invest. How far an adopter can lower</w:t>
+      </w:r>
+      <w:r>
+        <w:t xml:space="preserve"> </w:t>
+      </w:r>
+      <m:oMath>
+        <m:r>
+          <m:t>η</m:t>
+        </m:r>
+      </m:oMath>
+      <w:r>
+        <w:t xml:space="preserve"> </w:t>
+      </w:r>
+      <w:r>
+        <w:t xml:space="preserve">through other means, such as the choice of what to build, we leave to future work.</w:t>
       </w:r>
     </w:p>
     <w:p>
@@ -234,7 +262,18 @@
         <w:pStyle w:val="BodyText"/>
       </w:pPr>
       <w:r>
-        <w:t xml:space="preserve">We make three contributions. First, Proposition 5 adds vendor encroachment to the appropriability account of IT value and shows that, for a technology whose supplier can enter the adopter’s layer, the adopter’s profitable window depends on the supplier’s behavior as well as on rivals’. This turns contractual choices about data use, fine-tuning ownership, and deployment into strategic decisions of the kind that Section 7.2 discusses. Second, we place that result in an integrated benchmark across the developer, the adopter, and the consumer, with appropriability defined ex ante as expected imitation lag and cost, which yields testable constructs (quality lead, imitation lag, and organizational capital) that can be measured from public sources. Third, we provide illustrative evidence on these constructs from leaderboard, endpoint-price, and regulatory filing data. The evidence does not bear on Proposition 5 itself and is limited, and we state what it cannot show. For practice, the theory replaces the question that dominates managerial discussion of AI, namely how much to invest, with the question it identifies as decisive: what does the firm own that the model cannot supply, and how long will it take competitors, and the model’s own supplier, to own it as well?</w:t>
+        <w:t xml:space="preserve">We make three contributions. First, Proposition 5 adds vendor encroachment to the appropriability account of IT value and shows that, for a technology whose supplier can enter the adopter’s layer, the adopter’s profitable window depends on the supplier’s behavior as well as on rivals’. Propositions 6 and 7 extend the result by endogenizing</w:t>
+      </w:r>
+      <w:r>
+        <w:t xml:space="preserve"> </w:t>
+      </w:r>
+      <m:oMath>
+        <m:r>
+          <m:t>η</m:t>
+        </m:r>
+      </m:oMath>
+      <w:r>
+        <w:t xml:space="preserve">, and they turn contractual choices about data use, fine-tuning ownership, and deployment into strategic decisions of the kind that Section 7.2 discusses. Second, we place that result in an integrated benchmark across the developer, the adopter, and the consumer, with appropriability defined ex ante as expected imitation lag and cost, which yields testable constructs (quality lead, imitation lag, and organizational capital) that can be measured from public sources. Third, we provide illustrative evidence on these constructs from leaderboard, endpoint-price, and regulatory filing data. The evidence does not bear on Proposition 5 itself and is limited, and we state what it cannot show. For practice, the theory replaces the question that dominates managerial discussion of AI, namely how much to invest, with the question it identifies as decisive: what does the firm own that the model cannot supply, and how long will it take competitors, and the model’s own supplier, to own it as well?</w:t>
       </w:r>
     </w:p>
     <w:p>
@@ -1079,7 +1118,7 @@
     </w:p>
     <w:bookmarkEnd w:id="30"/>
     <w:bookmarkEnd w:id="31"/>
-    <w:bookmarkStart w:id="36" w:name="model-and-propositions"/>
+    <w:bookmarkStart w:id="37" w:name="model-and-propositions"/>
     <w:p>
       <w:pPr>
         <w:pStyle w:val="Heading1"/>
@@ -2669,7 +2708,245 @@
               <w:jc w:val="left"/>
             </w:pPr>
             <w:r>
-              <w:t xml:space="preserve">Rate at which a vendor productizes a complement builder’s use (Proposition 5)</w:t>
+              <w:t xml:space="preserve">Rate at which a vendor productizes a complement builder’s use (Propositions 5 to 7)</w:t>
+            </w:r>
+          </w:p>
+        </w:tc>
+      </w:tr>
+      <w:tr>
+        <w:tc>
+          <w:tcPr/>
+          <w:p>
+            <w:pPr>
+              <w:pStyle w:val="Compact"/>
+              <w:jc w:val="left"/>
+            </w:pPr>
+            <m:oMath>
+              <m:r>
+                <m:t>μ</m:t>
+              </m:r>
+            </m:oMath>
+            <w:r>
+              <w:t xml:space="preserve">,</w:t>
+            </w:r>
+            <w:r>
+              <w:t xml:space="preserve"> </w:t>
+            </w:r>
+            <m:oMath>
+              <m:r>
+                <m:t>r</m:t>
+              </m:r>
+            </m:oMath>
+          </w:p>
+        </w:tc>
+        <w:tc>
+          <w:tcPr/>
+          <w:p>
+            <w:pPr>
+              <w:pStyle w:val="Compact"/>
+              <w:jc w:val="left"/>
+            </w:pPr>
+            <w:r>
+              <w:t xml:space="preserve">Rate at which rivals imitate</w:t>
+            </w:r>
+            <w:r>
+              <w:t xml:space="preserve"> </w:t>
+            </w:r>
+            <m:oMath>
+              <m:sSub>
+                <m:e>
+                  <m:r>
+                    <m:t>O</m:t>
+                  </m:r>
+                </m:e>
+                <m:sub>
+                  <m:r>
+                    <m:t>j</m:t>
+                  </m:r>
+                </m:sub>
+              </m:sSub>
+            </m:oMath>
+            <w:r>
+              <w:t xml:space="preserve"> </w:t>
+            </w:r>
+            <w:r>
+              <w:t xml:space="preserve">(Section 4.5);</w:t>
+            </w:r>
+            <w:r>
+              <w:t xml:space="preserve"> </w:t>
+            </w:r>
+            <m:oMath>
+              <m:r>
+                <m:t>r</m:t>
+              </m:r>
+              <m:r>
+                <m:rPr>
+                  <m:sty m:val="p"/>
+                </m:rPr>
+                <m:t>=</m:t>
+              </m:r>
+              <m:r>
+                <m:t>ρ</m:t>
+              </m:r>
+              <m:r>
+                <m:rPr>
+                  <m:sty m:val="p"/>
+                </m:rPr>
+                <m:t>+</m:t>
+              </m:r>
+              <m:r>
+                <m:t>μ</m:t>
+              </m:r>
+            </m:oMath>
+          </w:p>
+        </w:tc>
+      </w:tr>
+      <w:tr>
+        <w:tc>
+          <w:tcPr/>
+          <w:p>
+            <w:pPr>
+              <w:pStyle w:val="Compact"/>
+              <w:jc w:val="left"/>
+            </w:pPr>
+            <m:oMath>
+              <m:r>
+                <m:t>s</m:t>
+              </m:r>
+            </m:oMath>
+            <w:r>
+              <w:t xml:space="preserve">,</w:t>
+            </w:r>
+            <w:r>
+              <w:t xml:space="preserve"> </w:t>
+            </w:r>
+            <m:oMath>
+              <m:r>
+                <m:t>K</m:t>
+              </m:r>
+              <m:d>
+                <m:dPr>
+                  <m:begChr m:val="("/>
+                  <m:endChr m:val=")"/>
+                  <m:sepChr m:val=""/>
+                  <m:grow/>
+                </m:dPr>
+                <m:e>
+                  <m:r>
+                    <m:t>s</m:t>
+                  </m:r>
+                </m:e>
+              </m:d>
+            </m:oMath>
+          </w:p>
+        </w:tc>
+        <w:tc>
+          <w:tcPr/>
+          <w:p>
+            <w:pPr>
+              <w:pStyle w:val="Compact"/>
+              <w:jc w:val="left"/>
+            </w:pPr>
+            <w:r>
+              <w:t xml:space="preserve">Contractual protection against productization; developer’s cost curvature, increasing in</w:t>
+            </w:r>
+            <w:r>
+              <w:t xml:space="preserve"> </w:t>
+            </w:r>
+            <m:oMath>
+              <m:r>
+                <m:t>s</m:t>
+              </m:r>
+            </m:oMath>
+          </w:p>
+        </w:tc>
+      </w:tr>
+      <w:tr>
+        <w:tc>
+          <w:tcPr/>
+          <w:p>
+            <w:pPr>
+              <w:pStyle w:val="Compact"/>
+              <w:jc w:val="left"/>
+            </w:pPr>
+            <m:oMath>
+              <m:r>
+                <m:t>R</m:t>
+              </m:r>
+            </m:oMath>
+            <w:r>
+              <w:t xml:space="preserve">,</w:t>
+            </w:r>
+            <w:r>
+              <w:t xml:space="preserve"> </w:t>
+            </w:r>
+            <m:oMath>
+              <m:r>
+                <m:t>ϕ</m:t>
+              </m:r>
+            </m:oMath>
+          </w:p>
+        </w:tc>
+        <w:tc>
+          <w:tcPr/>
+          <w:p>
+            <w:pPr>
+              <w:pStyle w:val="Compact"/>
+              <w:jc w:val="left"/>
+            </w:pPr>
+            <w:r>
+              <w:t xml:space="preserve">Rent flow</w:t>
+            </w:r>
+            <w:r>
+              <w:t xml:space="preserve"> </w:t>
+            </w:r>
+            <m:oMath>
+              <m:d>
+                <m:dPr>
+                  <m:begChr m:val="("/>
+                  <m:endChr m:val=")"/>
+                  <m:sepChr m:val=""/>
+                  <m:grow/>
+                </m:dPr>
+                <m:e>
+                  <m:r>
+                    <m:t>p</m:t>
+                  </m:r>
+                  <m:r>
+                    <m:rPr>
+                      <m:sty m:val="p"/>
+                    </m:rPr>
+                    <m:t>−</m:t>
+                  </m:r>
+                  <m:sSub>
+                    <m:e>
+                      <m:r>
+                        <m:t>c</m:t>
+                      </m:r>
+                    </m:e>
+                    <m:sub>
+                      <m:r>
+                        <m:t>j</m:t>
+                      </m:r>
+                    </m:sub>
+                  </m:sSub>
+                </m:e>
+              </m:d>
+              <m:sSub>
+                <m:e>
+                  <m:r>
+                    <m:t>q</m:t>
+                  </m:r>
+                </m:e>
+                <m:sub>
+                  <m:r>
+                    <m:t>j</m:t>
+                  </m:r>
+                </m:sub>
+              </m:sSub>
+            </m:oMath>
+            <w:r>
+              <w:t xml:space="preserve">; share of its present value the developer gains by productizing</w:t>
             </w:r>
           </w:p>
         </w:tc>
@@ -4984,8 +5261,2366 @@
       </w:r>
     </w:p>
     <w:bookmarkEnd w:id="35"/>
+    <w:bookmarkStart w:id="36" w:name="Xb251667487cf04b98c628b0f1577ec4895e93a1"/>
+    <w:p>
+      <w:pPr>
+        <w:pStyle w:val="Heading2"/>
+      </w:pPr>
+      <w:r>
+        <w:t xml:space="preserve">4.5 Endogenous encroachment and contract protection</w:t>
+      </w:r>
+    </w:p>
+    <w:p>
+      <w:pPr>
+        <w:pStyle w:val="FirstParagraph"/>
+      </w:pPr>
+      <w:r>
+        <w:t xml:space="preserve">Proposition 5 treats the productization rate</w:t>
+      </w:r>
+      <w:r>
+        <w:t xml:space="preserve"> </w:t>
+      </w:r>
+      <m:oMath>
+        <m:r>
+          <m:t>η</m:t>
+        </m:r>
+      </m:oMath>
+      <w:r>
+        <w:t xml:space="preserve"> </w:t>
+      </w:r>
+      <w:r>
+        <w:t xml:space="preserve">as given. Here we let the developer choose it and ask how contract terms affect the choice. The analysis is a reduced-form extension. It adds the minimum structure needed to endogenize</w:t>
+      </w:r>
+      <w:r>
+        <w:t xml:space="preserve"> </w:t>
+      </w:r>
+      <m:oMath>
+        <m:r>
+          <m:t>η</m:t>
+        </m:r>
+      </m:oMath>
+      <w:r>
+        <w:t xml:space="preserve">, and it should be read as a first formalization and not as a full model of vendor behavior.</w:t>
+      </w:r>
+    </w:p>
+    <w:p>
+      <w:pPr>
+        <w:pStyle w:val="BodyText"/>
+      </w:pPr>
+      <w:r>
+        <w:rPr>
+          <w:iCs/>
+          <w:i/>
+        </w:rPr>
+        <w:t xml:space="preserve">Setup.</w:t>
+      </w:r>
+      <w:r>
+        <w:t xml:space="preserve"> </w:t>
+      </w:r>
+      <w:r>
+        <w:t xml:space="preserve">Let</w:t>
+      </w:r>
+      <w:r>
+        <w:t xml:space="preserve"> </w:t>
+      </w:r>
+      <m:oMath>
+        <m:r>
+          <m:t>R</m:t>
+        </m:r>
+        <m:r>
+          <m:rPr>
+            <m:sty m:val="p"/>
+          </m:rPr>
+          <m:t>=</m:t>
+        </m:r>
+        <m:d>
+          <m:dPr>
+            <m:begChr m:val="("/>
+            <m:endChr m:val=")"/>
+            <m:sepChr m:val=""/>
+            <m:grow/>
+          </m:dPr>
+          <m:e>
+            <m:r>
+              <m:t>p</m:t>
+            </m:r>
+            <m:r>
+              <m:rPr>
+                <m:sty m:val="p"/>
+              </m:rPr>
+              <m:t>−</m:t>
+            </m:r>
+            <m:sSub>
+              <m:e>
+                <m:r>
+                  <m:t>c</m:t>
+                </m:r>
+              </m:e>
+              <m:sub>
+                <m:r>
+                  <m:t>j</m:t>
+                </m:r>
+              </m:sub>
+            </m:sSub>
+          </m:e>
+        </m:d>
+        <m:sSub>
+          <m:e>
+            <m:r>
+              <m:t>q</m:t>
+            </m:r>
+          </m:e>
+          <m:sub>
+            <m:r>
+              <m:t>j</m:t>
+            </m:r>
+          </m:sub>
+        </m:sSub>
+      </m:oMath>
+      <w:r>
+        <w:t xml:space="preserve"> </w:t>
+      </w:r>
+      <w:r>
+        <w:t xml:space="preserve">be the adopter’s rent flow. For tractability, we replace the deterministic imitation lag</w:t>
+      </w:r>
+      <w:r>
+        <w:t xml:space="preserve"> </w:t>
+      </w:r>
+      <m:oMath>
+        <m:sSub>
+          <m:e>
+            <m:r>
+              <m:t>τ</m:t>
+            </m:r>
+          </m:e>
+          <m:sub>
+            <m:r>
+              <m:t>O</m:t>
+            </m:r>
+          </m:sub>
+        </m:sSub>
+      </m:oMath>
+      <w:r>
+        <w:t xml:space="preserve"> </w:t>
+      </w:r>
+      <w:r>
+        <w:t xml:space="preserve">by an exponential one: rivals imitate</w:t>
+      </w:r>
+      <w:r>
+        <w:t xml:space="preserve"> </w:t>
+      </w:r>
+      <m:oMath>
+        <m:sSub>
+          <m:e>
+            <m:r>
+              <m:t>O</m:t>
+            </m:r>
+          </m:e>
+          <m:sub>
+            <m:r>
+              <m:t>j</m:t>
+            </m:r>
+          </m:sub>
+        </m:sSub>
+      </m:oMath>
+      <w:r>
+        <w:t xml:space="preserve"> </w:t>
+      </w:r>
+      <w:r>
+        <w:t xml:space="preserve">at rate</w:t>
+      </w:r>
+      <w:r>
+        <w:t xml:space="preserve"> </w:t>
+      </w:r>
+      <m:oMath>
+        <m:r>
+          <m:t>μ</m:t>
+        </m:r>
+      </m:oMath>
+      <w:r>
+        <w:t xml:space="preserve">, so that the mean lag is</w:t>
+      </w:r>
+      <w:r>
+        <w:t xml:space="preserve"> </w:t>
+      </w:r>
+      <m:oMath>
+        <m:r>
+          <m:t>1</m:t>
+        </m:r>
+        <m:r>
+          <m:rPr>
+            <m:sty m:val="p"/>
+          </m:rPr>
+          <m:t>/</m:t>
+        </m:r>
+        <m:r>
+          <m:t>μ</m:t>
+        </m:r>
+      </m:oMath>
+      <w:r>
+        <w:t xml:space="preserve">. Write</w:t>
+      </w:r>
+      <w:r>
+        <w:t xml:space="preserve"> </w:t>
+      </w:r>
+      <m:oMath>
+        <m:r>
+          <m:t>r</m:t>
+        </m:r>
+        <m:r>
+          <m:rPr>
+            <m:sty m:val="p"/>
+          </m:rPr>
+          <m:t>=</m:t>
+        </m:r>
+        <m:r>
+          <m:t>ρ</m:t>
+        </m:r>
+        <m:r>
+          <m:rPr>
+            <m:sty m:val="p"/>
+          </m:rPr>
+          <m:t>+</m:t>
+        </m:r>
+        <m:r>
+          <m:t>μ</m:t>
+        </m:r>
+      </m:oMath>
+      <w:r>
+        <w:t xml:space="preserve">. The adopter’s expected rent from Proposition 5 then becomes</w:t>
+      </w:r>
+      <w:r>
+        <w:t xml:space="preserve"> </w:t>
+      </w:r>
+      <m:oMath>
+        <m:r>
+          <m:t>R</m:t>
+        </m:r>
+        <m:r>
+          <m:rPr>
+            <m:sty m:val="p"/>
+          </m:rPr>
+          <m:t>/</m:t>
+        </m:r>
+        <m:d>
+          <m:dPr>
+            <m:begChr m:val="("/>
+            <m:endChr m:val=")"/>
+            <m:sepChr m:val=""/>
+            <m:grow/>
+          </m:dPr>
+          <m:e>
+            <m:r>
+              <m:t>r</m:t>
+            </m:r>
+            <m:r>
+              <m:rPr>
+                <m:sty m:val="p"/>
+              </m:rPr>
+              <m:t>+</m:t>
+            </m:r>
+            <m:r>
+              <m:t>η</m:t>
+            </m:r>
+          </m:e>
+        </m:d>
+        <m:r>
+          <m:rPr>
+            <m:sty m:val="p"/>
+          </m:rPr>
+          <m:t>−</m:t>
+        </m:r>
+        <m:r>
+          <m:t>g</m:t>
+        </m:r>
+        <m:d>
+          <m:dPr>
+            <m:begChr m:val="("/>
+            <m:endChr m:val=")"/>
+            <m:sepChr m:val=""/>
+            <m:grow/>
+          </m:dPr>
+          <m:e>
+            <m:sSub>
+              <m:e>
+                <m:r>
+                  <m:t>O</m:t>
+                </m:r>
+              </m:e>
+              <m:sub>
+                <m:r>
+                  <m:t>j</m:t>
+                </m:r>
+              </m:sub>
+            </m:sSub>
+          </m:e>
+        </m:d>
+      </m:oMath>
+      <w:r>
+        <w:t xml:space="preserve">, with the same comparative statics. A contract specifies protection</w:t>
+      </w:r>
+      <w:r>
+        <w:t xml:space="preserve"> </w:t>
+      </w:r>
+      <m:oMath>
+        <m:r>
+          <m:t>s</m:t>
+        </m:r>
+        <m:r>
+          <m:rPr>
+            <m:sty m:val="p"/>
+          </m:rPr>
+          <m:t>∈</m:t>
+        </m:r>
+        <m:r>
+          <m:rPr>
+            <m:sty m:val="p"/>
+          </m:rPr>
+          <m:t>[</m:t>
+        </m:r>
+        <m:r>
+          <m:t>0</m:t>
+        </m:r>
+        <m:r>
+          <m:rPr>
+            <m:sty m:val="p"/>
+          </m:rPr>
+          <m:t>,</m:t>
+        </m:r>
+        <m:r>
+          <m:t>1</m:t>
+        </m:r>
+        <m:r>
+          <m:rPr>
+            <m:sty m:val="p"/>
+          </m:rPr>
+          <m:t>)</m:t>
+        </m:r>
+      </m:oMath>
+      <w:r>
+        <w:t xml:space="preserve">, which limits the developer’s use of the adopter’s data, fine-tuning, or deployment information. The developer exerts effort</w:t>
+      </w:r>
+      <w:r>
+        <w:t xml:space="preserve"> </w:t>
+      </w:r>
+      <m:oMath>
+        <m:r>
+          <m:t>e</m:t>
+        </m:r>
+      </m:oMath>
+      <w:r>
+        <w:t xml:space="preserve"> </w:t>
+      </w:r>
+      <w:r>
+        <w:t xml:space="preserve">at cost</w:t>
+      </w:r>
+      <w:r>
+        <w:t xml:space="preserve"> </w:t>
+      </w:r>
+      <m:oMath>
+        <m:d>
+          <m:dPr>
+            <m:begChr m:val="("/>
+            <m:endChr m:val=")"/>
+            <m:sepChr m:val=""/>
+            <m:grow/>
+          </m:dPr>
+          <m:e>
+            <m:r>
+              <m:t>k</m:t>
+            </m:r>
+            <m:r>
+              <m:rPr>
+                <m:sty m:val="p"/>
+              </m:rPr>
+              <m:t>/</m:t>
+            </m:r>
+            <m:r>
+              <m:t>2</m:t>
+            </m:r>
+          </m:e>
+        </m:d>
+        <m:sSup>
+          <m:e>
+            <m:r>
+              <m:t>e</m:t>
+            </m:r>
+          </m:e>
+          <m:sup>
+            <m:r>
+              <m:t>2</m:t>
+            </m:r>
+          </m:sup>
+        </m:sSup>
+      </m:oMath>
+      <w:r>
+        <w:t xml:space="preserve">, but only the fraction</w:t>
+      </w:r>
+      <w:r>
+        <w:t xml:space="preserve"> </w:t>
+      </w:r>
+      <m:oMath>
+        <m:r>
+          <m:t>1</m:t>
+        </m:r>
+        <m:r>
+          <m:rPr>
+            <m:sty m:val="p"/>
+          </m:rPr>
+          <m:t>−</m:t>
+        </m:r>
+        <m:r>
+          <m:t>s</m:t>
+        </m:r>
+      </m:oMath>
+      <w:r>
+        <w:t xml:space="preserve"> </w:t>
+      </w:r>
+      <w:r>
+        <w:t xml:space="preserve">of that effort converts into productization, so that</w:t>
+      </w:r>
+      <w:r>
+        <w:t xml:space="preserve"> </w:t>
+      </w:r>
+      <m:oMath>
+        <m:r>
+          <m:t>η</m:t>
+        </m:r>
+        <m:r>
+          <m:rPr>
+            <m:sty m:val="p"/>
+          </m:rPr>
+          <m:t>=</m:t>
+        </m:r>
+        <m:d>
+          <m:dPr>
+            <m:begChr m:val="("/>
+            <m:endChr m:val=")"/>
+            <m:sepChr m:val=""/>
+            <m:grow/>
+          </m:dPr>
+          <m:e>
+            <m:r>
+              <m:t>1</m:t>
+            </m:r>
+            <m:r>
+              <m:rPr>
+                <m:sty m:val="p"/>
+              </m:rPr>
+              <m:t>−</m:t>
+            </m:r>
+            <m:r>
+              <m:t>s</m:t>
+            </m:r>
+          </m:e>
+        </m:d>
+        <m:r>
+          <m:t>e</m:t>
+        </m:r>
+      </m:oMath>
+      <w:r>
+        <w:t xml:space="preserve">. The cost of achieving a rate</w:t>
+      </w:r>
+      <w:r>
+        <w:t xml:space="preserve"> </w:t>
+      </w:r>
+      <m:oMath>
+        <m:r>
+          <m:t>η</m:t>
+        </m:r>
+      </m:oMath>
+      <w:r>
+        <w:t xml:space="preserve"> </w:t>
+      </w:r>
+      <w:r>
+        <w:t xml:space="preserve">is therefore</w:t>
+      </w:r>
+      <w:r>
+        <w:t xml:space="preserve"> </w:t>
+      </w:r>
+      <m:oMath>
+        <m:d>
+          <m:dPr>
+            <m:begChr m:val="("/>
+            <m:endChr m:val=")"/>
+            <m:sepChr m:val=""/>
+            <m:grow/>
+          </m:dPr>
+          <m:e>
+            <m:r>
+              <m:t>K</m:t>
+            </m:r>
+            <m:r>
+              <m:rPr>
+                <m:sty m:val="p"/>
+              </m:rPr>
+              <m:t>/</m:t>
+            </m:r>
+            <m:r>
+              <m:t>2</m:t>
+            </m:r>
+          </m:e>
+        </m:d>
+        <m:sSup>
+          <m:e>
+            <m:r>
+              <m:t>η</m:t>
+            </m:r>
+          </m:e>
+          <m:sup>
+            <m:r>
+              <m:t>2</m:t>
+            </m:r>
+          </m:sup>
+        </m:sSup>
+      </m:oMath>
+      <w:r>
+        <w:t xml:space="preserve"> </w:t>
+      </w:r>
+      <w:r>
+        <w:t xml:space="preserve">with</w:t>
+      </w:r>
+      <w:r>
+        <w:t xml:space="preserve"> </w:t>
+      </w:r>
+      <m:oMath>
+        <m:r>
+          <m:t>K</m:t>
+        </m:r>
+        <m:d>
+          <m:dPr>
+            <m:begChr m:val="("/>
+            <m:endChr m:val=")"/>
+            <m:sepChr m:val=""/>
+            <m:grow/>
+          </m:dPr>
+          <m:e>
+            <m:r>
+              <m:t>s</m:t>
+            </m:r>
+          </m:e>
+        </m:d>
+        <m:r>
+          <m:rPr>
+            <m:sty m:val="p"/>
+          </m:rPr>
+          <m:t>=</m:t>
+        </m:r>
+        <m:r>
+          <m:t>k</m:t>
+        </m:r>
+        <m:r>
+          <m:rPr>
+            <m:sty m:val="p"/>
+          </m:rPr>
+          <m:t>/</m:t>
+        </m:r>
+        <m:sSup>
+          <m:e>
+            <m:d>
+              <m:dPr>
+                <m:begChr m:val="("/>
+                <m:endChr m:val=")"/>
+                <m:sepChr m:val=""/>
+                <m:grow/>
+              </m:dPr>
+              <m:e>
+                <m:r>
+                  <m:t>1</m:t>
+                </m:r>
+                <m:r>
+                  <m:rPr>
+                    <m:sty m:val="p"/>
+                  </m:rPr>
+                  <m:t>−</m:t>
+                </m:r>
+                <m:r>
+                  <m:t>s</m:t>
+                </m:r>
+              </m:e>
+            </m:d>
+          </m:e>
+          <m:sup>
+            <m:r>
+              <m:t>2</m:t>
+            </m:r>
+          </m:sup>
+        </m:sSup>
+      </m:oMath>
+      <w:r>
+        <w:t xml:space="preserve">, which increases in</w:t>
+      </w:r>
+      <w:r>
+        <w:t xml:space="preserve"> </w:t>
+      </w:r>
+      <m:oMath>
+        <m:r>
+          <m:t>s</m:t>
+        </m:r>
+      </m:oMath>
+      <w:r>
+        <w:t xml:space="preserve">. When it productizes the use, the developer gains the present value</w:t>
+      </w:r>
+      <w:r>
+        <w:t xml:space="preserve"> </w:t>
+      </w:r>
+      <m:oMath>
+        <m:r>
+          <m:t>G</m:t>
+        </m:r>
+        <m:r>
+          <m:rPr>
+            <m:sty m:val="p"/>
+          </m:rPr>
+          <m:t>=</m:t>
+        </m:r>
+        <m:r>
+          <m:t>ϕ</m:t>
+        </m:r>
+        <m:r>
+          <m:t>R</m:t>
+        </m:r>
+        <m:r>
+          <m:rPr>
+            <m:sty m:val="p"/>
+          </m:rPr>
+          <m:t>/</m:t>
+        </m:r>
+        <m:r>
+          <m:t>r</m:t>
+        </m:r>
+      </m:oMath>
+      <w:r>
+        <w:t xml:space="preserve">, where</w:t>
+      </w:r>
+      <w:r>
+        <w:t xml:space="preserve"> </w:t>
+      </w:r>
+      <m:oMath>
+        <m:r>
+          <m:t>ϕ</m:t>
+        </m:r>
+        <m:r>
+          <m:rPr>
+            <m:sty m:val="p"/>
+          </m:rPr>
+          <m:t>∈</m:t>
+        </m:r>
+        <m:r>
+          <m:rPr>
+            <m:sty m:val="p"/>
+          </m:rPr>
+          <m:t>(</m:t>
+        </m:r>
+        <m:r>
+          <m:t>0</m:t>
+        </m:r>
+        <m:r>
+          <m:rPr>
+            <m:sty m:val="p"/>
+          </m:rPr>
+          <m:t>,</m:t>
+        </m:r>
+        <m:r>
+          <m:t>1</m:t>
+        </m:r>
+        <m:r>
+          <m:rPr>
+            <m:sty m:val="p"/>
+          </m:rPr>
+          <m:t>]</m:t>
+        </m:r>
+      </m:oMath>
+      <w:r>
+        <w:t xml:space="preserve"> </w:t>
+      </w:r>
+      <w:r>
+        <w:t xml:space="preserve">is the share of the rent’s present value</w:t>
+      </w:r>
+      <w:r>
+        <w:t xml:space="preserve"> </w:t>
+      </w:r>
+      <m:oMath>
+        <m:r>
+          <m:t>R</m:t>
+        </m:r>
+        <m:r>
+          <m:rPr>
+            <m:sty m:val="p"/>
+          </m:rPr>
+          <m:t>/</m:t>
+        </m:r>
+        <m:r>
+          <m:t>r</m:t>
+        </m:r>
+      </m:oMath>
+      <w:r>
+        <w:t xml:space="preserve"> </w:t>
+      </w:r>
+      <w:r>
+        <w:t xml:space="preserve">that it captures, and the rest passes to consumers. The developer chooses</w:t>
+      </w:r>
+      <w:r>
+        <w:t xml:space="preserve"> </w:t>
+      </w:r>
+      <m:oMath>
+        <m:r>
+          <m:t>η</m:t>
+        </m:r>
+      </m:oMath>
+      <w:r>
+        <w:t xml:space="preserve"> </w:t>
+      </w:r>
+      <w:r>
+        <w:t xml:space="preserve">to maximize</w:t>
+      </w:r>
+    </w:p>
+    <w:p>
+      <w:pPr>
+        <w:pStyle w:val="BodyText"/>
+      </w:pPr>
+      <m:oMathPara>
+        <m:oMathParaPr>
+          <m:jc m:val="center"/>
+        </m:oMathParaPr>
+        <m:oMath>
+          <m:r>
+            <m:t>J</m:t>
+          </m:r>
+          <m:d>
+            <m:dPr>
+              <m:begChr m:val="("/>
+              <m:endChr m:val=")"/>
+              <m:sepChr m:val=""/>
+              <m:grow/>
+            </m:dPr>
+            <m:e>
+              <m:r>
+                <m:t>η</m:t>
+              </m:r>
+            </m:e>
+          </m:d>
+          <m:r>
+            <m:rPr>
+              <m:sty m:val="p"/>
+            </m:rPr>
+            <m:t>=</m:t>
+          </m:r>
+          <m:f>
+            <m:fPr>
+              <m:type m:val="bar"/>
+            </m:fPr>
+            <m:num>
+              <m:r>
+                <m:t>G</m:t>
+              </m:r>
+              <m:r>
+                <m:t>η</m:t>
+              </m:r>
+              <m:r>
+                <m:rPr>
+                  <m:sty m:val="p"/>
+                </m:rPr>
+                <m:t>−</m:t>
+              </m:r>
+              <m:r>
+                <m:t>K</m:t>
+              </m:r>
+              <m:sSup>
+                <m:e>
+                  <m:r>
+                    <m:t>η</m:t>
+                  </m:r>
+                </m:e>
+                <m:sup>
+                  <m:r>
+                    <m:t>2</m:t>
+                  </m:r>
+                </m:sup>
+              </m:sSup>
+              <m:r>
+                <m:rPr>
+                  <m:sty m:val="p"/>
+                </m:rPr>
+                <m:t>/</m:t>
+              </m:r>
+              <m:r>
+                <m:t>2</m:t>
+              </m:r>
+            </m:num>
+            <m:den>
+              <m:r>
+                <m:t>r</m:t>
+              </m:r>
+              <m:r>
+                <m:rPr>
+                  <m:sty m:val="p"/>
+                </m:rPr>
+                <m:t>+</m:t>
+              </m:r>
+              <m:r>
+                <m:t>η</m:t>
+              </m:r>
+            </m:den>
+          </m:f>
+          <m:r>
+            <m:rPr>
+              <m:sty m:val="p"/>
+            </m:rPr>
+            <m:t>,</m:t>
+          </m:r>
+        </m:oMath>
+      </m:oMathPara>
+    </w:p>
+    <w:p>
+      <w:pPr>
+        <w:pStyle w:val="FirstParagraph"/>
+      </w:pPr>
+      <w:r>
+        <w:t xml:space="preserve">the expected present value of its gain net of effort cost, which accrues until productization or imitation ends the opportunity.</w:t>
+      </w:r>
+    </w:p>
+    <w:p>
+      <w:pPr>
+        <w:pStyle w:val="BodyText"/>
+      </w:pPr>
+      <w:r>
+        <w:rPr>
+          <w:bCs/>
+          <w:b/>
+        </w:rPr>
+        <w:t xml:space="preserve">Proposition 6 (Equilibrium productization).</w:t>
+      </w:r>
+      <w:r>
+        <w:t xml:space="preserve"> </w:t>
+      </w:r>
+      <w:r>
+        <w:t xml:space="preserve">The developer’s problem has a unique interior solution,</w:t>
+      </w:r>
+    </w:p>
+    <w:p>
+      <w:pPr>
+        <w:pStyle w:val="BodyText"/>
+      </w:pPr>
+      <m:oMathPara>
+        <m:oMathParaPr>
+          <m:jc m:val="center"/>
+        </m:oMathParaPr>
+        <m:oMath>
+          <m:sSup>
+            <m:e>
+              <m:r>
+                <m:t>η</m:t>
+              </m:r>
+            </m:e>
+            <m:sup>
+              <m:r>
+                <m:rPr>
+                  <m:sty m:val="p"/>
+                </m:rPr>
+                <m:t>*</m:t>
+              </m:r>
+            </m:sup>
+          </m:sSup>
+          <m:r>
+            <m:rPr>
+              <m:sty m:val="p"/>
+            </m:rPr>
+            <m:t>=</m:t>
+          </m:r>
+          <m:r>
+            <m:rPr>
+              <m:sty m:val="p"/>
+            </m:rPr>
+            <m:t>−</m:t>
+          </m:r>
+          <m:r>
+            <m:t>r</m:t>
+          </m:r>
+          <m:r>
+            <m:rPr>
+              <m:sty m:val="p"/>
+            </m:rPr>
+            <m:t>+</m:t>
+          </m:r>
+          <m:rad>
+            <m:radPr>
+              <m:degHide m:val="on"/>
+            </m:radPr>
+            <m:deg/>
+            <m:e>
+              <m:sSup>
+                <m:e>
+                  <m:r>
+                    <m:t>r</m:t>
+                  </m:r>
+                </m:e>
+                <m:sup>
+                  <m:r>
+                    <m:t>2</m:t>
+                  </m:r>
+                </m:sup>
+              </m:sSup>
+              <m:r>
+                <m:rPr>
+                  <m:sty m:val="p"/>
+                </m:rPr>
+                <m:t>+</m:t>
+              </m:r>
+              <m:r>
+                <m:t>2</m:t>
+              </m:r>
+              <m:r>
+                <m:t>G</m:t>
+              </m:r>
+              <m:r>
+                <m:t>r</m:t>
+              </m:r>
+              <m:r>
+                <m:rPr>
+                  <m:sty m:val="p"/>
+                </m:rPr>
+                <m:t>/</m:t>
+              </m:r>
+              <m:r>
+                <m:t>K</m:t>
+              </m:r>
+            </m:e>
+          </m:rad>
+          <m:r>
+            <m:rPr>
+              <m:sty m:val="p"/>
+            </m:rPr>
+            <m:t>.</m:t>
+          </m:r>
+        </m:oMath>
+      </m:oMathPara>
+    </w:p>
+    <w:p>
+      <w:pPr>
+        <w:pStyle w:val="FirstParagraph"/>
+      </w:pPr>
+      <w:r>
+        <w:t xml:space="preserve">The rate</w:t>
+      </w:r>
+      <w:r>
+        <w:t xml:space="preserve"> </w:t>
+      </w:r>
+      <m:oMath>
+        <m:sSup>
+          <m:e>
+            <m:r>
+              <m:t>η</m:t>
+            </m:r>
+          </m:e>
+          <m:sup>
+            <m:r>
+              <m:rPr>
+                <m:sty m:val="p"/>
+              </m:rPr>
+              <m:t>*</m:t>
+            </m:r>
+          </m:sup>
+        </m:sSup>
+      </m:oMath>
+      <w:r>
+        <w:t xml:space="preserve"> </w:t>
+      </w:r>
+      <w:r>
+        <w:t xml:space="preserve">is increasing in</w:t>
+      </w:r>
+      <w:r>
+        <w:t xml:space="preserve"> </w:t>
+      </w:r>
+      <m:oMath>
+        <m:r>
+          <m:t>G</m:t>
+        </m:r>
+      </m:oMath>
+      <w:r>
+        <w:t xml:space="preserve"> </w:t>
+      </w:r>
+      <w:r>
+        <w:t xml:space="preserve">(and so in</w:t>
+      </w:r>
+      <w:r>
+        <w:t xml:space="preserve"> </w:t>
+      </w:r>
+      <m:oMath>
+        <m:r>
+          <m:t>R</m:t>
+        </m:r>
+      </m:oMath>
+      <w:r>
+        <w:t xml:space="preserve"> </w:t>
+      </w:r>
+      <w:r>
+        <w:t xml:space="preserve">and</w:t>
+      </w:r>
+      <w:r>
+        <w:t xml:space="preserve"> </w:t>
+      </w:r>
+      <m:oMath>
+        <m:r>
+          <m:t>ϕ</m:t>
+        </m:r>
+      </m:oMath>
+      <w:r>
+        <w:t xml:space="preserve">) and decreasing in</w:t>
+      </w:r>
+      <w:r>
+        <w:t xml:space="preserve"> </w:t>
+      </w:r>
+      <m:oMath>
+        <m:r>
+          <m:t>K</m:t>
+        </m:r>
+      </m:oMath>
+      <w:r>
+        <w:t xml:space="preserve"> </w:t>
+      </w:r>
+      <w:r>
+        <w:t xml:space="preserve">(and so in</w:t>
+      </w:r>
+      <w:r>
+        <w:t xml:space="preserve"> </w:t>
+      </w:r>
+      <m:oMath>
+        <m:r>
+          <m:t>s</m:t>
+        </m:r>
+      </m:oMath>
+      <w:r>
+        <w:t xml:space="preserve">). For a given</w:t>
+      </w:r>
+      <w:r>
+        <w:t xml:space="preserve"> </w:t>
+      </w:r>
+      <m:oMath>
+        <m:r>
+          <m:t>G</m:t>
+        </m:r>
+      </m:oMath>
+      <w:r>
+        <w:t xml:space="preserve">, it is increasing in</w:t>
+      </w:r>
+      <w:r>
+        <w:t xml:space="preserve"> </w:t>
+      </w:r>
+      <m:oMath>
+        <m:r>
+          <m:t>r</m:t>
+        </m:r>
+      </m:oMath>
+      <w:r>
+        <w:t xml:space="preserve">: the faster rivals are expected to imitate, the faster the developer productizes.</w:t>
+      </w:r>
+    </w:p>
+    <w:p>
+      <w:pPr>
+        <w:pStyle w:val="BodyText"/>
+      </w:pPr>
+      <w:r>
+        <w:rPr>
+          <w:bCs/>
+          <w:b/>
+        </w:rPr>
+        <w:t xml:space="preserve">Proposition 7 (Contract protection and complement investment).</w:t>
+      </w:r>
+      <w:r>
+        <w:t xml:space="preserve"> </w:t>
+      </w:r>
+      <w:r>
+        <w:t xml:space="preserve">The adopter’s expected rent</w:t>
+      </w:r>
+      <w:r>
+        <w:t xml:space="preserve"> </w:t>
+      </w:r>
+      <m:oMath>
+        <m:r>
+          <m:t>R</m:t>
+        </m:r>
+        <m:r>
+          <m:rPr>
+            <m:sty m:val="p"/>
+          </m:rPr>
+          <m:t>/</m:t>
+        </m:r>
+        <m:d>
+          <m:dPr>
+            <m:begChr m:val="("/>
+            <m:endChr m:val=")"/>
+            <m:sepChr m:val=""/>
+            <m:grow/>
+          </m:dPr>
+          <m:e>
+            <m:r>
+              <m:t>r</m:t>
+            </m:r>
+            <m:r>
+              <m:rPr>
+                <m:sty m:val="p"/>
+              </m:rPr>
+              <m:t>+</m:t>
+            </m:r>
+            <m:sSup>
+              <m:e>
+                <m:r>
+                  <m:t>η</m:t>
+                </m:r>
+              </m:e>
+              <m:sup>
+                <m:r>
+                  <m:rPr>
+                    <m:sty m:val="p"/>
+                  </m:rPr>
+                  <m:t>*</m:t>
+                </m:r>
+              </m:sup>
+            </m:sSup>
+            <m:d>
+              <m:dPr>
+                <m:begChr m:val="("/>
+                <m:endChr m:val=")"/>
+                <m:sepChr m:val=""/>
+                <m:grow/>
+              </m:dPr>
+              <m:e>
+                <m:r>
+                  <m:t>s</m:t>
+                </m:r>
+              </m:e>
+            </m:d>
+          </m:e>
+        </m:d>
+        <m:r>
+          <m:rPr>
+            <m:sty m:val="p"/>
+          </m:rPr>
+          <m:t>−</m:t>
+        </m:r>
+        <m:r>
+          <m:t>g</m:t>
+        </m:r>
+        <m:d>
+          <m:dPr>
+            <m:begChr m:val="("/>
+            <m:endChr m:val=")"/>
+            <m:sepChr m:val=""/>
+            <m:grow/>
+          </m:dPr>
+          <m:e>
+            <m:sSub>
+              <m:e>
+                <m:r>
+                  <m:t>O</m:t>
+                </m:r>
+              </m:e>
+              <m:sub>
+                <m:r>
+                  <m:t>j</m:t>
+                </m:r>
+              </m:sub>
+            </m:sSub>
+          </m:e>
+        </m:d>
+      </m:oMath>
+      <w:r>
+        <w:t xml:space="preserve"> </w:t>
+      </w:r>
+      <w:r>
+        <w:t xml:space="preserve">is increasing in</w:t>
+      </w:r>
+      <w:r>
+        <w:t xml:space="preserve"> </w:t>
+      </w:r>
+      <m:oMath>
+        <m:r>
+          <m:t>s</m:t>
+        </m:r>
+      </m:oMath>
+      <w:r>
+        <w:t xml:space="preserve">. Consequently, the set of organizational-capital investments that satisfy</w:t>
+      </w:r>
+      <w:r>
+        <w:t xml:space="preserve"> </w:t>
+      </w:r>
+      <m:oMath>
+        <m:r>
+          <m:t>R</m:t>
+        </m:r>
+        <m:r>
+          <m:rPr>
+            <m:sty m:val="p"/>
+          </m:rPr>
+          <m:t>/</m:t>
+        </m:r>
+        <m:d>
+          <m:dPr>
+            <m:begChr m:val="("/>
+            <m:endChr m:val=")"/>
+            <m:sepChr m:val=""/>
+            <m:grow/>
+          </m:dPr>
+          <m:e>
+            <m:r>
+              <m:t>r</m:t>
+            </m:r>
+            <m:r>
+              <m:rPr>
+                <m:sty m:val="p"/>
+              </m:rPr>
+              <m:t>+</m:t>
+            </m:r>
+            <m:sSup>
+              <m:e>
+                <m:r>
+                  <m:t>η</m:t>
+                </m:r>
+              </m:e>
+              <m:sup>
+                <m:r>
+                  <m:rPr>
+                    <m:sty m:val="p"/>
+                  </m:rPr>
+                  <m:t>*</m:t>
+                </m:r>
+              </m:sup>
+            </m:sSup>
+          </m:e>
+        </m:d>
+        <m:r>
+          <m:rPr>
+            <m:sty m:val="p"/>
+          </m:rPr>
+          <m:t>≥</m:t>
+        </m:r>
+        <m:r>
+          <m:t>g</m:t>
+        </m:r>
+        <m:d>
+          <m:dPr>
+            <m:begChr m:val="("/>
+            <m:endChr m:val=")"/>
+            <m:sepChr m:val=""/>
+            <m:grow/>
+          </m:dPr>
+          <m:e>
+            <m:sSub>
+              <m:e>
+                <m:r>
+                  <m:t>O</m:t>
+                </m:r>
+              </m:e>
+              <m:sub>
+                <m:r>
+                  <m:t>j</m:t>
+                </m:r>
+              </m:sub>
+            </m:sSub>
+          </m:e>
+        </m:d>
+      </m:oMath>
+      <w:r>
+        <w:t xml:space="preserve"> </w:t>
+      </w:r>
+      <w:r>
+        <w:t xml:space="preserve">expands as</w:t>
+      </w:r>
+      <w:r>
+        <w:t xml:space="preserve"> </w:t>
+      </w:r>
+      <m:oMath>
+        <m:r>
+          <m:t>s</m:t>
+        </m:r>
+      </m:oMath>
+      <w:r>
+        <w:t xml:space="preserve"> </w:t>
+      </w:r>
+      <w:r>
+        <w:t xml:space="preserve">rises, and some investments that would not be made without protection are made with it.</w:t>
+      </w:r>
+    </w:p>
+    <w:p>
+      <w:pPr>
+        <w:pStyle w:val="BodyText"/>
+      </w:pPr>
+      <w:r>
+        <w:t xml:space="preserve">Proposition 6 says that imitation by rivals and encroachment by the vendor are strategic complements. A shorter expected imitation lag makes the developer move sooner, so that the two threats to the adopter’s rent compound. Proposition 7 is the hold-up logic of Klein et al. (1978) and Grossman and Hart (1986) applied to the LLM supply relationship. An adopter that fears productization under-invests in the co-specialized capital that generates its rent, and contract terms that raise the developer’s cost of encroaching restore some of that investment.</w:t>
+      </w:r>
+    </w:p>
+    <w:p>
+      <w:pPr>
+        <w:pStyle w:val="BodyText"/>
+      </w:pPr>
+      <w:r>
+        <w:t xml:space="preserve">Whether such protection is actually written is a separate question. The adopter’s willingness to pay for a move from</w:t>
+      </w:r>
+      <w:r>
+        <w:t xml:space="preserve"> </w:t>
+      </w:r>
+      <m:oMath>
+        <m:sSub>
+          <m:e>
+            <m:r>
+              <m:t>s</m:t>
+            </m:r>
+          </m:e>
+          <m:sub>
+            <m:r>
+              <m:t>0</m:t>
+            </m:r>
+          </m:sub>
+        </m:sSub>
+      </m:oMath>
+      <w:r>
+        <w:t xml:space="preserve"> </w:t>
+      </w:r>
+      <w:r>
+        <w:t xml:space="preserve">to</w:t>
+      </w:r>
+      <w:r>
+        <w:t xml:space="preserve"> </w:t>
+      </w:r>
+      <m:oMath>
+        <m:sSub>
+          <m:e>
+            <m:r>
+              <m:t>s</m:t>
+            </m:r>
+          </m:e>
+          <m:sub>
+            <m:r>
+              <m:t>1</m:t>
+            </m:r>
+          </m:sub>
+        </m:sSub>
+      </m:oMath>
+      <w:r>
+        <w:t xml:space="preserve"> </w:t>
+      </w:r>
+      <w:r>
+        <w:t xml:space="preserve">is</w:t>
+      </w:r>
+      <w:r>
+        <w:t xml:space="preserve"> </w:t>
+      </w:r>
+      <m:oMath>
+        <m:r>
+          <m:t>R</m:t>
+        </m:r>
+        <m:r>
+          <m:rPr>
+            <m:sty m:val="p"/>
+          </m:rPr>
+          <m:t>/</m:t>
+        </m:r>
+        <m:d>
+          <m:dPr>
+            <m:begChr m:val="("/>
+            <m:endChr m:val=")"/>
+            <m:sepChr m:val=""/>
+            <m:grow/>
+          </m:dPr>
+          <m:e>
+            <m:r>
+              <m:t>r</m:t>
+            </m:r>
+            <m:r>
+              <m:rPr>
+                <m:sty m:val="p"/>
+              </m:rPr>
+              <m:t>+</m:t>
+            </m:r>
+            <m:sSubSup>
+              <m:e>
+                <m:r>
+                  <m:t>η</m:t>
+                </m:r>
+              </m:e>
+              <m:sub>
+                <m:r>
+                  <m:t>1</m:t>
+                </m:r>
+              </m:sub>
+              <m:sup>
+                <m:r>
+                  <m:rPr>
+                    <m:sty m:val="p"/>
+                  </m:rPr>
+                  <m:t>*</m:t>
+                </m:r>
+              </m:sup>
+            </m:sSubSup>
+          </m:e>
+        </m:d>
+        <m:r>
+          <m:rPr>
+            <m:sty m:val="p"/>
+          </m:rPr>
+          <m:t>−</m:t>
+        </m:r>
+        <m:r>
+          <m:t>R</m:t>
+        </m:r>
+        <m:r>
+          <m:rPr>
+            <m:sty m:val="p"/>
+          </m:rPr>
+          <m:t>/</m:t>
+        </m:r>
+        <m:d>
+          <m:dPr>
+            <m:begChr m:val="("/>
+            <m:endChr m:val=")"/>
+            <m:sepChr m:val=""/>
+            <m:grow/>
+          </m:dPr>
+          <m:e>
+            <m:r>
+              <m:t>r</m:t>
+            </m:r>
+            <m:r>
+              <m:rPr>
+                <m:sty m:val="p"/>
+              </m:rPr>
+              <m:t>+</m:t>
+            </m:r>
+            <m:sSubSup>
+              <m:e>
+                <m:r>
+                  <m:t>η</m:t>
+                </m:r>
+              </m:e>
+              <m:sub>
+                <m:r>
+                  <m:t>0</m:t>
+                </m:r>
+              </m:sub>
+              <m:sup>
+                <m:r>
+                  <m:rPr>
+                    <m:sty m:val="p"/>
+                  </m:rPr>
+                  <m:t>*</m:t>
+                </m:r>
+              </m:sup>
+            </m:sSubSup>
+          </m:e>
+        </m:d>
+      </m:oMath>
+      <w:r>
+        <w:t xml:space="preserve">. The developer’s loss is</w:t>
+      </w:r>
+      <w:r>
+        <w:t xml:space="preserve"> </w:t>
+      </w:r>
+      <m:oMath>
+        <m:sSub>
+          <m:e>
+            <m:r>
+              <m:t>K</m:t>
+            </m:r>
+          </m:e>
+          <m:sub>
+            <m:r>
+              <m:t>1</m:t>
+            </m:r>
+          </m:sub>
+        </m:sSub>
+        <m:sSubSup>
+          <m:e>
+            <m:r>
+              <m:t>η</m:t>
+            </m:r>
+          </m:e>
+          <m:sub>
+            <m:r>
+              <m:t>1</m:t>
+            </m:r>
+          </m:sub>
+          <m:sup>
+            <m:r>
+              <m:rPr>
+                <m:sty m:val="p"/>
+              </m:rPr>
+              <m:t>*</m:t>
+            </m:r>
+          </m:sup>
+        </m:sSubSup>
+        <m:r>
+          <m:rPr>
+            <m:sty m:val="p"/>
+          </m:rPr>
+          <m:t>−</m:t>
+        </m:r>
+        <m:sSub>
+          <m:e>
+            <m:r>
+              <m:t>K</m:t>
+            </m:r>
+          </m:e>
+          <m:sub>
+            <m:r>
+              <m:t>0</m:t>
+            </m:r>
+          </m:sub>
+        </m:sSub>
+        <m:sSubSup>
+          <m:e>
+            <m:r>
+              <m:t>η</m:t>
+            </m:r>
+          </m:e>
+          <m:sub>
+            <m:r>
+              <m:t>0</m:t>
+            </m:r>
+          </m:sub>
+          <m:sup>
+            <m:r>
+              <m:rPr>
+                <m:sty m:val="p"/>
+              </m:rPr>
+              <m:t>*</m:t>
+            </m:r>
+          </m:sup>
+        </m:sSubSup>
+      </m:oMath>
+      <w:r>
+        <w:t xml:space="preserve">, because its value at the optimum is</w:t>
+      </w:r>
+      <w:r>
+        <w:t xml:space="preserve"> </w:t>
+      </w:r>
+      <m:oMath>
+        <m:sSup>
+          <m:e>
+            <m:r>
+              <m:t>J</m:t>
+            </m:r>
+          </m:e>
+          <m:sup>
+            <m:r>
+              <m:rPr>
+                <m:sty m:val="p"/>
+              </m:rPr>
+              <m:t>*</m:t>
+            </m:r>
+          </m:sup>
+        </m:sSup>
+        <m:r>
+          <m:rPr>
+            <m:sty m:val="p"/>
+          </m:rPr>
+          <m:t>=</m:t>
+        </m:r>
+        <m:r>
+          <m:t>G</m:t>
+        </m:r>
+        <m:r>
+          <m:rPr>
+            <m:sty m:val="p"/>
+          </m:rPr>
+          <m:t>−</m:t>
+        </m:r>
+        <m:r>
+          <m:t>K</m:t>
+        </m:r>
+        <m:sSup>
+          <m:e>
+            <m:r>
+              <m:t>η</m:t>
+            </m:r>
+          </m:e>
+          <m:sup>
+            <m:r>
+              <m:rPr>
+                <m:sty m:val="p"/>
+              </m:rPr>
+              <m:t>*</m:t>
+            </m:r>
+          </m:sup>
+        </m:sSup>
+      </m:oMath>
+      <w:r>
+        <w:t xml:space="preserve">. A contract can be agreed only if the first exceeds the second. Table 4 gives a numerical illustration. Protection clears for uses with small rents and fails for uses with large rents, because the developer’s gain from productizing grows with the rent. The pattern depends on the parameters and is not general, since in a simulation with randomly drawn parameters the willingness to pay fell short of the developer’s loss in about five percent of the draws. We therefore offer it as an illustration and not as a proposition. If it held more generally, it would imply that the uses most worth protecting are the ones least likely to be protected.</w:t>
+      </w:r>
+    </w:p>
+    <w:p>
+      <w:pPr>
+        <w:pStyle w:val="BodyText"/>
+      </w:pPr>
+      <w:r>
+        <w:rPr>
+          <w:bCs/>
+          <w:b/>
+        </w:rPr>
+        <w:t xml:space="preserve">Table 4. Willingness to pay for protection versus the developer’s loss (illustration;</w:t>
+      </w:r>
+      <w:r>
+        <w:rPr>
+          <w:bCs/>
+          <w:b/>
+        </w:rPr>
+        <w:t xml:space="preserve"> </w:t>
+      </w:r>
+      <m:oMath>
+        <m:r>
+          <m:t>r</m:t>
+        </m:r>
+        <m:r>
+          <m:rPr>
+            <m:sty m:val="p"/>
+          </m:rPr>
+          <m:t>=</m:t>
+        </m:r>
+        <m:r>
+          <m:t>0.3</m:t>
+        </m:r>
+      </m:oMath>
+      <w:r>
+        <w:rPr>
+          <w:bCs/>
+          <w:b/>
+        </w:rPr>
+        <w:t xml:space="preserve">,</w:t>
+      </w:r>
+      <w:r>
+        <w:rPr>
+          <w:bCs/>
+          <w:b/>
+        </w:rPr>
+        <w:t xml:space="preserve"> </w:t>
+      </w:r>
+      <m:oMath>
+        <m:r>
+          <m:t>ϕ</m:t>
+        </m:r>
+        <m:r>
+          <m:rPr>
+            <m:sty m:val="p"/>
+          </m:rPr>
+          <m:t>=</m:t>
+        </m:r>
+        <m:r>
+          <m:t>0.8</m:t>
+        </m:r>
+      </m:oMath>
+      <w:r>
+        <w:rPr>
+          <w:bCs/>
+          <w:b/>
+        </w:rPr>
+        <w:t xml:space="preserve">,</w:t>
+      </w:r>
+      <w:r>
+        <w:rPr>
+          <w:bCs/>
+          <w:b/>
+        </w:rPr>
+        <w:t xml:space="preserve"> </w:t>
+      </w:r>
+      <m:oMath>
+        <m:r>
+          <m:t>k</m:t>
+        </m:r>
+        <m:r>
+          <m:rPr>
+            <m:sty m:val="p"/>
+          </m:rPr>
+          <m:t>=</m:t>
+        </m:r>
+        <m:r>
+          <m:t>1</m:t>
+        </m:r>
+      </m:oMath>
+      <w:r>
+        <w:rPr>
+          <w:bCs/>
+          <w:b/>
+        </w:rPr>
+        <w:t xml:space="preserve">,</w:t>
+      </w:r>
+      <w:r>
+        <w:rPr>
+          <w:bCs/>
+          <w:b/>
+        </w:rPr>
+        <w:t xml:space="preserve"> </w:t>
+      </w:r>
+      <m:oMath>
+        <m:r>
+          <m:t>s</m:t>
+        </m:r>
+      </m:oMath>
+      <w:r>
+        <w:rPr>
+          <w:bCs/>
+          <w:b/>
+        </w:rPr>
+        <w:t xml:space="preserve"> </w:t>
+      </w:r>
+      <w:r>
+        <w:rPr>
+          <w:bCs/>
+          <w:b/>
+        </w:rPr>
+        <w:t xml:space="preserve">raised from 0 to 0.5)</w:t>
+      </w:r>
+    </w:p>
+    <w:tbl>
+      <w:tblPr>
+        <w:tblStyle w:val="Table"/>
+        <w:tblW w:type="pct" w:w="5000"/>
+        <w:tblLook w:firstRow="1" w:lastRow="0" w:firstColumn="0" w:lastColumn="0" w:noHBand="0" w:noVBand="0" w:val="0020"/>
+        <w:jc w:val="start"/>
+      </w:tblPr>
+      <w:tblGrid>
+        <w:gridCol w:w="1320"/>
+        <w:gridCol w:w="1320"/>
+        <w:gridCol w:w="1320"/>
+        <w:gridCol w:w="1320"/>
+        <w:gridCol w:w="1320"/>
+        <w:gridCol w:w="1320"/>
+      </w:tblGrid>
+      <w:tr>
+        <w:trPr>
+          <w:tblHeader w:val="true"/>
+        </w:trPr>
+        <w:tc>
+          <w:tcPr/>
+          <w:p>
+            <w:pPr>
+              <w:pStyle w:val="Compact"/>
+              <w:jc w:val="right"/>
+            </w:pPr>
+            <m:oMath>
+              <m:r>
+                <m:t>R</m:t>
+              </m:r>
+            </m:oMath>
+          </w:p>
+        </w:tc>
+        <w:tc>
+          <w:tcPr/>
+          <w:p>
+            <w:pPr>
+              <w:pStyle w:val="Compact"/>
+              <w:jc w:val="right"/>
+            </w:pPr>
+            <m:oMath>
+              <m:sSup>
+                <m:e>
+                  <m:r>
+                    <m:t>η</m:t>
+                  </m:r>
+                </m:e>
+                <m:sup>
+                  <m:r>
+                    <m:rPr>
+                      <m:sty m:val="p"/>
+                    </m:rPr>
+                    <m:t>*</m:t>
+                  </m:r>
+                </m:sup>
+              </m:sSup>
+            </m:oMath>
+            <w:r>
+              <w:t xml:space="preserve"> </w:t>
+            </w:r>
+            <w:r>
+              <w:t xml:space="preserve">(</w:t>
+            </w:r>
+            <m:oMath>
+              <m:r>
+                <m:t>s</m:t>
+              </m:r>
+              <m:r>
+                <m:rPr>
+                  <m:sty m:val="p"/>
+                </m:rPr>
+                <m:t>=</m:t>
+              </m:r>
+              <m:r>
+                <m:t>0</m:t>
+              </m:r>
+            </m:oMath>
+            <w:r>
+              <w:t xml:space="preserve">)</w:t>
+            </w:r>
+          </w:p>
+        </w:tc>
+        <w:tc>
+          <w:tcPr/>
+          <w:p>
+            <w:pPr>
+              <w:pStyle w:val="Compact"/>
+              <w:jc w:val="right"/>
+            </w:pPr>
+            <m:oMath>
+              <m:sSup>
+                <m:e>
+                  <m:r>
+                    <m:t>η</m:t>
+                  </m:r>
+                </m:e>
+                <m:sup>
+                  <m:r>
+                    <m:rPr>
+                      <m:sty m:val="p"/>
+                    </m:rPr>
+                    <m:t>*</m:t>
+                  </m:r>
+                </m:sup>
+              </m:sSup>
+            </m:oMath>
+            <w:r>
+              <w:t xml:space="preserve"> </w:t>
+            </w:r>
+            <w:r>
+              <w:t xml:space="preserve">(</w:t>
+            </w:r>
+            <m:oMath>
+              <m:r>
+                <m:t>s</m:t>
+              </m:r>
+              <m:r>
+                <m:rPr>
+                  <m:sty m:val="p"/>
+                </m:rPr>
+                <m:t>=</m:t>
+              </m:r>
+              <m:r>
+                <m:t>0.5</m:t>
+              </m:r>
+            </m:oMath>
+            <w:r>
+              <w:t xml:space="preserve">)</w:t>
+            </w:r>
+          </w:p>
+        </w:tc>
+        <w:tc>
+          <w:tcPr/>
+          <w:p>
+            <w:pPr>
+              <w:pStyle w:val="Compact"/>
+              <w:jc w:val="right"/>
+            </w:pPr>
+            <w:r>
+              <w:t xml:space="preserve">Willingness to pay</w:t>
+            </w:r>
+          </w:p>
+        </w:tc>
+        <w:tc>
+          <w:tcPr/>
+          <w:p>
+            <w:pPr>
+              <w:pStyle w:val="Compact"/>
+              <w:jc w:val="right"/>
+            </w:pPr>
+            <w:r>
+              <w:t xml:space="preserve">Developer’s loss</w:t>
+            </w:r>
+          </w:p>
+        </w:tc>
+        <w:tc>
+          <w:tcPr/>
+          <w:p>
+            <w:pPr>
+              <w:pStyle w:val="Compact"/>
+              <w:jc w:val="left"/>
+            </w:pPr>
+            <w:r>
+              <w:t xml:space="preserve">Contract agreed</w:t>
+            </w:r>
+          </w:p>
+        </w:tc>
+      </w:tr>
+      <w:tr>
+        <w:tc>
+          <w:tcPr/>
+          <w:p>
+            <w:pPr>
+              <w:pStyle w:val="Compact"/>
+              <w:jc w:val="right"/>
+            </w:pPr>
+            <w:r>
+              <w:t xml:space="preserve">0.5</w:t>
+            </w:r>
+          </w:p>
+        </w:tc>
+        <w:tc>
+          <w:tcPr/>
+          <w:p>
+            <w:pPr>
+              <w:pStyle w:val="Compact"/>
+              <w:jc w:val="right"/>
+            </w:pPr>
+            <w:r>
+              <w:t xml:space="preserve">0.643</w:t>
+            </w:r>
+          </w:p>
+        </w:tc>
+        <w:tc>
+          <w:tcPr/>
+          <w:p>
+            <w:pPr>
+              <w:pStyle w:val="Compact"/>
+              <w:jc w:val="right"/>
+            </w:pPr>
+            <w:r>
+              <w:t xml:space="preserve">0.239</w:t>
+            </w:r>
+          </w:p>
+        </w:tc>
+        <w:tc>
+          <w:tcPr/>
+          <w:p>
+            <w:pPr>
+              <w:pStyle w:val="Compact"/>
+              <w:jc w:val="right"/>
+            </w:pPr>
+            <w:r>
+              <w:t xml:space="preserve">0.398</w:t>
+            </w:r>
+          </w:p>
+        </w:tc>
+        <w:tc>
+          <w:tcPr/>
+          <w:p>
+            <w:pPr>
+              <w:pStyle w:val="Compact"/>
+              <w:jc w:val="right"/>
+            </w:pPr>
+            <w:r>
+              <w:t xml:space="preserve">0.311</w:t>
+            </w:r>
+          </w:p>
+        </w:tc>
+        <w:tc>
+          <w:tcPr/>
+          <w:p>
+            <w:pPr>
+              <w:pStyle w:val="Compact"/>
+              <w:jc w:val="left"/>
+            </w:pPr>
+            <w:r>
+              <w:t xml:space="preserve">Yes</w:t>
+            </w:r>
+          </w:p>
+        </w:tc>
+      </w:tr>
+      <w:tr>
+        <w:tc>
+          <w:tcPr/>
+          <w:p>
+            <w:pPr>
+              <w:pStyle w:val="Compact"/>
+              <w:jc w:val="right"/>
+            </w:pPr>
+            <w:r>
+              <w:t xml:space="preserve">1</w:t>
+            </w:r>
+          </w:p>
+        </w:tc>
+        <w:tc>
+          <w:tcPr/>
+          <w:p>
+            <w:pPr>
+              <w:pStyle w:val="Compact"/>
+              <w:jc w:val="right"/>
+            </w:pPr>
+            <w:r>
+              <w:t xml:space="preserve">1.000</w:t>
+            </w:r>
+          </w:p>
+        </w:tc>
+        <w:tc>
+          <w:tcPr/>
+          <w:p>
+            <w:pPr>
+              <w:pStyle w:val="Compact"/>
+              <w:jc w:val="right"/>
+            </w:pPr>
+            <w:r>
+              <w:t xml:space="preserve">0.400</w:t>
+            </w:r>
+          </w:p>
+        </w:tc>
+        <w:tc>
+          <w:tcPr/>
+          <w:p>
+            <w:pPr>
+              <w:pStyle w:val="Compact"/>
+              <w:jc w:val="right"/>
+            </w:pPr>
+            <w:r>
+              <w:t xml:space="preserve">0.659</w:t>
+            </w:r>
+          </w:p>
+        </w:tc>
+        <w:tc>
+          <w:tcPr/>
+          <w:p>
+            <w:pPr>
+              <w:pStyle w:val="Compact"/>
+              <w:jc w:val="right"/>
+            </w:pPr>
+            <w:r>
+              <w:t xml:space="preserve">0.600</w:t>
+            </w:r>
+          </w:p>
+        </w:tc>
+        <w:tc>
+          <w:tcPr/>
+          <w:p>
+            <w:pPr>
+              <w:pStyle w:val="Compact"/>
+              <w:jc w:val="left"/>
+            </w:pPr>
+            <w:r>
+              <w:t xml:space="preserve">Yes</w:t>
+            </w:r>
+          </w:p>
+        </w:tc>
+      </w:tr>
+      <w:tr>
+        <w:tc>
+          <w:tcPr/>
+          <w:p>
+            <w:pPr>
+              <w:pStyle w:val="Compact"/>
+              <w:jc w:val="right"/>
+            </w:pPr>
+            <w:r>
+              <w:t xml:space="preserve">2</w:t>
+            </w:r>
+          </w:p>
+        </w:tc>
+        <w:tc>
+          <w:tcPr/>
+          <w:p>
+            <w:pPr>
+              <w:pStyle w:val="Compact"/>
+              <w:jc w:val="right"/>
+            </w:pPr>
+            <w:r>
+              <w:t xml:space="preserve">1.514</w:t>
+            </w:r>
+          </w:p>
+        </w:tc>
+        <w:tc>
+          <w:tcPr/>
+          <w:p>
+            <w:pPr>
+              <w:pStyle w:val="Compact"/>
+              <w:jc w:val="right"/>
+            </w:pPr>
+            <w:r>
+              <w:t xml:space="preserve">0.643</w:t>
+            </w:r>
+          </w:p>
+        </w:tc>
+        <w:tc>
+          <w:tcPr/>
+          <w:p>
+            <w:pPr>
+              <w:pStyle w:val="Compact"/>
+              <w:jc w:val="right"/>
+            </w:pPr>
+            <w:r>
+              <w:t xml:space="preserve">1.017</w:t>
+            </w:r>
+          </w:p>
+        </w:tc>
+        <w:tc>
+          <w:tcPr/>
+          <w:p>
+            <w:pPr>
+              <w:pStyle w:val="Compact"/>
+              <w:jc w:val="right"/>
+            </w:pPr>
+            <w:r>
+              <w:t xml:space="preserve">1.060</w:t>
+            </w:r>
+          </w:p>
+        </w:tc>
+        <w:tc>
+          <w:tcPr/>
+          <w:p>
+            <w:pPr>
+              <w:pStyle w:val="Compact"/>
+              <w:jc w:val="left"/>
+            </w:pPr>
+            <w:r>
+              <w:t xml:space="preserve">No</w:t>
+            </w:r>
+          </w:p>
+        </w:tc>
+      </w:tr>
+      <w:tr>
+        <w:tc>
+          <w:tcPr/>
+          <w:p>
+            <w:pPr>
+              <w:pStyle w:val="Compact"/>
+              <w:jc w:val="right"/>
+            </w:pPr>
+            <w:r>
+              <w:t xml:space="preserve">4</w:t>
+            </w:r>
+          </w:p>
+        </w:tc>
+        <w:tc>
+          <w:tcPr/>
+          <w:p>
+            <w:pPr>
+              <w:pStyle w:val="Compact"/>
+              <w:jc w:val="right"/>
+            </w:pPr>
+            <w:r>
+              <w:t xml:space="preserve">2.248</w:t>
+            </w:r>
+          </w:p>
+        </w:tc>
+        <w:tc>
+          <w:tcPr/>
+          <w:p>
+            <w:pPr>
+              <w:pStyle w:val="Compact"/>
+              <w:jc w:val="right"/>
+            </w:pPr>
+            <w:r>
+              <w:t xml:space="preserve">1.000</w:t>
+            </w:r>
+          </w:p>
+        </w:tc>
+        <w:tc>
+          <w:tcPr/>
+          <w:p>
+            <w:pPr>
+              <w:pStyle w:val="Compact"/>
+              <w:jc w:val="right"/>
+            </w:pPr>
+            <w:r>
+              <w:t xml:space="preserve">1.507</w:t>
+            </w:r>
+          </w:p>
+        </w:tc>
+        <w:tc>
+          <w:tcPr/>
+          <w:p>
+            <w:pPr>
+              <w:pStyle w:val="Compact"/>
+              <w:jc w:val="right"/>
+            </w:pPr>
+            <w:r>
+              <w:t xml:space="preserve">1.752</w:t>
+            </w:r>
+          </w:p>
+        </w:tc>
+        <w:tc>
+          <w:tcPr/>
+          <w:p>
+            <w:pPr>
+              <w:pStyle w:val="Compact"/>
+              <w:jc w:val="left"/>
+            </w:pPr>
+            <w:r>
+              <w:t xml:space="preserve">No</w:t>
+            </w:r>
+          </w:p>
+        </w:tc>
+      </w:tr>
+      <w:tr>
+        <w:tc>
+          <w:tcPr/>
+          <w:p>
+            <w:pPr>
+              <w:pStyle w:val="Compact"/>
+              <w:jc w:val="right"/>
+            </w:pPr>
+            <w:r>
+              <w:t xml:space="preserve">8</w:t>
+            </w:r>
+          </w:p>
+        </w:tc>
+        <w:tc>
+          <w:tcPr/>
+          <w:p>
+            <w:pPr>
+              <w:pStyle w:val="Compact"/>
+              <w:jc w:val="right"/>
+            </w:pPr>
+            <w:r>
+              <w:t xml:space="preserve">3.290</w:t>
+            </w:r>
+          </w:p>
+        </w:tc>
+        <w:tc>
+          <w:tcPr/>
+          <w:p>
+            <w:pPr>
+              <w:pStyle w:val="Compact"/>
+              <w:jc w:val="right"/>
+            </w:pPr>
+            <w:r>
+              <w:t xml:space="preserve">1.514</w:t>
+            </w:r>
+          </w:p>
+        </w:tc>
+        <w:tc>
+          <w:tcPr/>
+          <w:p>
+            <w:pPr>
+              <w:pStyle w:val="Compact"/>
+              <w:jc w:val="right"/>
+            </w:pPr>
+            <w:r>
+              <w:t xml:space="preserve">2.182</w:t>
+            </w:r>
+          </w:p>
+        </w:tc>
+        <w:tc>
+          <w:tcPr/>
+          <w:p>
+            <w:pPr>
+              <w:pStyle w:val="Compact"/>
+              <w:jc w:val="right"/>
+            </w:pPr>
+            <w:r>
+              <w:t xml:space="preserve">2.765</w:t>
+            </w:r>
+          </w:p>
+        </w:tc>
+        <w:tc>
+          <w:tcPr/>
+          <w:p>
+            <w:pPr>
+              <w:pStyle w:val="Compact"/>
+              <w:jc w:val="left"/>
+            </w:pPr>
+            <w:r>
+              <w:t xml:space="preserve">No</w:t>
+            </w:r>
+          </w:p>
+        </w:tc>
+      </w:tr>
+    </w:tbl>
+    <w:p>
+      <w:pPr>
+        <w:pStyle w:val="BodyText"/>
+      </w:pPr>
+      <w:r>
+        <w:t xml:space="preserve">The extension has clear limits. The rate</w:t>
+      </w:r>
+      <w:r>
+        <w:t xml:space="preserve"> </w:t>
+      </w:r>
+      <m:oMath>
+        <m:r>
+          <m:t>η</m:t>
+        </m:r>
+      </m:oMath>
+      <w:r>
+        <w:t xml:space="preserve"> </w:t>
+      </w:r>
+      <w:r>
+        <w:t xml:space="preserve">is constant and chosen by a single developer. We do not model competition among vendors for the same use, the adopter’s responses (concealing the use, moving to another vendor), or bargaining over the contract. The functional form</w:t>
+      </w:r>
+      <w:r>
+        <w:t xml:space="preserve"> </w:t>
+      </w:r>
+      <m:oMath>
+        <m:r>
+          <m:t>K</m:t>
+        </m:r>
+        <m:d>
+          <m:dPr>
+            <m:begChr m:val="("/>
+            <m:endChr m:val=")"/>
+            <m:sepChr m:val=""/>
+            <m:grow/>
+          </m:dPr>
+          <m:e>
+            <m:r>
+              <m:t>s</m:t>
+            </m:r>
+          </m:e>
+        </m:d>
+        <m:r>
+          <m:rPr>
+            <m:sty m:val="p"/>
+          </m:rPr>
+          <m:t>=</m:t>
+        </m:r>
+        <m:r>
+          <m:t>k</m:t>
+        </m:r>
+        <m:r>
+          <m:rPr>
+            <m:sty m:val="p"/>
+          </m:rPr>
+          <m:t>/</m:t>
+        </m:r>
+        <m:sSup>
+          <m:e>
+            <m:d>
+              <m:dPr>
+                <m:begChr m:val="("/>
+                <m:endChr m:val=")"/>
+                <m:sepChr m:val=""/>
+                <m:grow/>
+              </m:dPr>
+              <m:e>
+                <m:r>
+                  <m:t>1</m:t>
+                </m:r>
+                <m:r>
+                  <m:rPr>
+                    <m:sty m:val="p"/>
+                  </m:rPr>
+                  <m:t>−</m:t>
+                </m:r>
+                <m:r>
+                  <m:t>s</m:t>
+                </m:r>
+              </m:e>
+            </m:d>
+          </m:e>
+          <m:sup>
+            <m:r>
+              <m:t>2</m:t>
+            </m:r>
+          </m:sup>
+        </m:sSup>
+      </m:oMath>
+      <w:r>
+        <w:t xml:space="preserve"> </w:t>
+      </w:r>
+      <w:r>
+        <w:t xml:space="preserve">is a convenience, and the share</w:t>
+      </w:r>
+      <w:r>
+        <w:t xml:space="preserve"> </w:t>
+      </w:r>
+      <m:oMath>
+        <m:r>
+          <m:t>ϕ</m:t>
+        </m:r>
+      </m:oMath>
+      <w:r>
+        <w:t xml:space="preserve"> </w:t>
+      </w:r>
+      <w:r>
+        <w:t xml:space="preserve">is a reduced-form parameter that does not model how the developer earns from a productized offering. Contract terms are not publicly observed, so the propositions cannot be examined with the data in Section 6.</w:t>
+      </w:r>
+    </w:p>
     <w:bookmarkEnd w:id="36"/>
-    <w:bookmarkStart w:id="39" w:name="empirical-counterparts-and-implications"/>
+    <w:bookmarkEnd w:id="37"/>
+    <w:bookmarkStart w:id="40" w:name="empirical-counterparts-and-implications"/>
     <w:p>
       <w:pPr>
         <w:pStyle w:val="Heading1"/>
@@ -4994,7 +7629,7 @@
         <w:t xml:space="preserve">5. Empirical Counterparts and Implications</w:t>
       </w:r>
     </w:p>
-    <w:bookmarkStart w:id="37" w:name="mapping-model-objects-to-data"/>
+    <w:bookmarkStart w:id="38" w:name="mapping-model-objects-to-data"/>
     <w:p>
       <w:pPr>
         <w:pStyle w:val="Heading2"/>
@@ -5447,8 +8082,8 @@
         </w:tc>
       </w:tr>
     </w:tbl>
-    <w:bookmarkEnd w:id="37"/>
-    <w:bookmarkStart w:id="38" w:name="empirical-implications"/>
+    <w:bookmarkEnd w:id="38"/>
+    <w:bookmarkStart w:id="39" w:name="empirical-implications"/>
     <w:p>
       <w:pPr>
         <w:pStyle w:val="Heading2"/>
@@ -5579,9 +8214,9 @@
         <w:t xml:space="preserve">Among adopters, pooled exposure to LLMs, meaning use or mention without a dated first-party GA, does not predict economic profit. Disconfirmation is a time-invariant exposure indicator that predicts operating margin in the pooled cross-section.</w:t>
       </w:r>
     </w:p>
-    <w:bookmarkEnd w:id="38"/>
     <w:bookmarkEnd w:id="39"/>
-    <w:bookmarkStart w:id="43" w:name="illustrative-evidence"/>
+    <w:bookmarkEnd w:id="40"/>
+    <w:bookmarkStart w:id="44" w:name="illustrative-evidence"/>
     <w:p>
       <w:pPr>
         <w:pStyle w:val="Heading1"/>
@@ -5614,7 +8249,7 @@
         <w:t xml:space="preserve">On the developer side, we regress log realized price on the lab’s lead with lab fixed effects and a trend, clustering by lab. On the adopter side, we regress operating margin on a post-GA indicator with firm and year fixed effects, clustering by firm.</w:t>
       </w:r>
     </w:p>
-    <w:bookmarkStart w:id="40" w:name="developer-side-h1"/>
+    <w:bookmarkStart w:id="41" w:name="developer-side-h1"/>
     <w:p>
       <w:pPr>
         <w:pStyle w:val="Heading2"/>
@@ -5685,8 +8320,8 @@
         <w:t xml:space="preserve">They are identified mainly by new releases and so do not isolate the premium on a given model. They should be read as associations between a lab’s lead and its flagship price, and not as tests of H1a or H1b. Those tests require a model-month panel and a release-level panel of launch prices, which we do not estimate here.</w:t>
       </w:r>
     </w:p>
-    <w:bookmarkEnd w:id="40"/>
-    <w:bookmarkStart w:id="41" w:name="adopter-side-h2-to-h4"/>
+    <w:bookmarkEnd w:id="41"/>
+    <w:bookmarkStart w:id="42" w:name="adopter-side-h2-to-h4"/>
     <w:p>
       <w:pPr>
         <w:pStyle w:val="Heading2"/>
@@ -6113,8 +8748,8 @@
         <w:t xml:space="preserve">coefficient and the last post-GA bin. The data are therefore inconclusive on H4, and we do not claim that the margin increment decays. A time-invariant bundle-by-post-2023 difference-in-differences gives a similar coefficient and is retained as a robustness check.</w:t>
       </w:r>
     </w:p>
-    <w:bookmarkEnd w:id="41"/>
-    <w:bookmarkStart w:id="42" w:name="what-is-and-is-not-identified"/>
+    <w:bookmarkEnd w:id="42"/>
+    <w:bookmarkStart w:id="43" w:name="what-is-and-is-not-identified"/>
     <w:p>
       <w:pPr>
         <w:pStyle w:val="Heading2"/>
@@ -6131,9 +8766,9 @@
         <w:t xml:space="preserve">Six restrictions bind. First, the realized price is the mean of provider cards on OpenRouter, not a billed invoice and not a GAAP inference margin. Second, endpoint coverage is incomplete (102 of 171 priced months). Third, GA years are coded from public product dates, and they do not measure token spend or retrieval intensity. Fourth, Table 1 figures are illustrative and are not regression inputs. Fifth, two-way fixed-effects estimates under staggered timing can be biased when effects differ across cohorts (Goodman-Bacon 2021), and they rest on parallel trends, which we do not test beyond the pre-GA coefficients in the event study. Sixth, operating margin is an accounting measure and not the economic profit of Proposition 2, and the timing of GA marks the launch of a product, not the start of organizational-capital accumulation.</w:t>
       </w:r>
     </w:p>
-    <w:bookmarkEnd w:id="42"/>
     <w:bookmarkEnd w:id="43"/>
-    <w:bookmarkStart w:id="47" w:name="discussion"/>
+    <w:bookmarkEnd w:id="44"/>
+    <w:bookmarkStart w:id="48" w:name="discussion"/>
     <w:p>
       <w:pPr>
         <w:pStyle w:val="Heading1"/>
@@ -6142,7 +8777,7 @@
         <w:t xml:space="preserve">7. Discussion</w:t>
       </w:r>
     </w:p>
-    <w:bookmarkStart w:id="44" w:name="contributions"/>
+    <w:bookmarkStart w:id="45" w:name="contributions"/>
     <w:p>
       <w:pPr>
         <w:pStyle w:val="Heading2"/>
@@ -6167,8 +8802,8 @@
         <w:t xml:space="preserve">We should be clear about what is not new. The mechanisms in each layer are established in industrial organization and strategy (Section 2.4). What the paper adds is their combination under a single appropriability definition and the specification of measurable counterparts for a technology in which those counterparts are observable.</w:t>
       </w:r>
     </w:p>
-    <w:bookmarkEnd w:id="44"/>
-    <w:bookmarkStart w:id="45" w:name="implications-for-practice"/>
+    <w:bookmarkEnd w:id="45"/>
+    <w:bookmarkStart w:id="46" w:name="implications-for-practice"/>
     <w:p>
       <w:pPr>
         <w:pStyle w:val="Heading2"/>
@@ -6182,11 +8817,11 @@
         <w:pStyle w:val="FirstParagraph"/>
       </w:pPr>
       <w:r>
-        <w:t xml:space="preserve">For adopters, the central question is not how much to spend on AI but what the firm owns that the model cannot supply, and how long competitors will take to own it too. The theory also says that spending on the model itself is not a source of advantage, since any rival can buy the same model. For developers, the next model is the source of value, not the current one. When leads last only a few months, much of the reported loss is economic (Corollary 4). The valuations of frontier labs are best read as prices for an option on a sequence of future leads and not as capitalized current earnings. For the relationship between the two sides, Proposition 5 implies that contractual terms covering data use, fine-tuning ownership, and on-premise deployment are strategic decisions, because they affect the rate at which a vendor can productize an adopter’s use.</w:t>
-      </w:r>
-    </w:p>
-    <w:bookmarkEnd w:id="45"/>
-    <w:bookmarkStart w:id="46" w:name="boundary-conditions-and-limitations"/>
+        <w:t xml:space="preserve">For adopters, the central question is not how much to spend on AI but what the firm owns that the model cannot supply, and how long competitors will take to own it too. The theory also says that spending on the model itself is not a source of advantage, since any rival can buy the same model. For developers, the next model is the source of value, not the current one. When leads last only a few months, much of the reported loss is economic (Corollary 4). The valuations of frontier labs are best read as prices for an option on a sequence of future leads and not as capitalized current earnings. For the relationship between the two sides, Propositions 5 to 7 imply that contractual terms covering data use, fine-tuning ownership, and on-premise deployment are strategic decisions, because they affect the rate at which a vendor can productize an adopter’s use and so the adopter’s incentive to invest in the capital that generates its rent. The illustration in Table 4 suggests that such terms may be hardest to obtain for the most valuable uses, which is a reason for adopters to negotiate them before a use proves valuable and not after.</w:t>
+      </w:r>
+    </w:p>
+    <w:bookmarkEnd w:id="46"/>
+    <w:bookmarkStart w:id="47" w:name="boundary-conditions-and-limitations"/>
     <w:p>
       <w:pPr>
         <w:pStyle w:val="Heading2"/>
@@ -6211,9 +8846,9 @@
         <w:t xml:space="preserve">The model abstracts from uncertainty in training outcomes, from strategic interaction among developers (the lead and the catch-up lag are treated as exogenous), and from purchasable organizational capital. Making the lead endogenous to a training race is the most natural extension, and it is where we would expect a more specifically LLM-based theory to develop. The empirical proxies are imperfect, and misclassification biases the estimated difference between commodity and complementary use toward zero. The adopter sample is small and made up of large software incumbents, so the results should not be generalized to adopters in other industries. Finally, the evidence is observational and cross-sectional in time, over a period in which the technology and its business models are still changing. H1a, H1b, and H2 are not tested here, and the evidence on H4 is inconclusive. The tests reported are best viewed as a first look at the constructs, and they are not a confirmation of the theory.</w:t>
       </w:r>
     </w:p>
-    <w:bookmarkEnd w:id="46"/>
     <w:bookmarkEnd w:id="47"/>
-    <w:bookmarkStart w:id="48" w:name="conclusion"/>
+    <w:bookmarkEnd w:id="48"/>
+    <w:bookmarkStart w:id="49" w:name="conclusion"/>
     <w:p>
       <w:pPr>
         <w:pStyle w:val="Heading1"/>
@@ -6238,8 +8873,8 @@
         <w:t xml:space="preserve">The public record makes the developer half of this account visible. Frontier labs combine large booked revenue with large operating losses and pay complement owners for compute. The price of matched capability falls several-fold each year, while the cost of frontier capability rises. Investors nonetheless value the same firms as if a release sequence will continue. These three facts are consistent with a single explanation: competition over a general-purpose input whose quality lead is short and must be bought again with each release. The profitability puzzle that accompanies every general-purpose technology is, on this account, what competition over a common input looks like from the inside.</w:t>
       </w:r>
     </w:p>
-    <w:bookmarkEnd w:id="48"/>
-    <w:bookmarkStart w:id="49" w:name="appendix-a.-proofs"/>
+    <w:bookmarkEnd w:id="49"/>
+    <w:bookmarkStart w:id="50" w:name="appendix-a.-proofs"/>
     <w:p>
       <w:pPr>
         <w:pStyle w:val="Heading1"/>
@@ -9458,8 +12093,1599 @@
         </m:r>
       </m:oMath>
     </w:p>
-    <w:bookmarkEnd w:id="49"/>
-    <w:bookmarkStart w:id="50" w:name="references"/>
+    <w:p>
+      <w:pPr>
+        <w:pStyle w:val="BodyText"/>
+      </w:pPr>
+      <w:r>
+        <w:rPr>
+          <w:bCs/>
+          <w:b/>
+        </w:rPr>
+        <w:t xml:space="preserve">Proof of Proposition 6.</w:t>
+      </w:r>
+      <w:r>
+        <w:t xml:space="preserve"> </w:t>
+      </w:r>
+      <w:r>
+        <w:t xml:space="preserve">Write</w:t>
+      </w:r>
+      <w:r>
+        <w:t xml:space="preserve"> </w:t>
+      </w:r>
+      <m:oMath>
+        <m:r>
+          <m:t>N</m:t>
+        </m:r>
+        <m:d>
+          <m:dPr>
+            <m:begChr m:val="("/>
+            <m:endChr m:val=")"/>
+            <m:sepChr m:val=""/>
+            <m:grow/>
+          </m:dPr>
+          <m:e>
+            <m:r>
+              <m:t>η</m:t>
+            </m:r>
+          </m:e>
+        </m:d>
+        <m:r>
+          <m:rPr>
+            <m:sty m:val="p"/>
+          </m:rPr>
+          <m:t>=</m:t>
+        </m:r>
+        <m:r>
+          <m:t>G</m:t>
+        </m:r>
+        <m:r>
+          <m:t>η</m:t>
+        </m:r>
+        <m:r>
+          <m:rPr>
+            <m:sty m:val="p"/>
+          </m:rPr>
+          <m:t>−</m:t>
+        </m:r>
+        <m:r>
+          <m:t>K</m:t>
+        </m:r>
+        <m:sSup>
+          <m:e>
+            <m:r>
+              <m:t>η</m:t>
+            </m:r>
+          </m:e>
+          <m:sup>
+            <m:r>
+              <m:t>2</m:t>
+            </m:r>
+          </m:sup>
+        </m:sSup>
+        <m:r>
+          <m:rPr>
+            <m:sty m:val="p"/>
+          </m:rPr>
+          <m:t>/</m:t>
+        </m:r>
+        <m:r>
+          <m:t>2</m:t>
+        </m:r>
+      </m:oMath>
+      <w:r>
+        <w:t xml:space="preserve">, so that</w:t>
+      </w:r>
+      <w:r>
+        <w:t xml:space="preserve"> </w:t>
+      </w:r>
+      <m:oMath>
+        <m:r>
+          <m:t>J</m:t>
+        </m:r>
+        <m:r>
+          <m:rPr>
+            <m:sty m:val="p"/>
+          </m:rPr>
+          <m:t>=</m:t>
+        </m:r>
+        <m:r>
+          <m:t>N</m:t>
+        </m:r>
+        <m:r>
+          <m:rPr>
+            <m:sty m:val="p"/>
+          </m:rPr>
+          <m:t>/</m:t>
+        </m:r>
+        <m:d>
+          <m:dPr>
+            <m:begChr m:val="("/>
+            <m:endChr m:val=")"/>
+            <m:sepChr m:val=""/>
+            <m:grow/>
+          </m:dPr>
+          <m:e>
+            <m:r>
+              <m:t>r</m:t>
+            </m:r>
+            <m:r>
+              <m:rPr>
+                <m:sty m:val="p"/>
+              </m:rPr>
+              <m:t>+</m:t>
+            </m:r>
+            <m:r>
+              <m:t>η</m:t>
+            </m:r>
+          </m:e>
+        </m:d>
+      </m:oMath>
+      <w:r>
+        <w:t xml:space="preserve">. The first-order condition</w:t>
+      </w:r>
+      <w:r>
+        <w:t xml:space="preserve"> </w:t>
+      </w:r>
+      <m:oMath>
+        <m:r>
+          <m:t>N</m:t>
+        </m:r>
+        <m:r>
+          <m:rPr>
+            <m:sty m:val="p"/>
+          </m:rPr>
+          <m:t>′</m:t>
+        </m:r>
+        <m:d>
+          <m:dPr>
+            <m:begChr m:val="("/>
+            <m:endChr m:val=")"/>
+            <m:sepChr m:val=""/>
+            <m:grow/>
+          </m:dPr>
+          <m:e>
+            <m:r>
+              <m:t>η</m:t>
+            </m:r>
+          </m:e>
+        </m:d>
+        <m:d>
+          <m:dPr>
+            <m:begChr m:val="("/>
+            <m:endChr m:val=")"/>
+            <m:sepChr m:val=""/>
+            <m:grow/>
+          </m:dPr>
+          <m:e>
+            <m:r>
+              <m:t>r</m:t>
+            </m:r>
+            <m:r>
+              <m:rPr>
+                <m:sty m:val="p"/>
+              </m:rPr>
+              <m:t>+</m:t>
+            </m:r>
+            <m:r>
+              <m:t>η</m:t>
+            </m:r>
+          </m:e>
+        </m:d>
+        <m:r>
+          <m:rPr>
+            <m:sty m:val="p"/>
+          </m:rPr>
+          <m:t>=</m:t>
+        </m:r>
+        <m:r>
+          <m:t>N</m:t>
+        </m:r>
+        <m:d>
+          <m:dPr>
+            <m:begChr m:val="("/>
+            <m:endChr m:val=")"/>
+            <m:sepChr m:val=""/>
+            <m:grow/>
+          </m:dPr>
+          <m:e>
+            <m:r>
+              <m:t>η</m:t>
+            </m:r>
+          </m:e>
+        </m:d>
+      </m:oMath>
+      <w:r>
+        <w:t xml:space="preserve"> </w:t>
+      </w:r>
+      <w:r>
+        <w:t xml:space="preserve">reads</w:t>
+      </w:r>
+      <w:r>
+        <w:t xml:space="preserve"> </w:t>
+      </w:r>
+      <m:oMath>
+        <m:d>
+          <m:dPr>
+            <m:begChr m:val="("/>
+            <m:endChr m:val=")"/>
+            <m:sepChr m:val=""/>
+            <m:grow/>
+          </m:dPr>
+          <m:e>
+            <m:r>
+              <m:t>G</m:t>
+            </m:r>
+            <m:r>
+              <m:rPr>
+                <m:sty m:val="p"/>
+              </m:rPr>
+              <m:t>−</m:t>
+            </m:r>
+            <m:r>
+              <m:t>K</m:t>
+            </m:r>
+            <m:r>
+              <m:t>η</m:t>
+            </m:r>
+          </m:e>
+        </m:d>
+        <m:d>
+          <m:dPr>
+            <m:begChr m:val="("/>
+            <m:endChr m:val=")"/>
+            <m:sepChr m:val=""/>
+            <m:grow/>
+          </m:dPr>
+          <m:e>
+            <m:r>
+              <m:t>r</m:t>
+            </m:r>
+            <m:r>
+              <m:rPr>
+                <m:sty m:val="p"/>
+              </m:rPr>
+              <m:t>+</m:t>
+            </m:r>
+            <m:r>
+              <m:t>η</m:t>
+            </m:r>
+          </m:e>
+        </m:d>
+        <m:r>
+          <m:rPr>
+            <m:sty m:val="p"/>
+          </m:rPr>
+          <m:t>=</m:t>
+        </m:r>
+        <m:r>
+          <m:t>G</m:t>
+        </m:r>
+        <m:r>
+          <m:t>η</m:t>
+        </m:r>
+        <m:r>
+          <m:rPr>
+            <m:sty m:val="p"/>
+          </m:rPr>
+          <m:t>−</m:t>
+        </m:r>
+        <m:r>
+          <m:t>K</m:t>
+        </m:r>
+        <m:sSup>
+          <m:e>
+            <m:r>
+              <m:t>η</m:t>
+            </m:r>
+          </m:e>
+          <m:sup>
+            <m:r>
+              <m:t>2</m:t>
+            </m:r>
+          </m:sup>
+        </m:sSup>
+        <m:r>
+          <m:rPr>
+            <m:sty m:val="p"/>
+          </m:rPr>
+          <m:t>/</m:t>
+        </m:r>
+        <m:r>
+          <m:t>2</m:t>
+        </m:r>
+      </m:oMath>
+      <w:r>
+        <w:t xml:space="preserve">, which simplifies to</w:t>
+      </w:r>
+      <w:r>
+        <w:t xml:space="preserve"> </w:t>
+      </w:r>
+      <m:oMath>
+        <m:sSup>
+          <m:e>
+            <m:r>
+              <m:t>η</m:t>
+            </m:r>
+          </m:e>
+          <m:sup>
+            <m:r>
+              <m:t>2</m:t>
+            </m:r>
+          </m:sup>
+        </m:sSup>
+        <m:r>
+          <m:rPr>
+            <m:sty m:val="p"/>
+          </m:rPr>
+          <m:t>+</m:t>
+        </m:r>
+        <m:r>
+          <m:t>2</m:t>
+        </m:r>
+        <m:r>
+          <m:t>r</m:t>
+        </m:r>
+        <m:r>
+          <m:t>η</m:t>
+        </m:r>
+        <m:r>
+          <m:rPr>
+            <m:sty m:val="p"/>
+          </m:rPr>
+          <m:t>−</m:t>
+        </m:r>
+        <m:r>
+          <m:t>2</m:t>
+        </m:r>
+        <m:r>
+          <m:t>G</m:t>
+        </m:r>
+        <m:r>
+          <m:t>r</m:t>
+        </m:r>
+        <m:r>
+          <m:rPr>
+            <m:sty m:val="p"/>
+          </m:rPr>
+          <m:t>/</m:t>
+        </m:r>
+        <m:r>
+          <m:t>K</m:t>
+        </m:r>
+        <m:r>
+          <m:rPr>
+            <m:sty m:val="p"/>
+          </m:rPr>
+          <m:t>=</m:t>
+        </m:r>
+        <m:r>
+          <m:t>0</m:t>
+        </m:r>
+      </m:oMath>
+      <w:r>
+        <w:t xml:space="preserve">. This quadratic has exactly one positive root, given by (7). Since</w:t>
+      </w:r>
+      <w:r>
+        <w:t xml:space="preserve"> </w:t>
+      </w:r>
+      <m:oMath>
+        <m:r>
+          <m:t>J</m:t>
+        </m:r>
+        <m:d>
+          <m:dPr>
+            <m:begChr m:val="("/>
+            <m:endChr m:val=")"/>
+            <m:sepChr m:val=""/>
+            <m:grow/>
+          </m:dPr>
+          <m:e>
+            <m:r>
+              <m:t>0</m:t>
+            </m:r>
+          </m:e>
+        </m:d>
+        <m:r>
+          <m:rPr>
+            <m:sty m:val="p"/>
+          </m:rPr>
+          <m:t>=</m:t>
+        </m:r>
+        <m:r>
+          <m:t>0</m:t>
+        </m:r>
+      </m:oMath>
+      <w:r>
+        <w:t xml:space="preserve">,</w:t>
+      </w:r>
+      <w:r>
+        <w:t xml:space="preserve"> </w:t>
+      </w:r>
+      <m:oMath>
+        <m:r>
+          <m:t>J</m:t>
+        </m:r>
+        <m:r>
+          <m:rPr>
+            <m:sty m:val="p"/>
+          </m:rPr>
+          <m:t>′</m:t>
+        </m:r>
+        <m:d>
+          <m:dPr>
+            <m:begChr m:val="("/>
+            <m:endChr m:val=")"/>
+            <m:sepChr m:val=""/>
+            <m:grow/>
+          </m:dPr>
+          <m:e>
+            <m:r>
+              <m:t>0</m:t>
+            </m:r>
+          </m:e>
+        </m:d>
+        <m:r>
+          <m:rPr>
+            <m:sty m:val="p"/>
+          </m:rPr>
+          <m:t>=</m:t>
+        </m:r>
+        <m:r>
+          <m:t>G</m:t>
+        </m:r>
+        <m:r>
+          <m:rPr>
+            <m:sty m:val="p"/>
+          </m:rPr>
+          <m:t>/</m:t>
+        </m:r>
+        <m:r>
+          <m:t>r</m:t>
+        </m:r>
+        <m:r>
+          <m:rPr>
+            <m:sty m:val="p"/>
+          </m:rPr>
+          <m:t>&gt;</m:t>
+        </m:r>
+        <m:r>
+          <m:t>0</m:t>
+        </m:r>
+      </m:oMath>
+      <w:r>
+        <w:t xml:space="preserve">, and</w:t>
+      </w:r>
+      <w:r>
+        <w:t xml:space="preserve"> </w:t>
+      </w:r>
+      <m:oMath>
+        <m:r>
+          <m:t>J</m:t>
+        </m:r>
+        <m:r>
+          <m:rPr>
+            <m:sty m:val="p"/>
+          </m:rPr>
+          <m:t>→</m:t>
+        </m:r>
+        <m:r>
+          <m:rPr>
+            <m:sty m:val="p"/>
+          </m:rPr>
+          <m:t>−</m:t>
+        </m:r>
+        <m:r>
+          <m:rPr>
+            <m:sty m:val="p"/>
+          </m:rPr>
+          <m:t>∞</m:t>
+        </m:r>
+      </m:oMath>
+      <w:r>
+        <w:t xml:space="preserve"> </w:t>
+      </w:r>
+      <w:r>
+        <w:t xml:space="preserve">as</w:t>
+      </w:r>
+      <w:r>
+        <w:t xml:space="preserve"> </w:t>
+      </w:r>
+      <m:oMath>
+        <m:r>
+          <m:t>η</m:t>
+        </m:r>
+        <m:r>
+          <m:rPr>
+            <m:sty m:val="p"/>
+          </m:rPr>
+          <m:t>→</m:t>
+        </m:r>
+        <m:r>
+          <m:rPr>
+            <m:sty m:val="p"/>
+          </m:rPr>
+          <m:t>∞</m:t>
+        </m:r>
+      </m:oMath>
+      <w:r>
+        <w:t xml:space="preserve">, that root is the global maximum on</w:t>
+      </w:r>
+      <w:r>
+        <w:t xml:space="preserve"> </w:t>
+      </w:r>
+      <m:oMath>
+        <m:r>
+          <m:t>η</m:t>
+        </m:r>
+        <m:r>
+          <m:rPr>
+            <m:sty m:val="p"/>
+          </m:rPr>
+          <m:t>≥</m:t>
+        </m:r>
+        <m:r>
+          <m:t>0</m:t>
+        </m:r>
+      </m:oMath>
+      <w:r>
+        <w:t xml:space="preserve">. Equation (7) shows directly that</w:t>
+      </w:r>
+      <w:r>
+        <w:t xml:space="preserve"> </w:t>
+      </w:r>
+      <m:oMath>
+        <m:sSup>
+          <m:e>
+            <m:r>
+              <m:t>η</m:t>
+            </m:r>
+          </m:e>
+          <m:sup>
+            <m:r>
+              <m:rPr>
+                <m:sty m:val="p"/>
+              </m:rPr>
+              <m:t>*</m:t>
+            </m:r>
+          </m:sup>
+        </m:sSup>
+      </m:oMath>
+      <w:r>
+        <w:t xml:space="preserve"> </w:t>
+      </w:r>
+      <w:r>
+        <w:t xml:space="preserve">increases in</w:t>
+      </w:r>
+      <w:r>
+        <w:t xml:space="preserve"> </w:t>
+      </w:r>
+      <m:oMath>
+        <m:r>
+          <m:t>G</m:t>
+        </m:r>
+      </m:oMath>
+      <w:r>
+        <w:t xml:space="preserve"> </w:t>
+      </w:r>
+      <w:r>
+        <w:t xml:space="preserve">and decreases in</w:t>
+      </w:r>
+      <w:r>
+        <w:t xml:space="preserve"> </w:t>
+      </w:r>
+      <m:oMath>
+        <m:r>
+          <m:t>K</m:t>
+        </m:r>
+      </m:oMath>
+      <w:r>
+        <w:t xml:space="preserve">, and</w:t>
+      </w:r>
+      <w:r>
+        <w:t xml:space="preserve"> </w:t>
+      </w:r>
+      <m:oMath>
+        <m:r>
+          <m:t>K</m:t>
+        </m:r>
+        <m:d>
+          <m:dPr>
+            <m:begChr m:val="("/>
+            <m:endChr m:val=")"/>
+            <m:sepChr m:val=""/>
+            <m:grow/>
+          </m:dPr>
+          <m:e>
+            <m:r>
+              <m:t>s</m:t>
+            </m:r>
+          </m:e>
+        </m:d>
+        <m:r>
+          <m:rPr>
+            <m:sty m:val="p"/>
+          </m:rPr>
+          <m:t>=</m:t>
+        </m:r>
+        <m:r>
+          <m:t>k</m:t>
+        </m:r>
+        <m:r>
+          <m:rPr>
+            <m:sty m:val="p"/>
+          </m:rPr>
+          <m:t>/</m:t>
+        </m:r>
+        <m:sSup>
+          <m:e>
+            <m:d>
+              <m:dPr>
+                <m:begChr m:val="("/>
+                <m:endChr m:val=")"/>
+                <m:sepChr m:val=""/>
+                <m:grow/>
+              </m:dPr>
+              <m:e>
+                <m:r>
+                  <m:t>1</m:t>
+                </m:r>
+                <m:r>
+                  <m:rPr>
+                    <m:sty m:val="p"/>
+                  </m:rPr>
+                  <m:t>−</m:t>
+                </m:r>
+                <m:r>
+                  <m:t>s</m:t>
+                </m:r>
+              </m:e>
+            </m:d>
+          </m:e>
+          <m:sup>
+            <m:r>
+              <m:t>2</m:t>
+            </m:r>
+          </m:sup>
+        </m:sSup>
+      </m:oMath>
+      <w:r>
+        <w:t xml:space="preserve"> </w:t>
+      </w:r>
+      <w:r>
+        <w:t xml:space="preserve">increases in</w:t>
+      </w:r>
+      <w:r>
+        <w:t xml:space="preserve"> </w:t>
+      </w:r>
+      <m:oMath>
+        <m:r>
+          <m:t>s</m:t>
+        </m:r>
+      </m:oMath>
+      <w:r>
+        <w:t xml:space="preserve">. For</w:t>
+      </w:r>
+      <w:r>
+        <w:t xml:space="preserve"> </w:t>
+      </w:r>
+      <m:oMath>
+        <m:r>
+          <m:t>r</m:t>
+        </m:r>
+      </m:oMath>
+      <w:r>
+        <w:t xml:space="preserve">, differentiate (7) with</w:t>
+      </w:r>
+      <w:r>
+        <w:t xml:space="preserve"> </w:t>
+      </w:r>
+      <m:oMath>
+        <m:r>
+          <m:t>G</m:t>
+        </m:r>
+      </m:oMath>
+      <w:r>
+        <w:t xml:space="preserve"> </w:t>
+      </w:r>
+      <w:r>
+        <w:t xml:space="preserve">and</w:t>
+      </w:r>
+      <w:r>
+        <w:t xml:space="preserve"> </w:t>
+      </w:r>
+      <m:oMath>
+        <m:r>
+          <m:t>K</m:t>
+        </m:r>
+      </m:oMath>
+      <w:r>
+        <w:t xml:space="preserve"> </w:t>
+      </w:r>
+      <w:r>
+        <w:t xml:space="preserve">fixed:</w:t>
+      </w:r>
+      <w:r>
+        <w:t xml:space="preserve"> </w:t>
+      </w:r>
+      <m:oMath>
+        <m:r>
+          <m:rPr>
+            <m:sty m:val="p"/>
+          </m:rPr>
+          <m:t>∂</m:t>
+        </m:r>
+        <m:sSup>
+          <m:e>
+            <m:r>
+              <m:t>η</m:t>
+            </m:r>
+          </m:e>
+          <m:sup>
+            <m:r>
+              <m:rPr>
+                <m:sty m:val="p"/>
+              </m:rPr>
+              <m:t>*</m:t>
+            </m:r>
+          </m:sup>
+        </m:sSup>
+        <m:r>
+          <m:rPr>
+            <m:sty m:val="p"/>
+          </m:rPr>
+          <m:t>/</m:t>
+        </m:r>
+        <m:r>
+          <m:rPr>
+            <m:sty m:val="p"/>
+          </m:rPr>
+          <m:t>∂</m:t>
+        </m:r>
+        <m:r>
+          <m:t>r</m:t>
+        </m:r>
+        <m:r>
+          <m:rPr>
+            <m:sty m:val="p"/>
+          </m:rPr>
+          <m:t>=</m:t>
+        </m:r>
+        <m:r>
+          <m:rPr>
+            <m:sty m:val="p"/>
+          </m:rPr>
+          <m:t>−</m:t>
+        </m:r>
+        <m:r>
+          <m:t>1</m:t>
+        </m:r>
+        <m:r>
+          <m:rPr>
+            <m:sty m:val="p"/>
+          </m:rPr>
+          <m:t>+</m:t>
+        </m:r>
+        <m:d>
+          <m:dPr>
+            <m:begChr m:val="("/>
+            <m:endChr m:val=")"/>
+            <m:sepChr m:val=""/>
+            <m:grow/>
+          </m:dPr>
+          <m:e>
+            <m:r>
+              <m:t>r</m:t>
+            </m:r>
+            <m:r>
+              <m:rPr>
+                <m:sty m:val="p"/>
+              </m:rPr>
+              <m:t>+</m:t>
+            </m:r>
+            <m:r>
+              <m:t>G</m:t>
+            </m:r>
+            <m:r>
+              <m:rPr>
+                <m:sty m:val="p"/>
+              </m:rPr>
+              <m:t>/</m:t>
+            </m:r>
+            <m:r>
+              <m:t>K</m:t>
+            </m:r>
+          </m:e>
+        </m:d>
+        <m:r>
+          <m:rPr>
+            <m:sty m:val="p"/>
+          </m:rPr>
+          <m:t>/</m:t>
+        </m:r>
+        <m:rad>
+          <m:radPr>
+            <m:degHide m:val="on"/>
+          </m:radPr>
+          <m:deg/>
+          <m:e>
+            <m:sSup>
+              <m:e>
+                <m:r>
+                  <m:t>r</m:t>
+                </m:r>
+              </m:e>
+              <m:sup>
+                <m:r>
+                  <m:t>2</m:t>
+                </m:r>
+              </m:sup>
+            </m:sSup>
+            <m:r>
+              <m:rPr>
+                <m:sty m:val="p"/>
+              </m:rPr>
+              <m:t>+</m:t>
+            </m:r>
+            <m:r>
+              <m:t>2</m:t>
+            </m:r>
+            <m:r>
+              <m:t>G</m:t>
+            </m:r>
+            <m:r>
+              <m:t>r</m:t>
+            </m:r>
+            <m:r>
+              <m:rPr>
+                <m:sty m:val="p"/>
+              </m:rPr>
+              <m:t>/</m:t>
+            </m:r>
+            <m:r>
+              <m:t>K</m:t>
+            </m:r>
+          </m:e>
+        </m:rad>
+      </m:oMath>
+      <w:r>
+        <w:t xml:space="preserve">. Because</w:t>
+      </w:r>
+      <w:r>
+        <w:t xml:space="preserve"> </w:t>
+      </w:r>
+      <m:oMath>
+        <m:sSup>
+          <m:e>
+            <m:d>
+              <m:dPr>
+                <m:begChr m:val="("/>
+                <m:endChr m:val=")"/>
+                <m:sepChr m:val=""/>
+                <m:grow/>
+              </m:dPr>
+              <m:e>
+                <m:r>
+                  <m:t>r</m:t>
+                </m:r>
+                <m:r>
+                  <m:rPr>
+                    <m:sty m:val="p"/>
+                  </m:rPr>
+                  <m:t>+</m:t>
+                </m:r>
+                <m:r>
+                  <m:t>G</m:t>
+                </m:r>
+                <m:r>
+                  <m:rPr>
+                    <m:sty m:val="p"/>
+                  </m:rPr>
+                  <m:t>/</m:t>
+                </m:r>
+                <m:r>
+                  <m:t>K</m:t>
+                </m:r>
+              </m:e>
+            </m:d>
+          </m:e>
+          <m:sup>
+            <m:r>
+              <m:t>2</m:t>
+            </m:r>
+          </m:sup>
+        </m:sSup>
+        <m:r>
+          <m:rPr>
+            <m:sty m:val="p"/>
+          </m:rPr>
+          <m:t>=</m:t>
+        </m:r>
+        <m:sSup>
+          <m:e>
+            <m:r>
+              <m:t>r</m:t>
+            </m:r>
+          </m:e>
+          <m:sup>
+            <m:r>
+              <m:t>2</m:t>
+            </m:r>
+          </m:sup>
+        </m:sSup>
+        <m:r>
+          <m:rPr>
+            <m:sty m:val="p"/>
+          </m:rPr>
+          <m:t>+</m:t>
+        </m:r>
+        <m:r>
+          <m:t>2</m:t>
+        </m:r>
+        <m:r>
+          <m:t>G</m:t>
+        </m:r>
+        <m:r>
+          <m:t>r</m:t>
+        </m:r>
+        <m:r>
+          <m:rPr>
+            <m:sty m:val="p"/>
+          </m:rPr>
+          <m:t>/</m:t>
+        </m:r>
+        <m:r>
+          <m:t>K</m:t>
+        </m:r>
+        <m:r>
+          <m:rPr>
+            <m:sty m:val="p"/>
+          </m:rPr>
+          <m:t>+</m:t>
+        </m:r>
+        <m:sSup>
+          <m:e>
+            <m:r>
+              <m:t>G</m:t>
+            </m:r>
+          </m:e>
+          <m:sup>
+            <m:r>
+              <m:t>2</m:t>
+            </m:r>
+          </m:sup>
+        </m:sSup>
+        <m:r>
+          <m:rPr>
+            <m:sty m:val="p"/>
+          </m:rPr>
+          <m:t>/</m:t>
+        </m:r>
+        <m:sSup>
+          <m:e>
+            <m:r>
+              <m:t>K</m:t>
+            </m:r>
+          </m:e>
+          <m:sup>
+            <m:r>
+              <m:t>2</m:t>
+            </m:r>
+          </m:sup>
+        </m:sSup>
+        <m:r>
+          <m:rPr>
+            <m:sty m:val="p"/>
+          </m:rPr>
+          <m:t>&gt;</m:t>
+        </m:r>
+        <m:sSup>
+          <m:e>
+            <m:r>
+              <m:t>r</m:t>
+            </m:r>
+          </m:e>
+          <m:sup>
+            <m:r>
+              <m:t>2</m:t>
+            </m:r>
+          </m:sup>
+        </m:sSup>
+        <m:r>
+          <m:rPr>
+            <m:sty m:val="p"/>
+          </m:rPr>
+          <m:t>+</m:t>
+        </m:r>
+        <m:r>
+          <m:t>2</m:t>
+        </m:r>
+        <m:r>
+          <m:t>G</m:t>
+        </m:r>
+        <m:r>
+          <m:t>r</m:t>
+        </m:r>
+        <m:r>
+          <m:rPr>
+            <m:sty m:val="p"/>
+          </m:rPr>
+          <m:t>/</m:t>
+        </m:r>
+        <m:r>
+          <m:t>K</m:t>
+        </m:r>
+      </m:oMath>
+      <w:r>
+        <w:t xml:space="preserve">, the derivative is positive. Finally, the first-order condition implies</w:t>
+      </w:r>
+      <w:r>
+        <w:t xml:space="preserve"> </w:t>
+      </w:r>
+      <m:oMath>
+        <m:sSup>
+          <m:e>
+            <m:r>
+              <m:t>J</m:t>
+            </m:r>
+          </m:e>
+          <m:sup>
+            <m:r>
+              <m:rPr>
+                <m:sty m:val="p"/>
+              </m:rPr>
+              <m:t>*</m:t>
+            </m:r>
+          </m:sup>
+        </m:sSup>
+        <m:r>
+          <m:rPr>
+            <m:sty m:val="p"/>
+          </m:rPr>
+          <m:t>=</m:t>
+        </m:r>
+        <m:r>
+          <m:t>N</m:t>
+        </m:r>
+        <m:r>
+          <m:rPr>
+            <m:sty m:val="p"/>
+          </m:rPr>
+          <m:t>′</m:t>
+        </m:r>
+        <m:d>
+          <m:dPr>
+            <m:begChr m:val="("/>
+            <m:endChr m:val=")"/>
+            <m:sepChr m:val=""/>
+            <m:grow/>
+          </m:dPr>
+          <m:e>
+            <m:sSup>
+              <m:e>
+                <m:r>
+                  <m:t>η</m:t>
+                </m:r>
+              </m:e>
+              <m:sup>
+                <m:r>
+                  <m:rPr>
+                    <m:sty m:val="p"/>
+                  </m:rPr>
+                  <m:t>*</m:t>
+                </m:r>
+              </m:sup>
+            </m:sSup>
+          </m:e>
+        </m:d>
+        <m:r>
+          <m:rPr>
+            <m:sty m:val="p"/>
+          </m:rPr>
+          <m:t>=</m:t>
+        </m:r>
+        <m:r>
+          <m:t>G</m:t>
+        </m:r>
+        <m:r>
+          <m:rPr>
+            <m:sty m:val="p"/>
+          </m:rPr>
+          <m:t>−</m:t>
+        </m:r>
+        <m:r>
+          <m:t>K</m:t>
+        </m:r>
+        <m:sSup>
+          <m:e>
+            <m:r>
+              <m:t>η</m:t>
+            </m:r>
+          </m:e>
+          <m:sup>
+            <m:r>
+              <m:rPr>
+                <m:sty m:val="p"/>
+              </m:rPr>
+              <m:t>*</m:t>
+            </m:r>
+          </m:sup>
+        </m:sSup>
+      </m:oMath>
+      <w:r>
+        <w:t xml:space="preserve">, which is used in the text.</w:t>
+      </w:r>
+      <w:r>
+        <w:t xml:space="preserve"> </w:t>
+      </w:r>
+      <m:oMath>
+        <m:r>
+          <m:rPr>
+            <m:sty m:val="p"/>
+          </m:rPr>
+          <m:t>◼</m:t>
+        </m:r>
+      </m:oMath>
+    </w:p>
+    <w:p>
+      <w:pPr>
+        <w:pStyle w:val="BodyText"/>
+      </w:pPr>
+      <w:r>
+        <w:rPr>
+          <w:bCs/>
+          <w:b/>
+        </w:rPr>
+        <w:t xml:space="preserve">Proof of Proposition 7.</w:t>
+      </w:r>
+      <w:r>
+        <w:t xml:space="preserve"> </w:t>
+      </w:r>
+      <w:r>
+        <w:t xml:space="preserve">By Proposition 6,</w:t>
+      </w:r>
+      <w:r>
+        <w:t xml:space="preserve"> </w:t>
+      </w:r>
+      <m:oMath>
+        <m:sSup>
+          <m:e>
+            <m:r>
+              <m:t>η</m:t>
+            </m:r>
+          </m:e>
+          <m:sup>
+            <m:r>
+              <m:rPr>
+                <m:sty m:val="p"/>
+              </m:rPr>
+              <m:t>*</m:t>
+            </m:r>
+          </m:sup>
+        </m:sSup>
+        <m:d>
+          <m:dPr>
+            <m:begChr m:val="("/>
+            <m:endChr m:val=")"/>
+            <m:sepChr m:val=""/>
+            <m:grow/>
+          </m:dPr>
+          <m:e>
+            <m:r>
+              <m:t>s</m:t>
+            </m:r>
+          </m:e>
+        </m:d>
+      </m:oMath>
+      <w:r>
+        <w:t xml:space="preserve"> </w:t>
+      </w:r>
+      <w:r>
+        <w:t xml:space="preserve">is decreasing in</w:t>
+      </w:r>
+      <w:r>
+        <w:t xml:space="preserve"> </w:t>
+      </w:r>
+      <m:oMath>
+        <m:r>
+          <m:t>s</m:t>
+        </m:r>
+      </m:oMath>
+      <w:r>
+        <w:t xml:space="preserve">, and</w:t>
+      </w:r>
+      <w:r>
+        <w:t xml:space="preserve"> </w:t>
+      </w:r>
+      <m:oMath>
+        <m:r>
+          <m:t>R</m:t>
+        </m:r>
+        <m:r>
+          <m:rPr>
+            <m:sty m:val="p"/>
+          </m:rPr>
+          <m:t>/</m:t>
+        </m:r>
+        <m:d>
+          <m:dPr>
+            <m:begChr m:val="("/>
+            <m:endChr m:val=")"/>
+            <m:sepChr m:val=""/>
+            <m:grow/>
+          </m:dPr>
+          <m:e>
+            <m:r>
+              <m:t>r</m:t>
+            </m:r>
+            <m:r>
+              <m:rPr>
+                <m:sty m:val="p"/>
+              </m:rPr>
+              <m:t>+</m:t>
+            </m:r>
+            <m:r>
+              <m:t>η</m:t>
+            </m:r>
+          </m:e>
+        </m:d>
+      </m:oMath>
+      <w:r>
+        <w:t xml:space="preserve"> </w:t>
+      </w:r>
+      <w:r>
+        <w:t xml:space="preserve">is decreasing in</w:t>
+      </w:r>
+      <w:r>
+        <w:t xml:space="preserve"> </w:t>
+      </w:r>
+      <m:oMath>
+        <m:r>
+          <m:t>η</m:t>
+        </m:r>
+      </m:oMath>
+      <w:r>
+        <w:t xml:space="preserve">, so</w:t>
+      </w:r>
+      <w:r>
+        <w:t xml:space="preserve"> </w:t>
+      </w:r>
+      <m:oMath>
+        <m:r>
+          <m:t>R</m:t>
+        </m:r>
+        <m:r>
+          <m:rPr>
+            <m:sty m:val="p"/>
+          </m:rPr>
+          <m:t>/</m:t>
+        </m:r>
+        <m:d>
+          <m:dPr>
+            <m:begChr m:val="("/>
+            <m:endChr m:val=")"/>
+            <m:sepChr m:val=""/>
+            <m:grow/>
+          </m:dPr>
+          <m:e>
+            <m:r>
+              <m:t>r</m:t>
+            </m:r>
+            <m:r>
+              <m:rPr>
+                <m:sty m:val="p"/>
+              </m:rPr>
+              <m:t>+</m:t>
+            </m:r>
+            <m:sSup>
+              <m:e>
+                <m:r>
+                  <m:t>η</m:t>
+                </m:r>
+              </m:e>
+              <m:sup>
+                <m:r>
+                  <m:rPr>
+                    <m:sty m:val="p"/>
+                  </m:rPr>
+                  <m:t>*</m:t>
+                </m:r>
+              </m:sup>
+            </m:sSup>
+            <m:d>
+              <m:dPr>
+                <m:begChr m:val="("/>
+                <m:endChr m:val=")"/>
+                <m:sepChr m:val=""/>
+                <m:grow/>
+              </m:dPr>
+              <m:e>
+                <m:r>
+                  <m:t>s</m:t>
+                </m:r>
+              </m:e>
+            </m:d>
+          </m:e>
+        </m:d>
+      </m:oMath>
+      <w:r>
+        <w:t xml:space="preserve"> </w:t>
+      </w:r>
+      <w:r>
+        <w:t xml:space="preserve">is increasing in</w:t>
+      </w:r>
+      <w:r>
+        <w:t xml:space="preserve"> </w:t>
+      </w:r>
+      <m:oMath>
+        <m:r>
+          <m:t>s</m:t>
+        </m:r>
+      </m:oMath>
+      <w:r>
+        <w:t xml:space="preserve">. The investment condition compares this present value with</w:t>
+      </w:r>
+      <w:r>
+        <w:t xml:space="preserve"> </w:t>
+      </w:r>
+      <m:oMath>
+        <m:r>
+          <m:t>g</m:t>
+        </m:r>
+        <m:d>
+          <m:dPr>
+            <m:begChr m:val="("/>
+            <m:endChr m:val=")"/>
+            <m:sepChr m:val=""/>
+            <m:grow/>
+          </m:dPr>
+          <m:e>
+            <m:sSub>
+              <m:e>
+                <m:r>
+                  <m:t>O</m:t>
+                </m:r>
+              </m:e>
+              <m:sub>
+                <m:r>
+                  <m:t>j</m:t>
+                </m:r>
+              </m:sub>
+            </m:sSub>
+          </m:e>
+        </m:d>
+      </m:oMath>
+      <w:r>
+        <w:t xml:space="preserve">, so the set of</w:t>
+      </w:r>
+      <w:r>
+        <w:t xml:space="preserve"> </w:t>
+      </w:r>
+      <m:oMath>
+        <m:sSub>
+          <m:e>
+            <m:r>
+              <m:t>O</m:t>
+            </m:r>
+          </m:e>
+          <m:sub>
+            <m:r>
+              <m:t>j</m:t>
+            </m:r>
+          </m:sub>
+        </m:sSub>
+      </m:oMath>
+      <w:r>
+        <w:t xml:space="preserve"> </w:t>
+      </w:r>
+      <w:r>
+        <w:t xml:space="preserve">for which it holds is larger at higher</w:t>
+      </w:r>
+      <w:r>
+        <w:t xml:space="preserve"> </w:t>
+      </w:r>
+      <m:oMath>
+        <m:r>
+          <m:t>s</m:t>
+        </m:r>
+      </m:oMath>
+      <w:r>
+        <w:t xml:space="preserve">. For any</w:t>
+      </w:r>
+      <w:r>
+        <w:t xml:space="preserve"> </w:t>
+      </w:r>
+      <m:oMath>
+        <m:sSub>
+          <m:e>
+            <m:r>
+              <m:t>O</m:t>
+            </m:r>
+          </m:e>
+          <m:sub>
+            <m:r>
+              <m:t>j</m:t>
+            </m:r>
+          </m:sub>
+        </m:sSub>
+      </m:oMath>
+      <w:r>
+        <w:t xml:space="preserve"> </w:t>
+      </w:r>
+      <w:r>
+        <w:t xml:space="preserve">with</w:t>
+      </w:r>
+      <w:r>
+        <w:t xml:space="preserve"> </w:t>
+      </w:r>
+      <m:oMath>
+        <m:r>
+          <m:t>R</m:t>
+        </m:r>
+        <m:r>
+          <m:rPr>
+            <m:sty m:val="p"/>
+          </m:rPr>
+          <m:t>/</m:t>
+        </m:r>
+        <m:d>
+          <m:dPr>
+            <m:begChr m:val="("/>
+            <m:endChr m:val=")"/>
+            <m:sepChr m:val=""/>
+            <m:grow/>
+          </m:dPr>
+          <m:e>
+            <m:r>
+              <m:t>r</m:t>
+            </m:r>
+            <m:r>
+              <m:rPr>
+                <m:sty m:val="p"/>
+              </m:rPr>
+              <m:t>+</m:t>
+            </m:r>
+            <m:sSup>
+              <m:e>
+                <m:r>
+                  <m:t>η</m:t>
+                </m:r>
+              </m:e>
+              <m:sup>
+                <m:r>
+                  <m:rPr>
+                    <m:sty m:val="p"/>
+                  </m:rPr>
+                  <m:t>*</m:t>
+                </m:r>
+              </m:sup>
+            </m:sSup>
+            <m:d>
+              <m:dPr>
+                <m:begChr m:val="("/>
+                <m:endChr m:val=")"/>
+                <m:sepChr m:val=""/>
+                <m:grow/>
+              </m:dPr>
+              <m:e>
+                <m:r>
+                  <m:t>0</m:t>
+                </m:r>
+              </m:e>
+            </m:d>
+          </m:e>
+        </m:d>
+        <m:r>
+          <m:rPr>
+            <m:sty m:val="p"/>
+          </m:rPr>
+          <m:t>&lt;</m:t>
+        </m:r>
+        <m:r>
+          <m:t>g</m:t>
+        </m:r>
+        <m:d>
+          <m:dPr>
+            <m:begChr m:val="("/>
+            <m:endChr m:val=")"/>
+            <m:sepChr m:val=""/>
+            <m:grow/>
+          </m:dPr>
+          <m:e>
+            <m:sSub>
+              <m:e>
+                <m:r>
+                  <m:t>O</m:t>
+                </m:r>
+              </m:e>
+              <m:sub>
+                <m:r>
+                  <m:t>j</m:t>
+                </m:r>
+              </m:sub>
+            </m:sSub>
+          </m:e>
+        </m:d>
+        <m:r>
+          <m:rPr>
+            <m:sty m:val="p"/>
+          </m:rPr>
+          <m:t>≤</m:t>
+        </m:r>
+        <m:r>
+          <m:t>R</m:t>
+        </m:r>
+        <m:r>
+          <m:rPr>
+            <m:sty m:val="p"/>
+          </m:rPr>
+          <m:t>/</m:t>
+        </m:r>
+        <m:d>
+          <m:dPr>
+            <m:begChr m:val="("/>
+            <m:endChr m:val=")"/>
+            <m:sepChr m:val=""/>
+            <m:grow/>
+          </m:dPr>
+          <m:e>
+            <m:r>
+              <m:t>r</m:t>
+            </m:r>
+            <m:r>
+              <m:rPr>
+                <m:sty m:val="p"/>
+              </m:rPr>
+              <m:t>+</m:t>
+            </m:r>
+            <m:sSup>
+              <m:e>
+                <m:r>
+                  <m:t>η</m:t>
+                </m:r>
+              </m:e>
+              <m:sup>
+                <m:r>
+                  <m:rPr>
+                    <m:sty m:val="p"/>
+                  </m:rPr>
+                  <m:t>*</m:t>
+                </m:r>
+              </m:sup>
+            </m:sSup>
+            <m:d>
+              <m:dPr>
+                <m:begChr m:val="("/>
+                <m:endChr m:val=")"/>
+                <m:sepChr m:val=""/>
+                <m:grow/>
+              </m:dPr>
+              <m:e>
+                <m:r>
+                  <m:t>s</m:t>
+                </m:r>
+              </m:e>
+            </m:d>
+          </m:e>
+        </m:d>
+      </m:oMath>
+      <w:r>
+        <w:t xml:space="preserve">, the investment is made only with protection.</w:t>
+      </w:r>
+      <w:r>
+        <w:t xml:space="preserve"> </w:t>
+      </w:r>
+      <m:oMath>
+        <m:r>
+          <m:rPr>
+            <m:sty m:val="p"/>
+          </m:rPr>
+          <m:t>◼</m:t>
+        </m:r>
+      </m:oMath>
+    </w:p>
+    <w:bookmarkEnd w:id="50"/>
+    <w:bookmarkStart w:id="51" w:name="references"/>
     <w:p>
       <w:pPr>
         <w:pStyle w:val="Heading1"/>
@@ -10023,6 +14249,30 @@
         <w:pStyle w:val="BodyText"/>
       </w:pPr>
       <w:r>
+        <w:t xml:space="preserve">Grossman, S. J., and Hart, O. D. 1986. The costs and benefits of ownership: A theory of vertical and lateral integration.</w:t>
+      </w:r>
+      <w:r>
+        <w:t xml:space="preserve"> </w:t>
+      </w:r>
+      <w:r>
+        <w:rPr>
+          <w:iCs/>
+          <w:i/>
+        </w:rPr>
+        <w:t xml:space="preserve">Journal of Political Economy</w:t>
+      </w:r>
+      <w:r>
+        <w:t xml:space="preserve"> </w:t>
+      </w:r>
+      <w:r>
+        <w:t xml:space="preserve">94(4):691–719.</w:t>
+      </w:r>
+    </w:p>
+    <w:p>
+      <w:pPr>
+        <w:pStyle w:val="BodyText"/>
+      </w:pPr>
+      <w:r>
         <w:t xml:space="preserve">Gundlach, H., Lynch, J., Mertens, M., and Thompson, N. 2026. The price of progress: Price performance and the future of AI. Preprint, arXiv:2511.23455v2.</w:t>
       </w:r>
     </w:p>
@@ -10063,6 +14313,30 @@
         <w:pStyle w:val="BodyText"/>
       </w:pPr>
       <w:r>
+        <w:t xml:space="preserve">Klein, B., Crawford, R. G., and Alchian, A. A. 1978. Vertical integration, appropriable rents, and the competitive contracting process.</w:t>
+      </w:r>
+      <w:r>
+        <w:t xml:space="preserve"> </w:t>
+      </w:r>
+      <w:r>
+        <w:rPr>
+          <w:iCs/>
+          <w:i/>
+        </w:rPr>
+        <w:t xml:space="preserve">Journal of Law and Economics</w:t>
+      </w:r>
+      <w:r>
+        <w:t xml:space="preserve"> </w:t>
+      </w:r>
+      <w:r>
+        <w:t xml:space="preserve">21(2):297–326.</w:t>
+      </w:r>
+    </w:p>
+    <w:p>
+      <w:pPr>
+        <w:pStyle w:val="BodyText"/>
+      </w:pPr>
+      <w:r>
         <w:t xml:space="preserve">Lippman, S. A., and Rumelt, R. P. 1982. Uncertain imitability: An analysis of interfirm differences in efficiency under competition.</w:t>
       </w:r>
       <w:r>
@@ -10531,7 +14805,7 @@
         <w:t xml:space="preserve">, June 16. https://www.wheresyoured.at/exclusive-openai-financials/.</w:t>
       </w:r>
     </w:p>
-    <w:bookmarkEnd w:id="50"/>
+    <w:bookmarkEnd w:id="51"/>
     <w:sectPr/>
   </w:body>
 </w:document>

</xml_diff>

<commit_message>
Add Section 4.6 on vendor competition (Proposition 8) with proof
Co-Authored-By: Claude Sonnet 5.5 <noreply@anthropic.com>
Claude-Session: https://claude.ai/code/session_01SvJ27oz7kYhWEBfZS3x4ro
</commit_message>
<xml_diff>
--- a/isr/ISR_Who_Profits_from_LLMs.docx
+++ b/isr/ISR_Who_Profits_from_LLMs.docx
@@ -240,7 +240,7 @@
         <w:t xml:space="preserve"> </w:t>
       </w:r>
       <w:r>
-        <w:t xml:space="preserve">and shows how contract terms that limit its use of adopters’ data change that choice and, through it, the adopter’s incentive to invest. How far an adopter can lower</w:t>
+        <w:t xml:space="preserve">and shows how contract terms that limit its use of adopters’ data change that choice and, through it, the adopter’s incentive to invest. Section 4.6 adds competition among vendors, which weakens the effect of such terms. How far an adopter can lower</w:t>
       </w:r>
       <w:r>
         <w:t xml:space="preserve"> </w:t>
@@ -262,7 +262,7 @@
         <w:pStyle w:val="BodyText"/>
       </w:pPr>
       <w:r>
-        <w:t xml:space="preserve">We make three contributions. First, Proposition 5 adds vendor encroachment to the appropriability account of IT value and shows that, for a technology whose supplier can enter the adopter’s layer, the adopter’s profitable window depends on the supplier’s behavior as well as on rivals’. Propositions 6 and 7 extend the result by endogenizing</w:t>
+        <w:t xml:space="preserve">We make three contributions. First, Proposition 5 adds vendor encroachment to the appropriability account of IT value and shows that, for a technology whose supplier can enter the adopter’s layer, the adopter’s profitable window depends on the supplier’s behavior as well as on rivals’. Propositions 6 to 8 extend the result by endogenizing</w:t>
       </w:r>
       <w:r>
         <w:t xml:space="preserve"> </w:t>
@@ -273,7 +273,10 @@
         </m:r>
       </m:oMath>
       <w:r>
-        <w:t xml:space="preserve">, and they turn contractual choices about data use, fine-tuning ownership, and deployment into strategic decisions of the kind that Section 7.2 discusses. Second, we place that result in an integrated benchmark across the developer, the adopter, and the consumer, with appropriability defined ex ante as expected imitation lag and cost, which yields testable constructs (quality lead, imitation lag, and organizational capital) that can be measured from public sources. Third, we provide illustrative evidence on these constructs from leaderboard, endpoint-price, and regulatory filing data. The evidence does not bear on Proposition 5 itself and is limited, and we state what it cannot show. For practice, the theory replaces the question that dominates managerial discussion of AI, namely how much to invest, with the question it identifies as decisive: what does the firm own that the model cannot supply, and how long will it take competitors, and the model’s own supplier, to own it as well?</w:t>
+        <w:t xml:space="preserve"> </w:t>
+      </w:r>
+      <w:r>
+        <w:t xml:space="preserve">and allowing vendors to compete, and they turn contractual choices about data use, fine-tuning ownership, and deployment into strategic decisions of the kind that Section 7.2 discusses. Second, we place that result in an integrated benchmark across the developer, the adopter, and the consumer, with appropriability defined ex ante as expected imitation lag and cost, which yields testable constructs (quality lead, imitation lag, and organizational capital) that can be measured from public sources. Third, we provide illustrative evidence on these constructs from leaderboard, endpoint-price, and regulatory filing data. The evidence does not bear on Proposition 5 itself and is limited, and we state what it cannot show. For practice, the theory replaces the question that dominates managerial discussion of AI, namely how much to invest, with the question it identifies as decisive: what does the firm own that the model cannot supply, and how long will it take competitors, and the model’s own supplier, to own it as well?</w:t>
       </w:r>
     </w:p>
     <w:p>
@@ -1118,7 +1121,7 @@
     </w:p>
     <w:bookmarkEnd w:id="30"/>
     <w:bookmarkEnd w:id="31"/>
-    <w:bookmarkStart w:id="37" w:name="model-and-propositions"/>
+    <w:bookmarkStart w:id="38" w:name="model-and-propositions"/>
     <w:p>
       <w:pPr>
         <w:pStyle w:val="Heading1"/>
@@ -2708,7 +2711,7 @@
               <w:jc w:val="left"/>
             </w:pPr>
             <w:r>
-              <w:t xml:space="preserve">Rate at which a vendor productizes a complement builder’s use (Propositions 5 to 7)</w:t>
+              <w:t xml:space="preserve">Rate at which a vendor productizes a complement builder’s use (Propositions 5 to 8)</w:t>
             </w:r>
           </w:p>
         </w:tc>
@@ -2798,6 +2801,34 @@
                 <m:t>μ</m:t>
               </m:r>
             </m:oMath>
+          </w:p>
+        </w:tc>
+      </w:tr>
+      <w:tr>
+        <w:tc>
+          <w:tcPr/>
+          <w:p>
+            <w:pPr>
+              <w:pStyle w:val="Compact"/>
+              <w:jc w:val="left"/>
+            </w:pPr>
+            <m:oMath>
+              <m:r>
+                <m:t>N</m:t>
+              </m:r>
+            </m:oMath>
+          </w:p>
+        </w:tc>
+        <w:tc>
+          <w:tcPr/>
+          <w:p>
+            <w:pPr>
+              <w:pStyle w:val="Compact"/>
+              <w:jc w:val="left"/>
+            </w:pPr>
+            <w:r>
+              <w:t xml:space="preserve">Number of vendors able to productize the same use (Section 4.6)</w:t>
+            </w:r>
           </w:p>
         </w:tc>
       </w:tr>
@@ -7528,7 +7559,7 @@
         <w:t xml:space="preserve"> </w:t>
       </w:r>
       <w:r>
-        <w:t xml:space="preserve">is constant and chosen by a single developer. We do not model competition among vendors for the same use, the adopter’s responses (concealing the use, moving to another vendor), or bargaining over the contract. The functional form</w:t>
+        <w:t xml:space="preserve">is constant and chosen by a single developer. Competition among vendors is added in Section 4.6. We still do not model the adopter’s responses (concealing the use, moving to another vendor) or bargaining over the contract. The functional form</w:t>
       </w:r>
       <w:r>
         <w:t xml:space="preserve"> </w:t>
@@ -7619,8 +7650,1939 @@
       </w:r>
     </w:p>
     <w:bookmarkEnd w:id="36"/>
+    <w:bookmarkStart w:id="37" w:name="competition-among-vendors"/>
+    <w:p>
+      <w:pPr>
+        <w:pStyle w:val="Heading2"/>
+      </w:pPr>
+      <w:r>
+        <w:t xml:space="preserve">4.6 Competition among vendors</w:t>
+      </w:r>
+    </w:p>
+    <w:p>
+      <w:pPr>
+        <w:pStyle w:val="FirstParagraph"/>
+      </w:pPr>
+      <w:r>
+        <w:t xml:space="preserve">Section 4.5 has a single developer decide whether to productize the adopter’s use. In practice, several vendors can see that a use is valuable and build it. We now allow</w:t>
+      </w:r>
+      <w:r>
+        <w:t xml:space="preserve"> </w:t>
+      </w:r>
+      <m:oMath>
+        <m:r>
+          <m:t>N</m:t>
+        </m:r>
+      </m:oMath>
+      <w:r>
+        <w:t xml:space="preserve"> </w:t>
+      </w:r>
+      <w:r>
+        <w:t xml:space="preserve">symmetric vendors to race for the same use.</w:t>
+      </w:r>
+    </w:p>
+    <w:p>
+      <w:pPr>
+        <w:pStyle w:val="BodyText"/>
+      </w:pPr>
+      <w:r>
+        <w:rPr>
+          <w:iCs/>
+          <w:i/>
+        </w:rPr>
+        <w:t xml:space="preserve">Setup.</w:t>
+      </w:r>
+      <w:r>
+        <w:t xml:space="preserve"> </w:t>
+      </w:r>
+      <w:r>
+        <w:t xml:space="preserve">Each vendor</w:t>
+      </w:r>
+      <w:r>
+        <w:t xml:space="preserve"> </w:t>
+      </w:r>
+      <m:oMath>
+        <m:r>
+          <m:t>i</m:t>
+        </m:r>
+      </m:oMath>
+      <w:r>
+        <w:t xml:space="preserve"> </w:t>
+      </w:r>
+      <w:r>
+        <w:t xml:space="preserve">chooses a productization rate</w:t>
+      </w:r>
+      <w:r>
+        <w:t xml:space="preserve"> </w:t>
+      </w:r>
+      <m:oMath>
+        <m:sSub>
+          <m:e>
+            <m:r>
+              <m:t>η</m:t>
+            </m:r>
+          </m:e>
+          <m:sub>
+            <m:r>
+              <m:t>i</m:t>
+            </m:r>
+          </m:sub>
+        </m:sSub>
+      </m:oMath>
+      <w:r>
+        <w:t xml:space="preserve"> </w:t>
+      </w:r>
+      <w:r>
+        <w:t xml:space="preserve">at cost</w:t>
+      </w:r>
+      <w:r>
+        <w:t xml:space="preserve"> </w:t>
+      </w:r>
+      <m:oMath>
+        <m:d>
+          <m:dPr>
+            <m:begChr m:val="("/>
+            <m:endChr m:val=")"/>
+            <m:sepChr m:val=""/>
+            <m:grow/>
+          </m:dPr>
+          <m:e>
+            <m:r>
+              <m:t>K</m:t>
+            </m:r>
+            <m:r>
+              <m:rPr>
+                <m:sty m:val="p"/>
+              </m:rPr>
+              <m:t>/</m:t>
+            </m:r>
+            <m:r>
+              <m:t>2</m:t>
+            </m:r>
+          </m:e>
+        </m:d>
+        <m:sSubSup>
+          <m:e>
+            <m:r>
+              <m:t>η</m:t>
+            </m:r>
+          </m:e>
+          <m:sub>
+            <m:r>
+              <m:t>i</m:t>
+            </m:r>
+          </m:sub>
+          <m:sup>
+            <m:r>
+              <m:t>2</m:t>
+            </m:r>
+          </m:sup>
+        </m:sSubSup>
+      </m:oMath>
+      <w:r>
+        <w:t xml:space="preserve">. The first to productize the use earns</w:t>
+      </w:r>
+      <w:r>
+        <w:t xml:space="preserve"> </w:t>
+      </w:r>
+      <m:oMath>
+        <m:r>
+          <m:t>G</m:t>
+        </m:r>
+      </m:oMath>
+      <w:r>
+        <w:t xml:space="preserve"> </w:t>
+      </w:r>
+      <w:r>
+        <w:t xml:space="preserve">and the others earn nothing, and productization by any vendor ends the adopter’s rent. Rivals’ imitation continues at rate</w:t>
+      </w:r>
+      <w:r>
+        <w:t xml:space="preserve"> </w:t>
+      </w:r>
+      <m:oMath>
+        <m:r>
+          <m:t>μ</m:t>
+        </m:r>
+      </m:oMath>
+      <w:r>
+        <w:t xml:space="preserve">. With</w:t>
+      </w:r>
+      <w:r>
+        <w:t xml:space="preserve"> </w:t>
+      </w:r>
+      <m:oMath>
+        <m:r>
+          <m:t>H</m:t>
+        </m:r>
+        <m:r>
+          <m:rPr>
+            <m:sty m:val="p"/>
+          </m:rPr>
+          <m:t>=</m:t>
+        </m:r>
+        <m:nary>
+          <m:naryPr>
+            <m:chr m:val="∑"/>
+            <m:limLoc m:val="undOvr"/>
+            <m:subHide m:val="off"/>
+            <m:supHide m:val="on"/>
+          </m:naryPr>
+          <m:sub>
+            <m:r>
+              <m:t>i</m:t>
+            </m:r>
+          </m:sub>
+          <m:sup>
+            <m:r>
+              <m:t>​</m:t>
+            </m:r>
+          </m:sup>
+          <m:e>
+            <m:sSub>
+              <m:e>
+                <m:r>
+                  <m:t>η</m:t>
+                </m:r>
+              </m:e>
+              <m:sub>
+                <m:r>
+                  <m:t>i</m:t>
+                </m:r>
+              </m:sub>
+            </m:sSub>
+          </m:e>
+        </m:nary>
+      </m:oMath>
+      <w:r>
+        <w:t xml:space="preserve"> </w:t>
+      </w:r>
+      <w:r>
+        <w:t xml:space="preserve">the total rate, vendor</w:t>
+      </w:r>
+      <w:r>
+        <w:t xml:space="preserve"> </w:t>
+      </w:r>
+      <m:oMath>
+        <m:r>
+          <m:t>i</m:t>
+        </m:r>
+      </m:oMath>
+      <w:r>
+        <w:t xml:space="preserve"> </w:t>
+      </w:r>
+      <w:r>
+        <w:t xml:space="preserve">maximizes</w:t>
+      </w:r>
+    </w:p>
+    <w:p>
+      <w:pPr>
+        <w:pStyle w:val="BodyText"/>
+      </w:pPr>
+      <m:oMathPara>
+        <m:oMathParaPr>
+          <m:jc m:val="center"/>
+        </m:oMathParaPr>
+        <m:oMath>
+          <m:sSub>
+            <m:e>
+              <m:r>
+                <m:t>J</m:t>
+              </m:r>
+            </m:e>
+            <m:sub>
+              <m:r>
+                <m:t>i</m:t>
+              </m:r>
+            </m:sub>
+          </m:sSub>
+          <m:r>
+            <m:rPr>
+              <m:sty m:val="p"/>
+            </m:rPr>
+            <m:t>=</m:t>
+          </m:r>
+          <m:f>
+            <m:fPr>
+              <m:type m:val="bar"/>
+            </m:fPr>
+            <m:num>
+              <m:r>
+                <m:t>G</m:t>
+              </m:r>
+              <m:sSub>
+                <m:e>
+                  <m:r>
+                    <m:t>η</m:t>
+                  </m:r>
+                </m:e>
+                <m:sub>
+                  <m:r>
+                    <m:t>i</m:t>
+                  </m:r>
+                </m:sub>
+              </m:sSub>
+              <m:r>
+                <m:rPr>
+                  <m:sty m:val="p"/>
+                </m:rPr>
+                <m:t>−</m:t>
+              </m:r>
+              <m:r>
+                <m:t>K</m:t>
+              </m:r>
+              <m:sSubSup>
+                <m:e>
+                  <m:r>
+                    <m:t>η</m:t>
+                  </m:r>
+                </m:e>
+                <m:sub>
+                  <m:r>
+                    <m:t>i</m:t>
+                  </m:r>
+                </m:sub>
+                <m:sup>
+                  <m:r>
+                    <m:t>2</m:t>
+                  </m:r>
+                </m:sup>
+              </m:sSubSup>
+              <m:r>
+                <m:rPr>
+                  <m:sty m:val="p"/>
+                </m:rPr>
+                <m:t>/</m:t>
+              </m:r>
+              <m:r>
+                <m:t>2</m:t>
+              </m:r>
+            </m:num>
+            <m:den>
+              <m:r>
+                <m:t>r</m:t>
+              </m:r>
+              <m:r>
+                <m:rPr>
+                  <m:sty m:val="p"/>
+                </m:rPr>
+                <m:t>+</m:t>
+              </m:r>
+              <m:r>
+                <m:t>H</m:t>
+              </m:r>
+            </m:den>
+          </m:f>
+          <m:r>
+            <m:rPr>
+              <m:sty m:val="p"/>
+            </m:rPr>
+            <m:t>.</m:t>
+          </m:r>
+        </m:oMath>
+      </m:oMathPara>
+    </w:p>
+    <w:p>
+      <w:pPr>
+        <w:pStyle w:val="FirstParagraph"/>
+      </w:pPr>
+      <w:r>
+        <w:t xml:space="preserve">For given rivals’ rates this is the problem of Section 4.5 with</w:t>
+      </w:r>
+      <w:r>
+        <w:t xml:space="preserve"> </w:t>
+      </w:r>
+      <m:oMath>
+        <m:r>
+          <m:t>r</m:t>
+        </m:r>
+      </m:oMath>
+      <w:r>
+        <w:t xml:space="preserve"> </w:t>
+      </w:r>
+      <w:r>
+        <w:t xml:space="preserve">replaced by</w:t>
+      </w:r>
+      <w:r>
+        <w:t xml:space="preserve"> </w:t>
+      </w:r>
+      <m:oMath>
+        <m:r>
+          <m:t>r</m:t>
+        </m:r>
+        <m:r>
+          <m:rPr>
+            <m:sty m:val="p"/>
+          </m:rPr>
+          <m:t>+</m:t>
+        </m:r>
+        <m:r>
+          <m:t>H</m:t>
+        </m:r>
+        <m:r>
+          <m:rPr>
+            <m:sty m:val="p"/>
+          </m:rPr>
+          <m:t>−</m:t>
+        </m:r>
+        <m:sSub>
+          <m:e>
+            <m:r>
+              <m:t>η</m:t>
+            </m:r>
+          </m:e>
+          <m:sub>
+            <m:r>
+              <m:t>i</m:t>
+            </m:r>
+          </m:sub>
+        </m:sSub>
+      </m:oMath>
+      <w:r>
+        <w:t xml:space="preserve">.</w:t>
+      </w:r>
+    </w:p>
+    <w:p>
+      <w:pPr>
+        <w:pStyle w:val="BodyText"/>
+      </w:pPr>
+      <w:r>
+        <w:rPr>
+          <w:bCs/>
+          <w:b/>
+        </w:rPr>
+        <w:t xml:space="preserve">Proposition 8 (Vendor competition).</w:t>
+      </w:r>
+      <w:r>
+        <w:t xml:space="preserve"> </w:t>
+      </w:r>
+      <w:r>
+        <w:t xml:space="preserve">The game has a unique equilibrium, and it is symmetric. The common rate</w:t>
+      </w:r>
+      <w:r>
+        <w:t xml:space="preserve"> </w:t>
+      </w:r>
+      <m:oMath>
+        <m:sSup>
+          <m:e>
+            <m:r>
+              <m:t>η</m:t>
+            </m:r>
+          </m:e>
+          <m:sup>
+            <m:r>
+              <m:rPr>
+                <m:sty m:val="p"/>
+              </m:rPr>
+              <m:t>*</m:t>
+            </m:r>
+          </m:sup>
+        </m:sSup>
+        <m:d>
+          <m:dPr>
+            <m:begChr m:val="("/>
+            <m:endChr m:val=")"/>
+            <m:sepChr m:val=""/>
+            <m:grow/>
+          </m:dPr>
+          <m:e>
+            <m:r>
+              <m:t>N</m:t>
+            </m:r>
+          </m:e>
+        </m:d>
+      </m:oMath>
+      <w:r>
+        <w:t xml:space="preserve"> </w:t>
+      </w:r>
+      <w:r>
+        <w:t xml:space="preserve">is the positive root of</w:t>
+      </w:r>
+    </w:p>
+    <w:p>
+      <w:pPr>
+        <w:pStyle w:val="BodyText"/>
+      </w:pPr>
+      <m:oMathPara>
+        <m:oMathParaPr>
+          <m:jc m:val="center"/>
+        </m:oMathParaPr>
+        <m:oMath>
+          <m:r>
+            <m:t>K</m:t>
+          </m:r>
+          <m:d>
+            <m:dPr>
+              <m:begChr m:val="("/>
+              <m:endChr m:val=")"/>
+              <m:sepChr m:val=""/>
+              <m:grow/>
+            </m:dPr>
+            <m:e>
+              <m:r>
+                <m:t>N</m:t>
+              </m:r>
+              <m:r>
+                <m:rPr>
+                  <m:sty m:val="p"/>
+                </m:rPr>
+                <m:t>−</m:t>
+              </m:r>
+              <m:f>
+                <m:fPr>
+                  <m:type m:val="lin"/>
+                </m:fPr>
+                <m:num>
+                  <m:r>
+                    <m:t>1</m:t>
+                  </m:r>
+                </m:num>
+                <m:den>
+                  <m:r>
+                    <m:t>2</m:t>
+                  </m:r>
+                </m:den>
+              </m:f>
+            </m:e>
+          </m:d>
+          <m:sSup>
+            <m:e>
+              <m:r>
+                <m:t>η</m:t>
+              </m:r>
+            </m:e>
+            <m:sup>
+              <m:r>
+                <m:t>2</m:t>
+              </m:r>
+            </m:sup>
+          </m:sSup>
+          <m:r>
+            <m:rPr>
+              <m:sty m:val="p"/>
+            </m:rPr>
+            <m:t>+</m:t>
+          </m:r>
+          <m:d>
+            <m:dPr>
+              <m:begChr m:val="("/>
+              <m:endChr m:val=")"/>
+              <m:sepChr m:val=""/>
+              <m:grow/>
+            </m:dPr>
+            <m:e>
+              <m:r>
+                <m:t>K</m:t>
+              </m:r>
+              <m:r>
+                <m:t>r</m:t>
+              </m:r>
+              <m:r>
+                <m:rPr>
+                  <m:sty m:val="p"/>
+                </m:rPr>
+                <m:t>−</m:t>
+              </m:r>
+              <m:r>
+                <m:t>G</m:t>
+              </m:r>
+              <m:d>
+                <m:dPr>
+                  <m:begChr m:val="("/>
+                  <m:endChr m:val=")"/>
+                  <m:sepChr m:val=""/>
+                  <m:grow/>
+                </m:dPr>
+                <m:e>
+                  <m:r>
+                    <m:t>N</m:t>
+                  </m:r>
+                  <m:r>
+                    <m:rPr>
+                      <m:sty m:val="p"/>
+                    </m:rPr>
+                    <m:t>−</m:t>
+                  </m:r>
+                  <m:r>
+                    <m:t>1</m:t>
+                  </m:r>
+                </m:e>
+              </m:d>
+            </m:e>
+          </m:d>
+          <m:r>
+            <m:t>η</m:t>
+          </m:r>
+          <m:r>
+            <m:rPr>
+              <m:sty m:val="p"/>
+            </m:rPr>
+            <m:t>−</m:t>
+          </m:r>
+          <m:r>
+            <m:t>G</m:t>
+          </m:r>
+          <m:r>
+            <m:t>r</m:t>
+          </m:r>
+          <m:r>
+            <m:rPr>
+              <m:sty m:val="p"/>
+            </m:rPr>
+            <m:t>=</m:t>
+          </m:r>
+          <m:r>
+            <m:t>0</m:t>
+          </m:r>
+          <m:r>
+            <m:rPr>
+              <m:sty m:val="p"/>
+            </m:rPr>
+            <m:t>.</m:t>
+          </m:r>
+        </m:oMath>
+      </m:oMathPara>
+    </w:p>
+    <w:p>
+      <w:pPr>
+        <w:pStyle w:val="FirstParagraph"/>
+      </w:pPr>
+      <w:r>
+        <w:t xml:space="preserve">Both the per-vendor rate</w:t>
+      </w:r>
+      <w:r>
+        <w:t xml:space="preserve"> </w:t>
+      </w:r>
+      <m:oMath>
+        <m:sSup>
+          <m:e>
+            <m:r>
+              <m:t>η</m:t>
+            </m:r>
+          </m:e>
+          <m:sup>
+            <m:r>
+              <m:rPr>
+                <m:sty m:val="p"/>
+              </m:rPr>
+              <m:t>*</m:t>
+            </m:r>
+          </m:sup>
+        </m:sSup>
+        <m:d>
+          <m:dPr>
+            <m:begChr m:val="("/>
+            <m:endChr m:val=")"/>
+            <m:sepChr m:val=""/>
+            <m:grow/>
+          </m:dPr>
+          <m:e>
+            <m:r>
+              <m:t>N</m:t>
+            </m:r>
+          </m:e>
+        </m:d>
+      </m:oMath>
+      <w:r>
+        <w:t xml:space="preserve"> </w:t>
+      </w:r>
+      <w:r>
+        <w:t xml:space="preserve">and the total rate</w:t>
+      </w:r>
+      <w:r>
+        <w:t xml:space="preserve"> </w:t>
+      </w:r>
+      <m:oMath>
+        <m:sSup>
+          <m:e>
+            <m:r>
+              <m:t>H</m:t>
+            </m:r>
+          </m:e>
+          <m:sup>
+            <m:r>
+              <m:rPr>
+                <m:sty m:val="p"/>
+              </m:rPr>
+              <m:t>*</m:t>
+            </m:r>
+          </m:sup>
+        </m:sSup>
+        <m:d>
+          <m:dPr>
+            <m:begChr m:val="("/>
+            <m:endChr m:val=")"/>
+            <m:sepChr m:val=""/>
+            <m:grow/>
+          </m:dPr>
+          <m:e>
+            <m:r>
+              <m:t>N</m:t>
+            </m:r>
+          </m:e>
+        </m:d>
+        <m:r>
+          <m:rPr>
+            <m:sty m:val="p"/>
+          </m:rPr>
+          <m:t>=</m:t>
+        </m:r>
+        <m:r>
+          <m:t>N</m:t>
+        </m:r>
+        <m:sSup>
+          <m:e>
+            <m:r>
+              <m:t>η</m:t>
+            </m:r>
+          </m:e>
+          <m:sup>
+            <m:r>
+              <m:rPr>
+                <m:sty m:val="p"/>
+              </m:rPr>
+              <m:t>*</m:t>
+            </m:r>
+          </m:sup>
+        </m:sSup>
+        <m:d>
+          <m:dPr>
+            <m:begChr m:val="("/>
+            <m:endChr m:val=")"/>
+            <m:sepChr m:val=""/>
+            <m:grow/>
+          </m:dPr>
+          <m:e>
+            <m:r>
+              <m:t>N</m:t>
+            </m:r>
+          </m:e>
+        </m:d>
+      </m:oMath>
+      <w:r>
+        <w:t xml:space="preserve"> </w:t>
+      </w:r>
+      <w:r>
+        <w:t xml:space="preserve">are increasing in</w:t>
+      </w:r>
+      <w:r>
+        <w:t xml:space="preserve"> </w:t>
+      </w:r>
+      <m:oMath>
+        <m:r>
+          <m:t>N</m:t>
+        </m:r>
+      </m:oMath>
+      <w:r>
+        <w:t xml:space="preserve">. Each vendor’s expected payoff,</w:t>
+      </w:r>
+      <w:r>
+        <w:t xml:space="preserve"> </w:t>
+      </w:r>
+      <m:oMath>
+        <m:r>
+          <m:t>G</m:t>
+        </m:r>
+        <m:r>
+          <m:rPr>
+            <m:sty m:val="p"/>
+          </m:rPr>
+          <m:t>−</m:t>
+        </m:r>
+        <m:r>
+          <m:t>K</m:t>
+        </m:r>
+        <m:sSup>
+          <m:e>
+            <m:r>
+              <m:t>η</m:t>
+            </m:r>
+          </m:e>
+          <m:sup>
+            <m:r>
+              <m:rPr>
+                <m:sty m:val="p"/>
+              </m:rPr>
+              <m:t>*</m:t>
+            </m:r>
+          </m:sup>
+        </m:sSup>
+        <m:d>
+          <m:dPr>
+            <m:begChr m:val="("/>
+            <m:endChr m:val=")"/>
+            <m:sepChr m:val=""/>
+            <m:grow/>
+          </m:dPr>
+          <m:e>
+            <m:r>
+              <m:t>N</m:t>
+            </m:r>
+          </m:e>
+        </m:d>
+      </m:oMath>
+      <w:r>
+        <w:t xml:space="preserve">, is decreasing in</w:t>
+      </w:r>
+      <w:r>
+        <w:t xml:space="preserve"> </w:t>
+      </w:r>
+      <m:oMath>
+        <m:r>
+          <m:t>N</m:t>
+        </m:r>
+      </m:oMath>
+      <w:r>
+        <w:t xml:space="preserve">, and the adopter’s expected rent</w:t>
+      </w:r>
+      <w:r>
+        <w:t xml:space="preserve"> </w:t>
+      </w:r>
+      <m:oMath>
+        <m:r>
+          <m:t>R</m:t>
+        </m:r>
+        <m:r>
+          <m:rPr>
+            <m:sty m:val="p"/>
+          </m:rPr>
+          <m:t>/</m:t>
+        </m:r>
+        <m:d>
+          <m:dPr>
+            <m:begChr m:val="("/>
+            <m:endChr m:val=")"/>
+            <m:sepChr m:val=""/>
+            <m:grow/>
+          </m:dPr>
+          <m:e>
+            <m:r>
+              <m:t>r</m:t>
+            </m:r>
+            <m:r>
+              <m:rPr>
+                <m:sty m:val="p"/>
+              </m:rPr>
+              <m:t>+</m:t>
+            </m:r>
+            <m:sSup>
+              <m:e>
+                <m:r>
+                  <m:t>H</m:t>
+                </m:r>
+              </m:e>
+              <m:sup>
+                <m:r>
+                  <m:rPr>
+                    <m:sty m:val="p"/>
+                  </m:rPr>
+                  <m:t>*</m:t>
+                </m:r>
+              </m:sup>
+            </m:sSup>
+            <m:d>
+              <m:dPr>
+                <m:begChr m:val="("/>
+                <m:endChr m:val=")"/>
+                <m:sepChr m:val=""/>
+                <m:grow/>
+              </m:dPr>
+              <m:e>
+                <m:r>
+                  <m:t>N</m:t>
+                </m:r>
+              </m:e>
+            </m:d>
+          </m:e>
+        </m:d>
+        <m:r>
+          <m:rPr>
+            <m:sty m:val="p"/>
+          </m:rPr>
+          <m:t>−</m:t>
+        </m:r>
+        <m:r>
+          <m:t>g</m:t>
+        </m:r>
+        <m:d>
+          <m:dPr>
+            <m:begChr m:val="("/>
+            <m:endChr m:val=")"/>
+            <m:sepChr m:val=""/>
+            <m:grow/>
+          </m:dPr>
+          <m:e>
+            <m:sSub>
+              <m:e>
+                <m:r>
+                  <m:t>O</m:t>
+                </m:r>
+              </m:e>
+              <m:sub>
+                <m:r>
+                  <m:t>j</m:t>
+                </m:r>
+              </m:sub>
+            </m:sSub>
+          </m:e>
+        </m:d>
+      </m:oMath>
+      <w:r>
+        <w:t xml:space="preserve"> </w:t>
+      </w:r>
+      <w:r>
+        <w:t xml:space="preserve">is decreasing in</w:t>
+      </w:r>
+      <w:r>
+        <w:t xml:space="preserve"> </w:t>
+      </w:r>
+      <m:oMath>
+        <m:r>
+          <m:t>N</m:t>
+        </m:r>
+      </m:oMath>
+      <w:r>
+        <w:t xml:space="preserve">. For</w:t>
+      </w:r>
+      <w:r>
+        <w:t xml:space="preserve"> </w:t>
+      </w:r>
+      <m:oMath>
+        <m:r>
+          <m:t>N</m:t>
+        </m:r>
+        <m:r>
+          <m:rPr>
+            <m:sty m:val="p"/>
+          </m:rPr>
+          <m:t>=</m:t>
+        </m:r>
+        <m:r>
+          <m:t>1</m:t>
+        </m:r>
+      </m:oMath>
+      <w:r>
+        <w:t xml:space="preserve"> </w:t>
+      </w:r>
+      <w:r>
+        <w:t xml:space="preserve">the solution is that of Proposition 6.</w:t>
+      </w:r>
+    </w:p>
+    <w:p>
+      <w:pPr>
+        <w:pStyle w:val="BodyText"/>
+      </w:pPr>
+      <w:r>
+        <w:t xml:space="preserve">Competition among vendors thus has two effects that work in the same direction. Each vendor moves faster, because a rival’s progress raises the cost of waiting, and there are more vendors moving. The adopter’s profitable window shortens. The vendors’ own payoffs fall, so the race dissipates part of what the use is worth to them, much as competition among developers dissipates the premium in Proposition 3.</w:t>
+      </w:r>
+    </w:p>
+    <w:p>
+      <w:pPr>
+        <w:pStyle w:val="BodyText"/>
+      </w:pPr>
+      <w:r>
+        <w:rPr>
+          <w:iCs/>
+          <w:i/>
+        </w:rPr>
+        <w:t xml:space="preserve">Contract protection under competition.</w:t>
+      </w:r>
+      <w:r>
+        <w:t xml:space="preserve"> </w:t>
+      </w:r>
+      <w:r>
+        <w:t xml:space="preserve">The result in Proposition 7 required only that one vendor’s cost rise with protection. With several vendors, a contract between the adopter and its own supplier binds only that supplier. Let the adopter’s supplier have cost</w:t>
+      </w:r>
+      <w:r>
+        <w:t xml:space="preserve"> </w:t>
+      </w:r>
+      <m:oMath>
+        <m:r>
+          <m:t>K</m:t>
+        </m:r>
+        <m:d>
+          <m:dPr>
+            <m:begChr m:val="("/>
+            <m:endChr m:val=")"/>
+            <m:sepChr m:val=""/>
+            <m:grow/>
+          </m:dPr>
+          <m:e>
+            <m:r>
+              <m:t>s</m:t>
+            </m:r>
+          </m:e>
+        </m:d>
+        <m:r>
+          <m:rPr>
+            <m:sty m:val="p"/>
+          </m:rPr>
+          <m:t>=</m:t>
+        </m:r>
+        <m:r>
+          <m:t>k</m:t>
+        </m:r>
+        <m:r>
+          <m:rPr>
+            <m:sty m:val="p"/>
+          </m:rPr>
+          <m:t>/</m:t>
+        </m:r>
+        <m:sSup>
+          <m:e>
+            <m:d>
+              <m:dPr>
+                <m:begChr m:val="("/>
+                <m:endChr m:val=")"/>
+                <m:sepChr m:val=""/>
+                <m:grow/>
+              </m:dPr>
+              <m:e>
+                <m:r>
+                  <m:t>1</m:t>
+                </m:r>
+                <m:r>
+                  <m:rPr>
+                    <m:sty m:val="p"/>
+                  </m:rPr>
+                  <m:t>−</m:t>
+                </m:r>
+                <m:r>
+                  <m:t>s</m:t>
+                </m:r>
+              </m:e>
+            </m:d>
+          </m:e>
+          <m:sup>
+            <m:r>
+              <m:t>2</m:t>
+            </m:r>
+          </m:sup>
+        </m:sSup>
+      </m:oMath>
+      <w:r>
+        <w:t xml:space="preserve"> </w:t>
+      </w:r>
+      <w:r>
+        <w:t xml:space="preserve">and let</w:t>
+      </w:r>
+      <w:r>
+        <w:t xml:space="preserve"> </w:t>
+      </w:r>
+      <m:oMath>
+        <m:r>
+          <m:t>N</m:t>
+        </m:r>
+        <m:r>
+          <m:rPr>
+            <m:sty m:val="p"/>
+          </m:rPr>
+          <m:t>−</m:t>
+        </m:r>
+        <m:r>
+          <m:t>1</m:t>
+        </m:r>
+      </m:oMath>
+      <w:r>
+        <w:t xml:space="preserve"> </w:t>
+      </w:r>
+      <w:r>
+        <w:t xml:space="preserve">outsiders keep the cost</w:t>
+      </w:r>
+      <w:r>
+        <w:t xml:space="preserve"> </w:t>
+      </w:r>
+      <m:oMath>
+        <m:r>
+          <m:t>k</m:t>
+        </m:r>
+      </m:oMath>
+      <w:r>
+        <w:t xml:space="preserve">, because they have no access to the adopter’s data and so are unaffected by</w:t>
+      </w:r>
+      <w:r>
+        <w:t xml:space="preserve"> </w:t>
+      </w:r>
+      <m:oMath>
+        <m:r>
+          <m:t>s</m:t>
+        </m:r>
+      </m:oMath>
+      <w:r>
+        <w:t xml:space="preserve">. Table 5 shows what protection then achieves, for different numbers of outsiders. With no outsiders, raising</w:t>
+      </w:r>
+      <w:r>
+        <w:t xml:space="preserve"> </w:t>
+      </w:r>
+      <m:oMath>
+        <m:r>
+          <m:t>s</m:t>
+        </m:r>
+      </m:oMath>
+      <w:r>
+        <w:t xml:space="preserve"> </w:t>
+      </w:r>
+      <w:r>
+        <w:t xml:space="preserve">from 0 to 0.5 cuts the total productization rate by two thirds and raises the value of the adopter’s rent flow by more than half. With eight outsiders it cuts the rate by less than a tenth, and the gain in the value of the rent flow is under ten percent. In simulations with randomly drawn parameters (3,000 draws, up to six outsiders), both the proportional reduction in the total rate and the gain in the adopter’s rent declined with every added outsider, with no exceptions. We report this as a regularity and not as a proposition, since we have no proof for the asymmetric case.</w:t>
+      </w:r>
+    </w:p>
+    <w:p>
+      <w:pPr>
+        <w:pStyle w:val="BodyText"/>
+      </w:pPr>
+      <w:r>
+        <w:rPr>
+          <w:bCs/>
+          <w:b/>
+        </w:rPr>
+        <w:t xml:space="preserve">Table 5. Effect of protection from the adopter’s own supplier, by number of outsider vendors (illustration;</w:t>
+      </w:r>
+      <w:r>
+        <w:rPr>
+          <w:bCs/>
+          <w:b/>
+        </w:rPr>
+        <w:t xml:space="preserve"> </w:t>
+      </w:r>
+      <m:oMath>
+        <m:r>
+          <m:t>R</m:t>
+        </m:r>
+        <m:r>
+          <m:rPr>
+            <m:sty m:val="p"/>
+          </m:rPr>
+          <m:t>=</m:t>
+        </m:r>
+        <m:r>
+          <m:t>1</m:t>
+        </m:r>
+      </m:oMath>
+      <w:r>
+        <w:rPr>
+          <w:bCs/>
+          <w:b/>
+        </w:rPr>
+        <w:t xml:space="preserve">,</w:t>
+      </w:r>
+      <w:r>
+        <w:rPr>
+          <w:bCs/>
+          <w:b/>
+        </w:rPr>
+        <w:t xml:space="preserve"> </w:t>
+      </w:r>
+      <m:oMath>
+        <m:r>
+          <m:t>r</m:t>
+        </m:r>
+        <m:r>
+          <m:rPr>
+            <m:sty m:val="p"/>
+          </m:rPr>
+          <m:t>=</m:t>
+        </m:r>
+        <m:r>
+          <m:t>0.3</m:t>
+        </m:r>
+      </m:oMath>
+      <w:r>
+        <w:rPr>
+          <w:bCs/>
+          <w:b/>
+        </w:rPr>
+        <w:t xml:space="preserve">,</w:t>
+      </w:r>
+      <w:r>
+        <w:rPr>
+          <w:bCs/>
+          <w:b/>
+        </w:rPr>
+        <w:t xml:space="preserve"> </w:t>
+      </w:r>
+      <m:oMath>
+        <m:r>
+          <m:t>ϕ</m:t>
+        </m:r>
+        <m:r>
+          <m:rPr>
+            <m:sty m:val="p"/>
+          </m:rPr>
+          <m:t>=</m:t>
+        </m:r>
+        <m:r>
+          <m:t>0.8</m:t>
+        </m:r>
+      </m:oMath>
+      <w:r>
+        <w:rPr>
+          <w:bCs/>
+          <w:b/>
+        </w:rPr>
+        <w:t xml:space="preserve">,</w:t>
+      </w:r>
+      <w:r>
+        <w:rPr>
+          <w:bCs/>
+          <w:b/>
+        </w:rPr>
+        <w:t xml:space="preserve"> </w:t>
+      </w:r>
+      <m:oMath>
+        <m:r>
+          <m:t>k</m:t>
+        </m:r>
+        <m:r>
+          <m:rPr>
+            <m:sty m:val="p"/>
+          </m:rPr>
+          <m:t>=</m:t>
+        </m:r>
+        <m:r>
+          <m:t>5</m:t>
+        </m:r>
+      </m:oMath>
+      <w:r>
+        <w:rPr>
+          <w:bCs/>
+          <w:b/>
+        </w:rPr>
+        <w:t xml:space="preserve">,</w:t>
+      </w:r>
+      <w:r>
+        <w:rPr>
+          <w:bCs/>
+          <w:b/>
+        </w:rPr>
+        <w:t xml:space="preserve"> </w:t>
+      </w:r>
+      <m:oMath>
+        <m:r>
+          <m:t>s</m:t>
+        </m:r>
+      </m:oMath>
+      <w:r>
+        <w:rPr>
+          <w:bCs/>
+          <w:b/>
+        </w:rPr>
+        <w:t xml:space="preserve"> </w:t>
+      </w:r>
+      <w:r>
+        <w:rPr>
+          <w:bCs/>
+          <w:b/>
+        </w:rPr>
+        <w:t xml:space="preserve">raised from 0 to 0.5)</w:t>
+      </w:r>
+    </w:p>
+    <w:tbl>
+      <w:tblPr>
+        <w:tblStyle w:val="Table"/>
+        <w:tblW w:type="pct" w:w="5000"/>
+        <w:tblLook w:firstRow="1" w:lastRow="0" w:firstColumn="0" w:lastColumn="0" w:noHBand="0" w:noVBand="0" w:val="0020"/>
+        <w:jc w:val="start"/>
+      </w:tblPr>
+      <w:tblGrid>
+        <w:gridCol w:w="1131"/>
+        <w:gridCol w:w="1131"/>
+        <w:gridCol w:w="1131"/>
+        <w:gridCol w:w="1131"/>
+        <w:gridCol w:w="1131"/>
+        <w:gridCol w:w="1131"/>
+        <w:gridCol w:w="1131"/>
+      </w:tblGrid>
+      <w:tr>
+        <w:trPr>
+          <w:tblHeader w:val="true"/>
+        </w:trPr>
+        <w:tc>
+          <w:tcPr/>
+          <w:p>
+            <w:pPr>
+              <w:pStyle w:val="Compact"/>
+              <w:jc w:val="right"/>
+            </w:pPr>
+            <w:r>
+              <w:t xml:space="preserve">Outsiders</w:t>
+            </w:r>
+          </w:p>
+        </w:tc>
+        <w:tc>
+          <w:tcPr/>
+          <w:p>
+            <w:pPr>
+              <w:pStyle w:val="Compact"/>
+              <w:jc w:val="right"/>
+            </w:pPr>
+            <w:r>
+              <w:t xml:space="preserve">Total rate</w:t>
+            </w:r>
+            <w:r>
+              <w:t xml:space="preserve"> </w:t>
+            </w:r>
+            <m:oMath>
+              <m:r>
+                <m:t>H</m:t>
+              </m:r>
+            </m:oMath>
+            <w:r>
+              <w:t xml:space="preserve"> </w:t>
+            </w:r>
+            <w:r>
+              <w:t xml:space="preserve">(</w:t>
+            </w:r>
+            <m:oMath>
+              <m:r>
+                <m:t>s</m:t>
+              </m:r>
+              <m:r>
+                <m:rPr>
+                  <m:sty m:val="p"/>
+                </m:rPr>
+                <m:t>=</m:t>
+              </m:r>
+              <m:r>
+                <m:t>0</m:t>
+              </m:r>
+            </m:oMath>
+            <w:r>
+              <w:t xml:space="preserve">)</w:t>
+            </w:r>
+          </w:p>
+        </w:tc>
+        <w:tc>
+          <w:tcPr/>
+          <w:p>
+            <w:pPr>
+              <w:pStyle w:val="Compact"/>
+              <w:jc w:val="right"/>
+            </w:pPr>
+            <w:r>
+              <w:t xml:space="preserve">Total rate</w:t>
+            </w:r>
+            <w:r>
+              <w:t xml:space="preserve"> </w:t>
+            </w:r>
+            <m:oMath>
+              <m:r>
+                <m:t>H</m:t>
+              </m:r>
+            </m:oMath>
+            <w:r>
+              <w:t xml:space="preserve"> </w:t>
+            </w:r>
+            <w:r>
+              <w:t xml:space="preserve">(</w:t>
+            </w:r>
+            <m:oMath>
+              <m:r>
+                <m:t>s</m:t>
+              </m:r>
+              <m:r>
+                <m:rPr>
+                  <m:sty m:val="p"/>
+                </m:rPr>
+                <m:t>=</m:t>
+              </m:r>
+              <m:r>
+                <m:t>0.5</m:t>
+              </m:r>
+            </m:oMath>
+            <w:r>
+              <w:t xml:space="preserve">)</w:t>
+            </w:r>
+          </w:p>
+        </w:tc>
+        <w:tc>
+          <w:tcPr/>
+          <w:p>
+            <w:pPr>
+              <w:pStyle w:val="Compact"/>
+              <w:jc w:val="right"/>
+            </w:pPr>
+            <w:r>
+              <w:t xml:space="preserve">Reduction (%)</w:t>
+            </w:r>
+          </w:p>
+        </w:tc>
+        <w:tc>
+          <w:tcPr/>
+          <w:p>
+            <w:pPr>
+              <w:pStyle w:val="Compact"/>
+              <w:jc w:val="right"/>
+            </w:pPr>
+            <w:r>
+              <w:t xml:space="preserve">Adopter’s rent flow value (</w:t>
+            </w:r>
+            <m:oMath>
+              <m:r>
+                <m:t>s</m:t>
+              </m:r>
+              <m:r>
+                <m:rPr>
+                  <m:sty m:val="p"/>
+                </m:rPr>
+                <m:t>=</m:t>
+              </m:r>
+              <m:r>
+                <m:t>0</m:t>
+              </m:r>
+            </m:oMath>
+            <w:r>
+              <w:t xml:space="preserve">)</w:t>
+            </w:r>
+          </w:p>
+        </w:tc>
+        <w:tc>
+          <w:tcPr/>
+          <w:p>
+            <w:pPr>
+              <w:pStyle w:val="Compact"/>
+              <w:jc w:val="right"/>
+            </w:pPr>
+            <w:r>
+              <w:t xml:space="preserve">Adopter’s rent flow value (</w:t>
+            </w:r>
+            <m:oMath>
+              <m:r>
+                <m:t>s</m:t>
+              </m:r>
+              <m:r>
+                <m:rPr>
+                  <m:sty m:val="p"/>
+                </m:rPr>
+                <m:t>=</m:t>
+              </m:r>
+              <m:r>
+                <m:t>0.5</m:t>
+              </m:r>
+            </m:oMath>
+            <w:r>
+              <w:t xml:space="preserve">)</w:t>
+            </w:r>
+          </w:p>
+        </w:tc>
+        <w:tc>
+          <w:tcPr/>
+          <w:p>
+            <w:pPr>
+              <w:pStyle w:val="Compact"/>
+              <w:jc w:val="right"/>
+            </w:pPr>
+            <w:r>
+              <w:t xml:space="preserve">Gain</w:t>
+            </w:r>
+          </w:p>
+        </w:tc>
+      </w:tr>
+      <w:tr>
+        <w:tc>
+          <w:tcPr/>
+          <w:p>
+            <w:pPr>
+              <w:pStyle w:val="Compact"/>
+              <w:jc w:val="right"/>
+            </w:pPr>
+            <w:r>
+              <w:t xml:space="preserve">0</w:t>
+            </w:r>
+          </w:p>
+        </w:tc>
+        <w:tc>
+          <w:tcPr/>
+          <w:p>
+            <w:pPr>
+              <w:pStyle w:val="Compact"/>
+              <w:jc w:val="right"/>
+            </w:pPr>
+            <w:r>
+              <w:t xml:space="preserve">0.340</w:t>
+            </w:r>
+          </w:p>
+        </w:tc>
+        <w:tc>
+          <w:tcPr/>
+          <w:p>
+            <w:pPr>
+              <w:pStyle w:val="Compact"/>
+              <w:jc w:val="right"/>
+            </w:pPr>
+            <w:r>
+              <w:t xml:space="preserve">0.112</w:t>
+            </w:r>
+          </w:p>
+        </w:tc>
+        <w:tc>
+          <w:tcPr/>
+          <w:p>
+            <w:pPr>
+              <w:pStyle w:val="Compact"/>
+              <w:jc w:val="right"/>
+            </w:pPr>
+            <w:r>
+              <w:t xml:space="preserve">67.0</w:t>
+            </w:r>
+          </w:p>
+        </w:tc>
+        <w:tc>
+          <w:tcPr/>
+          <w:p>
+            <w:pPr>
+              <w:pStyle w:val="Compact"/>
+              <w:jc w:val="right"/>
+            </w:pPr>
+            <w:r>
+              <w:t xml:space="preserve">1.562</w:t>
+            </w:r>
+          </w:p>
+        </w:tc>
+        <w:tc>
+          <w:tcPr/>
+          <w:p>
+            <w:pPr>
+              <w:pStyle w:val="Compact"/>
+              <w:jc w:val="right"/>
+            </w:pPr>
+            <w:r>
+              <w:t xml:space="preserve">2.425</w:t>
+            </w:r>
+          </w:p>
+        </w:tc>
+        <w:tc>
+          <w:tcPr/>
+          <w:p>
+            <w:pPr>
+              <w:pStyle w:val="Compact"/>
+              <w:jc w:val="right"/>
+            </w:pPr>
+            <w:r>
+              <w:t xml:space="preserve">0.864</w:t>
+            </w:r>
+          </w:p>
+        </w:tc>
+      </w:tr>
+      <w:tr>
+        <w:tc>
+          <w:tcPr/>
+          <w:p>
+            <w:pPr>
+              <w:pStyle w:val="Compact"/>
+              <w:jc w:val="right"/>
+            </w:pPr>
+            <w:r>
+              <w:t xml:space="preserve">1</w:t>
+            </w:r>
+          </w:p>
+        </w:tc>
+        <w:tc>
+          <w:tcPr/>
+          <w:p>
+            <w:pPr>
+              <w:pStyle w:val="Compact"/>
+              <w:jc w:val="right"/>
+            </w:pPr>
+            <w:r>
+              <w:t xml:space="preserve">0.827</w:t>
+            </w:r>
+          </w:p>
+        </w:tc>
+        <w:tc>
+          <w:tcPr/>
+          <w:p>
+            <w:pPr>
+              <w:pStyle w:val="Compact"/>
+              <w:jc w:val="right"/>
+            </w:pPr>
+            <w:r>
+              <w:t xml:space="preserve">0.493</w:t>
+            </w:r>
+          </w:p>
+        </w:tc>
+        <w:tc>
+          <w:tcPr/>
+          <w:p>
+            <w:pPr>
+              <w:pStyle w:val="Compact"/>
+              <w:jc w:val="right"/>
+            </w:pPr>
+            <w:r>
+              <w:t xml:space="preserve">40.4</w:t>
+            </w:r>
+          </w:p>
+        </w:tc>
+        <w:tc>
+          <w:tcPr/>
+          <w:p>
+            <w:pPr>
+              <w:pStyle w:val="Compact"/>
+              <w:jc w:val="right"/>
+            </w:pPr>
+            <w:r>
+              <w:t xml:space="preserve">0.887</w:t>
+            </w:r>
+          </w:p>
+        </w:tc>
+        <w:tc>
+          <w:tcPr/>
+          <w:p>
+            <w:pPr>
+              <w:pStyle w:val="Compact"/>
+              <w:jc w:val="right"/>
+            </w:pPr>
+            <w:r>
+              <w:t xml:space="preserve">1.261</w:t>
+            </w:r>
+          </w:p>
+        </w:tc>
+        <w:tc>
+          <w:tcPr/>
+          <w:p>
+            <w:pPr>
+              <w:pStyle w:val="Compact"/>
+              <w:jc w:val="right"/>
+            </w:pPr>
+            <w:r>
+              <w:t xml:space="preserve">0.374</w:t>
+            </w:r>
+          </w:p>
+        </w:tc>
+      </w:tr>
+      <w:tr>
+        <w:tc>
+          <w:tcPr/>
+          <w:p>
+            <w:pPr>
+              <w:pStyle w:val="Compact"/>
+              <w:jc w:val="right"/>
+            </w:pPr>
+            <w:r>
+              <w:t xml:space="preserve">2</w:t>
+            </w:r>
+          </w:p>
+        </w:tc>
+        <w:tc>
+          <w:tcPr/>
+          <w:p>
+            <w:pPr>
+              <w:pStyle w:val="Compact"/>
+              <w:jc w:val="right"/>
+            </w:pPr>
+            <w:r>
+              <w:t xml:space="preserve">1.347</w:t>
+            </w:r>
+          </w:p>
+        </w:tc>
+        <w:tc>
+          <w:tcPr/>
+          <w:p>
+            <w:pPr>
+              <w:pStyle w:val="Compact"/>
+              <w:jc w:val="right"/>
+            </w:pPr>
+            <w:r>
+              <w:t xml:space="preserve">0.980</w:t>
+            </w:r>
+          </w:p>
+        </w:tc>
+        <w:tc>
+          <w:tcPr/>
+          <w:p>
+            <w:pPr>
+              <w:pStyle w:val="Compact"/>
+              <w:jc w:val="right"/>
+            </w:pPr>
+            <w:r>
+              <w:t xml:space="preserve">27.3</w:t>
+            </w:r>
+          </w:p>
+        </w:tc>
+        <w:tc>
+          <w:tcPr/>
+          <w:p>
+            <w:pPr>
+              <w:pStyle w:val="Compact"/>
+              <w:jc w:val="right"/>
+            </w:pPr>
+            <w:r>
+              <w:t xml:space="preserve">0.607</w:t>
+            </w:r>
+          </w:p>
+        </w:tc>
+        <w:tc>
+          <w:tcPr/>
+          <w:p>
+            <w:pPr>
+              <w:pStyle w:val="Compact"/>
+              <w:jc w:val="right"/>
+            </w:pPr>
+            <w:r>
+              <w:t xml:space="preserve">0.781</w:t>
+            </w:r>
+          </w:p>
+        </w:tc>
+        <w:tc>
+          <w:tcPr/>
+          <w:p>
+            <w:pPr>
+              <w:pStyle w:val="Compact"/>
+              <w:jc w:val="right"/>
+            </w:pPr>
+            <w:r>
+              <w:t xml:space="preserve">0.174</w:t>
+            </w:r>
+          </w:p>
+        </w:tc>
+      </w:tr>
+      <w:tr>
+        <w:tc>
+          <w:tcPr/>
+          <w:p>
+            <w:pPr>
+              <w:pStyle w:val="Compact"/>
+              <w:jc w:val="right"/>
+            </w:pPr>
+            <w:r>
+              <w:t xml:space="preserve">4</w:t>
+            </w:r>
+          </w:p>
+        </w:tc>
+        <w:tc>
+          <w:tcPr/>
+          <w:p>
+            <w:pPr>
+              <w:pStyle w:val="Compact"/>
+              <w:jc w:val="right"/>
+            </w:pPr>
+            <w:r>
+              <w:t xml:space="preserve">2.406</w:t>
+            </w:r>
+          </w:p>
+        </w:tc>
+        <w:tc>
+          <w:tcPr/>
+          <w:p>
+            <w:pPr>
+              <w:pStyle w:val="Compact"/>
+              <w:jc w:val="right"/>
+            </w:pPr>
+            <w:r>
+              <w:t xml:space="preserve">2.021</w:t>
+            </w:r>
+          </w:p>
+        </w:tc>
+        <w:tc>
+          <w:tcPr/>
+          <w:p>
+            <w:pPr>
+              <w:pStyle w:val="Compact"/>
+              <w:jc w:val="right"/>
+            </w:pPr>
+            <w:r>
+              <w:t xml:space="preserve">16.0</w:t>
+            </w:r>
+          </w:p>
+        </w:tc>
+        <w:tc>
+          <w:tcPr/>
+          <w:p>
+            <w:pPr>
+              <w:pStyle w:val="Compact"/>
+              <w:jc w:val="right"/>
+            </w:pPr>
+            <w:r>
+              <w:t xml:space="preserve">0.369</w:t>
+            </w:r>
+          </w:p>
+        </w:tc>
+        <w:tc>
+          <w:tcPr/>
+          <w:p>
+            <w:pPr>
+              <w:pStyle w:val="Compact"/>
+              <w:jc w:val="right"/>
+            </w:pPr>
+            <w:r>
+              <w:t xml:space="preserve">0.431</w:t>
+            </w:r>
+          </w:p>
+        </w:tc>
+        <w:tc>
+          <w:tcPr/>
+          <w:p>
+            <w:pPr>
+              <w:pStyle w:val="Compact"/>
+              <w:jc w:val="right"/>
+            </w:pPr>
+            <w:r>
+              <w:t xml:space="preserve">0.061</w:t>
+            </w:r>
+          </w:p>
+        </w:tc>
+      </w:tr>
+      <w:tr>
+        <w:tc>
+          <w:tcPr/>
+          <w:p>
+            <w:pPr>
+              <w:pStyle w:val="Compact"/>
+              <w:jc w:val="right"/>
+            </w:pPr>
+            <w:r>
+              <w:t xml:space="preserve">8</w:t>
+            </w:r>
+          </w:p>
+        </w:tc>
+        <w:tc>
+          <w:tcPr/>
+          <w:p>
+            <w:pPr>
+              <w:pStyle w:val="Compact"/>
+              <w:jc w:val="right"/>
+            </w:pPr>
+            <w:r>
+              <w:t xml:space="preserve">4.536</w:t>
+            </w:r>
+          </w:p>
+        </w:tc>
+        <w:tc>
+          <w:tcPr/>
+          <w:p>
+            <w:pPr>
+              <w:pStyle w:val="Compact"/>
+              <w:jc w:val="right"/>
+            </w:pPr>
+            <w:r>
+              <w:t xml:space="preserve">4.143</w:t>
+            </w:r>
+          </w:p>
+        </w:tc>
+        <w:tc>
+          <w:tcPr/>
+          <w:p>
+            <w:pPr>
+              <w:pStyle w:val="Compact"/>
+              <w:jc w:val="right"/>
+            </w:pPr>
+            <w:r>
+              <w:t xml:space="preserve">8.7</w:t>
+            </w:r>
+          </w:p>
+        </w:tc>
+        <w:tc>
+          <w:tcPr/>
+          <w:p>
+            <w:pPr>
+              <w:pStyle w:val="Compact"/>
+              <w:jc w:val="right"/>
+            </w:pPr>
+            <w:r>
+              <w:t xml:space="preserve">0.207</w:t>
+            </w:r>
+          </w:p>
+        </w:tc>
+        <w:tc>
+          <w:tcPr/>
+          <w:p>
+            <w:pPr>
+              <w:pStyle w:val="Compact"/>
+              <w:jc w:val="right"/>
+            </w:pPr>
+            <w:r>
+              <w:t xml:space="preserve">0.225</w:t>
+            </w:r>
+          </w:p>
+        </w:tc>
+        <w:tc>
+          <w:tcPr/>
+          <w:p>
+            <w:pPr>
+              <w:pStyle w:val="Compact"/>
+              <w:jc w:val="right"/>
+            </w:pPr>
+            <w:r>
+              <w:t xml:space="preserve">0.018</w:t>
+            </w:r>
+          </w:p>
+        </w:tc>
+      </w:tr>
+    </w:tbl>
+    <w:p>
+      <w:pPr>
+        <w:pStyle w:val="BodyText"/>
+      </w:pPr>
+      <w:r>
+        <w:rPr>
+          <w:iCs/>
+          <w:i/>
+        </w:rPr>
+        <w:t xml:space="preserve">Note.</w:t>
+      </w:r>
+      <w:r>
+        <w:t xml:space="preserve"> </w:t>
+      </w:r>
+      <w:r>
+        <w:t xml:space="preserve">The adopter’s value is</w:t>
+      </w:r>
+      <w:r>
+        <w:t xml:space="preserve"> </w:t>
+      </w:r>
+      <m:oMath>
+        <m:r>
+          <m:t>R</m:t>
+        </m:r>
+        <m:r>
+          <m:rPr>
+            <m:sty m:val="p"/>
+          </m:rPr>
+          <m:t>/</m:t>
+        </m:r>
+        <m:d>
+          <m:dPr>
+            <m:begChr m:val="("/>
+            <m:endChr m:val=")"/>
+            <m:sepChr m:val=""/>
+            <m:grow/>
+          </m:dPr>
+          <m:e>
+            <m:r>
+              <m:t>r</m:t>
+            </m:r>
+            <m:r>
+              <m:rPr>
+                <m:sty m:val="p"/>
+              </m:rPr>
+              <m:t>+</m:t>
+            </m:r>
+            <m:r>
+              <m:t>H</m:t>
+            </m:r>
+          </m:e>
+        </m:d>
+      </m:oMath>
+      <w:r>
+        <w:t xml:space="preserve">, before subtracting the cost of organizational capital.</w:t>
+      </w:r>
+    </w:p>
+    <w:p>
+      <w:pPr>
+        <w:pStyle w:val="BodyText"/>
+      </w:pPr>
+      <w:r>
+        <w:t xml:space="preserve">The implication is that bilateral contract terms are most useful where the adopter’s use is visible to few vendors. In a market with many capable vendors, protection from one supplier does little, and an adopter’s rent depends more on how hard the use is to replicate without its data than on what it has negotiated. This reinforces the importance of the organizational capital that makes a use difficult to copy (Section 3.3) and suggests that protection would need to be industry-wide, for example through norms or regulation, to be effective in such markets.</w:t>
+      </w:r>
+    </w:p>
+    <w:p>
+      <w:pPr>
+        <w:pStyle w:val="BodyText"/>
+      </w:pPr>
+      <w:r>
+        <w:t xml:space="preserve">The same limits apply as in Section 4.5. Vendors are symmetric apart from their access to the adopter’s data, the rate of each vendor is constant, and a vendor whose rival wins earns nothing. Letting the winner share the use, or letting vendors differentiate their offerings, would soften the race.</w:t>
+      </w:r>
+    </w:p>
     <w:bookmarkEnd w:id="37"/>
-    <w:bookmarkStart w:id="40" w:name="empirical-counterparts-and-implications"/>
+    <w:bookmarkEnd w:id="38"/>
+    <w:bookmarkStart w:id="41" w:name="empirical-counterparts-and-implications"/>
     <w:p>
       <w:pPr>
         <w:pStyle w:val="Heading1"/>
@@ -7629,7 +9591,7 @@
         <w:t xml:space="preserve">5. Empirical Counterparts and Implications</w:t>
       </w:r>
     </w:p>
-    <w:bookmarkStart w:id="38" w:name="mapping-model-objects-to-data"/>
+    <w:bookmarkStart w:id="39" w:name="mapping-model-objects-to-data"/>
     <w:p>
       <w:pPr>
         <w:pStyle w:val="Heading2"/>
@@ -8082,8 +10044,8 @@
         </w:tc>
       </w:tr>
     </w:tbl>
-    <w:bookmarkEnd w:id="38"/>
-    <w:bookmarkStart w:id="39" w:name="empirical-implications"/>
+    <w:bookmarkEnd w:id="39"/>
+    <w:bookmarkStart w:id="40" w:name="empirical-implications"/>
     <w:p>
       <w:pPr>
         <w:pStyle w:val="Heading2"/>
@@ -8214,9 +10176,9 @@
         <w:t xml:space="preserve">Among adopters, pooled exposure to LLMs, meaning use or mention without a dated first-party GA, does not predict economic profit. Disconfirmation is a time-invariant exposure indicator that predicts operating margin in the pooled cross-section.</w:t>
       </w:r>
     </w:p>
-    <w:bookmarkEnd w:id="39"/>
     <w:bookmarkEnd w:id="40"/>
-    <w:bookmarkStart w:id="44" w:name="illustrative-evidence"/>
+    <w:bookmarkEnd w:id="41"/>
+    <w:bookmarkStart w:id="45" w:name="illustrative-evidence"/>
     <w:p>
       <w:pPr>
         <w:pStyle w:val="Heading1"/>
@@ -8249,7 +10211,7 @@
         <w:t xml:space="preserve">On the developer side, we regress log realized price on the lab’s lead with lab fixed effects and a trend, clustering by lab. On the adopter side, we regress operating margin on a post-GA indicator with firm and year fixed effects, clustering by firm.</w:t>
       </w:r>
     </w:p>
-    <w:bookmarkStart w:id="41" w:name="developer-side-h1"/>
+    <w:bookmarkStart w:id="42" w:name="developer-side-h1"/>
     <w:p>
       <w:pPr>
         <w:pStyle w:val="Heading2"/>
@@ -8320,8 +10282,8 @@
         <w:t xml:space="preserve">They are identified mainly by new releases and so do not isolate the premium on a given model. They should be read as associations between a lab’s lead and its flagship price, and not as tests of H1a or H1b. Those tests require a model-month panel and a release-level panel of launch prices, which we do not estimate here.</w:t>
       </w:r>
     </w:p>
-    <w:bookmarkEnd w:id="41"/>
-    <w:bookmarkStart w:id="42" w:name="adopter-side-h2-to-h4"/>
+    <w:bookmarkEnd w:id="42"/>
+    <w:bookmarkStart w:id="43" w:name="adopter-side-h2-to-h4"/>
     <w:p>
       <w:pPr>
         <w:pStyle w:val="Heading2"/>
@@ -8748,8 +10710,8 @@
         <w:t xml:space="preserve">coefficient and the last post-GA bin. The data are therefore inconclusive on H4, and we do not claim that the margin increment decays. A time-invariant bundle-by-post-2023 difference-in-differences gives a similar coefficient and is retained as a robustness check.</w:t>
       </w:r>
     </w:p>
-    <w:bookmarkEnd w:id="42"/>
-    <w:bookmarkStart w:id="43" w:name="what-is-and-is-not-identified"/>
+    <w:bookmarkEnd w:id="43"/>
+    <w:bookmarkStart w:id="44" w:name="what-is-and-is-not-identified"/>
     <w:p>
       <w:pPr>
         <w:pStyle w:val="Heading2"/>
@@ -8766,9 +10728,9 @@
         <w:t xml:space="preserve">Six restrictions bind. First, the realized price is the mean of provider cards on OpenRouter, not a billed invoice and not a GAAP inference margin. Second, endpoint coverage is incomplete (102 of 171 priced months). Third, GA years are coded from public product dates, and they do not measure token spend or retrieval intensity. Fourth, Table 1 figures are illustrative and are not regression inputs. Fifth, two-way fixed-effects estimates under staggered timing can be biased when effects differ across cohorts (Goodman-Bacon 2021), and they rest on parallel trends, which we do not test beyond the pre-GA coefficients in the event study. Sixth, operating margin is an accounting measure and not the economic profit of Proposition 2, and the timing of GA marks the launch of a product, not the start of organizational-capital accumulation.</w:t>
       </w:r>
     </w:p>
-    <w:bookmarkEnd w:id="43"/>
     <w:bookmarkEnd w:id="44"/>
-    <w:bookmarkStart w:id="48" w:name="discussion"/>
+    <w:bookmarkEnd w:id="45"/>
+    <w:bookmarkStart w:id="49" w:name="discussion"/>
     <w:p>
       <w:pPr>
         <w:pStyle w:val="Heading1"/>
@@ -8777,7 +10739,7 @@
         <w:t xml:space="preserve">7. Discussion</w:t>
       </w:r>
     </w:p>
-    <w:bookmarkStart w:id="45" w:name="contributions"/>
+    <w:bookmarkStart w:id="46" w:name="contributions"/>
     <w:p>
       <w:pPr>
         <w:pStyle w:val="Heading2"/>
@@ -8802,8 +10764,8 @@
         <w:t xml:space="preserve">We should be clear about what is not new. The mechanisms in each layer are established in industrial organization and strategy (Section 2.4). What the paper adds is their combination under a single appropriability definition and the specification of measurable counterparts for a technology in which those counterparts are observable.</w:t>
       </w:r>
     </w:p>
-    <w:bookmarkEnd w:id="45"/>
-    <w:bookmarkStart w:id="46" w:name="implications-for-practice"/>
+    <w:bookmarkEnd w:id="46"/>
+    <w:bookmarkStart w:id="47" w:name="implications-for-practice"/>
     <w:p>
       <w:pPr>
         <w:pStyle w:val="Heading2"/>
@@ -8817,11 +10779,11 @@
         <w:pStyle w:val="FirstParagraph"/>
       </w:pPr>
       <w:r>
-        <w:t xml:space="preserve">For adopters, the central question is not how much to spend on AI but what the firm owns that the model cannot supply, and how long competitors will take to own it too. The theory also says that spending on the model itself is not a source of advantage, since any rival can buy the same model. For developers, the next model is the source of value, not the current one. When leads last only a few months, much of the reported loss is economic (Corollary 4). The valuations of frontier labs are best read as prices for an option on a sequence of future leads and not as capitalized current earnings. For the relationship between the two sides, Propositions 5 to 7 imply that contractual terms covering data use, fine-tuning ownership, and on-premise deployment are strategic decisions, because they affect the rate at which a vendor can productize an adopter’s use and so the adopter’s incentive to invest in the capital that generates its rent. The illustration in Table 4 suggests that such terms may be hardest to obtain for the most valuable uses, which is a reason for adopters to negotiate them before a use proves valuable and not after.</w:t>
-      </w:r>
-    </w:p>
-    <w:bookmarkEnd w:id="46"/>
-    <w:bookmarkStart w:id="47" w:name="boundary-conditions-and-limitations"/>
+        <w:t xml:space="preserve">For adopters, the central question is not how much to spend on AI but what the firm owns that the model cannot supply, and how long competitors will take to own it too. The theory also says that spending on the model itself is not a source of advantage, since any rival can buy the same model. For developers, the next model is the source of value, not the current one. When leads last only a few months, much of the reported loss is economic (Corollary 4). The valuations of frontier labs are best read as prices for an option on a sequence of future leads and not as capitalized current earnings. For the relationship between the two sides, Propositions 5 to 8 imply that contractual terms covering data use, fine-tuning ownership, and on-premise deployment are strategic decisions, because they affect the rate at which a vendor can productize an adopter’s use and so the adopter’s incentive to invest in the capital that generates its rent. The illustration in Table 4 suggests that such terms may be hardest to obtain for the most valuable uses, which is a reason for adopters to negotiate them before a use proves valuable and not after. Table 5 adds that, when many vendors can build the use, a clause with one supplier buys little, so that the adopter’s protection comes mainly from the difficulty of replicating the use.</w:t>
+      </w:r>
+    </w:p>
+    <w:bookmarkEnd w:id="47"/>
+    <w:bookmarkStart w:id="48" w:name="boundary-conditions-and-limitations"/>
     <w:p>
       <w:pPr>
         <w:pStyle w:val="Heading2"/>
@@ -8846,9 +10808,9 @@
         <w:t xml:space="preserve">The model abstracts from uncertainty in training outcomes, from strategic interaction among developers (the lead and the catch-up lag are treated as exogenous), and from purchasable organizational capital. Making the lead endogenous to a training race is the most natural extension, and it is where we would expect a more specifically LLM-based theory to develop. The empirical proxies are imperfect, and misclassification biases the estimated difference between commodity and complementary use toward zero. The adopter sample is small and made up of large software incumbents, so the results should not be generalized to adopters in other industries. Finally, the evidence is observational and cross-sectional in time, over a period in which the technology and its business models are still changing. H1a, H1b, and H2 are not tested here, and the evidence on H4 is inconclusive. The tests reported are best viewed as a first look at the constructs, and they are not a confirmation of the theory.</w:t>
       </w:r>
     </w:p>
-    <w:bookmarkEnd w:id="47"/>
     <w:bookmarkEnd w:id="48"/>
-    <w:bookmarkStart w:id="49" w:name="conclusion"/>
+    <w:bookmarkEnd w:id="49"/>
+    <w:bookmarkStart w:id="50" w:name="conclusion"/>
     <w:p>
       <w:pPr>
         <w:pStyle w:val="Heading1"/>
@@ -8873,8 +10835,8 @@
         <w:t xml:space="preserve">The public record makes the developer half of this account visible. Frontier labs combine large booked revenue with large operating losses and pay complement owners for compute. The price of matched capability falls several-fold each year, while the cost of frontier capability rises. Investors nonetheless value the same firms as if a release sequence will continue. These three facts are consistent with a single explanation: competition over a general-purpose input whose quality lead is short and must be bought again with each release. The profitability puzzle that accompanies every general-purpose technology is, on this account, what competition over a common input looks like from the inside.</w:t>
       </w:r>
     </w:p>
-    <w:bookmarkEnd w:id="49"/>
-    <w:bookmarkStart w:id="50" w:name="appendix-a.-proofs"/>
+    <w:bookmarkEnd w:id="50"/>
+    <w:bookmarkStart w:id="51" w:name="appendix-a.-proofs"/>
     <w:p>
       <w:pPr>
         <w:pStyle w:val="Heading1"/>
@@ -13684,8 +15646,1598 @@
         </m:r>
       </m:oMath>
     </w:p>
-    <w:bookmarkEnd w:id="50"/>
-    <w:bookmarkStart w:id="51" w:name="references"/>
+    <w:p>
+      <w:pPr>
+        <w:pStyle w:val="BodyText"/>
+      </w:pPr>
+      <w:r>
+        <w:rPr>
+          <w:bCs/>
+          <w:b/>
+        </w:rPr>
+        <w:t xml:space="preserve">Proof of Proposition 8.</w:t>
+      </w:r>
+      <w:r>
+        <w:t xml:space="preserve"> </w:t>
+      </w:r>
+      <w:r>
+        <w:t xml:space="preserve">Fix the total rate</w:t>
+      </w:r>
+      <w:r>
+        <w:t xml:space="preserve"> </w:t>
+      </w:r>
+      <m:oMath>
+        <m:r>
+          <m:t>H</m:t>
+        </m:r>
+      </m:oMath>
+      <w:r>
+        <w:t xml:space="preserve">. By the argument for Proposition 6, vendor</w:t>
+      </w:r>
+      <w:r>
+        <w:t xml:space="preserve"> </w:t>
+      </w:r>
+      <m:oMath>
+        <m:r>
+          <m:t>i</m:t>
+        </m:r>
+      </m:oMath>
+      <w:r>
+        <w:t xml:space="preserve">’s best response to rivals’ total rate</w:t>
+      </w:r>
+      <w:r>
+        <w:t xml:space="preserve"> </w:t>
+      </w:r>
+      <m:oMath>
+        <m:r>
+          <m:t>H</m:t>
+        </m:r>
+        <m:r>
+          <m:rPr>
+            <m:sty m:val="p"/>
+          </m:rPr>
+          <m:t>−</m:t>
+        </m:r>
+        <m:sSub>
+          <m:e>
+            <m:r>
+              <m:t>η</m:t>
+            </m:r>
+          </m:e>
+          <m:sub>
+            <m:r>
+              <m:t>i</m:t>
+            </m:r>
+          </m:sub>
+        </m:sSub>
+      </m:oMath>
+      <w:r>
+        <w:t xml:space="preserve"> </w:t>
+      </w:r>
+      <w:r>
+        <w:t xml:space="preserve">is the unique positive root of</w:t>
+      </w:r>
+      <w:r>
+        <w:t xml:space="preserve"> </w:t>
+      </w:r>
+      <m:oMath>
+        <m:sSup>
+          <m:e>
+            <m:r>
+              <m:t>η</m:t>
+            </m:r>
+          </m:e>
+          <m:sup>
+            <m:r>
+              <m:t>2</m:t>
+            </m:r>
+          </m:sup>
+        </m:sSup>
+        <m:r>
+          <m:rPr>
+            <m:sty m:val="p"/>
+          </m:rPr>
+          <m:t>+</m:t>
+        </m:r>
+        <m:r>
+          <m:t>2</m:t>
+        </m:r>
+        <m:d>
+          <m:dPr>
+            <m:begChr m:val="("/>
+            <m:endChr m:val=")"/>
+            <m:sepChr m:val=""/>
+            <m:grow/>
+          </m:dPr>
+          <m:e>
+            <m:r>
+              <m:t>r</m:t>
+            </m:r>
+            <m:r>
+              <m:rPr>
+                <m:sty m:val="p"/>
+              </m:rPr>
+              <m:t>+</m:t>
+            </m:r>
+            <m:r>
+              <m:t>H</m:t>
+            </m:r>
+            <m:r>
+              <m:rPr>
+                <m:sty m:val="p"/>
+              </m:rPr>
+              <m:t>−</m:t>
+            </m:r>
+            <m:r>
+              <m:t>η</m:t>
+            </m:r>
+          </m:e>
+        </m:d>
+        <m:r>
+          <m:t>η</m:t>
+        </m:r>
+        <m:r>
+          <m:rPr>
+            <m:sty m:val="p"/>
+          </m:rPr>
+          <m:t>−</m:t>
+        </m:r>
+        <m:r>
+          <m:t>2</m:t>
+        </m:r>
+        <m:r>
+          <m:t>G</m:t>
+        </m:r>
+        <m:d>
+          <m:dPr>
+            <m:begChr m:val="("/>
+            <m:endChr m:val=")"/>
+            <m:sepChr m:val=""/>
+            <m:grow/>
+          </m:dPr>
+          <m:e>
+            <m:r>
+              <m:t>r</m:t>
+            </m:r>
+            <m:r>
+              <m:rPr>
+                <m:sty m:val="p"/>
+              </m:rPr>
+              <m:t>+</m:t>
+            </m:r>
+            <m:r>
+              <m:t>H</m:t>
+            </m:r>
+            <m:r>
+              <m:rPr>
+                <m:sty m:val="p"/>
+              </m:rPr>
+              <m:t>−</m:t>
+            </m:r>
+            <m:r>
+              <m:t>η</m:t>
+            </m:r>
+          </m:e>
+        </m:d>
+        <m:r>
+          <m:rPr>
+            <m:sty m:val="p"/>
+          </m:rPr>
+          <m:t>/</m:t>
+        </m:r>
+        <m:r>
+          <m:t>K</m:t>
+        </m:r>
+        <m:r>
+          <m:rPr>
+            <m:sty m:val="p"/>
+          </m:rPr>
+          <m:t>=</m:t>
+        </m:r>
+        <m:r>
+          <m:t>0</m:t>
+        </m:r>
+      </m:oMath>
+      <w:r>
+        <w:t xml:space="preserve">, which rearranges to</w:t>
+      </w:r>
+    </w:p>
+    <w:p>
+      <w:pPr>
+        <w:pStyle w:val="BodyText"/>
+      </w:pPr>
+      <m:oMathPara>
+        <m:oMathParaPr>
+          <m:jc m:val="center"/>
+        </m:oMathParaPr>
+        <m:oMath>
+          <m:f>
+            <m:fPr>
+              <m:type m:val="lin"/>
+            </m:fPr>
+            <m:num>
+              <m:r>
+                <m:t>K</m:t>
+              </m:r>
+            </m:num>
+            <m:den>
+              <m:r>
+                <m:t>2</m:t>
+              </m:r>
+            </m:den>
+          </m:f>
+          <m:sSup>
+            <m:e>
+              <m:r>
+                <m:t>η</m:t>
+              </m:r>
+            </m:e>
+            <m:sup>
+              <m:r>
+                <m:t>2</m:t>
+              </m:r>
+            </m:sup>
+          </m:sSup>
+          <m:r>
+            <m:rPr>
+              <m:sty m:val="p"/>
+            </m:rPr>
+            <m:t>−</m:t>
+          </m:r>
+          <m:d>
+            <m:dPr>
+              <m:begChr m:val="("/>
+              <m:endChr m:val=")"/>
+              <m:sepChr m:val=""/>
+              <m:grow/>
+            </m:dPr>
+            <m:e>
+              <m:r>
+                <m:t>K</m:t>
+              </m:r>
+              <m:d>
+                <m:dPr>
+                  <m:begChr m:val="("/>
+                  <m:endChr m:val=")"/>
+                  <m:sepChr m:val=""/>
+                  <m:grow/>
+                </m:dPr>
+                <m:e>
+                  <m:r>
+                    <m:t>r</m:t>
+                  </m:r>
+                  <m:r>
+                    <m:rPr>
+                      <m:sty m:val="p"/>
+                    </m:rPr>
+                    <m:t>+</m:t>
+                  </m:r>
+                  <m:r>
+                    <m:t>H</m:t>
+                  </m:r>
+                </m:e>
+              </m:d>
+              <m:r>
+                <m:rPr>
+                  <m:sty m:val="p"/>
+                </m:rPr>
+                <m:t>+</m:t>
+              </m:r>
+              <m:r>
+                <m:t>G</m:t>
+              </m:r>
+            </m:e>
+          </m:d>
+          <m:r>
+            <m:t>η</m:t>
+          </m:r>
+          <m:r>
+            <m:rPr>
+              <m:sty m:val="p"/>
+            </m:rPr>
+            <m:t>+</m:t>
+          </m:r>
+          <m:r>
+            <m:t>G</m:t>
+          </m:r>
+          <m:d>
+            <m:dPr>
+              <m:begChr m:val="("/>
+              <m:endChr m:val=")"/>
+              <m:sepChr m:val=""/>
+              <m:grow/>
+            </m:dPr>
+            <m:e>
+              <m:r>
+                <m:t>r</m:t>
+              </m:r>
+              <m:r>
+                <m:rPr>
+                  <m:sty m:val="p"/>
+                </m:rPr>
+                <m:t>+</m:t>
+              </m:r>
+              <m:r>
+                <m:t>H</m:t>
+              </m:r>
+            </m:e>
+          </m:d>
+          <m:r>
+            <m:rPr>
+              <m:sty m:val="p"/>
+            </m:rPr>
+            <m:t>=</m:t>
+          </m:r>
+          <m:r>
+            <m:t>0</m:t>
+          </m:r>
+          <m:r>
+            <m:rPr>
+              <m:sty m:val="p"/>
+            </m:rPr>
+            <m:t>.</m:t>
+          </m:r>
+        </m:oMath>
+      </m:oMathPara>
+    </w:p>
+    <w:p>
+      <w:pPr>
+        <w:pStyle w:val="FirstParagraph"/>
+      </w:pPr>
+      <w:r>
+        <w:t xml:space="preserve">The product of its two roots is positive and their sum is</w:t>
+      </w:r>
+      <w:r>
+        <w:t xml:space="preserve"> </w:t>
+      </w:r>
+      <m:oMath>
+        <m:r>
+          <m:t>2</m:t>
+        </m:r>
+        <m:d>
+          <m:dPr>
+            <m:begChr m:val="("/>
+            <m:endChr m:val=")"/>
+            <m:sepChr m:val=""/>
+            <m:grow/>
+          </m:dPr>
+          <m:e>
+            <m:r>
+              <m:t>r</m:t>
+            </m:r>
+            <m:r>
+              <m:rPr>
+                <m:sty m:val="p"/>
+              </m:rPr>
+              <m:t>+</m:t>
+            </m:r>
+            <m:r>
+              <m:t>H</m:t>
+            </m:r>
+          </m:e>
+        </m:d>
+        <m:r>
+          <m:rPr>
+            <m:sty m:val="p"/>
+          </m:rPr>
+          <m:t>+</m:t>
+        </m:r>
+        <m:r>
+          <m:t>2</m:t>
+        </m:r>
+        <m:r>
+          <m:t>G</m:t>
+        </m:r>
+        <m:r>
+          <m:rPr>
+            <m:sty m:val="p"/>
+          </m:rPr>
+          <m:t>/</m:t>
+        </m:r>
+        <m:r>
+          <m:t>K</m:t>
+        </m:r>
+      </m:oMath>
+      <w:r>
+        <w:t xml:space="preserve">, so the larger root exceeds</w:t>
+      </w:r>
+      <w:r>
+        <w:t xml:space="preserve"> </w:t>
+      </w:r>
+      <m:oMath>
+        <m:r>
+          <m:t>r</m:t>
+        </m:r>
+        <m:r>
+          <m:rPr>
+            <m:sty m:val="p"/>
+          </m:rPr>
+          <m:t>+</m:t>
+        </m:r>
+        <m:r>
+          <m:t>H</m:t>
+        </m:r>
+        <m:r>
+          <m:rPr>
+            <m:sty m:val="p"/>
+          </m:rPr>
+          <m:t>≥</m:t>
+        </m:r>
+        <m:sSub>
+          <m:e>
+            <m:r>
+              <m:t>η</m:t>
+            </m:r>
+          </m:e>
+          <m:sub>
+            <m:r>
+              <m:t>i</m:t>
+            </m:r>
+          </m:sub>
+        </m:sSub>
+      </m:oMath>
+      <w:r>
+        <w:t xml:space="preserve"> </w:t>
+      </w:r>
+      <w:r>
+        <w:t xml:space="preserve">and is infeasible. Hence</w:t>
+      </w:r>
+      <w:r>
+        <w:t xml:space="preserve"> </w:t>
+      </w:r>
+      <m:oMath>
+        <m:sSub>
+          <m:e>
+            <m:r>
+              <m:t>η</m:t>
+            </m:r>
+          </m:e>
+          <m:sub>
+            <m:r>
+              <m:t>i</m:t>
+            </m:r>
+          </m:sub>
+        </m:sSub>
+      </m:oMath>
+      <w:r>
+        <w:t xml:space="preserve"> </w:t>
+      </w:r>
+      <w:r>
+        <w:t xml:space="preserve">is the smaller root, which is the same for every vendor given</w:t>
+      </w:r>
+      <w:r>
+        <w:t xml:space="preserve"> </w:t>
+      </w:r>
+      <m:oMath>
+        <m:r>
+          <m:t>H</m:t>
+        </m:r>
+      </m:oMath>
+      <w:r>
+        <w:t xml:space="preserve">. All equilibria are therefore symmetric. Substituting</w:t>
+      </w:r>
+      <w:r>
+        <w:t xml:space="preserve"> </w:t>
+      </w:r>
+      <m:oMath>
+        <m:r>
+          <m:t>H</m:t>
+        </m:r>
+        <m:r>
+          <m:rPr>
+            <m:sty m:val="p"/>
+          </m:rPr>
+          <m:t>=</m:t>
+        </m:r>
+        <m:r>
+          <m:t>N</m:t>
+        </m:r>
+        <m:r>
+          <m:t>η</m:t>
+        </m:r>
+      </m:oMath>
+      <w:r>
+        <w:t xml:space="preserve"> </w:t>
+      </w:r>
+      <w:r>
+        <w:t xml:space="preserve">gives the quadratic (9), which has a positive leading coefficient and a negative constant term and therefore exactly one positive root. Define</w:t>
+      </w:r>
+      <w:r>
+        <w:t xml:space="preserve"> </w:t>
+      </w:r>
+      <m:oMath>
+        <m:r>
+          <m:t>F</m:t>
+        </m:r>
+        <m:d>
+          <m:dPr>
+            <m:begChr m:val="("/>
+            <m:endChr m:val=")"/>
+            <m:sepChr m:val=""/>
+            <m:grow/>
+          </m:dPr>
+          <m:e>
+            <m:r>
+              <m:t>η</m:t>
+            </m:r>
+            <m:r>
+              <m:rPr>
+                <m:sty m:val="p"/>
+              </m:rPr>
+              <m:t>,</m:t>
+            </m:r>
+            <m:r>
+              <m:t>N</m:t>
+            </m:r>
+          </m:e>
+        </m:d>
+        <m:r>
+          <m:rPr>
+            <m:sty m:val="p"/>
+          </m:rPr>
+          <m:t>=</m:t>
+        </m:r>
+        <m:r>
+          <m:rPr>
+            <m:sty m:val="p"/>
+          </m:rPr>
+          <m:t>−</m:t>
+        </m:r>
+        <m:d>
+          <m:dPr>
+            <m:begChr m:val="["/>
+            <m:endChr m:val="]"/>
+            <m:sepChr m:val=""/>
+            <m:grow/>
+          </m:dPr>
+          <m:e>
+            <m:r>
+              <m:t>K</m:t>
+            </m:r>
+            <m:d>
+              <m:dPr>
+                <m:begChr m:val="("/>
+                <m:endChr m:val=")"/>
+                <m:sepChr m:val=""/>
+                <m:grow/>
+              </m:dPr>
+              <m:e>
+                <m:r>
+                  <m:t>N</m:t>
+                </m:r>
+                <m:r>
+                  <m:rPr>
+                    <m:sty m:val="p"/>
+                  </m:rPr>
+                  <m:t>−</m:t>
+                </m:r>
+                <m:f>
+                  <m:fPr>
+                    <m:type m:val="lin"/>
+                  </m:fPr>
+                  <m:num>
+                    <m:r>
+                      <m:t>1</m:t>
+                    </m:r>
+                  </m:num>
+                  <m:den>
+                    <m:r>
+                      <m:t>2</m:t>
+                    </m:r>
+                  </m:den>
+                </m:f>
+              </m:e>
+            </m:d>
+            <m:sSup>
+              <m:e>
+                <m:r>
+                  <m:t>η</m:t>
+                </m:r>
+              </m:e>
+              <m:sup>
+                <m:r>
+                  <m:t>2</m:t>
+                </m:r>
+              </m:sup>
+            </m:sSup>
+            <m:r>
+              <m:rPr>
+                <m:sty m:val="p"/>
+              </m:rPr>
+              <m:t>+</m:t>
+            </m:r>
+            <m:d>
+              <m:dPr>
+                <m:begChr m:val="("/>
+                <m:endChr m:val=")"/>
+                <m:sepChr m:val=""/>
+                <m:grow/>
+              </m:dPr>
+              <m:e>
+                <m:r>
+                  <m:t>K</m:t>
+                </m:r>
+                <m:r>
+                  <m:t>r</m:t>
+                </m:r>
+                <m:r>
+                  <m:rPr>
+                    <m:sty m:val="p"/>
+                  </m:rPr>
+                  <m:t>−</m:t>
+                </m:r>
+                <m:r>
+                  <m:t>G</m:t>
+                </m:r>
+                <m:d>
+                  <m:dPr>
+                    <m:begChr m:val="("/>
+                    <m:endChr m:val=")"/>
+                    <m:sepChr m:val=""/>
+                    <m:grow/>
+                  </m:dPr>
+                  <m:e>
+                    <m:r>
+                      <m:t>N</m:t>
+                    </m:r>
+                    <m:r>
+                      <m:rPr>
+                        <m:sty m:val="p"/>
+                      </m:rPr>
+                      <m:t>−</m:t>
+                    </m:r>
+                    <m:r>
+                      <m:t>1</m:t>
+                    </m:r>
+                  </m:e>
+                </m:d>
+              </m:e>
+            </m:d>
+            <m:r>
+              <m:t>η</m:t>
+            </m:r>
+            <m:r>
+              <m:rPr>
+                <m:sty m:val="p"/>
+              </m:rPr>
+              <m:t>−</m:t>
+            </m:r>
+            <m:r>
+              <m:t>G</m:t>
+            </m:r>
+            <m:r>
+              <m:t>r</m:t>
+            </m:r>
+          </m:e>
+        </m:d>
+      </m:oMath>
+      <w:r>
+        <w:t xml:space="preserve">. Then</w:t>
+      </w:r>
+      <w:r>
+        <w:t xml:space="preserve"> </w:t>
+      </w:r>
+      <m:oMath>
+        <m:r>
+          <m:t>F</m:t>
+        </m:r>
+        <m:d>
+          <m:dPr>
+            <m:begChr m:val="("/>
+            <m:endChr m:val=")"/>
+            <m:sepChr m:val=""/>
+            <m:grow/>
+          </m:dPr>
+          <m:e>
+            <m:r>
+              <m:t>0</m:t>
+            </m:r>
+            <m:r>
+              <m:rPr>
+                <m:sty m:val="p"/>
+              </m:rPr>
+              <m:t>,</m:t>
+            </m:r>
+            <m:r>
+              <m:t>N</m:t>
+            </m:r>
+          </m:e>
+        </m:d>
+        <m:r>
+          <m:rPr>
+            <m:sty m:val="p"/>
+          </m:rPr>
+          <m:t>=</m:t>
+        </m:r>
+        <m:r>
+          <m:t>G</m:t>
+        </m:r>
+        <m:r>
+          <m:t>r</m:t>
+        </m:r>
+        <m:r>
+          <m:rPr>
+            <m:sty m:val="p"/>
+          </m:rPr>
+          <m:t>&gt;</m:t>
+        </m:r>
+        <m:r>
+          <m:t>0</m:t>
+        </m:r>
+      </m:oMath>
+      <w:r>
+        <w:t xml:space="preserve"> </w:t>
+      </w:r>
+      <w:r>
+        <w:t xml:space="preserve">and</w:t>
+      </w:r>
+      <w:r>
+        <w:t xml:space="preserve"> </w:t>
+      </w:r>
+      <m:oMath>
+        <m:r>
+          <m:t>F</m:t>
+        </m:r>
+        <m:d>
+          <m:dPr>
+            <m:begChr m:val="("/>
+            <m:endChr m:val=")"/>
+            <m:sepChr m:val=""/>
+            <m:grow/>
+          </m:dPr>
+          <m:e>
+            <m:r>
+              <m:t>G</m:t>
+            </m:r>
+            <m:r>
+              <m:rPr>
+                <m:sty m:val="p"/>
+              </m:rPr>
+              <m:t>/</m:t>
+            </m:r>
+            <m:r>
+              <m:t>K</m:t>
+            </m:r>
+            <m:r>
+              <m:rPr>
+                <m:sty m:val="p"/>
+              </m:rPr>
+              <m:t>,</m:t>
+            </m:r>
+            <m:r>
+              <m:t>N</m:t>
+            </m:r>
+          </m:e>
+        </m:d>
+        <m:r>
+          <m:rPr>
+            <m:sty m:val="p"/>
+          </m:rPr>
+          <m:t>=</m:t>
+        </m:r>
+        <m:r>
+          <m:rPr>
+            <m:sty m:val="p"/>
+          </m:rPr>
+          <m:t>−</m:t>
+        </m:r>
+        <m:sSup>
+          <m:e>
+            <m:r>
+              <m:t>G</m:t>
+            </m:r>
+          </m:e>
+          <m:sup>
+            <m:r>
+              <m:t>2</m:t>
+            </m:r>
+          </m:sup>
+        </m:sSup>
+        <m:r>
+          <m:rPr>
+            <m:sty m:val="p"/>
+          </m:rPr>
+          <m:t>/</m:t>
+        </m:r>
+        <m:d>
+          <m:dPr>
+            <m:begChr m:val="("/>
+            <m:endChr m:val=")"/>
+            <m:sepChr m:val=""/>
+            <m:grow/>
+          </m:dPr>
+          <m:e>
+            <m:r>
+              <m:t>2</m:t>
+            </m:r>
+            <m:r>
+              <m:t>K</m:t>
+            </m:r>
+          </m:e>
+        </m:d>
+        <m:r>
+          <m:rPr>
+            <m:sty m:val="p"/>
+          </m:rPr>
+          <m:t>&lt;</m:t>
+        </m:r>
+        <m:r>
+          <m:t>0</m:t>
+        </m:r>
+      </m:oMath>
+      <w:r>
+        <w:t xml:space="preserve">, so the root satisfies</w:t>
+      </w:r>
+      <w:r>
+        <w:t xml:space="preserve"> </w:t>
+      </w:r>
+      <m:oMath>
+        <m:sSup>
+          <m:e>
+            <m:r>
+              <m:t>η</m:t>
+            </m:r>
+          </m:e>
+          <m:sup>
+            <m:r>
+              <m:rPr>
+                <m:sty m:val="p"/>
+              </m:rPr>
+              <m:t>*</m:t>
+            </m:r>
+          </m:sup>
+        </m:sSup>
+        <m:r>
+          <m:rPr>
+            <m:sty m:val="p"/>
+          </m:rPr>
+          <m:t>&lt;</m:t>
+        </m:r>
+        <m:r>
+          <m:t>G</m:t>
+        </m:r>
+        <m:r>
+          <m:rPr>
+            <m:sty m:val="p"/>
+          </m:rPr>
+          <m:t>/</m:t>
+        </m:r>
+        <m:r>
+          <m:t>K</m:t>
+        </m:r>
+      </m:oMath>
+      <w:r>
+        <w:t xml:space="preserve">, and</w:t>
+      </w:r>
+      <w:r>
+        <w:t xml:space="preserve"> </w:t>
+      </w:r>
+      <m:oMath>
+        <m:r>
+          <m:t>F</m:t>
+        </m:r>
+      </m:oMath>
+      <w:r>
+        <w:t xml:space="preserve"> </w:t>
+      </w:r>
+      <w:r>
+        <w:t xml:space="preserve">crosses zero from above there. Because</w:t>
+      </w:r>
+      <w:r>
+        <w:t xml:space="preserve"> </w:t>
+      </w:r>
+      <m:oMath>
+        <m:r>
+          <m:t>F</m:t>
+        </m:r>
+        <m:d>
+          <m:dPr>
+            <m:begChr m:val="("/>
+            <m:endChr m:val=")"/>
+            <m:sepChr m:val=""/>
+            <m:grow/>
+          </m:dPr>
+          <m:e>
+            <m:r>
+              <m:t>η</m:t>
+            </m:r>
+            <m:r>
+              <m:rPr>
+                <m:sty m:val="p"/>
+              </m:rPr>
+              <m:t>,</m:t>
+            </m:r>
+            <m:r>
+              <m:t>N</m:t>
+            </m:r>
+            <m:r>
+              <m:rPr>
+                <m:sty m:val="p"/>
+              </m:rPr>
+              <m:t>+</m:t>
+            </m:r>
+            <m:r>
+              <m:t>1</m:t>
+            </m:r>
+          </m:e>
+        </m:d>
+        <m:r>
+          <m:rPr>
+            <m:sty m:val="p"/>
+          </m:rPr>
+          <m:t>−</m:t>
+        </m:r>
+        <m:r>
+          <m:t>F</m:t>
+        </m:r>
+        <m:d>
+          <m:dPr>
+            <m:begChr m:val="("/>
+            <m:endChr m:val=")"/>
+            <m:sepChr m:val=""/>
+            <m:grow/>
+          </m:dPr>
+          <m:e>
+            <m:r>
+              <m:t>η</m:t>
+            </m:r>
+            <m:r>
+              <m:rPr>
+                <m:sty m:val="p"/>
+              </m:rPr>
+              <m:t>,</m:t>
+            </m:r>
+            <m:r>
+              <m:t>N</m:t>
+            </m:r>
+          </m:e>
+        </m:d>
+        <m:r>
+          <m:rPr>
+            <m:sty m:val="p"/>
+          </m:rPr>
+          <m:t>=</m:t>
+        </m:r>
+        <m:r>
+          <m:t>η</m:t>
+        </m:r>
+        <m:d>
+          <m:dPr>
+            <m:begChr m:val="("/>
+            <m:endChr m:val=")"/>
+            <m:sepChr m:val=""/>
+            <m:grow/>
+          </m:dPr>
+          <m:e>
+            <m:r>
+              <m:t>G</m:t>
+            </m:r>
+            <m:r>
+              <m:rPr>
+                <m:sty m:val="p"/>
+              </m:rPr>
+              <m:t>−</m:t>
+            </m:r>
+            <m:r>
+              <m:t>K</m:t>
+            </m:r>
+            <m:r>
+              <m:t>η</m:t>
+            </m:r>
+          </m:e>
+        </m:d>
+        <m:r>
+          <m:rPr>
+            <m:sty m:val="p"/>
+          </m:rPr>
+          <m:t>&gt;</m:t>
+        </m:r>
+        <m:r>
+          <m:t>0</m:t>
+        </m:r>
+      </m:oMath>
+      <w:r>
+        <w:t xml:space="preserve"> </w:t>
+      </w:r>
+      <w:r>
+        <w:t xml:space="preserve">on</w:t>
+      </w:r>
+      <w:r>
+        <w:t xml:space="preserve"> </w:t>
+      </w:r>
+      <m:oMath>
+        <m:d>
+          <m:dPr>
+            <m:begChr m:val="("/>
+            <m:endChr m:val=")"/>
+            <m:sepChr m:val=""/>
+            <m:grow/>
+          </m:dPr>
+          <m:e>
+            <m:r>
+              <m:t>0</m:t>
+            </m:r>
+            <m:r>
+              <m:rPr>
+                <m:sty m:val="p"/>
+              </m:rPr>
+              <m:t>,</m:t>
+            </m:r>
+            <m:r>
+              <m:t>G</m:t>
+            </m:r>
+            <m:r>
+              <m:rPr>
+                <m:sty m:val="p"/>
+              </m:rPr>
+              <m:t>/</m:t>
+            </m:r>
+            <m:r>
+              <m:t>K</m:t>
+            </m:r>
+          </m:e>
+        </m:d>
+      </m:oMath>
+      <w:r>
+        <w:t xml:space="preserve">, we have</w:t>
+      </w:r>
+      <w:r>
+        <w:t xml:space="preserve"> </w:t>
+      </w:r>
+      <m:oMath>
+        <m:r>
+          <m:t>F</m:t>
+        </m:r>
+        <m:d>
+          <m:dPr>
+            <m:begChr m:val="("/>
+            <m:endChr m:val=")"/>
+            <m:sepChr m:val=""/>
+            <m:grow/>
+          </m:dPr>
+          <m:e>
+            <m:sSup>
+              <m:e>
+                <m:r>
+                  <m:t>η</m:t>
+                </m:r>
+              </m:e>
+              <m:sup>
+                <m:r>
+                  <m:rPr>
+                    <m:sty m:val="p"/>
+                  </m:rPr>
+                  <m:t>*</m:t>
+                </m:r>
+              </m:sup>
+            </m:sSup>
+            <m:d>
+              <m:dPr>
+                <m:begChr m:val="("/>
+                <m:endChr m:val=")"/>
+                <m:sepChr m:val=""/>
+                <m:grow/>
+              </m:dPr>
+              <m:e>
+                <m:r>
+                  <m:t>N</m:t>
+                </m:r>
+              </m:e>
+            </m:d>
+            <m:r>
+              <m:rPr>
+                <m:sty m:val="p"/>
+              </m:rPr>
+              <m:t>,</m:t>
+            </m:r>
+            <m:r>
+              <m:t>N</m:t>
+            </m:r>
+            <m:r>
+              <m:rPr>
+                <m:sty m:val="p"/>
+              </m:rPr>
+              <m:t>+</m:t>
+            </m:r>
+            <m:r>
+              <m:t>1</m:t>
+            </m:r>
+          </m:e>
+        </m:d>
+        <m:r>
+          <m:rPr>
+            <m:sty m:val="p"/>
+          </m:rPr>
+          <m:t>&gt;</m:t>
+        </m:r>
+        <m:r>
+          <m:t>0</m:t>
+        </m:r>
+      </m:oMath>
+      <w:r>
+        <w:t xml:space="preserve">, and so the root for</w:t>
+      </w:r>
+      <w:r>
+        <w:t xml:space="preserve"> </w:t>
+      </w:r>
+      <m:oMath>
+        <m:r>
+          <m:t>N</m:t>
+        </m:r>
+        <m:r>
+          <m:rPr>
+            <m:sty m:val="p"/>
+          </m:rPr>
+          <m:t>+</m:t>
+        </m:r>
+        <m:r>
+          <m:t>1</m:t>
+        </m:r>
+      </m:oMath>
+      <w:r>
+        <w:t xml:space="preserve"> </w:t>
+      </w:r>
+      <w:r>
+        <w:t xml:space="preserve">lies above</w:t>
+      </w:r>
+      <w:r>
+        <w:t xml:space="preserve"> </w:t>
+      </w:r>
+      <m:oMath>
+        <m:sSup>
+          <m:e>
+            <m:r>
+              <m:t>η</m:t>
+            </m:r>
+          </m:e>
+          <m:sup>
+            <m:r>
+              <m:rPr>
+                <m:sty m:val="p"/>
+              </m:rPr>
+              <m:t>*</m:t>
+            </m:r>
+          </m:sup>
+        </m:sSup>
+        <m:d>
+          <m:dPr>
+            <m:begChr m:val="("/>
+            <m:endChr m:val=")"/>
+            <m:sepChr m:val=""/>
+            <m:grow/>
+          </m:dPr>
+          <m:e>
+            <m:r>
+              <m:t>N</m:t>
+            </m:r>
+          </m:e>
+        </m:d>
+      </m:oMath>
+      <w:r>
+        <w:t xml:space="preserve">. Both</w:t>
+      </w:r>
+      <w:r>
+        <w:t xml:space="preserve"> </w:t>
+      </w:r>
+      <m:oMath>
+        <m:sSup>
+          <m:e>
+            <m:r>
+              <m:t>η</m:t>
+            </m:r>
+          </m:e>
+          <m:sup>
+            <m:r>
+              <m:rPr>
+                <m:sty m:val="p"/>
+              </m:rPr>
+              <m:t>*</m:t>
+            </m:r>
+          </m:sup>
+        </m:sSup>
+        <m:d>
+          <m:dPr>
+            <m:begChr m:val="("/>
+            <m:endChr m:val=")"/>
+            <m:sepChr m:val=""/>
+            <m:grow/>
+          </m:dPr>
+          <m:e>
+            <m:r>
+              <m:t>N</m:t>
+            </m:r>
+          </m:e>
+        </m:d>
+      </m:oMath>
+      <w:r>
+        <w:t xml:space="preserve"> </w:t>
+      </w:r>
+      <w:r>
+        <w:t xml:space="preserve">and</w:t>
+      </w:r>
+      <w:r>
+        <w:t xml:space="preserve"> </w:t>
+      </w:r>
+      <m:oMath>
+        <m:r>
+          <m:t>N</m:t>
+        </m:r>
+        <m:sSup>
+          <m:e>
+            <m:r>
+              <m:t>η</m:t>
+            </m:r>
+          </m:e>
+          <m:sup>
+            <m:r>
+              <m:rPr>
+                <m:sty m:val="p"/>
+              </m:rPr>
+              <m:t>*</m:t>
+            </m:r>
+          </m:sup>
+        </m:sSup>
+        <m:d>
+          <m:dPr>
+            <m:begChr m:val="("/>
+            <m:endChr m:val=")"/>
+            <m:sepChr m:val=""/>
+            <m:grow/>
+          </m:dPr>
+          <m:e>
+            <m:r>
+              <m:t>N</m:t>
+            </m:r>
+          </m:e>
+        </m:d>
+      </m:oMath>
+      <w:r>
+        <w:t xml:space="preserve"> </w:t>
+      </w:r>
+      <w:r>
+        <w:t xml:space="preserve">are therefore increasing in</w:t>
+      </w:r>
+      <w:r>
+        <w:t xml:space="preserve"> </w:t>
+      </w:r>
+      <m:oMath>
+        <m:r>
+          <m:t>N</m:t>
+        </m:r>
+      </m:oMath>
+      <w:r>
+        <w:t xml:space="preserve">. As in the proof of Proposition 6, the first-order condition gives</w:t>
+      </w:r>
+      <w:r>
+        <w:t xml:space="preserve"> </w:t>
+      </w:r>
+      <m:oMath>
+        <m:sSub>
+          <m:e>
+            <m:r>
+              <m:t>J</m:t>
+            </m:r>
+          </m:e>
+          <m:sub>
+            <m:r>
+              <m:t>i</m:t>
+            </m:r>
+          </m:sub>
+        </m:sSub>
+        <m:r>
+          <m:rPr>
+            <m:sty m:val="p"/>
+          </m:rPr>
+          <m:t>=</m:t>
+        </m:r>
+        <m:r>
+          <m:t>G</m:t>
+        </m:r>
+        <m:r>
+          <m:rPr>
+            <m:sty m:val="p"/>
+          </m:rPr>
+          <m:t>−</m:t>
+        </m:r>
+        <m:r>
+          <m:t>K</m:t>
+        </m:r>
+        <m:sSup>
+          <m:e>
+            <m:r>
+              <m:t>η</m:t>
+            </m:r>
+          </m:e>
+          <m:sup>
+            <m:r>
+              <m:rPr>
+                <m:sty m:val="p"/>
+              </m:rPr>
+              <m:t>*</m:t>
+            </m:r>
+          </m:sup>
+        </m:sSup>
+      </m:oMath>
+      <w:r>
+        <w:t xml:space="preserve">, which is decreasing in</w:t>
+      </w:r>
+      <w:r>
+        <w:t xml:space="preserve"> </w:t>
+      </w:r>
+      <m:oMath>
+        <m:r>
+          <m:t>N</m:t>
+        </m:r>
+      </m:oMath>
+      <w:r>
+        <w:t xml:space="preserve"> </w:t>
+      </w:r>
+      <w:r>
+        <w:t xml:space="preserve">since</w:t>
+      </w:r>
+      <w:r>
+        <w:t xml:space="preserve"> </w:t>
+      </w:r>
+      <m:oMath>
+        <m:sSup>
+          <m:e>
+            <m:r>
+              <m:t>η</m:t>
+            </m:r>
+          </m:e>
+          <m:sup>
+            <m:r>
+              <m:rPr>
+                <m:sty m:val="p"/>
+              </m:rPr>
+              <m:t>*</m:t>
+            </m:r>
+          </m:sup>
+        </m:sSup>
+      </m:oMath>
+      <w:r>
+        <w:t xml:space="preserve"> </w:t>
+      </w:r>
+      <w:r>
+        <w:t xml:space="preserve">is increasing, and positive since</w:t>
+      </w:r>
+      <w:r>
+        <w:t xml:space="preserve"> </w:t>
+      </w:r>
+      <m:oMath>
+        <m:sSup>
+          <m:e>
+            <m:r>
+              <m:t>η</m:t>
+            </m:r>
+          </m:e>
+          <m:sup>
+            <m:r>
+              <m:rPr>
+                <m:sty m:val="p"/>
+              </m:rPr>
+              <m:t>*</m:t>
+            </m:r>
+          </m:sup>
+        </m:sSup>
+        <m:r>
+          <m:rPr>
+            <m:sty m:val="p"/>
+          </m:rPr>
+          <m:t>&lt;</m:t>
+        </m:r>
+        <m:r>
+          <m:t>G</m:t>
+        </m:r>
+        <m:r>
+          <m:rPr>
+            <m:sty m:val="p"/>
+          </m:rPr>
+          <m:t>/</m:t>
+        </m:r>
+        <m:r>
+          <m:t>K</m:t>
+        </m:r>
+      </m:oMath>
+      <w:r>
+        <w:t xml:space="preserve">. The adopter’s value</w:t>
+      </w:r>
+      <w:r>
+        <w:t xml:space="preserve"> </w:t>
+      </w:r>
+      <m:oMath>
+        <m:r>
+          <m:t>R</m:t>
+        </m:r>
+        <m:r>
+          <m:rPr>
+            <m:sty m:val="p"/>
+          </m:rPr>
+          <m:t>/</m:t>
+        </m:r>
+        <m:d>
+          <m:dPr>
+            <m:begChr m:val="("/>
+            <m:endChr m:val=")"/>
+            <m:sepChr m:val=""/>
+            <m:grow/>
+          </m:dPr>
+          <m:e>
+            <m:r>
+              <m:t>r</m:t>
+            </m:r>
+            <m:r>
+              <m:rPr>
+                <m:sty m:val="p"/>
+              </m:rPr>
+              <m:t>+</m:t>
+            </m:r>
+            <m:sSup>
+              <m:e>
+                <m:r>
+                  <m:t>H</m:t>
+                </m:r>
+              </m:e>
+              <m:sup>
+                <m:r>
+                  <m:rPr>
+                    <m:sty m:val="p"/>
+                  </m:rPr>
+                  <m:t>*</m:t>
+                </m:r>
+              </m:sup>
+            </m:sSup>
+          </m:e>
+        </m:d>
+      </m:oMath>
+      <w:r>
+        <w:t xml:space="preserve"> </w:t>
+      </w:r>
+      <w:r>
+        <w:t xml:space="preserve">is decreasing in</w:t>
+      </w:r>
+      <w:r>
+        <w:t xml:space="preserve"> </w:t>
+      </w:r>
+      <m:oMath>
+        <m:sSup>
+          <m:e>
+            <m:r>
+              <m:t>H</m:t>
+            </m:r>
+          </m:e>
+          <m:sup>
+            <m:r>
+              <m:rPr>
+                <m:sty m:val="p"/>
+              </m:rPr>
+              <m:t>*</m:t>
+            </m:r>
+          </m:sup>
+        </m:sSup>
+      </m:oMath>
+      <w:r>
+        <w:t xml:space="preserve"> </w:t>
+      </w:r>
+      <w:r>
+        <w:t xml:space="preserve">and hence in</w:t>
+      </w:r>
+      <w:r>
+        <w:t xml:space="preserve"> </w:t>
+      </w:r>
+      <m:oMath>
+        <m:r>
+          <m:t>N</m:t>
+        </m:r>
+      </m:oMath>
+      <w:r>
+        <w:t xml:space="preserve">. For</w:t>
+      </w:r>
+      <w:r>
+        <w:t xml:space="preserve"> </w:t>
+      </w:r>
+      <m:oMath>
+        <m:r>
+          <m:t>N</m:t>
+        </m:r>
+        <m:r>
+          <m:rPr>
+            <m:sty m:val="p"/>
+          </m:rPr>
+          <m:t>=</m:t>
+        </m:r>
+        <m:r>
+          <m:t>1</m:t>
+        </m:r>
+      </m:oMath>
+      <w:r>
+        <w:t xml:space="preserve">, (9) reduces to</w:t>
+      </w:r>
+      <w:r>
+        <w:t xml:space="preserve"> </w:t>
+      </w:r>
+      <m:oMath>
+        <m:f>
+          <m:fPr>
+            <m:type m:val="lin"/>
+          </m:fPr>
+          <m:num>
+            <m:r>
+              <m:t>K</m:t>
+            </m:r>
+          </m:num>
+          <m:den>
+            <m:r>
+              <m:t>2</m:t>
+            </m:r>
+          </m:den>
+        </m:f>
+        <m:sSup>
+          <m:e>
+            <m:r>
+              <m:t>η</m:t>
+            </m:r>
+          </m:e>
+          <m:sup>
+            <m:r>
+              <m:t>2</m:t>
+            </m:r>
+          </m:sup>
+        </m:sSup>
+        <m:r>
+          <m:rPr>
+            <m:sty m:val="p"/>
+          </m:rPr>
+          <m:t>+</m:t>
+        </m:r>
+        <m:r>
+          <m:t>K</m:t>
+        </m:r>
+        <m:r>
+          <m:t>r</m:t>
+        </m:r>
+        <m:r>
+          <m:t>η</m:t>
+        </m:r>
+        <m:r>
+          <m:rPr>
+            <m:sty m:val="p"/>
+          </m:rPr>
+          <m:t>−</m:t>
+        </m:r>
+        <m:r>
+          <m:t>G</m:t>
+        </m:r>
+        <m:r>
+          <m:t>r</m:t>
+        </m:r>
+        <m:r>
+          <m:rPr>
+            <m:sty m:val="p"/>
+          </m:rPr>
+          <m:t>=</m:t>
+        </m:r>
+        <m:r>
+          <m:t>0</m:t>
+        </m:r>
+      </m:oMath>
+      <w:r>
+        <w:t xml:space="preserve">, which is the quadratic in the proof of Proposition 6.</w:t>
+      </w:r>
+      <w:r>
+        <w:t xml:space="preserve"> </w:t>
+      </w:r>
+      <m:oMath>
+        <m:r>
+          <m:rPr>
+            <m:sty m:val="p"/>
+          </m:rPr>
+          <m:t>◼</m:t>
+        </m:r>
+      </m:oMath>
+    </w:p>
+    <w:bookmarkEnd w:id="51"/>
+    <w:bookmarkStart w:id="52" w:name="references"/>
     <w:p>
       <w:pPr>
         <w:pStyle w:val="Heading1"/>
@@ -14805,7 +18357,7 @@
         <w:t xml:space="preserve">, June 16. https://www.wheresyoured.at/exclusive-openai-financials/.</w:t>
       </w:r>
     </w:p>
-    <w:bookmarkEnd w:id="51"/>
+    <w:bookmarkEnd w:id="52"/>
     <w:sectPr/>
   </w:body>
 </w:document>

</xml_diff>

<commit_message>
Reorganize Sections 4-6 for consistency: reorder subsections, align terminology, tables, and Section 6
Co-Authored-By: Claude Sonnet 5.5 <noreply@anthropic.com>
Claude-Session: https://claude.ai/code/session_01SvJ27oz7kYhWEBfZS3x4ro
</commit_message>
<xml_diff>
--- a/isr/ISR_Who_Profits_from_LLMs.docx
+++ b/isr/ISR_Who_Profits_from_LLMs.docx
@@ -226,7 +226,7 @@
         <w:t xml:space="preserve"> </w:t>
       </w:r>
       <w:r>
-        <w:t xml:space="preserve">as given. Section 4.5 then lets the developer choose</w:t>
+        <w:t xml:space="preserve">as given. Section 4.3 then lets the vendor choose</w:t>
       </w:r>
       <w:r>
         <w:t xml:space="preserve"> </w:t>
@@ -240,7 +240,7 @@
         <w:t xml:space="preserve"> </w:t>
       </w:r>
       <w:r>
-        <w:t xml:space="preserve">and shows how contract terms that limit its use of adopters’ data change that choice and, through it, the adopter’s incentive to invest. Section 4.6 adds competition among vendors, which weakens the effect of such terms. How far an adopter can lower</w:t>
+        <w:t xml:space="preserve">and shows how contract terms that limit its use of adopters’ data change that choice and, through it, the adopter’s incentive to invest. Section 4.4 adds competition among vendors, which weakens the effect of such terms. How far an adopter can lower</w:t>
       </w:r>
       <w:r>
         <w:t xml:space="preserve"> </w:t>
@@ -2064,7 +2064,23 @@
         <w:pStyle w:val="BodyText"/>
       </w:pPr>
       <w:r>
-        <w:t xml:space="preserve">Table 2 lists the notation.</w:t>
+        <w:t xml:space="preserve">In what follows, a</w:t>
+      </w:r>
+      <w:r>
+        <w:t xml:space="preserve"> </w:t>
+      </w:r>
+      <w:r>
+        <w:rPr>
+          <w:iCs/>
+          <w:i/>
+        </w:rPr>
+        <w:t xml:space="preserve">vendor</w:t>
+      </w:r>
+      <w:r>
+        <w:t xml:space="preserve"> </w:t>
+      </w:r>
+      <w:r>
+        <w:t xml:space="preserve">is a model developer that sells to adopters. The frontier developer is one such vendor, and Sections 4.3 and 4.4 consider vendors other than the frontier developer as well. Table 2 lists the notation.</w:t>
       </w:r>
     </w:p>
     <w:p>
@@ -2698,6 +2714,45 @@
             </w:pPr>
             <m:oMath>
               <m:r>
+                <m:t>G</m:t>
+              </m:r>
+            </m:oMath>
+            <w:r>
+              <w:t xml:space="preserve">,</w:t>
+            </w:r>
+            <w:r>
+              <w:t xml:space="preserve"> </w:t>
+            </w:r>
+            <m:oMath>
+              <m:r>
+                <m:t>H</m:t>
+              </m:r>
+            </m:oMath>
+          </w:p>
+        </w:tc>
+        <w:tc>
+          <w:tcPr/>
+          <w:p>
+            <w:pPr>
+              <w:pStyle w:val="Compact"/>
+              <w:jc w:val="left"/>
+            </w:pPr>
+            <w:r>
+              <w:t xml:space="preserve">A vendor’s gain from productizing a use; total productization rate across vendors</w:t>
+            </w:r>
+          </w:p>
+        </w:tc>
+      </w:tr>
+      <w:tr>
+        <w:tc>
+          <w:tcPr/>
+          <w:p>
+            <w:pPr>
+              <w:pStyle w:val="Compact"/>
+              <w:jc w:val="left"/>
+            </w:pPr>
+            <m:oMath>
+              <m:r>
                 <m:t>η</m:t>
               </m:r>
             </m:oMath>
@@ -2773,7 +2828,7 @@
               <w:t xml:space="preserve"> </w:t>
             </w:r>
             <w:r>
-              <w:t xml:space="preserve">(Section 4.5);</w:t>
+              <w:t xml:space="preserve">(Section 4.3);</w:t>
             </w:r>
             <w:r>
               <w:t xml:space="preserve"> </w:t>
@@ -2827,7 +2882,7 @@
               <w:jc w:val="left"/>
             </w:pPr>
             <w:r>
-              <w:t xml:space="preserve">Number of vendors able to productize the same use (Section 4.6)</w:t>
+              <w:t xml:space="preserve">Number of vendors able to productize the same use (Section 4.4)</w:t>
             </w:r>
           </w:p>
         </w:tc>
@@ -2998,7 +3053,7 @@
         <w:pStyle w:val="FirstParagraph"/>
       </w:pPr>
       <w:r>
-        <w:t xml:space="preserve">We state the propositions once here. Proofs are in Appendix A.</w:t>
+        <w:t xml:space="preserve">Propositions 1 to 5 are stated here. Propositions 6 to 8, which endogenize the productization rate and add competition among vendors, follow in Sections 4.3 and 4.4. All proofs are in Appendix A.</w:t>
       </w:r>
     </w:p>
     <w:p>
@@ -5027,13 +5082,13 @@
       </w:r>
     </w:p>
     <w:bookmarkEnd w:id="33"/>
-    <w:bookmarkStart w:id="34" w:name="comparative-statics"/>
+    <w:bookmarkStart w:id="34" w:name="Xb251667487cf04b98c628b0f1577ec4895e93a1"/>
     <w:p>
       <w:pPr>
         <w:pStyle w:val="Heading2"/>
       </w:pPr>
       <w:r>
-        <w:t xml:space="preserve">4.3 Comparative statics</w:t>
+        <w:t xml:space="preserve">4.3 Endogenous encroachment and contract protection</w:t>
       </w:r>
     </w:p>
     <w:p>
@@ -5041,271 +5096,6 @@
         <w:pStyle w:val="FirstParagraph"/>
       </w:pPr>
       <w:r>
-        <w:t xml:space="preserve">Five predictions follow, and they are the ones the empirical work in Sections 5 and 6 can address.</w:t>
-      </w:r>
-    </w:p>
-    <w:p>
-      <w:pPr>
-        <w:numPr>
-          <w:ilvl w:val="0"/>
-          <w:numId w:val="1001"/>
-        </w:numPr>
-        <w:pStyle w:val="Compact"/>
-      </w:pPr>
-      <w:r>
-        <w:t xml:space="preserve">Realized developer prices for inference rise with</w:t>
-      </w:r>
-      <w:r>
-        <w:t xml:space="preserve"> </w:t>
-      </w:r>
-      <m:oMath>
-        <m:r>
-          <m:t>Δ</m:t>
-        </m:r>
-        <m:r>
-          <m:t>θ</m:t>
-        </m:r>
-      </m:oMath>
-      <w:r>
-        <w:t xml:space="preserve"> </w:t>
-      </w:r>
-      <w:r>
-        <w:t xml:space="preserve">and fall toward serving cost as</w:t>
-      </w:r>
-      <w:r>
-        <w:t xml:space="preserve"> </w:t>
-      </w:r>
-      <m:oMath>
-        <m:r>
-          <m:t>Δ</m:t>
-        </m:r>
-        <m:r>
-          <m:t>θ</m:t>
-        </m:r>
-        <m:r>
-          <m:rPr>
-            <m:sty m:val="p"/>
-          </m:rPr>
-          <m:t>→</m:t>
-        </m:r>
-        <m:r>
-          <m:t>0</m:t>
-        </m:r>
-      </m:oMath>
-      <w:r>
-        <w:t xml:space="preserve"> </w:t>
-      </w:r>
-      <w:r>
-        <w:t xml:space="preserve">(Proposition 3).</w:t>
-      </w:r>
-    </w:p>
-    <w:p>
-      <w:pPr>
-        <w:numPr>
-          <w:ilvl w:val="0"/>
-          <w:numId w:val="1001"/>
-        </w:numPr>
-        <w:pStyle w:val="Compact"/>
-      </w:pPr>
-      <w:r>
-        <w:t xml:space="preserve">Developer rent is shortened by open-weight releases, compressed release intervals, and falling serving cost (Proposition 3 and Corollary 3).</w:t>
-      </w:r>
-    </w:p>
-    <w:p>
-      <w:pPr>
-        <w:numPr>
-          <w:ilvl w:val="0"/>
-          <w:numId w:val="1001"/>
-        </w:numPr>
-        <w:pStyle w:val="Compact"/>
-      </w:pPr>
-      <w:r>
-        <w:t xml:space="preserve">Adopter-side profit is predicted by a dated first-party product, which proxies</w:t>
-      </w:r>
-      <w:r>
-        <w:t xml:space="preserve"> </w:t>
-      </w:r>
-      <m:oMath>
-        <m:r>
-          <m:t>O</m:t>
-        </m:r>
-        <m:r>
-          <m:rPr>
-            <m:sty m:val="p"/>
-          </m:rPr>
-          <m:t>&gt;</m:t>
-        </m:r>
-        <m:r>
-          <m:t>0</m:t>
-        </m:r>
-      </m:oMath>
-      <w:r>
-        <w:t xml:space="preserve">, and not by pooled exposure to LLMs (Propositions 1 and 2).</w:t>
-      </w:r>
-    </w:p>
-    <w:p>
-      <w:pPr>
-        <w:numPr>
-          <w:ilvl w:val="0"/>
-          <w:numId w:val="1001"/>
-        </w:numPr>
-        <w:pStyle w:val="Compact"/>
-      </w:pPr>
-      <w:r>
-        <w:t xml:space="preserve">Industries with shorter</w:t>
-      </w:r>
-      <w:r>
-        <w:t xml:space="preserve"> </w:t>
-      </w:r>
-      <m:oMath>
-        <m:sSub>
-          <m:e>
-            <m:r>
-              <m:t>τ</m:t>
-            </m:r>
-          </m:e>
-          <m:sub>
-            <m:r>
-              <m:t>O</m:t>
-            </m:r>
-          </m:sub>
-        </m:sSub>
-      </m:oMath>
-      <w:r>
-        <w:t xml:space="preserve">, or with more vendor encroachment, show weaker associations between AI use and profit (Propositions 2 and 5).</w:t>
-      </w:r>
-    </w:p>
-    <w:p>
-      <w:pPr>
-        <w:numPr>
-          <w:ilvl w:val="0"/>
-          <w:numId w:val="1001"/>
-        </w:numPr>
-        <w:pStyle w:val="Compact"/>
-      </w:pPr>
-      <w:r>
-        <w:t xml:space="preserve">As downstream competition intensifies, the AI–profit association weakens while the AI–productivity association is unaffected (Propositions 1 and 4).</w:t>
-      </w:r>
-    </w:p>
-    <w:p>
-      <w:pPr>
-        <w:pStyle w:val="FirstParagraph"/>
-      </w:pPr>
-      <w:r>
-        <w:t xml:space="preserve">Predictions 4 and 5 are not tested here. Proposition 5 is also untested, but it bears directly on the LLM setting and on managerial choices about data-use terms and fine-tuning ownership, which we take up in Section 7.</w:t>
-      </w:r>
-    </w:p>
-    <w:bookmarkEnd w:id="34"/>
-    <w:bookmarkStart w:id="35" w:name="what-is-specific-to-llms"/>
-    <w:p>
-      <w:pPr>
-        <w:pStyle w:val="Heading2"/>
-      </w:pPr>
-      <w:r>
-        <w:t xml:space="preserve">4.4 What is specific to LLMs</w:t>
-      </w:r>
-    </w:p>
-    <w:p>
-      <w:pPr>
-        <w:pStyle w:val="FirstParagraph"/>
-      </w:pPr>
-      <w:r>
-        <w:t xml:space="preserve">A fair question is whether anything in the model is specific to LLMs, or whether the same propositions would describe any layered technology market. The structure is general. What is specific is the combination of values and measurement conditions that LLMs bring to it. Marginal inference cost</w:t>
-      </w:r>
-      <w:r>
-        <w:t xml:space="preserve"> </w:t>
-      </w:r>
-      <m:oMath>
-        <m:r>
-          <m:t>m</m:t>
-        </m:r>
-      </m:oMath>
-      <w:r>
-        <w:t xml:space="preserve"> </w:t>
-      </w:r>
-      <w:r>
-        <w:t xml:space="preserve">is low relative to the cost of producing a frontier model</w:t>
-      </w:r>
-      <w:r>
-        <w:t xml:space="preserve"> </w:t>
-      </w:r>
-      <m:oMath>
-        <m:sSub>
-          <m:e>
-            <m:r>
-              <m:t>F</m:t>
-            </m:r>
-          </m:e>
-          <m:sub>
-            <m:r>
-              <m:t>T</m:t>
-            </m:r>
-          </m:sub>
-        </m:sSub>
-      </m:oMath>
-      <w:r>
-        <w:t xml:space="preserve">, so that profit depends almost entirely on the premium</w:t>
-      </w:r>
-      <w:r>
-        <w:t xml:space="preserve"> </w:t>
-      </w:r>
-      <m:oMath>
-        <m:r>
-          <m:t>κ</m:t>
-        </m:r>
-        <m:r>
-          <m:t>Δ</m:t>
-        </m:r>
-        <m:r>
-          <m:t>θ</m:t>
-        </m:r>
-      </m:oMath>
-      <w:r>
-        <w:t xml:space="preserve">. The catch-up lag</w:t>
-      </w:r>
-      <w:r>
-        <w:t xml:space="preserve"> </w:t>
-      </w:r>
-      <m:oMath>
-        <m:sSub>
-          <m:e>
-            <m:r>
-              <m:t>τ</m:t>
-            </m:r>
-          </m:e>
-          <m:sub>
-            <m:r>
-              <m:rPr>
-                <m:nor/>
-                <m:sty m:val="p"/>
-              </m:rPr>
-              <m:t>dev</m:t>
-            </m:r>
-          </m:sub>
-        </m:sSub>
-      </m:oMath>
-      <w:r>
-        <w:t xml:space="preserve"> </w:t>
-      </w:r>
-      <w:r>
-        <w:t xml:space="preserve">is short, on the order of three to four months for open-weight models relative to the closed frontier (Emberson 2025, Epoch AI 2026), which places the developer close to the zero-rent corner of Proposition 3. The same model serves both the complement builder and its competitors on posted terms, which is what makes the adopter’s position commodity-like in the first place. And developers can and do move into the complement layer, which is the situation Proposition 5 describes. In this sense the theory is less a new mechanism than a calibration of known mechanisms to a market in which the state variables can be observed. We return to the limits of this claim in Section 7.3.</w:t>
-      </w:r>
-    </w:p>
-    <w:bookmarkEnd w:id="35"/>
-    <w:bookmarkStart w:id="36" w:name="Xb251667487cf04b98c628b0f1577ec4895e93a1"/>
-    <w:p>
-      <w:pPr>
-        <w:pStyle w:val="Heading2"/>
-      </w:pPr>
-      <w:r>
-        <w:t xml:space="preserve">4.5 Endogenous encroachment and contract protection</w:t>
-      </w:r>
-    </w:p>
-    <w:p>
-      <w:pPr>
-        <w:pStyle w:val="FirstParagraph"/>
-      </w:pPr>
-      <w:r>
         <w:t xml:space="preserve">Proposition 5 treats the productization rate</w:t>
       </w:r>
       <w:r>
@@ -5320,7 +5110,7 @@
         <w:t xml:space="preserve"> </w:t>
       </w:r>
       <w:r>
-        <w:t xml:space="preserve">as given. Here we let the developer choose it and ask how contract terms affect the choice. The analysis is a reduced-form extension. It adds the minimum structure needed to endogenize</w:t>
+        <w:t xml:space="preserve">as given. Here we let the vendor choose it and ask how contract terms affect the choice. The analysis is a reduced-form extension. It adds the minimum structure needed to endogenize</w:t>
       </w:r>
       <w:r>
         <w:t xml:space="preserve"> </w:t>
@@ -5629,7 +5419,7 @@
         </m:r>
       </m:oMath>
       <w:r>
-        <w:t xml:space="preserve">, which limits the developer’s use of the adopter’s data, fine-tuning, or deployment information. The developer exerts effort</w:t>
+        <w:t xml:space="preserve">, which limits the vendor’s use of the adopter’s data, fine-tuning, or deployment information. The vendor exerts effort</w:t>
       </w:r>
       <w:r>
         <w:t xml:space="preserve"> </w:t>
@@ -5890,7 +5680,7 @@
         </m:r>
       </m:oMath>
       <w:r>
-        <w:t xml:space="preserve">. When it productizes the use, the developer gains the present value</w:t>
+        <w:t xml:space="preserve">. When it productizes the use, the vendor gains the present value</w:t>
       </w:r>
       <w:r>
         <w:t xml:space="preserve"> </w:t>
@@ -5989,7 +5779,7 @@
         <w:t xml:space="preserve"> </w:t>
       </w:r>
       <w:r>
-        <w:t xml:space="preserve">that it captures, and the rest passes to consumers. The developer chooses</w:t>
+        <w:t xml:space="preserve">that it captures, and the rest passes to consumers. The vendor chooses</w:t>
       </w:r>
       <w:r>
         <w:t xml:space="preserve"> </w:t>
@@ -6126,7 +5916,7 @@
         <w:t xml:space="preserve"> </w:t>
       </w:r>
       <w:r>
-        <w:t xml:space="preserve">The developer’s problem has a unique interior solution,</w:t>
+        <w:t xml:space="preserve">The vendor’s problem has a unique interior solution,</w:t>
       </w:r>
     </w:p>
     <w:p>
@@ -6344,7 +6134,7 @@
         </m:r>
       </m:oMath>
       <w:r>
-        <w:t xml:space="preserve">: the faster rivals are expected to imitate, the faster the developer productizes.</w:t>
+        <w:t xml:space="preserve">: the faster rivals are expected to imitate, the faster the vendor productizes.</w:t>
       </w:r>
     </w:p>
     <w:p>
@@ -6578,7 +6368,7 @@
         <w:pStyle w:val="BodyText"/>
       </w:pPr>
       <w:r>
-        <w:t xml:space="preserve">Proposition 6 says that imitation by rivals and encroachment by the vendor are strategic complements. A shorter expected imitation lag makes the developer move sooner, so that the two threats to the adopter’s rent compound. Proposition 7 is the hold-up logic of Klein et al. (1978) and Grossman and Hart (1986) applied to the LLM supply relationship. An adopter that fears productization under-invests in the co-specialized capital that generates its rent, and contract terms that raise the developer’s cost of encroaching restore some of that investment.</w:t>
+        <w:t xml:space="preserve">Proposition 6 says that imitation by rivals and encroachment by the vendor are strategic complements. A shorter expected imitation lag makes the vendor move sooner, so that the two threats to the adopter’s rent compound. Proposition 7 is the hold-up logic of Klein et al. (1978) and Grossman and Hart (1986) applied to the LLM supply relationship. An adopter that fears productization under-invests in the co-specialized capital that generates its rent, and contract terms that raise the vendor’s cost of encroaching restore some of that investment.</w:t>
       </w:r>
     </w:p>
     <w:p>
@@ -6742,7 +6532,7 @@
         </m:d>
       </m:oMath>
       <w:r>
-        <w:t xml:space="preserve">. The developer’s loss is</w:t>
+        <w:t xml:space="preserve">. The vendor’s loss is</w:t>
       </w:r>
       <w:r>
         <w:t xml:space="preserve"> </w:t>
@@ -6876,7 +6666,7 @@
         </m:sSup>
       </m:oMath>
       <w:r>
-        <w:t xml:space="preserve">. A contract can be agreed only if the first exceeds the second. Table 4 gives a numerical illustration. Protection clears for uses with small rents and fails for uses with large rents, because the developer’s gain from productizing grows with the rent. The pattern depends on the parameters and is not general, since in a simulation with randomly drawn parameters the willingness to pay fell short of the developer’s loss in about five percent of the draws. We therefore offer it as an illustration and not as a proposition. If it held more generally, it would imply that the uses most worth protecting are the ones least likely to be protected.</w:t>
+        <w:t xml:space="preserve">. A contract can be agreed only if the first exceeds the second. Table 3 gives a numerical illustration. Protection clears for uses with small rents and fails for uses with large rents, because the vendor’s gain from productizing grows with the rent. The pattern depends on the parameters and is not general, since in a simulation with randomly drawn parameters the willingness to pay fell short of the vendor’s loss in about five percent of the draws. We therefore offer it as an illustration and not as a proposition. If it held more generally, it would imply that the uses most worth protecting are the ones least likely to be protected.</w:t>
       </w:r>
     </w:p>
     <w:p>
@@ -6888,7 +6678,7 @@
           <w:bCs/>
           <w:b/>
         </w:rPr>
-        <w:t xml:space="preserve">Table 4. Willingness to pay for protection versus the developer’s loss (illustration;</w:t>
+        <w:t xml:space="preserve">Table 3. Willingness to pay for protection versus the vendor’s loss (illustration;</w:t>
       </w:r>
       <w:r>
         <w:rPr>
@@ -7152,7 +6942,7 @@
               <w:jc w:val="right"/>
             </w:pPr>
             <w:r>
-              <w:t xml:space="preserve">Developer’s loss</w:t>
+              <w:t xml:space="preserve">Vendor’s loss</w:t>
             </w:r>
           </w:p>
         </w:tc>
@@ -7559,7 +7349,7 @@
         <w:t xml:space="preserve"> </w:t>
       </w:r>
       <w:r>
-        <w:t xml:space="preserve">is constant and chosen by a single developer. Competition among vendors is added in Section 4.6. We still do not model the adopter’s responses (concealing the use, moving to another vendor) or bargaining over the contract. The functional form</w:t>
+        <w:t xml:space="preserve">is constant and chosen by a single vendor. Competition among vendors is added in Section 4.4. We still do not model the adopter’s responses (concealing the use, moving to another vendor) or bargaining over the contract. The functional form</w:t>
       </w:r>
       <w:r>
         <w:t xml:space="preserve"> </w:t>
@@ -7649,14 +7439,14 @@
         <w:t xml:space="preserve">is a reduced-form parameter that does not model how the developer earns from a productized offering. Contract terms are not publicly observed, so the propositions cannot be examined with the data in Section 6.</w:t>
       </w:r>
     </w:p>
-    <w:bookmarkEnd w:id="36"/>
-    <w:bookmarkStart w:id="37" w:name="competition-among-vendors"/>
+    <w:bookmarkEnd w:id="34"/>
+    <w:bookmarkStart w:id="35" w:name="competition-among-vendors"/>
     <w:p>
       <w:pPr>
         <w:pStyle w:val="Heading2"/>
       </w:pPr>
       <w:r>
-        <w:t xml:space="preserve">4.6 Competition among vendors</w:t>
+        <w:t xml:space="preserve">4.4 Competition among vendors</w:t>
       </w:r>
     </w:p>
     <w:p>
@@ -7664,7 +7454,7 @@
         <w:pStyle w:val="FirstParagraph"/>
       </w:pPr>
       <w:r>
-        <w:t xml:space="preserve">Section 4.5 has a single developer decide whether to productize the adopter’s use. In practice, several vendors can see that a use is valuable and build it. We now allow</w:t>
+        <w:t xml:space="preserve">Section 4.3 has a single vendor decide whether to productize the adopter’s use. In practice, several vendors can see that a use is valuable and build it. We now allow</w:t>
       </w:r>
       <w:r>
         <w:t xml:space="preserve"> </w:t>
@@ -7986,7 +7776,7 @@
         <w:pStyle w:val="FirstParagraph"/>
       </w:pPr>
       <w:r>
-        <w:t xml:space="preserve">For given rivals’ rates this is the problem of Section 4.5 with</w:t>
+        <w:t xml:space="preserve">For given rivals’ rates this is the problem of Section 4.3 with</w:t>
       </w:r>
       <w:r>
         <w:t xml:space="preserve"> </w:t>
@@ -8708,7 +8498,7 @@
         </m:r>
       </m:oMath>
       <w:r>
-        <w:t xml:space="preserve">. Table 5 shows what protection then achieves, for different numbers of outsiders. With no outsiders, raising</w:t>
+        <w:t xml:space="preserve">. Table 4 shows what protection then achieves, for different numbers of outsiders. With no outsiders, raising</w:t>
       </w:r>
       <w:r>
         <w:t xml:space="preserve"> </w:t>
@@ -8734,7 +8524,7 @@
           <w:bCs/>
           <w:b/>
         </w:rPr>
-        <w:t xml:space="preserve">Table 5. Effect of protection from the adopter’s own supplier, by number of outsider vendors (illustration;</w:t>
+        <w:t xml:space="preserve">Table 4. Effect of protection from the adopter’s own supplier, by number of outsider vendors (illustration;</w:t>
       </w:r>
       <w:r>
         <w:rPr>
@@ -9577,7 +9367,296 @@
         <w:pStyle w:val="BodyText"/>
       </w:pPr>
       <w:r>
-        <w:t xml:space="preserve">The same limits apply as in Section 4.5. Vendors are symmetric apart from their access to the adopter’s data, the rate of each vendor is constant, and a vendor whose rival wins earns nothing. Letting the winner share the use, or letting vendors differentiate their offerings, would soften the race.</w:t>
+        <w:t xml:space="preserve">The same limits apply as in Section 4.3. Vendors are symmetric apart from their access to the adopter’s data, the rate of each vendor is constant, and a vendor whose rival wins earns nothing. Letting the winner share the use, or letting vendors differentiate their offerings, would soften the race.</w:t>
+      </w:r>
+    </w:p>
+    <w:bookmarkEnd w:id="35"/>
+    <w:bookmarkStart w:id="36" w:name="comparative-statics"/>
+    <w:p>
+      <w:pPr>
+        <w:pStyle w:val="Heading2"/>
+      </w:pPr>
+      <w:r>
+        <w:t xml:space="preserve">4.5 Comparative statics</w:t>
+      </w:r>
+    </w:p>
+    <w:p>
+      <w:pPr>
+        <w:pStyle w:val="FirstParagraph"/>
+      </w:pPr>
+      <w:r>
+        <w:t xml:space="preserve">Seven predictions follow from the propositions. The first three are the ones the empirical work in Sections 5 and 6 can address.</w:t>
+      </w:r>
+    </w:p>
+    <w:p>
+      <w:pPr>
+        <w:numPr>
+          <w:ilvl w:val="0"/>
+          <w:numId w:val="1001"/>
+        </w:numPr>
+        <w:pStyle w:val="Compact"/>
+      </w:pPr>
+      <w:r>
+        <w:t xml:space="preserve">Realized developer prices for inference rise with</w:t>
+      </w:r>
+      <w:r>
+        <w:t xml:space="preserve"> </w:t>
+      </w:r>
+      <m:oMath>
+        <m:r>
+          <m:t>Δ</m:t>
+        </m:r>
+        <m:r>
+          <m:t>θ</m:t>
+        </m:r>
+      </m:oMath>
+      <w:r>
+        <w:t xml:space="preserve"> </w:t>
+      </w:r>
+      <w:r>
+        <w:t xml:space="preserve">and fall toward serving cost as</w:t>
+      </w:r>
+      <w:r>
+        <w:t xml:space="preserve"> </w:t>
+      </w:r>
+      <m:oMath>
+        <m:r>
+          <m:t>Δ</m:t>
+        </m:r>
+        <m:r>
+          <m:t>θ</m:t>
+        </m:r>
+        <m:r>
+          <m:rPr>
+            <m:sty m:val="p"/>
+          </m:rPr>
+          <m:t>→</m:t>
+        </m:r>
+        <m:r>
+          <m:t>0</m:t>
+        </m:r>
+      </m:oMath>
+      <w:r>
+        <w:t xml:space="preserve"> </w:t>
+      </w:r>
+      <w:r>
+        <w:t xml:space="preserve">(Proposition 3).</w:t>
+      </w:r>
+    </w:p>
+    <w:p>
+      <w:pPr>
+        <w:numPr>
+          <w:ilvl w:val="0"/>
+          <w:numId w:val="1001"/>
+        </w:numPr>
+        <w:pStyle w:val="Compact"/>
+      </w:pPr>
+      <w:r>
+        <w:t xml:space="preserve">Developer rent is shortened by open-weight releases, compressed release intervals, and falling serving cost (Proposition 3 and Corollary 3).</w:t>
+      </w:r>
+    </w:p>
+    <w:p>
+      <w:pPr>
+        <w:numPr>
+          <w:ilvl w:val="0"/>
+          <w:numId w:val="1001"/>
+        </w:numPr>
+        <w:pStyle w:val="Compact"/>
+      </w:pPr>
+      <w:r>
+        <w:t xml:space="preserve">Adopter-side profit is predicted by a dated first-party product, which proxies</w:t>
+      </w:r>
+      <w:r>
+        <w:t xml:space="preserve"> </w:t>
+      </w:r>
+      <m:oMath>
+        <m:r>
+          <m:t>O</m:t>
+        </m:r>
+        <m:r>
+          <m:rPr>
+            <m:sty m:val="p"/>
+          </m:rPr>
+          <m:t>&gt;</m:t>
+        </m:r>
+        <m:r>
+          <m:t>0</m:t>
+        </m:r>
+      </m:oMath>
+      <w:r>
+        <w:t xml:space="preserve">, and not by pooled exposure to LLMs (Propositions 1 and 2).</w:t>
+      </w:r>
+    </w:p>
+    <w:p>
+      <w:pPr>
+        <w:numPr>
+          <w:ilvl w:val="0"/>
+          <w:numId w:val="1001"/>
+        </w:numPr>
+        <w:pStyle w:val="Compact"/>
+      </w:pPr>
+      <w:r>
+        <w:t xml:space="preserve">Industries with shorter</w:t>
+      </w:r>
+      <w:r>
+        <w:t xml:space="preserve"> </w:t>
+      </w:r>
+      <m:oMath>
+        <m:sSub>
+          <m:e>
+            <m:r>
+              <m:t>τ</m:t>
+            </m:r>
+          </m:e>
+          <m:sub>
+            <m:r>
+              <m:t>O</m:t>
+            </m:r>
+          </m:sub>
+        </m:sSub>
+      </m:oMath>
+      <w:r>
+        <w:t xml:space="preserve">, or with more vendor encroachment, show weaker associations between AI use and profit (Propositions 2 and 5).</w:t>
+      </w:r>
+    </w:p>
+    <w:p>
+      <w:pPr>
+        <w:numPr>
+          <w:ilvl w:val="0"/>
+          <w:numId w:val="1001"/>
+        </w:numPr>
+        <w:pStyle w:val="Compact"/>
+      </w:pPr>
+      <w:r>
+        <w:t xml:space="preserve">As downstream competition intensifies, the AI–profit association weakens while the AI–productivity association is unaffected (Propositions 1 and 4).</w:t>
+      </w:r>
+    </w:p>
+    <w:p>
+      <w:pPr>
+        <w:numPr>
+          <w:ilvl w:val="0"/>
+          <w:numId w:val="1001"/>
+        </w:numPr>
+        <w:pStyle w:val="Compact"/>
+      </w:pPr>
+      <w:r>
+        <w:t xml:space="preserve">Adopters invest more in co-specialized capital when contract terms limit vendors’ use of their data (Propositions 6 and 7).</w:t>
+      </w:r>
+    </w:p>
+    <w:p>
+      <w:pPr>
+        <w:numPr>
+          <w:ilvl w:val="0"/>
+          <w:numId w:val="1001"/>
+        </w:numPr>
+        <w:pStyle w:val="Compact"/>
+      </w:pPr>
+      <w:r>
+        <w:t xml:space="preserve">The effect of such terms weakens as the number of vendors able to build the same use grows (Proposition 8 and Table 4).</w:t>
+      </w:r>
+    </w:p>
+    <w:p>
+      <w:pPr>
+        <w:pStyle w:val="FirstParagraph"/>
+      </w:pPr>
+      <w:r>
+        <w:t xml:space="preserve">Predictions 4 to 7 are not tested here. Predictions 6 and 7 bear directly on the LLM setting and on managerial choices about data-use terms and fine-tuning ownership, which we take up in Section 7. They cannot be examined with public data, since contract terms are not observed.</w:t>
+      </w:r>
+    </w:p>
+    <w:bookmarkEnd w:id="36"/>
+    <w:bookmarkStart w:id="37" w:name="what-is-specific-to-llms"/>
+    <w:p>
+      <w:pPr>
+        <w:pStyle w:val="Heading2"/>
+      </w:pPr>
+      <w:r>
+        <w:t xml:space="preserve">4.6 What is specific to LLMs</w:t>
+      </w:r>
+    </w:p>
+    <w:p>
+      <w:pPr>
+        <w:pStyle w:val="FirstParagraph"/>
+      </w:pPr>
+      <w:r>
+        <w:t xml:space="preserve">A fair question is whether anything in the model is specific to LLMs, or whether the same propositions would describe any layered technology market. The structure is general. What is specific is the combination of values and measurement conditions that LLMs bring to it. Marginal inference cost</w:t>
+      </w:r>
+      <w:r>
+        <w:t xml:space="preserve"> </w:t>
+      </w:r>
+      <m:oMath>
+        <m:r>
+          <m:t>m</m:t>
+        </m:r>
+      </m:oMath>
+      <w:r>
+        <w:t xml:space="preserve"> </w:t>
+      </w:r>
+      <w:r>
+        <w:t xml:space="preserve">is low relative to the cost of producing a frontier model</w:t>
+      </w:r>
+      <w:r>
+        <w:t xml:space="preserve"> </w:t>
+      </w:r>
+      <m:oMath>
+        <m:sSub>
+          <m:e>
+            <m:r>
+              <m:t>F</m:t>
+            </m:r>
+          </m:e>
+          <m:sub>
+            <m:r>
+              <m:t>T</m:t>
+            </m:r>
+          </m:sub>
+        </m:sSub>
+      </m:oMath>
+      <w:r>
+        <w:t xml:space="preserve">, so that profit depends almost entirely on the premium</w:t>
+      </w:r>
+      <w:r>
+        <w:t xml:space="preserve"> </w:t>
+      </w:r>
+      <m:oMath>
+        <m:r>
+          <m:t>κ</m:t>
+        </m:r>
+        <m:r>
+          <m:t>Δ</m:t>
+        </m:r>
+        <m:r>
+          <m:t>θ</m:t>
+        </m:r>
+      </m:oMath>
+      <w:r>
+        <w:t xml:space="preserve">. The catch-up lag</w:t>
+      </w:r>
+      <w:r>
+        <w:t xml:space="preserve"> </w:t>
+      </w:r>
+      <m:oMath>
+        <m:sSub>
+          <m:e>
+            <m:r>
+              <m:t>τ</m:t>
+            </m:r>
+          </m:e>
+          <m:sub>
+            <m:r>
+              <m:rPr>
+                <m:nor/>
+                <m:sty m:val="p"/>
+              </m:rPr>
+              <m:t>dev</m:t>
+            </m:r>
+          </m:sub>
+        </m:sSub>
+      </m:oMath>
+      <w:r>
+        <w:t xml:space="preserve"> </w:t>
+      </w:r>
+      <w:r>
+        <w:t xml:space="preserve">is short, on the order of three to four months for open-weight models relative to the closed frontier (Emberson 2025, Epoch AI 2026), which places the developer close to the zero-rent corner of Proposition 3. The same model serves both the complement builder and its competitors on posted terms, which is what makes the adopter’s position commodity-like in the first place. And vendors can and do move into the complement layer, which is the situation Propositions 5 to 8 describe: the productization rate is chosen by vendors, shaped by contract terms, and driven up by competition among them. In this sense the theory is less a new mechanism than a calibration of known mechanisms to a market in which the state variables can be observed. We return to the limits of this claim in Section 7.3.</w:t>
       </w:r>
     </w:p>
     <w:bookmarkEnd w:id="37"/>
@@ -9617,7 +9696,7 @@
           <w:bCs/>
           <w:b/>
         </w:rPr>
-        <w:t xml:space="preserve">Table 3. Model objects and empirical counterparts</w:t>
+        <w:t xml:space="preserve">Table 5. Model objects and empirical counterparts</w:t>
       </w:r>
     </w:p>
     <w:tbl>
@@ -10043,6 +10122,68 @@
           </w:p>
         </w:tc>
       </w:tr>
+      <w:tr>
+        <w:tc>
+          <w:tcPr/>
+          <w:p>
+            <w:pPr>
+              <w:pStyle w:val="Compact"/>
+              <w:jc w:val="left"/>
+            </w:pPr>
+            <m:oMath>
+              <m:r>
+                <m:t>η</m:t>
+              </m:r>
+            </m:oMath>
+            <w:r>
+              <w:t xml:space="preserve">,</w:t>
+            </w:r>
+            <w:r>
+              <w:t xml:space="preserve"> </w:t>
+            </w:r>
+            <m:oMath>
+              <m:r>
+                <m:t>s</m:t>
+              </m:r>
+            </m:oMath>
+            <w:r>
+              <w:t xml:space="preserve">,</w:t>
+            </w:r>
+            <w:r>
+              <w:t xml:space="preserve"> </w:t>
+            </w:r>
+            <m:oMath>
+              <m:r>
+                <m:t>N</m:t>
+              </m:r>
+            </m:oMath>
+          </w:p>
+        </w:tc>
+        <w:tc>
+          <w:tcPr/>
+          <w:p>
+            <w:pPr>
+              <w:pStyle w:val="Compact"/>
+              <w:jc w:val="left"/>
+            </w:pPr>
+            <w:r>
+              <w:t xml:space="preserve">No public counterpart (contract terms and vendor entry are not observed)</w:t>
+            </w:r>
+          </w:p>
+        </w:tc>
+        <w:tc>
+          <w:tcPr/>
+          <w:p>
+            <w:pPr>
+              <w:pStyle w:val="Compact"/>
+              <w:jc w:val="left"/>
+            </w:pPr>
+            <w:r>
+              <w:t xml:space="preserve">n/a</w:t>
+            </w:r>
+          </w:p>
+        </w:tc>
+      </w:tr>
     </w:tbl>
     <w:bookmarkEnd w:id="39"/>
     <w:bookmarkStart w:id="40" w:name="empirical-implications"/>
@@ -10059,7 +10200,7 @@
         <w:pStyle w:val="FirstParagraph"/>
       </w:pPr>
       <w:r>
-        <w:t xml:space="preserve">The comparative statics in Section 4.3 yield five testable implications, stated below as hypotheses. We state all five to show how the theory would be tested, but the public data available to us bear on only some of them. H3 and H4 are examined in Section 6, together with a lab-month association that is related to H1a and H1b but does not test them. H1a, H1b, and H2 are stated for future work.</w:t>
+        <w:t xml:space="preserve">Predictions 1 and 3 of Section 4.5, together with the transience of complement rents (Corollary 2), yield the five hypotheses below: H1a and H1b from prediction 1, H2 and H3 from prediction 3, and H4 from Corollary 2. We state all five to show how the theory would be tested, but the public data available to us bear on only some of them. H3 and H4 are examined in Section 6, together with a lab-month association that is related to H1a and H1b but does not test them. H1a, H1b, and H2 are stated for future work.</w:t>
       </w:r>
     </w:p>
     <w:p>
@@ -10203,21 +10344,13 @@
         <w:t xml:space="preserve">The developer panel combines Arena overall leaderboard snapshots (Chiang et al. 2024) with OpenRouter endpoint prices (OpenRouter 2026). It contains 171 lab-months with a price, of which 102 have at least one live endpoint and 69 use the list-price fallback. The adopter panel is drawn from SEC EDGAR XBRL company facts (SEC 2026) and covers 81 firms and 520 firm-years, with staggered GA-year treatment for 21 firms. GA years are coded by hand from public product dates.</w:t>
       </w:r>
     </w:p>
-    <w:p>
-      <w:pPr>
-        <w:pStyle w:val="BodyText"/>
-      </w:pPr>
-      <w:r>
-        <w:t xml:space="preserve">On the developer side, we regress log realized price on the lab’s lead with lab fixed effects and a trend, clustering by lab. On the adopter side, we regress operating margin on a post-GA indicator with firm and year fixed effects, clustering by firm.</w:t>
-      </w:r>
-    </w:p>
-    <w:bookmarkStart w:id="42" w:name="developer-side-h1"/>
+    <w:bookmarkStart w:id="42" w:name="developer-side"/>
     <w:p>
       <w:pPr>
         <w:pStyle w:val="Heading2"/>
       </w:pPr>
       <w:r>
-        <w:t xml:space="preserve">6.1 Developer side (H1)</w:t>
+        <w:t xml:space="preserve">6.1 Developer side</w:t>
       </w:r>
     </w:p>
     <w:p>
@@ -10283,36 +10416,18 @@
       </w:r>
     </w:p>
     <w:bookmarkEnd w:id="42"/>
-    <w:bookmarkStart w:id="43" w:name="adopter-side-h2-to-h4"/>
+    <w:bookmarkStart w:id="43" w:name="adopter-side"/>
     <w:p>
       <w:pPr>
         <w:pStyle w:val="Heading2"/>
       </w:pPr>
       <w:r>
-        <w:t xml:space="preserve">6.2 Adopter side (H2 to H4)</w:t>
+        <w:t xml:space="preserve">6.2 Adopter side</w:t>
       </w:r>
     </w:p>
     <w:p>
       <w:pPr>
         <w:pStyle w:val="FirstParagraph"/>
-      </w:pPr>
-      <w:r>
-        <w:rPr>
-          <w:iCs/>
-          <w:i/>
-        </w:rPr>
-        <w:t xml:space="preserve">H2.</w:t>
-      </w:r>
-      <w:r>
-        <w:t xml:space="preserve"> </w:t>
-      </w:r>
-      <w:r>
-        <w:t xml:space="preserve">We do not report a test of H2 here.</w:t>
-      </w:r>
-    </w:p>
-    <w:p>
-      <w:pPr>
-        <w:pStyle w:val="BodyText"/>
       </w:pPr>
       <w:r>
         <w:rPr>
@@ -10325,7 +10440,7 @@
         <w:t xml:space="preserve"> </w:t>
       </w:r>
       <w:r>
-        <w:t xml:space="preserve">The two-way fixed-effects baseline gives a post-GA margin increment of 5.3 percentage points (</w:t>
+        <w:t xml:space="preserve">A two-way fixed-effects regression of operating margin on a post-GA indicator, with firm and year fixed effects and standard errors clustered by firm, gives a post-GA margin increment of 5.3 percentage points (</w:t>
       </w:r>
       <m:oMath>
         <m:r>
@@ -10707,7 +10822,7 @@
         <w:t xml:space="preserve"> </w:t>
       </w:r>
       <w:r>
-        <w:t xml:space="preserve">coefficient and the last post-GA bin. The data are therefore inconclusive on H4, and we do not claim that the margin increment decays. A time-invariant bundle-by-post-2023 difference-in-differences gives a similar coefficient and is retained as a robustness check.</w:t>
+        <w:t xml:space="preserve">coefficient and the last post-GA bin. The data are therefore inconclusive on H4, and we do not claim that the margin increment decays.</w:t>
       </w:r>
     </w:p>
     <w:bookmarkEnd w:id="43"/>
@@ -10779,7 +10894,7 @@
         <w:pStyle w:val="FirstParagraph"/>
       </w:pPr>
       <w:r>
-        <w:t xml:space="preserve">For adopters, the central question is not how much to spend on AI but what the firm owns that the model cannot supply, and how long competitors will take to own it too. The theory also says that spending on the model itself is not a source of advantage, since any rival can buy the same model. For developers, the next model is the source of value, not the current one. When leads last only a few months, much of the reported loss is economic (Corollary 4). The valuations of frontier labs are best read as prices for an option on a sequence of future leads and not as capitalized current earnings. For the relationship between the two sides, Propositions 5 to 8 imply that contractual terms covering data use, fine-tuning ownership, and on-premise deployment are strategic decisions, because they affect the rate at which a vendor can productize an adopter’s use and so the adopter’s incentive to invest in the capital that generates its rent. The illustration in Table 4 suggests that such terms may be hardest to obtain for the most valuable uses, which is a reason for adopters to negotiate them before a use proves valuable and not after. Table 5 adds that, when many vendors can build the use, a clause with one supplier buys little, so that the adopter’s protection comes mainly from the difficulty of replicating the use.</w:t>
+        <w:t xml:space="preserve">For adopters, the central question is not how much to spend on AI but what the firm owns that the model cannot supply, and how long competitors will take to own it too. The theory also says that spending on the model itself is not a source of advantage, since any rival can buy the same model. For developers, the next model is the source of value, not the current one. When leads last only a few months, much of the reported loss is economic (Corollary 4). The valuations of frontier labs are best read as prices for an option on a sequence of future leads and not as capitalized current earnings. For the relationship between the two sides, Propositions 5 to 8 imply that contractual terms covering data use, fine-tuning ownership, and on-premise deployment are strategic decisions, because they affect the rate at which a vendor can productize an adopter’s use and so the adopter’s incentive to invest in the capital that generates its rent. The illustration in Table 3 suggests that such terms may be hardest to obtain for the most valuable uses, which is a reason for adopters to negotiate them before a use proves valuable and not after. Table 4 adds that, when many vendors can build the use, a clause with one supplier buys little, so that the adopter’s protection comes mainly from the difficulty of replicating the use.</w:t>
       </w:r>
     </w:p>
     <w:bookmarkEnd w:id="47"/>

</xml_diff>

<commit_message>
Revise Sections 7-8 to match Propositions 5-8 and the revised structure
Co-Authored-By: Claude Sonnet 5.5 <noreply@anthropic.com>
Claude-Session: https://claude.ai/code/session_01SvJ27oz7kYhWEBfZS3x4ro
</commit_message>
<xml_diff>
--- a/isr/ISR_Who_Profits_from_LLMs.docx
+++ b/isr/ISR_Who_Profits_from_LLMs.docx
@@ -10868,7 +10868,7 @@
         <w:pStyle w:val="FirstParagraph"/>
       </w:pPr>
       <w:r>
-        <w:t xml:space="preserve">The paper extends IT business value theory (Melville et al. 2004) from the adopting firm to the vertical structure of a general-purpose technology. Modeling the developer, the adopter, and the consumer in one framework lets us say why developer losses, adopter productivity gains, and weak adopter profit effects are observed together. The same account separates the profitability paradox from the productivity paradox and derives the former from the zero-profit condition applied to an input with a common market price. We also provide an ex ante definition of appropriability that applies to developers and adopters alike, which speaks to the tautology charge against resource-based IT research, and we show how a model can be a source of rent at one date and a marginal-cost input at another.</w:t>
+        <w:t xml:space="preserve">The paper makes three contributions, in decreasing order of novelty. The first is the treatment of vendor encroachment. In the standard appropriability account, an adopter’s complement rent ends when rivals imitate its organizational capital. Proposition 5 shows that, when the supplier of the model can productize the adopter’s use, the rent depends on two clocks, imitation and encroachment. Propositions 6 to 8 endogenize the productization rate and show three things: contract terms that limit a vendor’s use of adopters’ data slow it and raise the adopter’s incentive to invest, imitation by rivals and encroachment by vendors are strategic complements, and competition among vendors both speeds productization and weakens the effect of a clause with any one supplier. These results connect the literature on platform-owner entry (Gawer and Henderson 2007, Zhu and Liu 2018) and the hold-up literature (Klein et al. 1978, Grossman and Hart 1986) to the supply of a general-purpose AI input.</w:t>
       </w:r>
     </w:p>
     <w:p>
@@ -10876,7 +10876,23 @@
         <w:pStyle w:val="BodyText"/>
       </w:pPr>
       <w:r>
-        <w:t xml:space="preserve">We should be clear about what is not new. The mechanisms in each layer are established in industrial organization and strategy (Section 2.4). What the paper adds is their combination under a single appropriability definition and the specification of measurable counterparts for a technology in which those counterparts are observable.</w:t>
+        <w:t xml:space="preserve">The second is an integrated benchmark. Modeling the developer, the adopter, and the consumer in one framework extends IT business value theory (Melville et al. 2004) from the adopting firm to the vertical structure of a general-purpose technology. It lets us say why developer losses, adopter productivity gains, and weak adopter profit effects are observed together. The same account separates the profitability paradox from the productivity paradox and derives the former from the zero-profit condition applied to an input with a common market price. The ex ante definition of appropriability applies to developers and adopters alike, which speaks to the tautology charge against resource-based IT research. It also shows how a model can be a source of rent at one date and a marginal-cost input at another.</w:t>
+      </w:r>
+    </w:p>
+    <w:p>
+      <w:pPr>
+        <w:pStyle w:val="BodyText"/>
+      </w:pPr>
+      <w:r>
+        <w:t xml:space="preserve">The third is illustrative evidence that the constructs can be measured from public sources. Section 6 shows that a lab’s flagship price is associated with its quality lead and that firms launching a first-party AI product report higher operating margins afterward. It does not test the theory, and it does not bear on Propositions 5 to 8.</w:t>
+      </w:r>
+    </w:p>
+    <w:p>
+      <w:pPr>
+        <w:pStyle w:val="BodyText"/>
+      </w:pPr>
+      <w:r>
+        <w:t xml:space="preserve">We should be clear about what is not new. The mechanisms in each layer are established in industrial organization and strategy (Section 2.4). What the paper adds is their combination under a single appropriability definition, the extension to vendor encroachment, and the specification of measurable counterparts for a technology in which those counterparts are observable.</w:t>
       </w:r>
     </w:p>
     <w:bookmarkEnd w:id="46"/>
@@ -10894,7 +10910,7 @@
         <w:pStyle w:val="FirstParagraph"/>
       </w:pPr>
       <w:r>
-        <w:t xml:space="preserve">For adopters, the central question is not how much to spend on AI but what the firm owns that the model cannot supply, and how long competitors will take to own it too. The theory also says that spending on the model itself is not a source of advantage, since any rival can buy the same model. For developers, the next model is the source of value, not the current one. When leads last only a few months, much of the reported loss is economic (Corollary 4). The valuations of frontier labs are best read as prices for an option on a sequence of future leads and not as capitalized current earnings. For the relationship between the two sides, Propositions 5 to 8 imply that contractual terms covering data use, fine-tuning ownership, and on-premise deployment are strategic decisions, because they affect the rate at which a vendor can productize an adopter’s use and so the adopter’s incentive to invest in the capital that generates its rent. The illustration in Table 3 suggests that such terms may be hardest to obtain for the most valuable uses, which is a reason for adopters to negotiate them before a use proves valuable and not after. Table 4 adds that, when many vendors can build the use, a clause with one supplier buys little, so that the adopter’s protection comes mainly from the difficulty of replicating the use.</w:t>
+        <w:t xml:space="preserve">For adopters, the central question is not how much to spend on AI but what the firm owns that the model cannot supply, and how long competitors will take to own it too. The theory also says that spending on the model itself is not a source of advantage, since any rival can buy the same model. For developers, the next model is the source of value, not the current one. When leads last only a few months, much of the reported loss is economic (Corollary 4). The valuations of frontier labs are best read as prices for an option on a sequence of future leads and not as capitalized current earnings. For the relationship between the two sides, Propositions 5 to 8 imply that contractual terms covering data use, fine-tuning ownership, and on-premise deployment are strategic decisions, because they affect the rate at which a vendor can productize an adopter’s use and so the adopter’s incentive to invest in the capital that generates its rent. The illustration in Table 3 suggests that such terms may be hardest to obtain for the most valuable uses, which is a reason for adopters to negotiate them before a use proves valuable and not after. Table 4 adds that, when many vendors can build the use, a clause with one supplier buys little, so that the adopter’s protection comes mainly from the difficulty of replicating the use. Both tables are illustrations and not estimates.</w:t>
       </w:r>
     </w:p>
     <w:bookmarkEnd w:id="47"/>
@@ -10912,7 +10928,7 @@
         <w:pStyle w:val="FirstParagraph"/>
       </w:pPr>
       <w:r>
-        <w:t xml:space="preserve">The theory assumes competitive downstream product markets. Where adopters hold market power, pass-through is incomplete, and commodity LLM use can raise profit. Evidence that IT intensity accompanies rising industry concentration suggests that this case is empirically relevant (Autor et al. 2020, Bessen 2020), and it is also an alternative reading of the margin increment in H3. The theory further assumes that the developer’s lead closes. Economies of scale in compute and data flywheels could prevent closure and shift surplus durably toward the developer, and sustained margins without a quality lead, that is, disconfirmation of H1, would indicate that this case dominates.</w:t>
+        <w:t xml:space="preserve">The theory assumes competitive downstream product markets. Where adopters hold market power, pass-through is incomplete, and commodity LLM use can raise profit. Evidence that IT intensity accompanies rising industry concentration suggests that this case is empirically relevant (Autor et al. 2020, Bessen 2020), and it is also an alternative reading of the margin increment in H3. The theory further assumes that the developer’s lead closes. Economies of scale in compute and data flywheels could prevent closure and shift surplus durably toward the developer, and sustained developer margins without a quality lead would run against Proposition 3 and indicate that this case dominates.</w:t>
       </w:r>
     </w:p>
     <w:p>
@@ -10920,7 +10936,7 @@
         <w:pStyle w:val="BodyText"/>
       </w:pPr>
       <w:r>
-        <w:t xml:space="preserve">The model abstracts from uncertainty in training outcomes, from strategic interaction among developers (the lead and the catch-up lag are treated as exogenous), and from purchasable organizational capital. Making the lead endogenous to a training race is the most natural extension, and it is where we would expect a more specifically LLM-based theory to develop. The empirical proxies are imperfect, and misclassification biases the estimated difference between commodity and complementary use toward zero. The adopter sample is small and made up of large software incumbents, so the results should not be generalized to adopters in other industries. Finally, the evidence is observational and cross-sectional in time, over a period in which the technology and its business models are still changing. H1a, H1b, and H2 are not tested here, and the evidence on H4 is inconclusive. The tests reported are best viewed as a first look at the constructs, and they are not a confirmation of the theory.</w:t>
+        <w:t xml:space="preserve">The model abstracts from uncertainty in training outcomes, from purchasable organizational capital, and from strategic interaction in the quality race itself: the lead and the catch-up lag are treated as exogenous. Section 4.4 introduces competition among vendors, but only in the race to productize a given use. Making the lead endogenous to a training race is the most natural extension, and it is where we would expect a more specifically LLM-based theory to develop. The extensions in Sections 4.3 and 4.4 are reduced-form: the productization rate is constant, vendors are symmetric apart from their access to the adopter’s data, and the adopter does not respond by hiding the use or switching vendor. Propositions 6 to 8 are not tested, because contract terms and vendor entry are not publicly observed. The empirical proxies are imperfect, and misclassification biases the estimated difference between commodity and complementary use toward zero. The adopter sample is small and made up of large software incumbents, so the results should not be generalized to adopters in other industries. Finally, the evidence is observational and covers a short period in which the technology and its business models are still changing. H1a, H1b, and H2 are not tested here, and the evidence on H4 is inconclusive. The evidence reported is best viewed as a first look at the constructs, and it is not a confirmation of the theory.</w:t>
       </w:r>
     </w:p>
     <w:bookmarkEnd w:id="48"/>
@@ -10939,7 +10955,7 @@
         <w:pStyle w:val="FirstParagraph"/>
       </w:pPr>
       <w:r>
-        <w:t xml:space="preserve">LLMs create value, and the theory developed here says where it goes. Adopters that use a model available to every competitor on the same terms pass their gain to consumers. The frontier developer captures a share in proportion to its quality lead, and only until a competitor closes it. Adopters that combine the model with organizational capital that rivals cannot quickly build earn a rent in proportion to how long the building takes, and that rent shrinks if a vendor productizes the use. The remainder goes to consumers, and statistics that pool all three positions report an average close to zero.</w:t>
+        <w:t xml:space="preserve">LLMs create value, and the theory developed here says where it goes. Adopters that use a model available to every competitor on the same terms pass their gain to consumers. The frontier developer captures a share in proportion to its quality lead, and only until a competitor closes it. Adopters that combine the model with organizational capital that rivals cannot quickly build earn a rent while the capital remains unimitated and unproductized by a vendor. The remainder goes to consumers, and statistics that pool all three positions report an average close to zero.</w:t>
       </w:r>
     </w:p>
     <w:p>
@@ -10947,7 +10963,15 @@
         <w:pStyle w:val="BodyText"/>
       </w:pPr>
       <w:r>
-        <w:t xml:space="preserve">The public record makes the developer half of this account visible. Frontier labs combine large booked revenue with large operating losses and pay complement owners for compute. The price of matched capability falls several-fold each year, while the cost of frontier capability rises. Investors nonetheless value the same firms as if a release sequence will continue. These three facts are consistent with a single explanation: competition over a general-purpose input whose quality lead is short and must be bought again with each release. The profitability puzzle that accompanies every general-purpose technology is, on this account, what competition over a common input looks like from the inside.</w:t>
+        <w:t xml:space="preserve">The public record makes the developer half of this account visible. Frontier labs combine large booked revenue with large operating losses and pay complement owners for compute. The price of matched capability falls several-fold each year, while the cost of frontier capability rises. Investors nonetheless value the same firms as if a release sequence will continue. These three facts are consistent with a single explanation: competition over a general-purpose input whose quality lead is short and must be bought again with each release.</w:t>
+      </w:r>
+    </w:p>
+    <w:p>
+      <w:pPr>
+        <w:pStyle w:val="BodyText"/>
+      </w:pPr>
+      <w:r>
+        <w:t xml:space="preserve">The adopter half is harder to see in the data, and it is where we think the theory adds most. An adopter’s profitable window is bounded by its suppliers as well as by its competitors. How fast vendors productize a successful use depends on the contract terms that limit their access to the adopter’s data, and on how many other vendors are in a position to build the same use. Where they are many, the difficulty of replicating the use matters more than any clause. Testing these claims requires data on contract terms and vendor entry that are not now public, and making the quality race itself endogenous is the next step for the theory. The profitability puzzle that accompanies every general-purpose technology is, on this account, what competition over a common input looks like from the inside.</w:t>
       </w:r>
     </w:p>
     <w:bookmarkEnd w:id="50"/>

</xml_diff>

<commit_message>
Shorten and tighten introduction; align terminology and cross-references
Co-Authored-By: Claude Sonnet 5.5 <noreply@anthropic.com>
Claude-Session: https://claude.ai/code/session_01SvJ27oz7kYhWEBfZS3x4ro
</commit_message>
<xml_diff>
--- a/isr/ISR_Who_Profits_from_LLMs.docx
+++ b/isr/ISR_Who_Profits_from_LLMs.docx
@@ -123,7 +123,7 @@
         <w:pStyle w:val="BodyText"/>
       </w:pPr>
       <w:r>
-        <w:t xml:space="preserve">Adopters of large language models (LLMs) report substantial productivity gains, yet profit is hard to locate at either end of the value chain. Developers post operating losses that exceed their revenue, and the margins of adopting firms show little systematic response. We argue that this pattern follows from appropriability and need not be read as a measurement failure. Drawing on competitive-equilibrium reasoning, vertical-differentiation models, and the profiting-from-innovation framework, we model three positions in the value chain: the frontier developer, the API adopter, and the complement builder. An API adopter earns no economic profit from the model itself, and the developer’s rent is proportional to its quality lead and disappears as rivals catch up. Complement builders earn rents from co-specialized organizational capital, but only until rivals imitate it or a developer productizes the use, so that an adopter’s profitable window depends on its suppliers as well as its competitors. When developers choose how fast to productize, contract terms that limit their use of adopters’ data slow them and raise adopters’ incentive to invest. Competition among developers speeds productization and weakens the effect of such terms. Illustrative evidence from public leaderboard, endpoint-price, and SEC filing data shows that a lab’s flagship price is positively associated with its quality lead and that firms launching a first-party AI product report higher operating margins afterward. The samples are small, and the evidence does not test the theory.</w:t>
+        <w:t xml:space="preserve">Adopters of large language models (LLMs) report substantial productivity gains, yet profit is hard to locate at either end of the value chain. Developers post operating losses that exceed their revenue, and the margins of adopting firms show little systematic response. We argue that this pattern follows from appropriability and need not be read as a measurement failure. Drawing on competitive-equilibrium reasoning, vertical-differentiation models, and the profiting-from-innovation framework, we model three positions in the value chain: the frontier developer, the API adopter, and the complement builder. An API adopter earns no economic profit from the model itself, and the developer’s rent is proportional to its quality lead and disappears as rivals catch up. Complement builders earn rents from co-specialized organizational capital, but only until rivals imitate it or a vendor productizes the use, so that an adopter’s profitable window depends on its suppliers as well as its competitors. When vendors choose how fast to productize, contract terms that limit their use of adopters’ data slow them and raise adopters’ incentive to invest. Competition among vendors speeds productization and weakens the effect of such terms. Illustrative evidence from public leaderboard, endpoint-price, and SEC filing data shows that a lab’s flagship price is positively associated with its quality lead and that firms launching a first-party AI product report higher operating margins afterward. The samples are small, and the evidence does not test the theory.</w:t>
       </w:r>
     </w:p>
     <w:p>
@@ -158,7 +158,7 @@
         <w:pStyle w:val="FirstParagraph"/>
       </w:pPr>
       <w:r>
-        <w:t xml:space="preserve">Within three years of the public release of the first widely used chat-based large language model, LLMs had been built into office software, customer service, software development, and search. Controlled studies had documented productivity gains of 14 to 55 percent on affected tasks (Brynjolfsson et al. 2025, Noy and Zhang 2023, Peng et al. 2023, Dell’Acqua et al. 2023), while the firms that develop the models were reporting operating losses on a scale with few precedents in the history of technology. Practitioners often describe this as a puzzle: the technology evidently works, nearly everyone is buying it, and nobody can find the profit.</w:t>
+        <w:t xml:space="preserve">Within three years of the first widely used chat-based large language model (LLM), such models had been built into office software, customer service, software development, and search. Controlled studies reported productivity gains of 14 to 55 percent on affected tasks (Brynjolfsson et al. 2025, Noy and Zhang 2023, Peng et al. 2023, Dell’Acqua et al. 2023). The firms that develop the models, meanwhile, reported operating losses on a scale with few precedents in the history of technology. Practitioners describe this as a puzzle: the technology evidently works and nearly everyone is buying it, yet nobody can find the profit.</w:t>
       </w:r>
     </w:p>
     <w:p>
@@ -166,7 +166,7 @@
         <w:pStyle w:val="BodyText"/>
       </w:pPr>
       <w:r>
-        <w:t xml:space="preserve">Information systems researchers will recognize the puzzle. It is the profitability half of the IT productivity paradox (Brynjolfsson 1993, Hitt and Brynjolfsson 1996), and it has reappeared in much the same form with each general-purpose technology since the mainframe. In this paper we argue that the puzzle has a stable answer that follows from standard economics, and that LLMs offer an unusually clean setting in which to state the answer and examine it. The answer is that value from a general-purpose technology is captured only where it is appropriable, and that appropriability is a property of the relationship between the technology and firm-specific complements, not of the technology alone. An LLM accessed through a public API is available to every firm in an industry on identical terms. Under competition, no firm then earns an economic profit from using it, because each firm’s gain is bid away in price and passes to consumers. Profit arises at two other points in the chain. It arises with the frontier developer, in proportion to the developer’s quality lead over the best alternative and for as long as the lead lasts. It also arises with adopters that combine the model with organizational capital that rivals lack and cannot quickly build, again for as long as imitation takes.</w:t>
+        <w:t xml:space="preserve">Information systems researchers will recognize the puzzle. It is the profitability half of the IT productivity paradox (Brynjolfsson 1993, Hitt and Brynjolfsson 1996), and it has returned in much the same form with each general-purpose technology since the mainframe. We argue that standard economics gives a stable answer. Value from a general-purpose technology is captured only where it is appropriable, and appropriability depends on the relationship between the technology and firm-specific complements, not on the technology alone. An LLM reached through a public API is available to every firm in an industry on identical terms, so under competition no adopter earns an economic profit from using it. Each firm’s gain is bid away in price and passes to consumers. Profit appears elsewhere. It accrues to the frontier developer, in proportion to its quality lead over the best alternative and for as long as the lead lasts, and to adopters that combine the model with organizational capital that rivals lack and cannot quickly build, for as long as imitation takes. Each of these claims is familiar from work on IT business value (Hitt and Brynjolfsson 1996, Mata et al. 1995, Bharadwaj 2000), profiting from innovation (Teece 1986), and vertical differentiation and vertical chains (Mussa and Rosen 1978, Spengler 1950). We treat them as a benchmark and not as our contribution.</w:t>
       </w:r>
     </w:p>
     <w:p>
@@ -174,7 +174,7 @@
         <w:pStyle w:val="BodyText"/>
       </w:pPr>
       <w:r>
-        <w:t xml:space="preserve">Each of these claims is familiar in isolation. Hitt and Brynjolfsson (1996) showed that IT can raise productivity and consumer surplus while leaving profitability unchanged. The resource-based view of IT holds that only imperfectly imitable IT-enabled capabilities confer sustained advantage (Mata et al. 1995, Bharadwaj 2000, Piccoli and Ives 2005). Teece (1986) identified appropriability regimes and co-specialized complementary assets as the determinants of who profits from an innovation. Models of vertical differentiation, vertical chains, and platforms with complementors (e.g., Mussa and Rosen 1978, Spengler 1950, Rochet and Tirole 2003) already tell us that surplus in a layered market is shared according to quality differences and competitive conditions at each layer. We do not claim a new theorem about any of these mechanisms, and we use them as the benchmark for what follows.</w:t>
+        <w:t xml:space="preserve">What the benchmark leaves out is a feature that sets LLMs apart from most earlier technologies. In the standard account, an adopter’s complement rent is threatened by one force, imitation by rival adopters, which takes time because organizational capital is slow to build. In the LLM chain there is a second force: the supplier of the input can move into the adopter’s layer. A developer sells its model on posted terms to an adopter and to the adopter’s competitors, can observe how the model is used through its interface, and can productize a successful use and sell it to everyone. Research on platform owners that enter complementors’ markets suggests that such entry is common and consequential (Gawer and Henderson 2007, Zhu and Liu 2018), but its implication for rent has not been brought into the appropriability framework. Once a use is productized, the adopter’s co-specialized capital becomes a commodity before rivals could have copied it, and the window in which the rent is earned shortens.</w:t>
       </w:r>
     </w:p>
     <w:p>
@@ -182,7 +182,43 @@
         <w:pStyle w:val="BodyText"/>
       </w:pPr>
       <w:r>
-        <w:t xml:space="preserve">What this benchmark leaves out is a feature of the LLM value chain that sets it apart from most earlier technologies. In the standard account, an adopter’s complement rent is threatened by one force, imitation by rival adopters, which takes time because organizational capital is slow to build. For LLMs there is a second force. The supplier of the input can itself move into the adopter’s layer. The developer sells the model on posted terms to the adopter and to the adopter’s competitors, sees how it is used through the interface, and is able to productize a successful use and sell it to everyone. Research on platform owners entering complementors’ markets suggests that this kind of entry is both common and consequential (Gawer and Henderson 2007, Zhu and Liu 2018). Its implication for rent has not been put into the appropriability framework. If the use is productized, the adopter’s co-specialized capital becomes a commodity before rivals could have copied it, and the window in which the rent is earned shortens.</w:t>
+        <w:t xml:space="preserve">Proposition 5 formalizes this. If a vendor productizes an adopter’s use at rate</w:t>
+      </w:r>
+      <w:r>
+        <w:t xml:space="preserve"> </w:t>
+      </w:r>
+      <m:oMath>
+        <m:r>
+          <m:t>η</m:t>
+        </m:r>
+      </m:oMath>
+      <w:r>
+        <w:t xml:space="preserve">, independently of imitation, the adopter’s expected complement rent falls strictly in</w:t>
+      </w:r>
+      <w:r>
+        <w:t xml:space="preserve"> </w:t>
+      </w:r>
+      <m:oMath>
+        <m:r>
+          <m:t>η</m:t>
+        </m:r>
+      </m:oMath>
+      <w:r>
+        <w:t xml:space="preserve">. The rent runs on two clocks, not one. The result is deliberately simple, and the later propositions build on it in two ways. Section 4.3 lets the vendor choose</w:t>
+      </w:r>
+      <w:r>
+        <w:t xml:space="preserve"> </w:t>
+      </w:r>
+      <m:oMath>
+        <m:r>
+          <m:t>η</m:t>
+        </m:r>
+      </m:oMath>
+      <w:r>
+        <w:t xml:space="preserve"> </w:t>
+      </w:r>
+      <w:r>
+        <w:t xml:space="preserve">and shows how contract terms that limit its use of adopters’ data change that choice and, through it, the adopter’s incentive to invest. Section 4.4 adds competition among vendors, which speeds productization and weakens the effect of any single contract. Together with the benchmark results for developers, adopters, and consumers (Propositions 1 to 4), these results give a fuller account of where profit appears.</w:t>
       </w:r>
     </w:p>
     <w:p>
@@ -190,101 +226,7 @@
         <w:pStyle w:val="BodyText"/>
       </w:pPr>
       <w:r>
-        <w:t xml:space="preserve">The central result of the paper, Proposition 5, formalizes this. When a vendor productizes an adopter’s use at rate</w:t>
-      </w:r>
-      <w:r>
-        <w:t xml:space="preserve"> </w:t>
-      </w:r>
-      <m:oMath>
-        <m:r>
-          <m:t>η</m:t>
-        </m:r>
-      </m:oMath>
-      <w:r>
-        <w:t xml:space="preserve">, independent of imitation by rivals, the adopter’s expected complement rent falls strictly in</w:t>
-      </w:r>
-      <w:r>
-        <w:t xml:space="preserve"> </w:t>
-      </w:r>
-      <m:oMath>
-        <m:r>
-          <m:t>η</m:t>
-        </m:r>
-      </m:oMath>
-      <w:r>
-        <w:t xml:space="preserve">, so that the rent depends on two clocks and not one. Taken with the benchmark results, this gives a fuller account of where profit appears. API adopters earn nothing from the model itself (Proposition 1). Complement builders earn a rent for as long as both rival imitation and vendor productization are held off (Propositions 2 and 5). The developer earns a rent in proportion to its quality lead, until rivals close it (Proposition 3). The remainder passes to consumers (Proposition 4). The result is deliberately simple, and it takes the rate</w:t>
-      </w:r>
-      <w:r>
-        <w:t xml:space="preserve"> </w:t>
-      </w:r>
-      <m:oMath>
-        <m:r>
-          <m:t>η</m:t>
-        </m:r>
-      </m:oMath>
-      <w:r>
-        <w:t xml:space="preserve"> </w:t>
-      </w:r>
-      <w:r>
-        <w:t xml:space="preserve">as given. Section 4.3 then lets the vendor choose</w:t>
-      </w:r>
-      <w:r>
-        <w:t xml:space="preserve"> </w:t>
-      </w:r>
-      <m:oMath>
-        <m:r>
-          <m:t>η</m:t>
-        </m:r>
-      </m:oMath>
-      <w:r>
-        <w:t xml:space="preserve"> </w:t>
-      </w:r>
-      <w:r>
-        <w:t xml:space="preserve">and shows how contract terms that limit its use of adopters’ data change that choice and, through it, the adopter’s incentive to invest. Section 4.4 adds competition among vendors, which weakens the effect of such terms. How far an adopter can lower</w:t>
-      </w:r>
-      <w:r>
-        <w:t xml:space="preserve"> </w:t>
-      </w:r>
-      <m:oMath>
-        <m:r>
-          <m:t>η</m:t>
-        </m:r>
-      </m:oMath>
-      <w:r>
-        <w:t xml:space="preserve"> </w:t>
-      </w:r>
-      <w:r>
-        <w:t xml:space="preserve">through other means, such as the choice of what to build, we leave to future work.</w:t>
-      </w:r>
-    </w:p>
-    <w:p>
-      <w:pPr>
-        <w:pStyle w:val="BodyText"/>
-      </w:pPr>
-      <w:r>
-        <w:t xml:space="preserve">We make three contributions. First, Proposition 5 adds vendor encroachment to the appropriability account of IT value and shows that, for a technology whose supplier can enter the adopter’s layer, the adopter’s profitable window depends on the supplier’s behavior as well as on rivals’. Propositions 6 to 8 extend the result by endogenizing</w:t>
-      </w:r>
-      <w:r>
-        <w:t xml:space="preserve"> </w:t>
-      </w:r>
-      <m:oMath>
-        <m:r>
-          <m:t>η</m:t>
-        </m:r>
-      </m:oMath>
-      <w:r>
-        <w:t xml:space="preserve"> </w:t>
-      </w:r>
-      <w:r>
-        <w:t xml:space="preserve">and allowing vendors to compete, and they turn contractual choices about data use, fine-tuning ownership, and deployment into strategic decisions of the kind that Section 7.2 discusses. Second, we place that result in an integrated benchmark across the developer, the adopter, and the consumer, with appropriability defined ex ante as expected imitation lag and cost, which yields testable constructs (quality lead, imitation lag, and organizational capital) that can be measured from public sources. Third, we provide illustrative evidence on these constructs from leaderboard, endpoint-price, and regulatory filing data. The evidence does not bear on Proposition 5 itself and is limited, and we state what it cannot show. For practice, the theory replaces the question that dominates managerial discussion of AI, namely how much to invest, with the question it identifies as decisive: what does the firm own that the model cannot supply, and how long will it take competitors, and the model’s own supplier, to own it as well?</w:t>
-      </w:r>
-    </w:p>
-    <w:p>
-      <w:pPr>
-        <w:pStyle w:val="BodyText"/>
-      </w:pPr>
-      <w:r>
-        <w:t xml:space="preserve">The paper proceeds as follows. Section 2 reviews the relevant literatures and the public financial record of frontier developers. Section 3 defines the constructs. Section 4 presents the model and states the propositions, with proofs in Appendix A. Section 5 maps the model to data and states its empirical implications, and Section 6 presents illustrative evidence. Section 7 discusses implications, boundary conditions, and limitations, and Section 8 concludes.</w:t>
+        <w:t xml:space="preserve">The paper makes three contributions, developed in Section 7.1. It adds vendor encroachment to the appropriability account of IT value. It places that result in an integrated benchmark in which appropriability is defined ex ante, so that quality lead, imitation lag, and organizational capital become measurable constructs. And it offers illustrative evidence on those constructs from public data. The evidence is limited and does not bear on the encroachment results, and we say what it cannot show. Section 2 reviews the literature and the public financial record of frontier developers. Section 3 defines the constructs, Section 4 presents the model, Section 5 maps it to data, and Section 6 presents the evidence. Section 7 discusses implications and limitations, and Section 8 concludes.</w:t>
       </w:r>
     </w:p>
     <w:bookmarkEnd w:id="20"/>
@@ -365,15 +307,7 @@
         <w:pStyle w:val="FirstParagraph"/>
       </w:pPr>
       <w:r>
-        <w:t xml:space="preserve">The question of who captures surplus in a layered market has been studied extensively outside IS, and our setting borrows from that work in three ways. First, vertical differentiation models show that a quality leader can price above its rival only by the amount buyers value the quality difference, so that its margin is proportional to the lead and falls to zero when the lead does (Mussa and Rosen 1978, Shaked and Sutton 1982). Our developer rent in Proposition 3 is an application of this logic, with the lead measured on public leaderboards. Second, the literature on vertical chains, beginning with Spengler (1950), analyzes how margins are divided among successive layers. Our division-of-surplus result (Proposition 4) is a decomposition of this kind. It is accounting in nature, and its content comes from how each term moves with the lead, the imitation lag, and downstream competition. Third, work on platforms and complementors shows that platform owners can enter complementors’ markets and that entry shortens the complementors’ profitable window (Gawer and Henderson 2007, Zhu and Liu 2018, Rochet and Tirole 2003). We use this in Proposition 5, where a developer’s productization of a use reduces the expected rent of the complement builder that created it.</w:t>
-      </w:r>
-    </w:p>
-    <w:p>
-      <w:pPr>
-        <w:pStyle w:val="BodyText"/>
-      </w:pPr>
-      <w:r>
-        <w:t xml:space="preserve">Against this background, the contribution of the present paper is not a new result about any single layer. It is the combination of these layers, with ex ante defined appropriability at each, applied to a technology for which the key state variables are observable and for which the empirical record is now long enough to look at.</w:t>
+        <w:t xml:space="preserve">The question of who captures surplus in a layered market has been studied extensively outside IS, and our setting borrows from that work in three ways. First, vertical differentiation models show that a quality leader can price above its rival only by the amount buyers value the quality difference, so that its margin is proportional to the lead and falls to zero when the lead does (Mussa and Rosen 1978, Shaked and Sutton 1982). Our developer rent in Proposition 3 is an application of this logic, with the lead measured on public leaderboards. Second, the literature on vertical chains, beginning with Spengler (1950), analyzes how margins are divided among successive layers. Our division-of-surplus result (Proposition 4) is a decomposition of this kind. It is accounting in nature, and its content comes from how each term moves with the lead, the imitation lag, and downstream competition. Third, work on platforms and complementors shows that platform owners can enter complementors’ markets and that entry shortens the complementors’ profitable window (Gawer and Henderson 2007, Zhu and Liu 2018, Rochet and Tirole 2003). We use this in Proposition 5, where a vendor’s productization of a use reduces the expected rent of the complement builder that created it.</w:t>
       </w:r>
     </w:p>
     <w:bookmarkEnd w:id="24"/>
@@ -417,7 +351,7 @@
         <w:pStyle w:val="BodyText"/>
       </w:pPr>
       <w:r>
-        <w:t xml:space="preserve">Revenue is large and growing. OpenAI’s 2025 operating loss of $20.9 billion on $13.1 billion of revenue was driven by $19.2 billion of research and development. Payments to Microsoft alone, $17.2 billion, equal about half of its $34 billion of total costs and expenses. The price of reaching a fixed benchmark score has fallen by roughly 5 to 10 times per year for models on the price-performance frontier (Cottier et al. 2025, Gundlach et al. 2026). The decline is steepest in the highest performance bin, about 31 times per year against 1.7 times in the lowest, while the cost of running the current best model has risen by 3 to 18 times per year (Gundlach et al. 2026). OpenAI’s gross margin nonetheless rose from 28 to 43 percent between 2024 and 2025, so over that interval serving cost fell faster than price.</w:t>
+        <w:t xml:space="preserve">Revenue is large and still growing, but costs are larger. OpenAI’s 2025 operating loss of $20.9 billion on $13.1 billion of revenue was driven by $19.2 billion of research and development. Payments to Microsoft alone, $17.2 billion, equal about half of its $34 billion of total costs and expenses. The price of reaching a fixed benchmark score has fallen by roughly 5 to 10 times per year for models on the price-performance frontier (Cottier et al. 2025, Gundlach et al. 2026). The decline is steepest in the highest performance bin, about 31 times per year against 1.7 times in the lowest, while the cost of running the current best model has risen by 3 to 18 times per year (Gundlach et al. 2026). OpenAI’s gross margin nonetheless rose from 28 to 43 percent between 2024 and 2025, so over that interval serving cost fell faster than price.</w:t>
       </w:r>
     </w:p>
     <w:p>
@@ -1080,7 +1014,7 @@
         <w:pStyle w:val="BodyText"/>
       </w:pPr>
       <w:r>
-        <w:t xml:space="preserve">The positions form a lifecycle. A frontier model becomes a commodity when competitors match its quality, and a proprietary use becomes a commodity when vendors productize it or when the underlying organizational capital diffuses. A single legal entity may occupy more than one position. Microsoft, for example, holds an equity claim on future model leads, supplies the compute that sits outside the three-way split in Section 4, and sells a bundled product (Copilot) that is a complement-builder’s offering. Consolidated operating income is therefore not developer rent.</w:t>
+        <w:t xml:space="preserve">The positions form a lifecycle. A frontier model becomes a commodity when competitors match its quality, and a proprietary use becomes a commodity when vendors productize it or when the underlying organizational capital diffuses. A single legal entity may occupy more than one position. Microsoft, for example, holds an equity claim on future model leads, supplies the compute that sits outside the three-way split of Section 4, and sells a bundled product (Copilot) that is a complement builder’s offering. Consolidated operating income is therefore not developer rent.</w:t>
       </w:r>
     </w:p>
     <w:bookmarkEnd w:id="28"/>
@@ -5068,6 +5002,25 @@
       </w:pPr>
       <w:r>
         <w:t xml:space="preserve">which is strictly decreasing in</w:t>
+      </w:r>
+      <w:r>
+        <w:t xml:space="preserve"> </w:t>
+      </w:r>
+      <m:oMath>
+        <m:r>
+          <m:t>η</m:t>
+        </m:r>
+      </m:oMath>
+      <w:r>
+        <w:t xml:space="preserve">.</w:t>
+      </w:r>
+    </w:p>
+    <w:p>
+      <w:pPr>
+        <w:pStyle w:val="BodyText"/>
+      </w:pPr>
+      <w:r>
+        <w:t xml:space="preserve">Section 4.3 repeats this result with an exponential imitation lag, which makes it possible to solve for the vendor’s choice of</w:t>
       </w:r>
       <w:r>
         <w:t xml:space="preserve"> </w:t>

</xml_diff>

<commit_message>
Rewrite prose of Sections 2 and 4 for clarity and consistency
Co-Authored-By: Claude Sonnet 5.5 <noreply@anthropic.com>
Claude-Session: https://claude.ai/code/session_01SvJ27oz7kYhWEBfZS3x4ro
</commit_message>
<xml_diff>
--- a/isr/ISR_Who_Profits_from_LLMs.docx
+++ b/isr/ISR_Who_Profits_from_LLMs.docx
@@ -253,7 +253,7 @@
         <w:pStyle w:val="FirstParagraph"/>
       </w:pPr>
       <w:r>
-        <w:t xml:space="preserve">The IT productivity paradox contains two questions that the literature has not always kept apart. The first is Solow’s (1987) original observation about aggregate productivity, which has a largely settled explanation in mismeasurement and in the lagged accumulation of expensed intangible complements (Griliches 1994, Brynjolfsson and Hitt 2003, Brynjolfsson et al. 2021). The second concerns profitability. Even where IT demonstrably raises productivity, it is weakly related to firm profit. Hitt and Brynjolfsson (1996) separated productivity, profitability, and consumer surplus, and found that IT raised the first and the third but left the second unchanged, which they attributed to competition passing IT gains through to consumers. Later work on IT business value has mostly treated the weak profit link as a measurement problem to be solved with better data. We take the other route and treat it as a prediction to be derived. The profitability component is also the one that LLMs reproduce.</w:t>
+        <w:t xml:space="preserve">The IT productivity paradox bundles two questions that the literature has not always kept apart. The first is Solow’s (1987) observation about aggregate productivity. It now has a largely settled explanation in mismeasurement and in the lagged buildup of expensed intangible complements (Griliches 1994, Brynjolfsson and Hitt 2003, Brynjolfsson et al. 2021). The second question is about profit. Even where IT demonstrably raises productivity, it bears only a weak relationship to firm profitability. Hitt and Brynjolfsson (1996) separated productivity, profitability, and consumer surplus. They found that IT raised the first and the third and left the second unchanged, and they attributed this to competition passing IT gains on to consumers. Later work on IT business value has mostly treated the weak link to profit as a measurement problem awaiting better data. We treat it instead as a prediction to be derived. It is also the half of the paradox that LLMs reproduce.</w:t>
       </w:r>
     </w:p>
     <w:bookmarkEnd w:id="21"/>
@@ -271,7 +271,7 @@
         <w:pStyle w:val="FirstParagraph"/>
       </w:pPr>
       <w:r>
-        <w:t xml:space="preserve">The resource-based view holds that sustained advantage requires resources that are valuable, rare, imperfectly imitable, and non-substitutable (Barney 1991, Peteraf 1993). Applied to IT, the argument is that technology itself rarely confers advantage because it can be purchased, while IT-enabled capabilities embedded in organizational routines can (Clemons and Row 1991, Mata et al. 1995, Bharadwaj 2000, Piccoli and Ives 2005). The economic foundation is complementarity (Milgrom and Roberts 1990). Bresnahan et al. (2002) documented complementarity among IT, workplace reorganization, and skills, and Brynjolfsson et al. (2002) estimated that the market value of IT-intensive firms reflects organizational capital worth roughly ten times the hardware. Imperfect imitability has identifiable sources: organizational capital accumulates through path-dependent processes subject to time-compression diseconomies (Dierickx and Cool 1989), and causal ambiguity protects it from copying (Lippman and Rumelt 1982). A well-known weakness of this literature is tautology, since any advantage that persists can be redescribed as inimitable after the fact. We address this in Section 3 by defining appropriability ex ante.</w:t>
+        <w:t xml:space="preserve">The resource-based view holds that sustained advantage requires resources that are valuable, rare, imperfectly imitable, and non-substitutable (Barney 1991, Peteraf 1993). Applied to IT, the argument runs as follows. Technology rarely confers advantage by itself, because anyone can buy it, but IT-enabled capabilities embedded in organizational routines can (Clemons and Row 1991, Mata et al. 1995, Bharadwaj 2000, Piccoli and Ives 2005). Complementarity supplies the economic foundation (Milgrom and Roberts 1990). Bresnahan et al. (2002) documented complementarity among IT, workplace reorganization, and skills, and Brynjolfsson et al. (2002) estimated that the market value of IT-intensive firms reflects organizational capital worth roughly ten times their hardware. Imperfect imitability has identifiable sources. Organizational capital builds up through path-dependent processes that cannot be compressed in time (Dierickx and Cool 1989), and causal ambiguity shields it from copying (Lippman and Rumelt 1982). The literature has a well-known weakness, however. Any advantage that persists can be redescribed after the fact as inimitable, which makes the argument tautological. Section 3 addresses this by defining appropriability ex ante.</w:t>
       </w:r>
     </w:p>
     <w:bookmarkEnd w:id="22"/>
@@ -289,7 +289,7 @@
         <w:pStyle w:val="FirstParagraph"/>
       </w:pPr>
       <w:r>
-        <w:t xml:space="preserve">Under competitive equilibrium with free entry, price equals minimum average cost and economic profit is zero. Schumpeter (1934, 1942) located profit in innovation: the innovator earns a temporary rent equal to the gap between price and its own cost until imitation closes the gap. Marshall (1890) called such returns quasi-rents. Teece (1986) specified who captures them. Innovators profit when the appropriability regime is tight or when they control co-specialized complementary assets. Nordhaus (2004) estimated that innovators in the United States capture roughly two percent of the social value of their innovations. For a general-purpose technology (Bresnahan and Trajtenberg 1995) the framework applies twice, once to the developer, whose innovation is the technology, and once to each adopter, whose innovation is a co-specialized use of it.</w:t>
+        <w:t xml:space="preserve">Under competitive equilibrium with free entry, price equals minimum average cost and economic profit is zero. Schumpeter (1934, 1942) located profit in innovation. The innovator earns a temporary rent equal to the gap between price and its own cost until imitation closes the gap, and Marshall (1890) called such returns quasi-rents. Teece (1986) specified who captures them: innovators profit when the appropriability regime is tight or when they control co-specialized complementary assets. Nordhaus (2004) estimated that innovators in the United States capture only about two percent of the social value of their innovations. For a general-purpose technology (Bresnahan and Trajtenberg 1995), the framework applies twice. It applies once to the developer, whose innovation is the technology, and once to each adopter, whose innovation is a co-specialized use of it.</w:t>
       </w:r>
     </w:p>
     <w:bookmarkEnd w:id="23"/>
@@ -307,7 +307,7 @@
         <w:pStyle w:val="FirstParagraph"/>
       </w:pPr>
       <w:r>
-        <w:t xml:space="preserve">The question of who captures surplus in a layered market has been studied extensively outside IS, and our setting borrows from that work in three ways. First, vertical differentiation models show that a quality leader can price above its rival only by the amount buyers value the quality difference, so that its margin is proportional to the lead and falls to zero when the lead does (Mussa and Rosen 1978, Shaked and Sutton 1982). Our developer rent in Proposition 3 is an application of this logic, with the lead measured on public leaderboards. Second, the literature on vertical chains, beginning with Spengler (1950), analyzes how margins are divided among successive layers. Our division-of-surplus result (Proposition 4) is a decomposition of this kind. It is accounting in nature, and its content comes from how each term moves with the lead, the imitation lag, and downstream competition. Third, work on platforms and complementors shows that platform owners can enter complementors’ markets and that entry shortens the complementors’ profitable window (Gawer and Henderson 2007, Zhu and Liu 2018, Rochet and Tirole 2003). We use this in Proposition 5, where a vendor’s productization of a use reduces the expected rent of the complement builder that created it.</w:t>
+        <w:t xml:space="preserve">Who captures surplus in a layered market has been studied extensively outside information systems, and our setting borrows from that work in three ways. First, models of vertical differentiation show that a quality leader can price above its rival only by the amount that buyers value the quality difference. Its margin is therefore proportional to the lead and falls to zero when the lead does (Mussa and Rosen 1978, Shaked and Sutton 1982). The developer rent in Proposition 3 applies this logic, with the lead measured on public leaderboards. Second, the literature on vertical chains, which begins with Spengler (1950), analyzes how margins are divided among successive layers. Our division-of-surplus result (Proposition 4) is a decomposition of this kind. It is accounting in nature, and its content lies in how each term moves with the lead, the imitation lag, and downstream competition. Third, work on platforms and complementors shows that platform owners can enter complementors’ markets and that their entry shortens the complementors’ profitable window (Gawer and Henderson 2007, Zhu and Liu 2018, Rochet and Tirole 2003). Proposition 5 builds on this result. A vendor’s productization of a use reduces the expected rent of the complement builder that created it.</w:t>
       </w:r>
     </w:p>
     <w:bookmarkEnd w:id="24"/>
@@ -325,7 +325,7 @@
         <w:pStyle w:val="FirstParagraph"/>
       </w:pPr>
       <w:r>
-        <w:t xml:space="preserve">LLM evidence to date has concentrated at the task level and at the developer level, with little at the level of firm profit. Field and laboratory studies report large productivity effects: Brynjolfsson et al. (2025) find a 14 percent increase in issues resolved per hour among customer-support agents; Noy and Zhang (2023) report a 40 percent reduction in time spent on professional writing tasks; Peng et al. (2023) report 55 percent faster task completion among programmers; and Dell’Acqua et al. (2023) find gains of 25 to 40 percent on consulting tasks that lie within the model’s capability frontier. Eloundou et al. (2024) estimate that a majority of occupations have at least some tasks exposed to LLMs. Agrawal et al. (2018, 2022) frame AI as lowering the cost of prediction, so that value accrues to owners of complements, and Bommasani et al. (2021) characterize foundation models as a shared substrate. At the level of the adopting organization the evidence is thinner and less favorable. Linking Danish adoption surveys to administrative records, Humlum and Vestergaard (2025) estimate precise null effects of AI chatbots on earnings and recorded hours two years after adoption, even where employers invested heavily in adoption.</w:t>
+        <w:t xml:space="preserve">The evidence on LLMs so far sits mostly at the task level and at the developer level, and little of it concerns firm profit. Field and laboratory studies find large productivity effects. Brynjolfsson et al. (2025) report a 14 percent increase in issues resolved per hour among customer-support agents. Noy and Zhang (2023) find a 40 percent reduction in the time spent on professional writing tasks, Peng et al. (2023) find that programmers complete tasks 55 percent faster, and Dell’Acqua et al. (2023) find gains of 25 to 40 percent on consulting tasks that lie within the model’s capability frontier. Eloundou et al. (2024) estimate that a majority of occupations have at least some tasks exposed to LLMs. Agrawal et al. (2018, 2022) frame AI as a fall in the cost of prediction, so that value accrues to the owners of complements, and Bommasani et al. (2021) describe foundation models as a shared substrate. At the level of the adopting organization the evidence is thinner and less favorable. Humlum and Vestergaard (2025) link Danish adoption surveys to administrative records and estimate precise null effects of AI chatbots on earnings and recorded hours two years after adoption, even where employers invested heavily in adoption.</w:t>
       </w:r>
     </w:p>
     <w:bookmarkEnd w:id="25"/>
@@ -343,7 +343,7 @@
         <w:pStyle w:val="FirstParagraph"/>
       </w:pPr>
       <w:r>
-        <w:t xml:space="preserve">Three regularities were visible before systematic study. Frontier quality is matched by rivals within months. The inference price of a given capability has fallen by more than an order of magnitude per year. And frontier developers report losses while raising capital at valuations that presuppose future profit. Table 1 collects the audited and company-disclosed figures that are available for 2024 to 2026.</w:t>
+        <w:t xml:space="preserve">Three regularities were visible before anyone studied them systematically. Rivals match frontier quality within months. The inference price of a given capability has fallen by more than an order of magnitude per year. And frontier developers report losses while raising capital at valuations that presuppose future profit. Table 1 collects the audited and company-disclosed figures that are available for 2024 to 2026.</w:t>
       </w:r>
     </w:p>
     <w:p>
@@ -351,7 +351,7 @@
         <w:pStyle w:val="BodyText"/>
       </w:pPr>
       <w:r>
-        <w:t xml:space="preserve">Revenue is large and still growing, but costs are larger. OpenAI’s 2025 operating loss of $20.9 billion on $13.1 billion of revenue was driven by $19.2 billion of research and development. Payments to Microsoft alone, $17.2 billion, equal about half of its $34 billion of total costs and expenses. The price of reaching a fixed benchmark score has fallen by roughly 5 to 10 times per year for models on the price-performance frontier (Cottier et al. 2025, Gundlach et al. 2026). The decline is steepest in the highest performance bin, about 31 times per year against 1.7 times in the lowest, while the cost of running the current best model has risen by 3 to 18 times per year (Gundlach et al. 2026). OpenAI’s gross margin nonetheless rose from 28 to 43 percent between 2024 and 2025, so over that interval serving cost fell faster than price.</w:t>
+        <w:t xml:space="preserve">Revenue is large and still growing, but costs are larger. OpenAI’s 2025 operating loss of $20.9 billion on $13.1 billion of revenue was driven by $19.2 billion of research and development. Its payments to Microsoft alone, $17.2 billion, equal about half of its $34 billion of total costs and expenses. Meanwhile the price of reaching a fixed benchmark score has fallen by roughly 5 to 10 times per year for models on the price-performance frontier (Cottier et al. 2025, Gundlach et al. 2026). The decline is steepest in the highest performance bin, about 31 times per year against 1.7 times in the lowest, while the cost of running the current best model has risen by 3 to 18 times per year (Gundlach et al. 2026). OpenAI’s gross margin nonetheless rose from 28 to 43 percent between 2024 and 2025, which means that serving cost fell faster than price over that interval.</w:t>
       </w:r>
     </w:p>
     <w:p>
@@ -906,7 +906,7 @@
         <w:pStyle w:val="BodyText"/>
       </w:pPr>
       <w:r>
-        <w:t xml:space="preserve">These figures are too coarse to test the theory, and they should not be read as doing so. Run-rate is not profit, and a hyperscaler’s AI profit is not a developer’s rent. Their role in this paper is to motivate the developer half of the theory and to fix orders of magnitude. The formal tests appear in Section 6.</w:t>
+        <w:t xml:space="preserve">These figures are too coarse to test the theory, and we do not use them that way. A run-rate is not a profit, and a hyperscaler’s AI profit is not a developer’s rent. Their role here is to motivate the developer half of the theory and to fix orders of magnitude. The empirical work appears in Section 6.</w:t>
       </w:r>
     </w:p>
     <w:bookmarkEnd w:id="26"/>
@@ -1078,7 +1078,7 @@
         <w:pStyle w:val="FirstParagraph"/>
       </w:pPr>
       <w:r>
-        <w:t xml:space="preserve">Consider a downstream industry with a continuum of firms indexed by</w:t>
+        <w:t xml:space="preserve">Consider a downstream industry with a continuum of firms, indexed by</w:t>
       </w:r>
       <w:r>
         <w:t xml:space="preserve"> </w:t>
@@ -1089,7 +1089,7 @@
         </m:r>
       </m:oMath>
       <w:r>
-        <w:t xml:space="preserve">, producing a homogeneous good sold at price</w:t>
+        <w:t xml:space="preserve">, that produce a homogeneous good sold at price</w:t>
       </w:r>
       <w:r>
         <w:t xml:space="preserve"> </w:t>
@@ -1111,7 +1111,10 @@
         </m:r>
       </m:oMath>
       <w:r>
-        <w:t xml:space="preserve">’s output is</w:t>
+        <w:t xml:space="preserve"> </w:t>
+      </w:r>
+      <w:r>
+        <w:t xml:space="preserve">produces output</w:t>
       </w:r>
     </w:p>
     <w:p>
@@ -1322,7 +1325,7 @@
         <w:t xml:space="preserve"> </w:t>
       </w:r>
       <w:r>
-        <w:t xml:space="preserve">is LLM usage purchased at a posted price</w:t>
+        <w:t xml:space="preserve">is LLM usage bought at a posted price</w:t>
       </w:r>
       <w:r>
         <w:t xml:space="preserve"> </w:t>
@@ -1356,7 +1359,7 @@
         <w:t xml:space="preserve"> </w:t>
       </w:r>
       <w:r>
-        <w:t xml:space="preserve">is firm-specific organizational capital that is co-specialized with the model, and</w:t>
+        <w:t xml:space="preserve">is firm-specific organizational capital co-specialized with the model, and</w:t>
       </w:r>
       <w:r>
         <w:t xml:space="preserve"> </w:t>
@@ -1398,7 +1401,7 @@
         <w:t xml:space="preserve"> </w:t>
       </w:r>
       <w:r>
-        <w:t xml:space="preserve">captures complementarity:</w:t>
+        <w:t xml:space="preserve">captures complementarity. It satisfies</w:t>
       </w:r>
       <w:r>
         <w:t xml:space="preserve"> </w:t>
@@ -1440,21 +1443,10 @@
         </m:r>
       </m:oMath>
       <w:r>
-        <w:t xml:space="preserve">, and</w:t>
-      </w:r>
-      <w:r>
-        <w:t xml:space="preserve"> </w:t>
-      </w:r>
-      <m:oMath>
-        <m:r>
-          <m:t>φ</m:t>
-        </m:r>
-      </m:oMath>
-      <w:r>
-        <w:t xml:space="preserve"> </w:t>
-      </w:r>
-      <w:r>
-        <w:t xml:space="preserve">is supermodular, so that the marginal product of</w:t>
+        <w:t xml:space="preserve"> </w:t>
+      </w:r>
+      <w:r>
+        <w:t xml:space="preserve">and is supermodular, so the marginal product of</w:t>
       </w:r>
       <w:r>
         <w:t xml:space="preserve"> </w:t>
@@ -1482,7 +1474,32 @@
         <w:t xml:space="preserve"> </w:t>
       </w:r>
       <w:r>
-        <w:t xml:space="preserve">and vice versa. The third argument of</w:t>
+        <w:t xml:space="preserve">and the marginal product of</w:t>
+      </w:r>
+      <w:r>
+        <w:t xml:space="preserve"> </w:t>
+      </w:r>
+      <m:oMath>
+        <m:r>
+          <m:t>O</m:t>
+        </m:r>
+      </m:oMath>
+      <w:r>
+        <w:t xml:space="preserve"> </w:t>
+      </w:r>
+      <w:r>
+        <w:t xml:space="preserve">rises with</w:t>
+      </w:r>
+      <w:r>
+        <w:t xml:space="preserve"> </w:t>
+      </w:r>
+      <m:oMath>
+        <m:r>
+          <m:t>L</m:t>
+        </m:r>
+      </m:oMath>
+      <w:r>
+        <w:t xml:space="preserve">. The third argument of</w:t>
       </w:r>
       <w:r>
         <w:t xml:space="preserve"> </w:t>
@@ -1496,7 +1513,7 @@
         <w:t xml:space="preserve"> </w:t>
       </w:r>
       <w:r>
-        <w:t xml:space="preserve">is the model’s commodity contribution, available to any firm that buys</w:t>
+        <w:t xml:space="preserve">is the model’s commodity contribution, which any firm can obtain by buying</w:t>
       </w:r>
       <w:r>
         <w:t xml:space="preserve"> </w:t>
@@ -1507,7 +1524,7 @@
         </m:r>
       </m:oMath>
       <w:r>
-        <w:t xml:space="preserve">. The fourth is the contribution that arises only in combination with</w:t>
+        <w:t xml:space="preserve">. The fourth argument is the contribution that arises only when the model is combined with</w:t>
       </w:r>
       <w:r>
         <w:t xml:space="preserve"> </w:t>
@@ -1550,10 +1567,7 @@
         </m:d>
       </m:oMath>
       <w:r>
-        <w:t xml:space="preserve"> </w:t>
-      </w:r>
-      <w:r>
-        <w:t xml:space="preserve">subject to time-compression diseconomies. A competitor can replicate it only after a lag</w:t>
+        <w:t xml:space="preserve">, reflecting time-compression diseconomies. A competitor can replicate it only after a lag</w:t>
       </w:r>
       <w:r>
         <w:t xml:space="preserve"> </w:t>
@@ -1784,7 +1798,7 @@
         <w:t xml:space="preserve"> </w:t>
       </w:r>
       <w:r>
-        <w:t xml:space="preserve">over the best alternative. Inference is supplied at a marginal cost</w:t>
+        <w:t xml:space="preserve">over the best alternative. Developers with comparable infrastructure supply inference at a common marginal cost</w:t>
       </w:r>
       <w:r>
         <w:t xml:space="preserve"> </w:t>
@@ -1795,10 +1809,7 @@
         </m:r>
       </m:oMath>
       <w:r>
-        <w:t xml:space="preserve"> </w:t>
-      </w:r>
-      <w:r>
-        <w:t xml:space="preserve">common to developers with comparable infrastructure. A frontier model costs</w:t>
+        <w:t xml:space="preserve">. A frontier model costs</w:t>
       </w:r>
       <w:r>
         <w:t xml:space="preserve"> </w:t>
@@ -1990,7 +2001,7 @@
         </m:d>
       </m:oMath>
       <w:r>
-        <w:t xml:space="preserve">. Compute is bought from its owners at market prices and is a factor payment, not a component of developer rent.</w:t>
+        <w:t xml:space="preserve">. Compute is bought from its owners at market prices. It is a factor payment and not part of developer rent.</w:t>
       </w:r>
     </w:p>
     <w:p>
@@ -1998,7 +2009,7 @@
         <w:pStyle w:val="BodyText"/>
       </w:pPr>
       <w:r>
-        <w:t xml:space="preserve">In what follows, a</w:t>
+        <w:t xml:space="preserve">A</w:t>
       </w:r>
       <w:r>
         <w:t xml:space="preserve"> </w:t>
@@ -2014,7 +2025,7 @@
         <w:t xml:space="preserve"> </w:t>
       </w:r>
       <w:r>
-        <w:t xml:space="preserve">is a model developer that sells to adopters. The frontier developer is one such vendor, and Sections 4.3 and 4.4 consider vendors other than the frontier developer as well. Table 2 lists the notation.</w:t>
+        <w:t xml:space="preserve">is a model developer that sells to adopters. The frontier developer is one such vendor, and Sections 4.3 and 4.4 also consider others. Table 2 lists the notation.</w:t>
       </w:r>
     </w:p>
     <w:p>
@@ -3005,10 +3016,7 @@
         <w:t xml:space="preserve"> </w:t>
       </w:r>
       <w:r>
-        <w:t xml:space="preserve">In a competitive industry with</w:t>
-      </w:r>
-      <w:r>
-        <w:t xml:space="preserve"> </w:t>
+        <w:t xml:space="preserve">In a competitive industry in which no adopter holds organizational capital (</w:t>
       </w:r>
       <m:oMath>
         <m:sSub>
@@ -3048,7 +3056,7 @@
         </m:r>
       </m:oMath>
       <w:r>
-        <w:t xml:space="preserve">, the economic profit attributable to LLM usage is zero for every adopter. An improvement in the model or a fall in</w:t>
+        <w:t xml:space="preserve">), LLM usage earns no adopter an economic profit. An improvement in the model, or a fall in</w:t>
       </w:r>
       <w:r>
         <w:t xml:space="preserve"> </w:t>
@@ -3068,10 +3076,7 @@
         </m:sSub>
       </m:oMath>
       <w:r>
-        <w:t xml:space="preserve"> </w:t>
-      </w:r>
-      <w:r>
-        <w:t xml:space="preserve">lowers the product price by the full reduction in minimum average cost, so the productivity gain accrues entirely to consumers.</w:t>
+        <w:t xml:space="preserve">, lowers the product price by the full reduction in minimum average cost, so the productivity gain accrues entirely to consumers.</w:t>
       </w:r>
     </w:p>
     <w:p>
@@ -5049,7 +5054,7 @@
         <w:pStyle w:val="FirstParagraph"/>
       </w:pPr>
       <w:r>
-        <w:t xml:space="preserve">Proposition 5 treats the productization rate</w:t>
+        <w:t xml:space="preserve">Proposition 5 takes the productization rate</w:t>
       </w:r>
       <w:r>
         <w:t xml:space="preserve"> </w:t>
@@ -5063,7 +5068,7 @@
         <w:t xml:space="preserve"> </w:t>
       </w:r>
       <w:r>
-        <w:t xml:space="preserve">as given. Here we let the vendor choose it and ask how contract terms affect the choice. The analysis is a reduced-form extension. It adds the minimum structure needed to endogenize</w:t>
+        <w:t xml:space="preserve">as given. Here we let the vendor choose it and ask how contract terms affect the choice. The analysis is a reduced-form extension that adds only the structure needed to endogenize</w:t>
       </w:r>
       <w:r>
         <w:t xml:space="preserve"> </w:t>
@@ -5074,7 +5079,7 @@
         </m:r>
       </m:oMath>
       <w:r>
-        <w:t xml:space="preserve">, and it should be read as a first formalization and not as a full model of vendor behavior.</w:t>
+        <w:t xml:space="preserve">. It is a first formalization and not a full model of vendor behavior.</w:t>
       </w:r>
     </w:p>
     <w:p>
@@ -5155,7 +5160,7 @@
         <w:t xml:space="preserve"> </w:t>
       </w:r>
       <w:r>
-        <w:t xml:space="preserve">be the adopter’s rent flow. For tractability, we replace the deterministic imitation lag</w:t>
+        <w:t xml:space="preserve">be the adopter’s rent flow. To keep the problem tractable, we replace the deterministic imitation lag</w:t>
       </w:r>
       <w:r>
         <w:t xml:space="preserve"> </w:t>
@@ -5178,7 +5183,7 @@
         <w:t xml:space="preserve"> </w:t>
       </w:r>
       <w:r>
-        <w:t xml:space="preserve">by an exponential one: rivals imitate</w:t>
+        <w:t xml:space="preserve">with an exponential one: rivals imitate</w:t>
       </w:r>
       <w:r>
         <w:t xml:space="preserve"> </w:t>
@@ -5212,7 +5217,7 @@
         </m:r>
       </m:oMath>
       <w:r>
-        <w:t xml:space="preserve">, so that the mean lag is</w:t>
+        <w:t xml:space="preserve">, so the mean lag is</w:t>
       </w:r>
       <w:r>
         <w:t xml:space="preserve"> </w:t>
@@ -5451,7 +5456,7 @@
         <w:t xml:space="preserve"> </w:t>
       </w:r>
       <w:r>
-        <w:t xml:space="preserve">of that effort converts into productization, so that</w:t>
+        <w:t xml:space="preserve">of that effort converts into productization, so</w:t>
       </w:r>
       <w:r>
         <w:t xml:space="preserve"> </w:t>
@@ -5493,7 +5498,7 @@
         </m:r>
       </m:oMath>
       <w:r>
-        <w:t xml:space="preserve">. The cost of achieving a rate</w:t>
+        <w:t xml:space="preserve">. Achieving a rate</w:t>
       </w:r>
       <w:r>
         <w:t xml:space="preserve"> </w:t>
@@ -5507,7 +5512,7 @@
         <w:t xml:space="preserve"> </w:t>
       </w:r>
       <w:r>
-        <w:t xml:space="preserve">is therefore</w:t>
+        <w:t xml:space="preserve">therefore costs</w:t>
       </w:r>
       <w:r>
         <w:t xml:space="preserve"> </w:t>
@@ -5549,10 +5554,7 @@
         </m:sSup>
       </m:oMath>
       <w:r>
-        <w:t xml:space="preserve"> </w:t>
-      </w:r>
-      <w:r>
-        <w:t xml:space="preserve">with</w:t>
+        <w:t xml:space="preserve">, where</w:t>
       </w:r>
       <w:r>
         <w:t xml:space="preserve"> </w:t>
@@ -5622,7 +5624,10 @@
         </m:sSup>
       </m:oMath>
       <w:r>
-        <w:t xml:space="preserve">, which increases in</w:t>
+        <w:t xml:space="preserve"> </w:t>
+      </w:r>
+      <w:r>
+        <w:t xml:space="preserve">increases in</w:t>
       </w:r>
       <w:r>
         <w:t xml:space="preserve"> </w:t>
@@ -5633,7 +5638,7 @@
         </m:r>
       </m:oMath>
       <w:r>
-        <w:t xml:space="preserve">. When it productizes the use, the vendor gains the present value</w:t>
+        <w:t xml:space="preserve">. If the vendor productizes the use, it gains the present value</w:t>
       </w:r>
       <w:r>
         <w:t xml:space="preserve"> </w:t>
@@ -5665,7 +5670,7 @@
         </m:r>
       </m:oMath>
       <w:r>
-        <w:t xml:space="preserve">, where</w:t>
+        <w:t xml:space="preserve">. Here</w:t>
       </w:r>
       <w:r>
         <w:t xml:space="preserve"> </w:t>
@@ -5732,7 +5737,7 @@
         <w:t xml:space="preserve"> </w:t>
       </w:r>
       <w:r>
-        <w:t xml:space="preserve">that it captures, and the rest passes to consumers. The vendor chooses</w:t>
+        <w:t xml:space="preserve">that the vendor captures, and the rest passes to consumers. The vendor chooses</w:t>
       </w:r>
       <w:r>
         <w:t xml:space="preserve"> </w:t>
@@ -5851,7 +5856,7 @@
         <w:pStyle w:val="FirstParagraph"/>
       </w:pPr>
       <w:r>
-        <w:t xml:space="preserve">the expected present value of its gain net of effort cost, which accrues until productization or imitation ends the opportunity.</w:t>
+        <w:t xml:space="preserve">the expected present value of its gain net of effort cost, which runs until productization or imitation ends the opportunity.</w:t>
       </w:r>
     </w:p>
     <w:p>
@@ -6321,7 +6326,7 @@
         <w:pStyle w:val="BodyText"/>
       </w:pPr>
       <w:r>
-        <w:t xml:space="preserve">Proposition 6 says that imitation by rivals and encroachment by the vendor are strategic complements. A shorter expected imitation lag makes the vendor move sooner, so that the two threats to the adopter’s rent compound. Proposition 7 is the hold-up logic of Klein et al. (1978) and Grossman and Hart (1986) applied to the LLM supply relationship. An adopter that fears productization under-invests in the co-specialized capital that generates its rent, and contract terms that raise the vendor’s cost of encroaching restore some of that investment.</w:t>
+        <w:t xml:space="preserve">Proposition 6 says that imitation by rivals and encroachment by the vendor are strategic complements. A shorter expected imitation lag makes the vendor move sooner, so the two threats to the adopter’s rent compound. Proposition 7 applies the hold-up logic of Klein et al. (1978) and Grossman and Hart (1986) to the LLM supply relationship. An adopter that fears productization under-invests in the co-specialized capital that generates its rent, and contract terms that raise the vendor’s cost of encroaching restore some of that investment.</w:t>
       </w:r>
     </w:p>
     <w:p>
@@ -6619,7 +6624,7 @@
         </m:sSup>
       </m:oMath>
       <w:r>
-        <w:t xml:space="preserve">. A contract can be agreed only if the first exceeds the second. Table 3 gives a numerical illustration. Protection clears for uses with small rents and fails for uses with large rents, because the vendor’s gain from productizing grows with the rent. The pattern depends on the parameters and is not general, since in a simulation with randomly drawn parameters the willingness to pay fell short of the vendor’s loss in about five percent of the draws. We therefore offer it as an illustration and not as a proposition. If it held more generally, it would imply that the uses most worth protecting are the ones least likely to be protected.</w:t>
+        <w:t xml:space="preserve">. A contract can be agreed only if the first exceeds the second. Table 3 gives a numerical illustration. Protection clears for uses with small rents and fails for uses with large rents, because the vendor’s gain from productizing grows with the rent. The pattern depends on the parameters. In a simulation with randomly drawn parameters, the willingness to pay fell short of the vendor’s loss in about five percent of the draws. We therefore offer the pattern as an illustration and not as a proposition. If it held more generally, the uses most worth protecting would be the ones least likely to be protected.</w:t>
       </w:r>
     </w:p>
     <w:p>
@@ -7302,7 +7307,7 @@
         <w:t xml:space="preserve"> </w:t>
       </w:r>
       <w:r>
-        <w:t xml:space="preserve">is constant and chosen by a single vendor. Competition among vendors is added in Section 4.4. We still do not model the adopter’s responses (concealing the use, moving to another vendor) or bargaining over the contract. The functional form</w:t>
+        <w:t xml:space="preserve">is constant and chosen by a single vendor, and Section 4.4 adds competition among vendors. We still do not model the adopter’s responses, such as concealing the use or moving to another vendor, or bargaining over the contract. The functional form</w:t>
       </w:r>
       <w:r>
         <w:t xml:space="preserve"> </w:t>
@@ -7389,7 +7394,7 @@
         <w:t xml:space="preserve"> </w:t>
       </w:r>
       <w:r>
-        <w:t xml:space="preserve">is a reduced-form parameter that does not model how the developer earns from a productized offering. Contract terms are not publicly observed, so the propositions cannot be examined with the data in Section 6.</w:t>
+        <w:t xml:space="preserve">is a reduced-form parameter that says nothing about how the vendor earns from a productized offering. Contract terms are not publicly observed, so the propositions cannot be examined with the data in Section 6.</w:t>
       </w:r>
     </w:p>
     <w:bookmarkEnd w:id="34"/>
@@ -7407,7 +7412,7 @@
         <w:pStyle w:val="FirstParagraph"/>
       </w:pPr>
       <w:r>
-        <w:t xml:space="preserve">Section 4.3 has a single vendor decide whether to productize the adopter’s use. In practice, several vendors can see that a use is valuable and build it. We now allow</w:t>
+        <w:t xml:space="preserve">Section 4.3 has a single vendor decide whether to productize the adopter’s use. In practice, several vendors may see that a use is valuable and try to build it. We now let</w:t>
       </w:r>
       <w:r>
         <w:t xml:space="preserve"> </w:t>
@@ -7421,7 +7426,7 @@
         <w:t xml:space="preserve"> </w:t>
       </w:r>
       <w:r>
-        <w:t xml:space="preserve">symmetric vendors to race for the same use.</w:t>
+        <w:t xml:space="preserve">symmetric vendors race for the same use.</w:t>
       </w:r>
     </w:p>
     <w:p>
@@ -7523,7 +7528,7 @@
         </m:sSubSup>
       </m:oMath>
       <w:r>
-        <w:t xml:space="preserve">. The first to productize the use earns</w:t>
+        <w:t xml:space="preserve">. The first vendor to productize the use earns</w:t>
       </w:r>
       <w:r>
         <w:t xml:space="preserve"> </w:t>
@@ -7537,7 +7542,7 @@
         <w:t xml:space="preserve"> </w:t>
       </w:r>
       <w:r>
-        <w:t xml:space="preserve">and the others earn nothing, and productization by any vendor ends the adopter’s rent. Rivals’ imitation continues at rate</w:t>
+        <w:t xml:space="preserve">and the others earn nothing, and productization by any vendor ends the adopter’s rent. Imitation by rival adopters continues at rate</w:t>
       </w:r>
       <w:r>
         <w:t xml:space="preserve"> </w:t>
@@ -7548,7 +7553,7 @@
         </m:r>
       </m:oMath>
       <w:r>
-        <w:t xml:space="preserve">. With</w:t>
+        <w:t xml:space="preserve">. Let</w:t>
       </w:r>
       <w:r>
         <w:t xml:space="preserve"> </w:t>
@@ -7600,7 +7605,7 @@
         <w:t xml:space="preserve"> </w:t>
       </w:r>
       <w:r>
-        <w:t xml:space="preserve">the total rate, vendor</w:t>
+        <w:t xml:space="preserve">be the total rate. Vendor</w:t>
       </w:r>
       <w:r>
         <w:t xml:space="preserve"> </w:t>
@@ -8315,7 +8320,7 @@
         <w:pStyle w:val="BodyText"/>
       </w:pPr>
       <w:r>
-        <w:t xml:space="preserve">Competition among vendors thus has two effects that work in the same direction. Each vendor moves faster, because a rival’s progress raises the cost of waiting, and there are more vendors moving. The adopter’s profitable window shortens. The vendors’ own payoffs fall, so the race dissipates part of what the use is worth to them, much as competition among developers dissipates the premium in Proposition 3.</w:t>
+        <w:t xml:space="preserve">Competition among vendors thus has two effects, and they work in the same direction. Each vendor moves faster, because a rival’s progress raises the cost of waiting, and more vendors are moving. The adopter’s profitable window shortens. The vendors’ own payoffs fall, so the race dissipates part of what the use is worth to them, much as competition among developers dissipates the premium in Proposition 3.</w:t>
       </w:r>
     </w:p>
     <w:p>
@@ -8333,7 +8338,7 @@
         <w:t xml:space="preserve"> </w:t>
       </w:r>
       <w:r>
-        <w:t xml:space="preserve">The result in Proposition 7 required only that one vendor’s cost rise with protection. With several vendors, a contract between the adopter and its own supplier binds only that supplier. Let the adopter’s supplier have cost</w:t>
+        <w:t xml:space="preserve">Proposition 7 required only that one vendor’s cost rise with protection. With several vendors, a contract between the adopter and its own supplier binds that supplier alone. Let the adopter’s supplier have cost</w:t>
       </w:r>
       <w:r>
         <w:t xml:space="preserve"> </w:t>
@@ -8403,10 +8408,7 @@
         </m:sSup>
       </m:oMath>
       <w:r>
-        <w:t xml:space="preserve"> </w:t>
-      </w:r>
-      <w:r>
-        <w:t xml:space="preserve">and let</w:t>
+        <w:t xml:space="preserve">, and let</w:t>
       </w:r>
       <w:r>
         <w:t xml:space="preserve"> </w:t>
@@ -8440,7 +8442,7 @@
         </m:r>
       </m:oMath>
       <w:r>
-        <w:t xml:space="preserve">, because they have no access to the adopter’s data and so are unaffected by</w:t>
+        <w:t xml:space="preserve">, because they have no access to the adopter’s data and are therefore unaffected by</w:t>
       </w:r>
       <w:r>
         <w:t xml:space="preserve"> </w:t>
@@ -8451,7 +8453,7 @@
         </m:r>
       </m:oMath>
       <w:r>
-        <w:t xml:space="preserve">. Table 4 shows what protection then achieves, for different numbers of outsiders. With no outsiders, raising</w:t>
+        <w:t xml:space="preserve">. Table 4 shows what protection achieves for different numbers of outsiders. With no outsiders, raising</w:t>
       </w:r>
       <w:r>
         <w:t xml:space="preserve"> </w:t>
@@ -8465,7 +8467,7 @@
         <w:t xml:space="preserve"> </w:t>
       </w:r>
       <w:r>
-        <w:t xml:space="preserve">from 0 to 0.5 cuts the total productization rate by two thirds and raises the value of the adopter’s rent flow by more than half. With eight outsiders it cuts the rate by less than a tenth, and the gain in the value of the rent flow is under ten percent. In simulations with randomly drawn parameters (3,000 draws, up to six outsiders), both the proportional reduction in the total rate and the gain in the adopter’s rent declined with every added outsider, with no exceptions. We report this as a regularity and not as a proposition, since we have no proof for the asymmetric case.</w:t>
+        <w:t xml:space="preserve">from 0 to 0.5 cuts the total productization rate by two thirds and raises the value of the adopter’s rent flow by more than half. With eight outsiders it cuts the rate by less than a tenth, and the value of the rent flow rises by under ten percent. In simulations with randomly drawn parameters (3,000 draws, up to six outsiders), both the proportional reduction in the total rate and the gain in the adopter’s rent fell with every added outsider, without exception. We report this as a regularity and not as a proposition, because we have no proof for the asymmetric case.</w:t>
       </w:r>
     </w:p>
     <w:p>
@@ -9312,7 +9314,7 @@
         <w:pStyle w:val="BodyText"/>
       </w:pPr>
       <w:r>
-        <w:t xml:space="preserve">The implication is that bilateral contract terms are most useful where the adopter’s use is visible to few vendors. In a market with many capable vendors, protection from one supplier does little, and an adopter’s rent depends more on how hard the use is to replicate without its data than on what it has negotiated. This reinforces the importance of the organizational capital that makes a use difficult to copy (Section 3.3) and suggests that protection would need to be industry-wide, for example through norms or regulation, to be effective in such markets.</w:t>
+        <w:t xml:space="preserve">Bilateral contract terms are therefore most useful where few vendors can see the adopter’s use. In a market with many capable vendors, protection from one supplier does little, and the adopter’s rent depends more on how hard the use is to replicate without its data than on what it has negotiated. This reinforces the role of the organizational capital that makes a use difficult to copy (Section 3.3). It also suggests that protection would have to be industry-wide, for example through norms or regulation, to be effective in such markets.</w:t>
       </w:r>
     </w:p>
     <w:p>
@@ -9320,7 +9322,7 @@
         <w:pStyle w:val="BodyText"/>
       </w:pPr>
       <w:r>
-        <w:t xml:space="preserve">The same limits apply as in Section 4.3. Vendors are symmetric apart from their access to the adopter’s data, the rate of each vendor is constant, and a vendor whose rival wins earns nothing. Letting the winner share the use, or letting vendors differentiate their offerings, would soften the race.</w:t>
+        <w:t xml:space="preserve">The limits noted in Section 4.3 apply here as well. Vendors are symmetric apart from their access to the adopter’s data, each vendor’s rate is constant, and a vendor whose rival wins earns nothing. Letting the winner share the use, or letting vendors differentiate their offerings, would soften the race.</w:t>
       </w:r>
     </w:p>
     <w:bookmarkEnd w:id="35"/>
@@ -9338,7 +9340,7 @@
         <w:pStyle w:val="FirstParagraph"/>
       </w:pPr>
       <w:r>
-        <w:t xml:space="preserve">Seven predictions follow from the propositions. The first three are the ones the empirical work in Sections 5 and 6 can address.</w:t>
+        <w:t xml:space="preserve">Seven predictions follow from the propositions. The empirical work in Sections 5 and 6 can address only the first three.</w:t>
       </w:r>
     </w:p>
     <w:p>
@@ -9513,7 +9515,7 @@
         <w:pStyle w:val="FirstParagraph"/>
       </w:pPr>
       <w:r>
-        <w:t xml:space="preserve">Predictions 4 to 7 are not tested here. Predictions 6 and 7 bear directly on the LLM setting and on managerial choices about data-use terms and fine-tuning ownership, which we take up in Section 7. They cannot be examined with public data, since contract terms are not observed.</w:t>
+        <w:t xml:space="preserve">Predictions 4 to 7 are not tested here. Predictions 6 and 7 bear directly on managerial choices about data-use terms and fine-tuning ownership, which we take up in Section 7, but they cannot be examined with public data because contract terms are not observed.</w:t>
       </w:r>
     </w:p>
     <w:bookmarkEnd w:id="36"/>
@@ -9545,7 +9547,7 @@
         <w:t xml:space="preserve"> </w:t>
       </w:r>
       <w:r>
-        <w:t xml:space="preserve">is low relative to the cost of producing a frontier model</w:t>
+        <w:t xml:space="preserve">is low relative to the cost</w:t>
       </w:r>
       <w:r>
         <w:t xml:space="preserve"> </w:t>
@@ -9565,7 +9567,10 @@
         </m:sSub>
       </m:oMath>
       <w:r>
-        <w:t xml:space="preserve">, so that profit depends almost entirely on the premium</w:t>
+        <w:t xml:space="preserve"> </w:t>
+      </w:r>
+      <w:r>
+        <w:t xml:space="preserve">of producing a frontier model, so profit depends almost entirely on the premium</w:t>
       </w:r>
       <w:r>
         <w:t xml:space="preserve"> </w:t>
@@ -9609,7 +9614,7 @@
         <w:t xml:space="preserve"> </w:t>
       </w:r>
       <w:r>
-        <w:t xml:space="preserve">is short, on the order of three to four months for open-weight models relative to the closed frontier (Emberson 2025, Epoch AI 2026), which places the developer close to the zero-rent corner of Proposition 3. The same model serves both the complement builder and its competitors on posted terms, which is what makes the adopter’s position commodity-like in the first place. And vendors can and do move into the complement layer, which is the situation Propositions 5 to 8 describe: the productization rate is chosen by vendors, shaped by contract terms, and driven up by competition among them. In this sense the theory is less a new mechanism than a calibration of known mechanisms to a market in which the state variables can be observed. We return to the limits of this claim in Section 7.3.</w:t>
+        <w:t xml:space="preserve">is short, about three to four months for open-weight models relative to the closed frontier (Emberson 2025, Epoch AI 2026), which places the developer close to the zero-rent corner of Proposition 3. The same model serves the complement builder and its competitors on posted terms, which is what makes the adopter’s position commodity-like in the first place. And vendors can and do move into the complement layer, which is the situation Propositions 5 to 8 describe: the productization rate is chosen by vendors, shaped by contract terms, and driven up by competition among them. In this sense the theory is less a new mechanism than a calibration of known mechanisms to a market in which the state variables can be observed. We return to the limits of this claim in Section 7.3.</w:t>
       </w:r>
     </w:p>
     <w:bookmarkEnd w:id="37"/>

</xml_diff>

<commit_message>
Rewrite prose of Sections 5 and 6
Co-Authored-By: Claude Sonnet 5.5 <noreply@anthropic.com>
Claude-Session: https://claude.ai/code/session_01SvJ27oz7kYhWEBfZS3x4ro
</commit_message>
<xml_diff>
--- a/isr/ISR_Who_Profits_from_LLMs.docx
+++ b/isr/ISR_Who_Profits_from_LLMs.docx
@@ -9642,7 +9642,7 @@
         <w:pStyle w:val="FirstParagraph"/>
       </w:pPr>
       <w:r>
-        <w:t xml:space="preserve">We assign each model object an empirical counterpart in public data. The mapping is interpretive. We do not recover structural parameters, and Table 1 figures are not regression inputs.</w:t>
+        <w:t xml:space="preserve">Table 5 assigns each object of the model an empirical counterpart in public data. The mapping is interpretive. We do not recover structural parameters, and the figures in Table 1 are not regression inputs.</w:t>
       </w:r>
     </w:p>
     <w:p>
@@ -10158,7 +10158,7 @@
         <w:pStyle w:val="FirstParagraph"/>
       </w:pPr>
       <w:r>
-        <w:t xml:space="preserve">Predictions 1 and 3 of Section 4.5, together with the transience of complement rents (Corollary 2), yield the five hypotheses below: H1a and H1b from prediction 1, H2 and H3 from prediction 3, and H4 from Corollary 2. We state all five to show how the theory would be tested, but the public data available to us bear on only some of them. H3 and H4 are examined in Section 6, together with a lab-month association that is related to H1a and H1b but does not test them. H1a, H1b, and H2 are stated for future work.</w:t>
+        <w:t xml:space="preserve">Predictions 1 and 3 of Section 4.5, together with the transience of complement rents (Corollary 2), yield five hypotheses. H1a and H1b follow from prediction 1, H2 and H3 from prediction 3, and H4 from Corollary 2. We state all five to show how the theory would be tested, but the public data available to us bear on only some of them. Section 6 examines H3 and H4, along with a lab-month association that is related to H1a and H1b without testing them. We leave H1a, H1b, and H2 to future work.</w:t>
       </w:r>
     </w:p>
     <w:p>
@@ -10170,7 +10170,7 @@
           <w:iCs/>
           <w:i/>
         </w:rPr>
-        <w:t xml:space="preserve">Implications examined in Section 6</w:t>
+        <w:t xml:space="preserve">Hypotheses examined in Section 6</w:t>
       </w:r>
     </w:p>
     <w:p>
@@ -10188,7 +10188,7 @@
         <w:t xml:space="preserve"> </w:t>
       </w:r>
       <w:r>
-        <w:t xml:space="preserve">Firms that ship a dated first-party AI product earn a higher operating margin after the GA year than before, relative to firms with no such product. Treatment is the calendar year of GA (for example, Copilot for Microsoft 365 in 2023, Firefly in 2023, Now Assist in 2023, Cortex in 2023, AIP in 2023, watsonx in 2023, Charlotte AI in 2023, Gemini for Workspace in 2024, Agentforce in 2024, Bits AI in 2024, and analogues), not a time-invariant bundle indicator.</w:t>
+        <w:t xml:space="preserve">Firms that ship a dated first-party AI product earn a higher operating margin after the GA year than before, relative to firms with no such product. Treatment is the calendar year of GA, not a time-invariant indicator. Examples are Copilot for Microsoft 365, Firefly, Now Assist, Cortex, AIP, watsonx, and Charlotte AI (all 2023), and Gemini for Workspace, Agentforce, and Bits AI (all 2024), together with analogues.</w:t>
       </w:r>
     </w:p>
     <w:p>
@@ -10206,7 +10206,7 @@
         <w:t xml:space="preserve"> </w:t>
       </w:r>
       <w:r>
-        <w:t xml:space="preserve">The within-firm margin increment after GA declines as event time lengthens. Disconfirmation is a flat or rising post-GA path, or a difference between the first post-GA year and the last post-GA bin that cannot be distinguished from zero.</w:t>
+        <w:t xml:space="preserve">The within-firm margin increment after GA declines as event time lengthens. The hypothesis is disconfirmed by a flat or rising post-GA path, or by a difference between the first post-GA year and the last post-GA bin that cannot be distinguished from zero.</w:t>
       </w:r>
     </w:p>
     <w:p>
@@ -10218,7 +10218,7 @@
           <w:iCs/>
           <w:i/>
         </w:rPr>
-        <w:t xml:space="preserve">Implications stated for future work</w:t>
+        <w:t xml:space="preserve">Hypotheses left to future work</w:t>
       </w:r>
     </w:p>
     <w:p>
@@ -10236,7 +10236,7 @@
         <w:t xml:space="preserve"> </w:t>
       </w:r>
       <w:r>
-        <w:t xml:space="preserve">Within a given flagship model, realized inference price rises with the model’s own quality lead and falls when a competitor closes it. The dependent variable is the OpenRouter provider-mean blended rate across endpoints for that model, which is a realized multi-provider price and not a single list card. Where endpoints are unpublished, the change-point list price is used as a fallback. Disconfirmation is the absence of a within-model price response to changes in the model’s own lead.</w:t>
+        <w:t xml:space="preserve">Within a given flagship model, realized inference price rises with the model’s own quality lead and falls when a competitor closes it. The dependent variable is the OpenRouter provider-mean blended rate across the model’s endpoints, which is a realized multi-provider price and not a single list card. Where endpoints are unpublished, the change-point list price serves as a fallback. The hypothesis is disconfirmed if the price does not respond to changes in the model’s own lead.</w:t>
       </w:r>
     </w:p>
     <w:p>
@@ -10254,7 +10254,7 @@
         <w:t xml:space="preserve"> </w:t>
       </w:r>
       <w:r>
-        <w:t xml:space="preserve">Across releases, a model’s launch price is increasing in its quality lead at launch. Because proprietary list prices rarely change after launch (Gundlach et al. 2026), the premium in Proposition 3 may attach mainly at release and decay as cheaper successors arrive, not through repricing. H1b captures this channel. Disconfirmation is the absence of any relationship between launch price and lead at launch.</w:t>
+        <w:t xml:space="preserve">Across releases, a model’s launch price is increasing in its quality lead at launch. Proprietary list prices rarely change after launch (Gundlach et al. 2026), so the premium in Proposition 3 may attach mainly at release and fade as cheaper successors arrive, not through repricing. H1b captures this channel. It is disconfirmed if launch price is unrelated to the lead at launch.</w:t>
       </w:r>
     </w:p>
     <w:p>
@@ -10272,7 +10272,7 @@
         <w:t xml:space="preserve"> </w:t>
       </w:r>
       <w:r>
-        <w:t xml:space="preserve">Among adopters, pooled exposure to LLMs, meaning use or mention without a dated first-party GA, does not predict economic profit. Disconfirmation is a time-invariant exposure indicator that predicts operating margin in the pooled cross-section.</w:t>
+        <w:t xml:space="preserve">Among adopters, pooled exposure to LLMs, meaning use or mention without a dated first-party GA, does not predict economic profit. The hypothesis is disconfirmed if a time-invariant exposure indicator predicts operating margin in the pooled cross-section.</w:t>
       </w:r>
     </w:p>
     <w:bookmarkEnd w:id="40"/>
@@ -10291,7 +10291,7 @@
         <w:pStyle w:val="FirstParagraph"/>
       </w:pPr>
       <w:r>
-        <w:t xml:space="preserve">This section relates the constructs of Section 5 to public data. It is not a test of the theory: the samples are small, the proxies are coarse, and several hypotheses are not tested. Its purpose is to show that the constructs can be measured and to indicate whether the data are consistent with the predictions.</w:t>
+        <w:t xml:space="preserve">This section relates the constructs of Section 5 to public data. It does not test the theory: the samples are small, the proxies are coarse, and several hypotheses go untested. Its purpose is to show that the constructs can be measured and to see whether the data are consistent with the predictions.</w:t>
       </w:r>
     </w:p>
     <w:p>
@@ -10299,7 +10299,7 @@
         <w:pStyle w:val="BodyText"/>
       </w:pPr>
       <w:r>
-        <w:t xml:space="preserve">The developer panel combines Arena overall leaderboard snapshots (Chiang et al. 2024) with OpenRouter endpoint prices (OpenRouter 2026). It contains 171 lab-months with a price, of which 102 have at least one live endpoint and 69 use the list-price fallback. The adopter panel is drawn from SEC EDGAR XBRL company facts (SEC 2026) and covers 81 firms and 520 firm-years, with staggered GA-year treatment for 21 firms. GA years are coded by hand from public product dates.</w:t>
+        <w:t xml:space="preserve">The developer panel combines Arena overall leaderboard snapshots (Chiang et al. 2024) with OpenRouter endpoint prices (OpenRouter 2026). It contains 171 lab-months with a price. Of these, 102 have at least one live endpoint, and the remaining 69 rely on the list-price fallback. The adopter panel comes from SEC EDGAR XBRL company facts (SEC 2026) and covers 81 firms and 520 firm-years, with staggered GA-year treatment for 21 firms. We coded the GA years by hand from public product dates.</w:t>
       </w:r>
     </w:p>
     <w:bookmarkStart w:id="42" w:name="developer-side"/>
@@ -10326,7 +10326,7 @@
         <w:t xml:space="preserve"> </w:t>
       </w:r>
       <w:r>
-        <w:t xml:space="preserve">Regressing log realized flagship price on the lab’s lead with lab fixed effects and a trend gives a coefficient of 0.0099 on the 171 lab-months with list fallback and 0.0068 on the 102 months with at least one live endpoint. Conventional clustered p-values are below 0.001 and 0.017, respectively. With few lab clusters these p-values likely overstate precision (Cameron et al. 2008), and we regard the estimates as suggestive. A first-difference cut on an older list-price snapshot series (</w:t>
+        <w:t xml:space="preserve">We regress log realized flagship price on the lab’s lead, with lab fixed effects and a trend. The coefficient is 0.0099 on the 171 lab-months that include the list-price fallback and 0.0068 on the 102 months with at least one live endpoint. Conventional clustered p-values are below 0.001 and 0.017, respectively. With so few lab clusters, these p-values probably overstate precision (Cameron et al. 2008), so we regard the estimates as suggestive. A first-difference cut on an older list-price snapshot series (</w:t>
       </w:r>
       <m:oMath>
         <m:r>
@@ -10370,7 +10370,7 @@
         <w:t xml:space="preserve"> </w:t>
       </w:r>
       <w:r>
-        <w:t xml:space="preserve">They are identified mainly by new releases and so do not isolate the premium on a given model. They should be read as associations between a lab’s lead and its flagship price, and not as tests of H1a or H1b. Those tests require a model-month panel and a release-level panel of launch prices, which we do not estimate here.</w:t>
+        <w:t xml:space="preserve">New releases drive most of the identifying variation, so the estimates do not isolate the premium on a given model. They are associations between a lab’s lead and its flagship price and not tests of H1a or H1b. Those tests need a model-month panel and a release-level panel of launch prices, which we do not estimate here.</w:t>
       </w:r>
     </w:p>
     <w:bookmarkEnd w:id="42"/>
@@ -10398,7 +10398,7 @@
         <w:t xml:space="preserve"> </w:t>
       </w:r>
       <w:r>
-        <w:t xml:space="preserve">A two-way fixed-effects regression of operating margin on a post-GA indicator, with firm and year fixed effects and standard errors clustered by firm, gives a post-GA margin increment of 5.3 percentage points (</w:t>
+        <w:t xml:space="preserve">We regress operating margin on a post-GA indicator with firm and year fixed effects and standard errors clustered by firm. The post-GA margin increment is 5.3 percentage points (</w:t>
       </w:r>
       <m:oMath>
         <m:r>
@@ -10458,7 +10458,7 @@
         <w:t xml:space="preserve"> </w:t>
       </w:r>
       <w:r>
-        <w:t xml:space="preserve">firm-years, 21 treated firms). Because the treated firms are large software incumbents and treatment is staggered, this estimate may be biased and may reflect non-AI margin trends, so we do not read it as a stand-alone test of H3. An increment carried by the operating-expense ratio, or concentrated among the largest firms, would point to cost reduction or market power and not to a complement rent.</w:t>
+        <w:t xml:space="preserve">firm-years, 21 treated firms). The treated firms are large software incumbents and treatment is staggered, so this estimate may be biased and may reflect margin trends unrelated to AI. We therefore do not read it as a stand-alone test of H3. An increment carried by the operating-expense ratio, or concentrated among the largest firms, would point to cost reduction or market power and not to a complement rent.</w:t>
       </w:r>
     </w:p>
     <w:p>
@@ -10505,7 +10505,7 @@
         <w:t xml:space="preserve"> </w:t>
       </w:r>
       <w:r>
-        <w:t xml:space="preserve">omitted, the coefficient at</w:t>
+        <w:t xml:space="preserve">omitted, the coefficient is −1.2 percentage points at</w:t>
       </w:r>
       <w:r>
         <w:t xml:space="preserve"> </w:t>
@@ -10534,7 +10534,7 @@
         <w:t xml:space="preserve"> </w:t>
       </w:r>
       <w:r>
-        <w:t xml:space="preserve">is −1.2 percentage points (</w:t>
+        <w:t xml:space="preserve">(</w:t>
       </w:r>
       <m:oMath>
         <m:r>
@@ -10551,7 +10551,7 @@
         </m:r>
       </m:oMath>
       <w:r>
-        <w:t xml:space="preserve">), at the GA year +4.4 (</w:t>
+        <w:t xml:space="preserve">), +4.4 at the GA year (</w:t>
       </w:r>
       <m:oMath>
         <m:r>
@@ -10568,7 +10568,7 @@
         </m:r>
       </m:oMath>
       <w:r>
-        <w:t xml:space="preserve">), at</w:t>
+        <w:t xml:space="preserve">), +6.1 at</w:t>
       </w:r>
       <w:r>
         <w:t xml:space="preserve"> </w:t>
@@ -10591,7 +10591,7 @@
         <w:t xml:space="preserve"> </w:t>
       </w:r>
       <w:r>
-        <w:t xml:space="preserve">+6.1 (</w:t>
+        <w:t xml:space="preserve">(</w:t>
       </w:r>
       <m:oMath>
         <m:r>
@@ -10608,7 +10608,7 @@
         </m:r>
       </m:oMath>
       <w:r>
-        <w:t xml:space="preserve">), at</w:t>
+        <w:t xml:space="preserve">), +5.3 at</w:t>
       </w:r>
       <w:r>
         <w:t xml:space="preserve"> </w:t>
@@ -10631,7 +10631,7 @@
         <w:t xml:space="preserve"> </w:t>
       </w:r>
       <w:r>
-        <w:t xml:space="preserve">+5.3 (</w:t>
+        <w:t xml:space="preserve">(</w:t>
       </w:r>
       <m:oMath>
         <m:r>
@@ -10648,7 +10648,7 @@
         </m:r>
       </m:oMath>
       <w:r>
-        <w:t xml:space="preserve">), and at</w:t>
+        <w:t xml:space="preserve">), and +2.4 at</w:t>
       </w:r>
       <w:r>
         <w:t xml:space="preserve"> </w:t>
@@ -10671,7 +10671,7 @@
         <w:t xml:space="preserve"> </w:t>
       </w:r>
       <w:r>
-        <w:t xml:space="preserve">+2.4 (</w:t>
+        <w:t xml:space="preserve">(</w:t>
       </w:r>
       <m:oMath>
         <m:r>
@@ -10688,7 +10688,7 @@
         </m:r>
       </m:oMath>
       <w:r>
-        <w:t xml:space="preserve">). The pre-period coefficient is small and not distinguishable from zero. The point estimates peak at</w:t>
+        <w:t xml:space="preserve">). The pre-period coefficient is small and indistinguishable from zero. The point estimates peak at</w:t>
       </w:r>
       <w:r>
         <w:t xml:space="preserve"> </w:t>
@@ -10711,7 +10711,7 @@
         <w:t xml:space="preserve"> </w:t>
       </w:r>
       <w:r>
-        <w:t xml:space="preserve">and fall afterward, which is the direction the theory predicts. However, the</w:t>
+        <w:t xml:space="preserve">and fall afterward, which is the direction the theory predicts. But the</w:t>
       </w:r>
       <w:r>
         <w:t xml:space="preserve"> </w:t>
@@ -10757,7 +10757,7 @@
         <w:t xml:space="preserve"> </w:t>
       </w:r>
       <w:r>
-        <w:t xml:space="preserve">estimates are imprecise and rest on fewer treated firms, and we do not test the equality of the</w:t>
+        <w:t xml:space="preserve">estimates are imprecise and rest on fewer treated firms, and we do not test whether the</w:t>
       </w:r>
       <w:r>
         <w:t xml:space="preserve"> </w:t>
@@ -10780,7 +10780,7 @@
         <w:t xml:space="preserve"> </w:t>
       </w:r>
       <w:r>
-        <w:t xml:space="preserve">coefficient and the last post-GA bin. The data are therefore inconclusive on H4, and we do not claim that the margin increment decays.</w:t>
+        <w:t xml:space="preserve">coefficient equals that of the last post-GA bin. The data are therefore inconclusive on H4, and we do not claim that the margin increment decays.</w:t>
       </w:r>
     </w:p>
     <w:bookmarkEnd w:id="43"/>
@@ -10798,7 +10798,7 @@
         <w:pStyle w:val="FirstParagraph"/>
       </w:pPr>
       <w:r>
-        <w:t xml:space="preserve">Six restrictions bind. First, the realized price is the mean of provider cards on OpenRouter, not a billed invoice and not a GAAP inference margin. Second, endpoint coverage is incomplete (102 of 171 priced months). Third, GA years are coded from public product dates, and they do not measure token spend or retrieval intensity. Fourth, Table 1 figures are illustrative and are not regression inputs. Fifth, two-way fixed-effects estimates under staggered timing can be biased when effects differ across cohorts (Goodman-Bacon 2021), and they rest on parallel trends, which we do not test beyond the pre-GA coefficients in the event study. Sixth, operating margin is an accounting measure and not the economic profit of Proposition 2, and the timing of GA marks the launch of a product, not the start of organizational-capital accumulation.</w:t>
+        <w:t xml:space="preserve">Six restrictions apply. First, the realized price is the mean of provider cards on OpenRouter, not a billed invoice and not a GAAP inference margin. Second, endpoint coverage is incomplete: 102 of the 171 priced months have a live endpoint. Third, GA years come from public product dates and do not measure token spend or retrieval intensity. Fourth, the figures in Table 1 are illustrative and are not regression inputs. Fifth, two-way fixed-effects estimates under staggered timing can be biased when effects differ across cohorts (Goodman-Bacon 2021), and they rest on parallel trends, which we examine only through the pre-GA coefficients of the event study. Sixth, operating margin is an accounting measure and not the economic profit of Proposition 2, and the GA date marks the launch of a product and not the start of organizational-capital accumulation.</w:t>
       </w:r>
     </w:p>
     <w:bookmarkEnd w:id="44"/>

</xml_diff>

<commit_message>
Reduce hypotheses to H1-H2 (adopter side); move developer-side predictions to descriptive evidence
Co-Authored-By: Claude Sonnet 5.5 <noreply@anthropic.com>
Claude-Session: https://claude.ai/code/session_01SvJ27oz7kYhWEBfZS3x4ro
</commit_message>
<xml_diff>
--- a/isr/ISR_Who_Profits_from_LLMs.docx
+++ b/isr/ISR_Who_Profits_from_LLMs.docx
@@ -10158,19 +10158,7 @@
         <w:pStyle w:val="FirstParagraph"/>
       </w:pPr>
       <w:r>
-        <w:t xml:space="preserve">Predictions 1 and 3 of Section 4.5, together with the transience of complement rents (Corollary 2), yield five hypotheses. H1a and H1b follow from prediction 1, H2 and H3 from prediction 3, and H4 from Corollary 2. We state all five to show how the theory would be tested, but the public data available to us bear on only some of them. Section 6 examines H3 and H4, along with a lab-month association that is related to H1a and H1b without testing them. We leave H1a, H1b, and H2 to future work.</w:t>
-      </w:r>
-    </w:p>
-    <w:p>
-      <w:pPr>
-        <w:pStyle w:val="BodyText"/>
-      </w:pPr>
-      <w:r>
-        <w:rPr>
-          <w:iCs/>
-          <w:i/>
-        </w:rPr>
-        <w:t xml:space="preserve">Hypotheses examined in Section 6</w:t>
+        <w:t xml:space="preserve">Prediction 3 of Section 4.5 and the transience of complement rents (Corollary 2) yield two hypotheses about adopters.</w:t>
       </w:r>
     </w:p>
     <w:p>
@@ -10182,79 +10170,13 @@
           <w:bCs/>
           <w:b/>
         </w:rPr>
-        <w:t xml:space="preserve">H3.</w:t>
+        <w:t xml:space="preserve">H1.</w:t>
       </w:r>
       <w:r>
         <w:t xml:space="preserve"> </w:t>
       </w:r>
       <w:r>
         <w:t xml:space="preserve">Firms that ship a dated first-party AI product earn a higher operating margin after the GA year than before, relative to firms with no such product. Treatment is the calendar year of GA, not a time-invariant indicator. Examples are Copilot for Microsoft 365, Firefly, Now Assist, Cortex, AIP, watsonx, and Charlotte AI (all 2023), and Gemini for Workspace, Agentforce, and Bits AI (all 2024), together with analogues.</w:t>
-      </w:r>
-    </w:p>
-    <w:p>
-      <w:pPr>
-        <w:pStyle w:val="BodyText"/>
-      </w:pPr>
-      <w:r>
-        <w:rPr>
-          <w:bCs/>
-          <w:b/>
-        </w:rPr>
-        <w:t xml:space="preserve">H4.</w:t>
-      </w:r>
-      <w:r>
-        <w:t xml:space="preserve"> </w:t>
-      </w:r>
-      <w:r>
-        <w:t xml:space="preserve">The within-firm margin increment after GA declines as event time lengthens. The hypothesis is disconfirmed by a flat or rising post-GA path, or by a difference between the first post-GA year and the last post-GA bin that cannot be distinguished from zero.</w:t>
-      </w:r>
-    </w:p>
-    <w:p>
-      <w:pPr>
-        <w:pStyle w:val="BodyText"/>
-      </w:pPr>
-      <w:r>
-        <w:rPr>
-          <w:iCs/>
-          <w:i/>
-        </w:rPr>
-        <w:t xml:space="preserve">Hypotheses left to future work</w:t>
-      </w:r>
-    </w:p>
-    <w:p>
-      <w:pPr>
-        <w:pStyle w:val="BodyText"/>
-      </w:pPr>
-      <w:r>
-        <w:rPr>
-          <w:bCs/>
-          <w:b/>
-        </w:rPr>
-        <w:t xml:space="preserve">H1a.</w:t>
-      </w:r>
-      <w:r>
-        <w:t xml:space="preserve"> </w:t>
-      </w:r>
-      <w:r>
-        <w:t xml:space="preserve">Within a given flagship model, realized inference price rises with the model’s own quality lead and falls when a competitor closes it. The dependent variable is the OpenRouter provider-mean blended rate across the model’s endpoints, which is a realized multi-provider price and not a single list card. Where endpoints are unpublished, the change-point list price serves as a fallback. The hypothesis is disconfirmed if the price does not respond to changes in the model’s own lead.</w:t>
-      </w:r>
-    </w:p>
-    <w:p>
-      <w:pPr>
-        <w:pStyle w:val="BodyText"/>
-      </w:pPr>
-      <w:r>
-        <w:rPr>
-          <w:bCs/>
-          <w:b/>
-        </w:rPr>
-        <w:t xml:space="preserve">H1b.</w:t>
-      </w:r>
-      <w:r>
-        <w:t xml:space="preserve"> </w:t>
-      </w:r>
-      <w:r>
-        <w:t xml:space="preserve">Across releases, a model’s launch price is increasing in its quality lead at launch. Proprietary list prices rarely change after launch (Gundlach et al. 2026), so the premium in Proposition 3 may attach mainly at release and fade as cheaper successors arrive, not through repricing. H1b captures this channel. It is disconfirmed if launch price is unrelated to the lead at launch.</w:t>
       </w:r>
     </w:p>
     <w:p>
@@ -10272,7 +10194,15 @@
         <w:t xml:space="preserve"> </w:t>
       </w:r>
       <w:r>
-        <w:t xml:space="preserve">Among adopters, pooled exposure to LLMs, meaning use or mention without a dated first-party GA, does not predict economic profit. The hypothesis is disconfirmed if a time-invariant exposure indicator predicts operating margin in the pooled cross-section.</w:t>
+        <w:t xml:space="preserve">The within-firm margin increment after GA declines as event time lengthens. The hypothesis is disconfirmed by a flat or rising post-GA path, or by a difference between the first post-GA year and the last post-GA bin that cannot be distinguished from zero.</w:t>
+      </w:r>
+    </w:p>
+    <w:p>
+      <w:pPr>
+        <w:pStyle w:val="BodyText"/>
+      </w:pPr>
+      <w:r>
+        <w:t xml:space="preserve">We do not state the developer-side predictions (1 and 2) as hypotheses, because testing them properly requires a model-month panel and release-level launch prices that we do not have. Section 6.1 reports a lab-month association related to prediction 1 as descriptive evidence. Predictions 4 to 7 concern industry variation, contract terms, and vendor entry, none of which public data capture.</w:t>
       </w:r>
     </w:p>
     <w:bookmarkEnd w:id="40"/>
@@ -10352,7 +10282,7 @@
         </m:r>
       </m:oMath>
       <w:r>
-        <w:t xml:space="preserve">) gives a coefficient of 0.0049 (p = 0.081). We read it as directional only and do not use it for H1a or H1b.</w:t>
+        <w:t xml:space="preserve">) gives a coefficient of 0.0049 (p = 0.081). We read it as directional only.</w:t>
       </w:r>
     </w:p>
     <w:p>
@@ -10370,7 +10300,7 @@
         <w:t xml:space="preserve"> </w:t>
       </w:r>
       <w:r>
-        <w:t xml:space="preserve">New releases drive most of the identifying variation, so the estimates do not isolate the premium on a given model. They are associations between a lab’s lead and its flagship price and not tests of H1a or H1b. Those tests need a model-month panel and a release-level panel of launch prices, which we do not estimate here.</w:t>
+        <w:t xml:space="preserve">New releases drive most of the identifying variation, so the estimates do not isolate the premium on a given model. They are associations between a lab’s lead and its flagship price and not tests of prediction 1, which concerns the price of a given model. A test needs a model-month panel and a release-level panel of launch prices, which we do not estimate here.</w:t>
       </w:r>
     </w:p>
     <w:bookmarkEnd w:id="42"/>
@@ -10392,7 +10322,7 @@
           <w:iCs/>
           <w:i/>
         </w:rPr>
-        <w:t xml:space="preserve">H3.</w:t>
+        <w:t xml:space="preserve">H1.</w:t>
       </w:r>
       <w:r>
         <w:t xml:space="preserve"> </w:t>
@@ -10458,7 +10388,7 @@
         <w:t xml:space="preserve"> </w:t>
       </w:r>
       <w:r>
-        <w:t xml:space="preserve">firm-years, 21 treated firms). The treated firms are large software incumbents and treatment is staggered, so this estimate may be biased and may reflect margin trends unrelated to AI. We therefore do not read it as a stand-alone test of H3. An increment carried by the operating-expense ratio, or concentrated among the largest firms, would point to cost reduction or market power and not to a complement rent.</w:t>
+        <w:t xml:space="preserve">firm-years, 21 treated firms). The treated firms are large software incumbents and treatment is staggered, so this estimate may be biased and may reflect margin trends unrelated to AI. We therefore do not read it as a stand-alone test of H1. An increment carried by the operating-expense ratio, or concentrated among the largest firms, would point to cost reduction or market power and not to a complement rent.</w:t>
       </w:r>
     </w:p>
     <w:p>
@@ -10470,7 +10400,7 @@
           <w:iCs/>
           <w:i/>
         </w:rPr>
-        <w:t xml:space="preserve">H4.</w:t>
+        <w:t xml:space="preserve">H2.</w:t>
       </w:r>
       <w:r>
         <w:t xml:space="preserve"> </w:t>
@@ -10780,7 +10710,7 @@
         <w:t xml:space="preserve"> </w:t>
       </w:r>
       <w:r>
-        <w:t xml:space="preserve">coefficient equals that of the last post-GA bin. The data are therefore inconclusive on H4, and we do not claim that the margin increment decays.</w:t>
+        <w:t xml:space="preserve">coefficient equals that of the last post-GA bin. The data are therefore inconclusive on H2, and we do not claim that the margin increment decays.</w:t>
       </w:r>
     </w:p>
     <w:bookmarkEnd w:id="43"/>
@@ -10886,7 +10816,7 @@
         <w:pStyle w:val="FirstParagraph"/>
       </w:pPr>
       <w:r>
-        <w:t xml:space="preserve">The theory assumes competitive downstream product markets. Where adopters hold market power, pass-through is incomplete, and commodity LLM use can raise profit. Evidence that IT intensity accompanies rising industry concentration suggests that this case is empirically relevant (Autor et al. 2020, Bessen 2020), and it is also an alternative reading of the margin increment in H3. The theory further assumes that the developer’s lead closes. Economies of scale in compute and data flywheels could prevent closure and shift surplus durably toward the developer, and sustained developer margins without a quality lead would run against Proposition 3 and indicate that this case dominates.</w:t>
+        <w:t xml:space="preserve">The theory assumes competitive downstream product markets. Where adopters hold market power, pass-through is incomplete, and commodity LLM use can raise profit. Evidence that IT intensity accompanies rising industry concentration suggests that this case is empirically relevant (Autor et al. 2020, Bessen 2020), and it is also an alternative reading of the margin increment in H1. The theory further assumes that the developer’s lead closes. Economies of scale in compute and data flywheels could prevent closure and shift surplus durably toward the developer, and sustained developer margins without a quality lead would run against Proposition 3 and indicate that this case dominates.</w:t>
       </w:r>
     </w:p>
     <w:p>
@@ -10894,7 +10824,7 @@
         <w:pStyle w:val="BodyText"/>
       </w:pPr>
       <w:r>
-        <w:t xml:space="preserve">The model abstracts from uncertainty in training outcomes, from purchasable organizational capital, and from strategic interaction in the quality race itself: the lead and the catch-up lag are treated as exogenous. Section 4.4 introduces competition among vendors, but only in the race to productize a given use. Making the lead endogenous to a training race is the most natural extension, and it is where we would expect a more specifically LLM-based theory to develop. The extensions in Sections 4.3 and 4.4 are reduced-form: the productization rate is constant, vendors are symmetric apart from their access to the adopter’s data, and the adopter does not respond by hiding the use or switching vendor. Propositions 6 to 8 are not tested, because contract terms and vendor entry are not publicly observed. The empirical proxies are imperfect, and misclassification biases the estimated difference between commodity and complementary use toward zero. The adopter sample is small and made up of large software incumbents, so the results should not be generalized to adopters in other industries. Finally, the evidence is observational and covers a short period in which the technology and its business models are still changing. H1a, H1b, and H2 are not tested here, and the evidence on H4 is inconclusive. The evidence reported is best viewed as a first look at the constructs, and it is not a confirmation of the theory.</w:t>
+        <w:t xml:space="preserve">The model abstracts from uncertainty in training outcomes, from purchasable organizational capital, and from strategic interaction in the quality race itself: the lead and the catch-up lag are treated as exogenous. Section 4.4 introduces competition among vendors, but only in the race to productize a given use. Making the lead endogenous to a training race is the most natural extension, and it is where we would expect a more specifically LLM-based theory to develop. The extensions in Sections 4.3 and 4.4 are reduced-form: the productization rate is constant, vendors are symmetric apart from their access to the adopter’s data, and the adopter does not respond by hiding the use or switching vendor. Propositions 6 to 8 are not tested, because contract terms and vendor entry are not publicly observed. The empirical proxies are imperfect, and misclassification biases the estimated difference between commodity and complementary use toward zero. The adopter sample is small and made up of large software incumbents, so the results should not be generalized to adopters in other industries. Finally, the evidence is observational and covers a short period in which the technology and its business models are still changing. Prediction 1 is not tested here, and the evidence on H2 is inconclusive. The evidence reported is best viewed as a first look at the constructs, and it is not a confirmation of the theory.</w:t>
       </w:r>
     </w:p>
     <w:bookmarkEnd w:id="48"/>

</xml_diff>

<commit_message>
Move model extensions to Appendix A; add summary Section 4.3; proofs now Appendix B
Co-Authored-By: Claude Sonnet 5.5 <noreply@anthropic.com>
Claude-Session: https://claude.ai/code/session_01SvJ27oz7kYhWEBfZS3x4ro
</commit_message>
<xml_diff>
--- a/isr/ISR_Who_Profits_from_LLMs.docx
+++ b/isr/ISR_Who_Profits_from_LLMs.docx
@@ -204,7 +204,7 @@
         </m:r>
       </m:oMath>
       <w:r>
-        <w:t xml:space="preserve">. The rent runs on two clocks, not one. The result is deliberately simple, and the later propositions build on it in two ways. Section 4.3 lets the vendor choose</w:t>
+        <w:t xml:space="preserve">. The rent runs on two clocks, not one. The result is deliberately simple, and the later propositions build on it in two ways. Appendix A.1 lets the vendor choose</w:t>
       </w:r>
       <w:r>
         <w:t xml:space="preserve"> </w:t>
@@ -218,7 +218,7 @@
         <w:t xml:space="preserve"> </w:t>
       </w:r>
       <w:r>
-        <w:t xml:space="preserve">and shows how contract terms that limit its use of adopters’ data change that choice and, through it, the adopter’s incentive to invest. Section 4.4 adds competition among vendors, which speeds productization and weakens the effect of any single contract. Section 4.5 lets adopters respond by concealing the use, which protects against all vendors at once, and Section 4.6 lets them switch supplier, which loses its effect as vendors multiply. Together with the benchmark results for developers, adopters, and consumers (Propositions 1 to 4), these results give a fuller account of where profit appears.</w:t>
+        <w:t xml:space="preserve">and shows how contract terms that limit its use of adopters’ data change that choice and, through it, the adopter’s incentive to invest. Appendix A.2 adds competition among vendors, which speeds productization and weakens the effect of any single contract. Appendix A.3 lets adopters respond by concealing the use, which protects against all vendors at once, and Appendix A.4 lets them switch supplier, which loses its effect as vendors multiply. Together with the benchmark results for developers, adopters, and consumers (Propositions 1 to 4), these results give a fuller account of where profit appears.</w:t>
       </w:r>
     </w:p>
     <w:p>
@@ -1055,7 +1055,7 @@
     </w:p>
     <w:bookmarkEnd w:id="30"/>
     <w:bookmarkEnd w:id="31"/>
-    <w:bookmarkStart w:id="40" w:name="model-and-propositions"/>
+    <w:bookmarkStart w:id="37" w:name="model-and-propositions"/>
     <w:p>
       <w:pPr>
         <w:pStyle w:val="Heading1"/>
@@ -2025,7 +2025,7 @@
         <w:t xml:space="preserve"> </w:t>
       </w:r>
       <w:r>
-        <w:t xml:space="preserve">is a model developer that sells to adopters. The frontier developer is one such vendor, and Sections 4.3 and 4.4 also consider others. Table 2 lists the notation.</w:t>
+        <w:t xml:space="preserve">is a model developer that sells to adopters. The frontier developer is one such vendor, and Appendix A also considers others. Table 2 lists the notation.</w:t>
       </w:r>
     </w:p>
     <w:p>
@@ -2773,7 +2773,7 @@
               <w:t xml:space="preserve"> </w:t>
             </w:r>
             <w:r>
-              <w:t xml:space="preserve">(Section 4.3);</w:t>
+              <w:t xml:space="preserve">(Appendix A.1);</w:t>
             </w:r>
             <w:r>
               <w:t xml:space="preserve"> </w:t>
@@ -2827,7 +2827,7 @@
               <w:jc w:val="left"/>
             </w:pPr>
             <w:r>
-              <w:t xml:space="preserve">Number of vendors able to productize the same use (Section 4.4)</w:t>
+              <w:t xml:space="preserve">Number of vendors able to productize the same use (Appendix A.2)</w:t>
             </w:r>
           </w:p>
         </w:tc>
@@ -2926,7 +2926,7 @@
               <w:jc w:val="left"/>
             </w:pPr>
             <w:r>
-              <w:t xml:space="preserve">Visibility of the adopter’s use to vendors; cost of concealment as a share of the rent flow per unit of concealment (Section 4.5)</w:t>
+              <w:t xml:space="preserve">Visibility of the adopter’s use to vendors; cost of concealment as a share of the rent flow per unit of concealment (Appendix A.3)</w:t>
             </w:r>
           </w:p>
         </w:tc>
@@ -3037,7 +3037,7 @@
         <w:pStyle w:val="FirstParagraph"/>
       </w:pPr>
       <w:r>
-        <w:t xml:space="preserve">Propositions 1 to 5 are stated here. Propositions 6 to 11, which endogenize the productization rate, add competition among vendors, and let adopters respond by concealing the use or switching supplier, follow in Sections 4.3 to 4.6. All proofs are in Appendix A.</w:t>
+        <w:t xml:space="preserve">Propositions 1 to 5 are stated here. Section 4.3 summarizes Propositions 6 to 11, which endogenize the productization rate, add competition among vendors, and let adopters respond by concealing the use or switching supplier. They are stated in Appendix A. All proofs are in Appendix B.</w:t>
       </w:r>
     </w:p>
     <w:p>
@@ -5064,7 +5064,7 @@
         <w:pStyle w:val="BodyText"/>
       </w:pPr>
       <w:r>
-        <w:t xml:space="preserve">Section 4.3 repeats this result with an exponential imitation lag, which makes it possible to solve for the vendor’s choice of</w:t>
+        <w:t xml:space="preserve">Appendix A.1 repeats this result with an exponential imitation lag, which makes it possible to solve for the vendor’s choice of</w:t>
       </w:r>
       <w:r>
         <w:t xml:space="preserve"> </w:t>
@@ -5079,13 +5079,1671 @@
       </w:r>
     </w:p>
     <w:bookmarkEnd w:id="33"/>
-    <w:bookmarkStart w:id="34" w:name="Xb251667487cf04b98c628b0f1577ec4895e93a1"/>
+    <w:bookmarkStart w:id="34" w:name="X7ad4551bf0dd99263865b2e757ff8ce9ebf459b"/>
     <w:p>
       <w:pPr>
         <w:pStyle w:val="Heading2"/>
       </w:pPr>
       <w:r>
-        <w:t xml:space="preserve">4.3 Endogenous encroachment and contract protection</w:t>
+        <w:t xml:space="preserve">4.3 Extensions: encroachment, competition, and adopter responses</w:t>
+      </w:r>
+    </w:p>
+    <w:p>
+      <w:pPr>
+        <w:pStyle w:val="FirstParagraph"/>
+      </w:pPr>
+      <w:r>
+        <w:t xml:space="preserve">Proposition 5 takes the productization rate as given. Appendix A relaxes this assumption in four steps and states Propositions 6 to 11. We summarize the results here.</w:t>
+      </w:r>
+    </w:p>
+    <w:p>
+      <w:pPr>
+        <w:pStyle w:val="BodyText"/>
+      </w:pPr>
+      <w:r>
+        <w:rPr>
+          <w:iCs/>
+          <w:i/>
+        </w:rPr>
+        <w:t xml:space="preserve">Endogenous encroachment.</w:t>
+      </w:r>
+      <w:r>
+        <w:t xml:space="preserve"> </w:t>
+      </w:r>
+      <w:r>
+        <w:t xml:space="preserve">When a vendor chooses its productization rate at a convex cost, the rate rises with the value of the use and falls with the cost that contract terms impose. It also rises when rivals imitate faster, so that imitation and encroachment are strategic complements (Proposition 6). Contract terms that limit the vendor’s use of the adopter’s data therefore raise the adopter’s expected rent and widen the set of complement investments worth making (Proposition 7).</w:t>
+      </w:r>
+    </w:p>
+    <w:p>
+      <w:pPr>
+        <w:pStyle w:val="BodyText"/>
+      </w:pPr>
+      <w:r>
+        <w:rPr>
+          <w:iCs/>
+          <w:i/>
+        </w:rPr>
+        <w:t xml:space="preserve">Competition among vendors.</w:t>
+      </w:r>
+      <w:r>
+        <w:t xml:space="preserve"> </w:t>
+      </w:r>
+      <w:r>
+        <w:t xml:space="preserve">When several vendors race to productize the same use, the equilibrium is unique. The rate of each vendor and the total rate rise with the number of vendors, and each vendor’s payoff falls (Proposition 8). A protection clause with the adopter’s own supplier lowers the total rate, but it removes only that supplier’s marginal contribution to the race, so its proportional effect vanishes as vendors multiply (Proposition 9).</w:t>
+      </w:r>
+    </w:p>
+    <w:p>
+      <w:pPr>
+        <w:pStyle w:val="BodyText"/>
+      </w:pPr>
+      <w:r>
+        <w:rPr>
+          <w:iCs/>
+          <w:i/>
+        </w:rPr>
+        <w:t xml:space="preserve">Adopter responses.</w:t>
+      </w:r>
+      <w:r>
+        <w:t xml:space="preserve"> </w:t>
+      </w:r>
+      <w:r>
+        <w:t xml:space="preserve">Concealing the use raises the cost of productizing for all vendors at once. Its proportional effect stays bounded away from zero as vendors multiply, and it is worthwhile when its cost is low relative to the threat (Proposition 10). Switching to a neutral supplier shares the weakness of a contract, because its effect also vanishes as vendors multiply (Proposition 11).</w:t>
+      </w:r>
+    </w:p>
+    <w:p>
+      <w:pPr>
+        <w:pStyle w:val="BodyText"/>
+      </w:pPr>
+      <w:r>
+        <w:t xml:space="preserve">Three conclusions follow. First, the profitable window of a complement builder depends on its suppliers as well as on its competitors. Second, protection that rests on a single counterparty weakens as the market for a use becomes crowded. Third, in a crowded market the adopter’s protection comes mainly from concealment and from the difficulty of replicating the use, which is why the organizational capital of Section 3 matters. The extensions are reduced-form, and Appendix A states their limits. Tables A1 to A3 in that appendix give numerical illustrations. The propositions are not tested with the data in Section 6.</w:t>
+      </w:r>
+    </w:p>
+    <w:bookmarkEnd w:id="34"/>
+    <w:bookmarkStart w:id="35" w:name="comparative-statics"/>
+    <w:p>
+      <w:pPr>
+        <w:pStyle w:val="Heading2"/>
+      </w:pPr>
+      <w:r>
+        <w:t xml:space="preserve">4.4 Comparative statics</w:t>
+      </w:r>
+    </w:p>
+    <w:p>
+      <w:pPr>
+        <w:pStyle w:val="FirstParagraph"/>
+      </w:pPr>
+      <w:r>
+        <w:t xml:space="preserve">Nine predictions follow from the propositions. The empirical work in Sections 5 and 6 can address only the first three.</w:t>
+      </w:r>
+    </w:p>
+    <w:p>
+      <w:pPr>
+        <w:numPr>
+          <w:ilvl w:val="0"/>
+          <w:numId w:val="1001"/>
+        </w:numPr>
+        <w:pStyle w:val="Compact"/>
+      </w:pPr>
+      <w:r>
+        <w:t xml:space="preserve">Realized developer prices for inference rise with</w:t>
+      </w:r>
+      <w:r>
+        <w:t xml:space="preserve"> </w:t>
+      </w:r>
+      <m:oMath>
+        <m:r>
+          <m:t>Δ</m:t>
+        </m:r>
+        <m:r>
+          <m:t>θ</m:t>
+        </m:r>
+      </m:oMath>
+      <w:r>
+        <w:t xml:space="preserve"> </w:t>
+      </w:r>
+      <w:r>
+        <w:t xml:space="preserve">and fall toward serving cost as</w:t>
+      </w:r>
+      <w:r>
+        <w:t xml:space="preserve"> </w:t>
+      </w:r>
+      <m:oMath>
+        <m:r>
+          <m:t>Δ</m:t>
+        </m:r>
+        <m:r>
+          <m:t>θ</m:t>
+        </m:r>
+        <m:r>
+          <m:rPr>
+            <m:sty m:val="p"/>
+          </m:rPr>
+          <m:t>→</m:t>
+        </m:r>
+        <m:r>
+          <m:t>0</m:t>
+        </m:r>
+      </m:oMath>
+      <w:r>
+        <w:t xml:space="preserve"> </w:t>
+      </w:r>
+      <w:r>
+        <w:t xml:space="preserve">(Proposition 3).</w:t>
+      </w:r>
+    </w:p>
+    <w:p>
+      <w:pPr>
+        <w:numPr>
+          <w:ilvl w:val="0"/>
+          <w:numId w:val="1001"/>
+        </w:numPr>
+        <w:pStyle w:val="Compact"/>
+      </w:pPr>
+      <w:r>
+        <w:t xml:space="preserve">Developer rent is shortened by open-weight releases, compressed release intervals, and falling serving cost (Proposition 3 and Corollary 3).</w:t>
+      </w:r>
+    </w:p>
+    <w:p>
+      <w:pPr>
+        <w:numPr>
+          <w:ilvl w:val="0"/>
+          <w:numId w:val="1001"/>
+        </w:numPr>
+        <w:pStyle w:val="Compact"/>
+      </w:pPr>
+      <w:r>
+        <w:t xml:space="preserve">Adopter-side profit is predicted by a dated first-party product, which proxies</w:t>
+      </w:r>
+      <w:r>
+        <w:t xml:space="preserve"> </w:t>
+      </w:r>
+      <m:oMath>
+        <m:r>
+          <m:t>O</m:t>
+        </m:r>
+        <m:r>
+          <m:rPr>
+            <m:sty m:val="p"/>
+          </m:rPr>
+          <m:t>&gt;</m:t>
+        </m:r>
+        <m:r>
+          <m:t>0</m:t>
+        </m:r>
+      </m:oMath>
+      <w:r>
+        <w:t xml:space="preserve">, and not by pooled exposure to LLMs (Propositions 1 and 2).</w:t>
+      </w:r>
+    </w:p>
+    <w:p>
+      <w:pPr>
+        <w:numPr>
+          <w:ilvl w:val="0"/>
+          <w:numId w:val="1001"/>
+        </w:numPr>
+        <w:pStyle w:val="Compact"/>
+      </w:pPr>
+      <w:r>
+        <w:t xml:space="preserve">Industries with shorter</w:t>
+      </w:r>
+      <w:r>
+        <w:t xml:space="preserve"> </w:t>
+      </w:r>
+      <m:oMath>
+        <m:sSub>
+          <m:e>
+            <m:r>
+              <m:t>τ</m:t>
+            </m:r>
+          </m:e>
+          <m:sub>
+            <m:r>
+              <m:t>O</m:t>
+            </m:r>
+          </m:sub>
+        </m:sSub>
+      </m:oMath>
+      <w:r>
+        <w:t xml:space="preserve">, or with more vendor encroachment, show weaker associations between AI use and profit (Propositions 2 and 5).</w:t>
+      </w:r>
+    </w:p>
+    <w:p>
+      <w:pPr>
+        <w:numPr>
+          <w:ilvl w:val="0"/>
+          <w:numId w:val="1001"/>
+        </w:numPr>
+        <w:pStyle w:val="Compact"/>
+      </w:pPr>
+      <w:r>
+        <w:t xml:space="preserve">As downstream competition intensifies, the AI–profit association weakens while the AI–productivity association is unaffected (Propositions 1 and 4).</w:t>
+      </w:r>
+    </w:p>
+    <w:p>
+      <w:pPr>
+        <w:numPr>
+          <w:ilvl w:val="0"/>
+          <w:numId w:val="1001"/>
+        </w:numPr>
+        <w:pStyle w:val="Compact"/>
+      </w:pPr>
+      <w:r>
+        <w:t xml:space="preserve">Adopters invest more in co-specialized capital when contract terms limit vendors’ use of their data (Propositions 6 and 7).</w:t>
+      </w:r>
+    </w:p>
+    <w:p>
+      <w:pPr>
+        <w:numPr>
+          <w:ilvl w:val="0"/>
+          <w:numId w:val="1001"/>
+        </w:numPr>
+        <w:pStyle w:val="Compact"/>
+      </w:pPr>
+      <w:r>
+        <w:t xml:space="preserve">The effect of a clause with one supplier weakens as the number of vendors able to build the same use grows (Propositions 8 and 9 and Tables A2 and A3).</w:t>
+      </w:r>
+    </w:p>
+    <w:p>
+      <w:pPr>
+        <w:numPr>
+          <w:ilvl w:val="0"/>
+          <w:numId w:val="1001"/>
+        </w:numPr>
+        <w:pStyle w:val="Compact"/>
+      </w:pPr>
+      <w:r>
+        <w:t xml:space="preserve">Adopters conceal valuable uses when concealment is cheap relative to the threat of encroachment, and concealment retains its effect as vendors multiply (Proposition 10 and Table A3).</w:t>
+      </w:r>
+    </w:p>
+    <w:p>
+      <w:pPr>
+        <w:numPr>
+          <w:ilvl w:val="0"/>
+          <w:numId w:val="1001"/>
+        </w:numPr>
+        <w:pStyle w:val="Compact"/>
+      </w:pPr>
+      <w:r>
+        <w:t xml:space="preserve">Adopters switch to neutral suppliers only when the supplier’s advantage from seeing the use is large relative to the cost of switching, and switching loses its effect as vendors multiply (Proposition 11 and Table A3).</w:t>
+      </w:r>
+    </w:p>
+    <w:p>
+      <w:pPr>
+        <w:pStyle w:val="FirstParagraph"/>
+      </w:pPr>
+      <w:r>
+        <w:t xml:space="preserve">Predictions 4 to 9 are not tested here. Predictions 6 to 9 bear directly on managerial choices about data-use terms and fine-tuning ownership, which we take up in Section 7, but they cannot be examined with public data because contract terms are not observed.</w:t>
+      </w:r>
+    </w:p>
+    <w:bookmarkEnd w:id="35"/>
+    <w:bookmarkStart w:id="36" w:name="what-is-specific-to-llms"/>
+    <w:p>
+      <w:pPr>
+        <w:pStyle w:val="Heading2"/>
+      </w:pPr>
+      <w:r>
+        <w:t xml:space="preserve">4.5 What is specific to LLMs</w:t>
+      </w:r>
+    </w:p>
+    <w:p>
+      <w:pPr>
+        <w:pStyle w:val="FirstParagraph"/>
+      </w:pPr>
+      <w:r>
+        <w:t xml:space="preserve">A fair question is whether anything in the model is specific to LLMs, or whether the same propositions would describe any layered technology market. The structure is general. What is specific is the combination of values and measurement conditions that LLMs bring to it. Marginal inference cost</w:t>
+      </w:r>
+      <w:r>
+        <w:t xml:space="preserve"> </w:t>
+      </w:r>
+      <m:oMath>
+        <m:r>
+          <m:t>m</m:t>
+        </m:r>
+      </m:oMath>
+      <w:r>
+        <w:t xml:space="preserve"> </w:t>
+      </w:r>
+      <w:r>
+        <w:t xml:space="preserve">is low relative to the cost</w:t>
+      </w:r>
+      <w:r>
+        <w:t xml:space="preserve"> </w:t>
+      </w:r>
+      <m:oMath>
+        <m:sSub>
+          <m:e>
+            <m:r>
+              <m:t>F</m:t>
+            </m:r>
+          </m:e>
+          <m:sub>
+            <m:r>
+              <m:t>T</m:t>
+            </m:r>
+          </m:sub>
+        </m:sSub>
+      </m:oMath>
+      <w:r>
+        <w:t xml:space="preserve"> </w:t>
+      </w:r>
+      <w:r>
+        <w:t xml:space="preserve">of producing a frontier model, so profit depends almost entirely on the premium</w:t>
+      </w:r>
+      <w:r>
+        <w:t xml:space="preserve"> </w:t>
+      </w:r>
+      <m:oMath>
+        <m:r>
+          <m:t>κ</m:t>
+        </m:r>
+        <m:r>
+          <m:t>Δ</m:t>
+        </m:r>
+        <m:r>
+          <m:t>θ</m:t>
+        </m:r>
+      </m:oMath>
+      <w:r>
+        <w:t xml:space="preserve">. The catch-up lag</w:t>
+      </w:r>
+      <w:r>
+        <w:t xml:space="preserve"> </w:t>
+      </w:r>
+      <m:oMath>
+        <m:sSub>
+          <m:e>
+            <m:r>
+              <m:t>τ</m:t>
+            </m:r>
+          </m:e>
+          <m:sub>
+            <m:r>
+              <m:rPr>
+                <m:nor/>
+                <m:sty m:val="p"/>
+              </m:rPr>
+              <m:t>dev</m:t>
+            </m:r>
+          </m:sub>
+        </m:sSub>
+      </m:oMath>
+      <w:r>
+        <w:t xml:space="preserve"> </w:t>
+      </w:r>
+      <w:r>
+        <w:t xml:space="preserve">is short, about three to four months for open-weight models relative to the closed frontier (Emberson 2025, Epoch AI 2026), which places the developer close to the zero-rent corner of Proposition 3. The same model serves the complement builder and its competitors on posted terms, which is what makes the adopter’s position commodity-like in the first place. And vendors can and do move into the complement layer, which is the situation Propositions 5 to 11 describe: the productization rate is chosen by vendors, shaped by contract terms, and driven up by competition among them. In this sense the theory is less a new mechanism than a calibration of known mechanisms to a market in which the state variables can be observed. We return to the limits of this claim in Section 7.3.</w:t>
+      </w:r>
+    </w:p>
+    <w:bookmarkEnd w:id="36"/>
+    <w:bookmarkEnd w:id="37"/>
+    <w:bookmarkStart w:id="40" w:name="empirical-counterparts-and-implications"/>
+    <w:p>
+      <w:pPr>
+        <w:pStyle w:val="Heading1"/>
+      </w:pPr>
+      <w:r>
+        <w:t xml:space="preserve">5. Empirical Counterparts and Implications</w:t>
+      </w:r>
+    </w:p>
+    <w:bookmarkStart w:id="38" w:name="mapping-model-objects-to-data"/>
+    <w:p>
+      <w:pPr>
+        <w:pStyle w:val="Heading2"/>
+      </w:pPr>
+      <w:r>
+        <w:t xml:space="preserve">5.1 Mapping model objects to data</w:t>
+      </w:r>
+    </w:p>
+    <w:p>
+      <w:pPr>
+        <w:pStyle w:val="FirstParagraph"/>
+      </w:pPr>
+      <w:r>
+        <w:t xml:space="preserve">Table 3 assigns each object of the model an empirical counterpart in public data. The mapping is interpretive. We do not recover structural parameters, and the figures in Table 1 are not regression inputs.</w:t>
+      </w:r>
+    </w:p>
+    <w:p>
+      <w:pPr>
+        <w:pStyle w:val="BodyText"/>
+      </w:pPr>
+      <w:r>
+        <w:rPr>
+          <w:bCs/>
+          <w:b/>
+        </w:rPr>
+        <w:t xml:space="preserve">Table 3. Model objects and empirical counterparts</w:t>
+      </w:r>
+    </w:p>
+    <w:tbl>
+      <w:tblPr>
+        <w:tblStyle w:val="Table"/>
+        <w:tblW w:type="pct" w:w="5000"/>
+        <w:tblLook w:firstRow="1" w:lastRow="0" w:firstColumn="0" w:lastColumn="0" w:noHBand="0" w:noVBand="0" w:val="0020"/>
+        <w:jc w:val="start"/>
+      </w:tblPr>
+      <w:tblGrid>
+        <w:gridCol w:w="2640"/>
+        <w:gridCol w:w="2640"/>
+        <w:gridCol w:w="2640"/>
+      </w:tblGrid>
+      <w:tr>
+        <w:trPr>
+          <w:tblHeader w:val="true"/>
+        </w:trPr>
+        <w:tc>
+          <w:tcPr/>
+          <w:p>
+            <w:pPr>
+              <w:pStyle w:val="Compact"/>
+              <w:jc w:val="left"/>
+            </w:pPr>
+            <w:r>
+              <w:t xml:space="preserve">Model object</w:t>
+            </w:r>
+          </w:p>
+        </w:tc>
+        <w:tc>
+          <w:tcPr/>
+          <w:p>
+            <w:pPr>
+              <w:pStyle w:val="Compact"/>
+              <w:jc w:val="left"/>
+            </w:pPr>
+            <w:r>
+              <w:t xml:space="preserve">Empirical counterpart</w:t>
+            </w:r>
+          </w:p>
+        </w:tc>
+        <w:tc>
+          <w:tcPr/>
+          <w:p>
+            <w:pPr>
+              <w:pStyle w:val="Compact"/>
+              <w:jc w:val="left"/>
+            </w:pPr>
+            <w:r>
+              <w:t xml:space="preserve">Source</w:t>
+            </w:r>
+          </w:p>
+        </w:tc>
+      </w:tr>
+      <w:tr>
+        <w:tc>
+          <w:tcPr/>
+          <w:p>
+            <w:pPr>
+              <w:pStyle w:val="Compact"/>
+              <w:jc w:val="left"/>
+            </w:pPr>
+            <m:oMath>
+              <m:r>
+                <m:t>Δ</m:t>
+              </m:r>
+              <m:r>
+                <m:t>θ</m:t>
+              </m:r>
+            </m:oMath>
+          </w:p>
+        </w:tc>
+        <w:tc>
+          <w:tcPr/>
+          <w:p>
+            <w:pPr>
+              <w:pStyle w:val="Compact"/>
+              <w:jc w:val="left"/>
+            </w:pPr>
+            <w:r>
+              <w:t xml:space="preserve">Gap between the top-ranked and second-ranked lab on the Arena overall leaderboard</w:t>
+            </w:r>
+          </w:p>
+        </w:tc>
+        <w:tc>
+          <w:tcPr/>
+          <w:p>
+            <w:pPr>
+              <w:pStyle w:val="Compact"/>
+              <w:jc w:val="left"/>
+            </w:pPr>
+            <w:r>
+              <w:t xml:space="preserve">Chiang et al. (2024)</w:t>
+            </w:r>
+          </w:p>
+        </w:tc>
+      </w:tr>
+      <w:tr>
+        <w:tc>
+          <w:tcPr/>
+          <w:p>
+            <w:pPr>
+              <w:pStyle w:val="Compact"/>
+              <w:jc w:val="left"/>
+            </w:pPr>
+            <m:oMath>
+              <m:r>
+                <m:t>κ</m:t>
+              </m:r>
+              <m:r>
+                <m:t>Δ</m:t>
+              </m:r>
+              <m:r>
+                <m:t>θ</m:t>
+              </m:r>
+            </m:oMath>
+          </w:p>
+        </w:tc>
+        <w:tc>
+          <w:tcPr/>
+          <w:p>
+            <w:pPr>
+              <w:pStyle w:val="Compact"/>
+              <w:jc w:val="left"/>
+            </w:pPr>
+            <w:r>
+              <w:t xml:space="preserve">Provider-mean blended flagship inference price, not a GAAP margin</w:t>
+            </w:r>
+          </w:p>
+        </w:tc>
+        <w:tc>
+          <w:tcPr/>
+          <w:p>
+            <w:pPr>
+              <w:pStyle w:val="Compact"/>
+              <w:jc w:val="left"/>
+            </w:pPr>
+            <w:r>
+              <w:t xml:space="preserve">OpenRouter (2026)</w:t>
+            </w:r>
+          </w:p>
+        </w:tc>
+      </w:tr>
+      <w:tr>
+        <w:tc>
+          <w:tcPr/>
+          <w:p>
+            <w:pPr>
+              <w:pStyle w:val="Compact"/>
+              <w:jc w:val="left"/>
+            </w:pPr>
+            <m:oMath>
+              <m:sSub>
+                <m:e>
+                  <m:r>
+                    <m:t>τ</m:t>
+                  </m:r>
+                </m:e>
+                <m:sub>
+                  <m:r>
+                    <m:rPr>
+                      <m:nor/>
+                      <m:sty m:val="p"/>
+                    </m:rPr>
+                    <m:t>dev</m:t>
+                  </m:r>
+                </m:sub>
+              </m:sSub>
+            </m:oMath>
+          </w:p>
+        </w:tc>
+        <w:tc>
+          <w:tcPr/>
+          <w:p>
+            <w:pPr>
+              <w:pStyle w:val="Compact"/>
+              <w:jc w:val="left"/>
+            </w:pPr>
+            <w:r>
+              <w:t xml:space="preserve">Time from a frontier release to the first competitor release matching its score</w:t>
+            </w:r>
+          </w:p>
+        </w:tc>
+        <w:tc>
+          <w:tcPr/>
+          <w:p>
+            <w:pPr>
+              <w:pStyle w:val="Compact"/>
+              <w:jc w:val="left"/>
+            </w:pPr>
+            <w:r>
+              <w:t xml:space="preserve">Arena series</w:t>
+            </w:r>
+          </w:p>
+        </w:tc>
+      </w:tr>
+      <w:tr>
+        <w:tc>
+          <w:tcPr/>
+          <w:p>
+            <w:pPr>
+              <w:pStyle w:val="Compact"/>
+              <w:jc w:val="left"/>
+            </w:pPr>
+            <m:oMath>
+              <m:r>
+                <m:t>φ</m:t>
+              </m:r>
+              <m:d>
+                <m:dPr>
+                  <m:begChr m:val="("/>
+                  <m:endChr m:val=")"/>
+                  <m:sepChr m:val=""/>
+                  <m:grow/>
+                </m:dPr>
+                <m:e>
+                  <m:r>
+                    <m:t>L</m:t>
+                  </m:r>
+                  <m:r>
+                    <m:rPr>
+                      <m:sty m:val="p"/>
+                    </m:rPr>
+                    <m:t>,</m:t>
+                  </m:r>
+                  <m:r>
+                    <m:t>O</m:t>
+                  </m:r>
+                </m:e>
+              </m:d>
+            </m:oMath>
+            <w:r>
+              <w:t xml:space="preserve"> </w:t>
+            </w:r>
+            <w:r>
+              <w:t xml:space="preserve">with</w:t>
+            </w:r>
+            <w:r>
+              <w:t xml:space="preserve"> </w:t>
+            </w:r>
+            <m:oMath>
+              <m:sSub>
+                <m:e>
+                  <m:r>
+                    <m:t>O</m:t>
+                  </m:r>
+                </m:e>
+                <m:sub>
+                  <m:r>
+                    <m:t>j</m:t>
+                  </m:r>
+                </m:sub>
+              </m:sSub>
+              <m:r>
+                <m:rPr>
+                  <m:sty m:val="p"/>
+                </m:rPr>
+                <m:t>&gt;</m:t>
+              </m:r>
+              <m:r>
+                <m:t>0</m:t>
+              </m:r>
+            </m:oMath>
+          </w:p>
+        </w:tc>
+        <w:tc>
+          <w:tcPr/>
+          <w:p>
+            <w:pPr>
+              <w:pStyle w:val="Compact"/>
+              <w:jc w:val="left"/>
+            </w:pPr>
+            <w:r>
+              <w:t xml:space="preserve">Dated general-availability (GA) year of a first-party AI product</w:t>
+            </w:r>
+          </w:p>
+        </w:tc>
+        <w:tc>
+          <w:tcPr/>
+          <w:p>
+            <w:pPr>
+              <w:pStyle w:val="Compact"/>
+              <w:jc w:val="left"/>
+            </w:pPr>
+            <w:r>
+              <w:t xml:space="preserve">Hand-coded from public product dates</w:t>
+            </w:r>
+          </w:p>
+        </w:tc>
+      </w:tr>
+      <w:tr>
+        <w:tc>
+          <w:tcPr/>
+          <w:p>
+            <w:pPr>
+              <w:pStyle w:val="Compact"/>
+              <w:jc w:val="left"/>
+            </w:pPr>
+            <m:oMath>
+              <m:sSub>
+                <m:e>
+                  <m:r>
+                    <m:t>O</m:t>
+                  </m:r>
+                </m:e>
+                <m:sub>
+                  <m:r>
+                    <m:t>j</m:t>
+                  </m:r>
+                </m:sub>
+              </m:sSub>
+              <m:r>
+                <m:rPr>
+                  <m:sty m:val="p"/>
+                </m:rPr>
+                <m:t>=</m:t>
+              </m:r>
+              <m:r>
+                <m:t>0</m:t>
+              </m:r>
+            </m:oMath>
+          </w:p>
+        </w:tc>
+        <w:tc>
+          <w:tcPr/>
+          <w:p>
+            <w:pPr>
+              <w:pStyle w:val="Compact"/>
+              <w:jc w:val="left"/>
+            </w:pPr>
+            <w:r>
+              <w:t xml:space="preserve">Pooled API use or mention without a coded GA year</w:t>
+            </w:r>
+          </w:p>
+        </w:tc>
+        <w:tc>
+          <w:tcPr/>
+          <w:p>
+            <w:pPr>
+              <w:pStyle w:val="Compact"/>
+              <w:jc w:val="left"/>
+            </w:pPr>
+            <w:r>
+              <w:t xml:space="preserve">SEC filings</w:t>
+            </w:r>
+          </w:p>
+        </w:tc>
+      </w:tr>
+      <w:tr>
+        <w:tc>
+          <w:tcPr/>
+          <w:p>
+            <w:pPr>
+              <w:pStyle w:val="Compact"/>
+              <w:jc w:val="left"/>
+            </w:pPr>
+            <w:r>
+              <w:t xml:space="preserve">Adopter profit</w:t>
+            </w:r>
+          </w:p>
+        </w:tc>
+        <w:tc>
+          <w:tcPr/>
+          <w:p>
+            <w:pPr>
+              <w:pStyle w:val="Compact"/>
+              <w:jc w:val="left"/>
+            </w:pPr>
+            <w:r>
+              <w:t xml:space="preserve">Operating margin</w:t>
+            </w:r>
+          </w:p>
+        </w:tc>
+        <w:tc>
+          <w:tcPr/>
+          <w:p>
+            <w:pPr>
+              <w:pStyle w:val="Compact"/>
+              <w:jc w:val="left"/>
+            </w:pPr>
+            <w:r>
+              <w:t xml:space="preserve">SEC EDGAR XBRL company facts</w:t>
+            </w:r>
+          </w:p>
+        </w:tc>
+      </w:tr>
+      <w:tr>
+        <w:tc>
+          <w:tcPr/>
+          <w:p>
+            <w:pPr>
+              <w:pStyle w:val="Compact"/>
+              <w:jc w:val="left"/>
+            </w:pPr>
+            <w:r>
+              <w:t xml:space="preserve">Compute payments</w:t>
+            </w:r>
+          </w:p>
+        </w:tc>
+        <w:tc>
+          <w:tcPr/>
+          <w:p>
+            <w:pPr>
+              <w:pStyle w:val="Compact"/>
+              <w:jc w:val="left"/>
+            </w:pPr>
+            <w:r>
+              <w:t xml:space="preserve">Factor payment outside the three-way split</w:t>
+            </w:r>
+          </w:p>
+        </w:tc>
+        <w:tc>
+          <w:tcPr/>
+          <w:p>
+            <w:pPr>
+              <w:pStyle w:val="Compact"/>
+              <w:jc w:val="left"/>
+            </w:pPr>
+            <w:r>
+              <w:t xml:space="preserve">Table 1 (illustrative)</w:t>
+            </w:r>
+          </w:p>
+        </w:tc>
+      </w:tr>
+      <w:tr>
+        <w:tc>
+          <w:tcPr/>
+          <w:p>
+            <w:pPr>
+              <w:pStyle w:val="Compact"/>
+              <w:jc w:val="left"/>
+            </w:pPr>
+            <m:oMath>
+              <m:r>
+                <m:t>η</m:t>
+              </m:r>
+            </m:oMath>
+            <w:r>
+              <w:t xml:space="preserve">,</w:t>
+            </w:r>
+            <w:r>
+              <w:t xml:space="preserve"> </w:t>
+            </w:r>
+            <m:oMath>
+              <m:r>
+                <m:t>s</m:t>
+              </m:r>
+            </m:oMath>
+            <w:r>
+              <w:t xml:space="preserve">,</w:t>
+            </w:r>
+            <w:r>
+              <w:t xml:space="preserve"> </w:t>
+            </w:r>
+            <m:oMath>
+              <m:r>
+                <m:t>N</m:t>
+              </m:r>
+            </m:oMath>
+          </w:p>
+        </w:tc>
+        <w:tc>
+          <w:tcPr/>
+          <w:p>
+            <w:pPr>
+              <w:pStyle w:val="Compact"/>
+              <w:jc w:val="left"/>
+            </w:pPr>
+            <w:r>
+              <w:t xml:space="preserve">No public counterpart (contract terms and vendor entry are not observed)</w:t>
+            </w:r>
+          </w:p>
+        </w:tc>
+        <w:tc>
+          <w:tcPr/>
+          <w:p>
+            <w:pPr>
+              <w:pStyle w:val="Compact"/>
+              <w:jc w:val="left"/>
+            </w:pPr>
+            <w:r>
+              <w:t xml:space="preserve">n/a</w:t>
+            </w:r>
+          </w:p>
+        </w:tc>
+      </w:tr>
+    </w:tbl>
+    <w:bookmarkEnd w:id="38"/>
+    <w:bookmarkStart w:id="39" w:name="empirical-implications"/>
+    <w:p>
+      <w:pPr>
+        <w:pStyle w:val="Heading2"/>
+      </w:pPr>
+      <w:r>
+        <w:t xml:space="preserve">5.2 Empirical implications</w:t>
+      </w:r>
+    </w:p>
+    <w:p>
+      <w:pPr>
+        <w:pStyle w:val="FirstParagraph"/>
+      </w:pPr>
+      <w:r>
+        <w:t xml:space="preserve">Prediction 3 of Section 4.4 and the transience of complement rents (Corollary 2) yield two hypotheses about adopters.</w:t>
+      </w:r>
+    </w:p>
+    <w:p>
+      <w:pPr>
+        <w:pStyle w:val="BodyText"/>
+      </w:pPr>
+      <w:r>
+        <w:rPr>
+          <w:bCs/>
+          <w:b/>
+        </w:rPr>
+        <w:t xml:space="preserve">H1.</w:t>
+      </w:r>
+      <w:r>
+        <w:t xml:space="preserve"> </w:t>
+      </w:r>
+      <w:r>
+        <w:t xml:space="preserve">Firms that ship a dated first-party AI product earn a higher operating margin after the GA year than before, relative to firms with no such product. Treatment is the calendar year of GA, not a time-invariant indicator. Examples are Copilot for Microsoft 365, Firefly, Now Assist, Cortex, AIP, watsonx, and Charlotte AI (all 2023), and Gemini for Workspace, Agentforce, and Bits AI (all 2024), together with analogues.</w:t>
+      </w:r>
+    </w:p>
+    <w:p>
+      <w:pPr>
+        <w:pStyle w:val="BodyText"/>
+      </w:pPr>
+      <w:r>
+        <w:rPr>
+          <w:bCs/>
+          <w:b/>
+        </w:rPr>
+        <w:t xml:space="preserve">H2.</w:t>
+      </w:r>
+      <w:r>
+        <w:t xml:space="preserve"> </w:t>
+      </w:r>
+      <w:r>
+        <w:t xml:space="preserve">The within-firm margin increment after GA declines as event time lengthens. The hypothesis is disconfirmed by a flat or rising post-GA path, or by a difference between the first post-GA year and the last post-GA bin that cannot be distinguished from zero.</w:t>
+      </w:r>
+    </w:p>
+    <w:p>
+      <w:pPr>
+        <w:pStyle w:val="BodyText"/>
+      </w:pPr>
+      <w:r>
+        <w:t xml:space="preserve">We do not state the developer-side predictions (1 and 2) as hypotheses, because testing them properly requires a model-month panel and release-level launch prices that we do not have. Section 6.1 reports a lab-month association related to prediction 1 as descriptive evidence. Predictions 4 to 9 concern industry variation, contract terms, vendor entry, concealment, and switching, none of which public data capture.</w:t>
+      </w:r>
+    </w:p>
+    <w:bookmarkEnd w:id="39"/>
+    <w:bookmarkEnd w:id="40"/>
+    <w:bookmarkStart w:id="44" w:name="illustrative-evidence"/>
+    <w:p>
+      <w:pPr>
+        <w:pStyle w:val="Heading1"/>
+      </w:pPr>
+      <w:r>
+        <w:t xml:space="preserve">6. Illustrative Evidence</w:t>
+      </w:r>
+    </w:p>
+    <w:p>
+      <w:pPr>
+        <w:pStyle w:val="FirstParagraph"/>
+      </w:pPr>
+      <w:r>
+        <w:t xml:space="preserve">This section relates the constructs of Section 5 to public data. It does not test the theory: the samples are small, the proxies are coarse, and several hypotheses go untested. Its purpose is to show that the constructs can be measured and to see whether the data are consistent with the predictions.</w:t>
+      </w:r>
+    </w:p>
+    <w:p>
+      <w:pPr>
+        <w:pStyle w:val="BodyText"/>
+      </w:pPr>
+      <w:r>
+        <w:t xml:space="preserve">The developer panel combines Arena overall leaderboard snapshots (Chiang et al. 2024) with OpenRouter endpoint prices (OpenRouter 2026). It contains 171 lab-months with a price. Of these, 102 have at least one live endpoint, and the remaining 69 rely on the list-price fallback. The adopter panel comes from SEC EDGAR XBRL company facts (SEC 2026) and covers 81 firms and 520 firm-years, with staggered GA-year treatment for 21 firms. We coded the GA years by hand from public product dates.</w:t>
+      </w:r>
+    </w:p>
+    <w:bookmarkStart w:id="41" w:name="developer-side"/>
+    <w:p>
+      <w:pPr>
+        <w:pStyle w:val="Heading2"/>
+      </w:pPr>
+      <w:r>
+        <w:t xml:space="preserve">6.1 Developer side</w:t>
+      </w:r>
+    </w:p>
+    <w:p>
+      <w:pPr>
+        <w:pStyle w:val="FirstParagraph"/>
+      </w:pPr>
+      <w:r>
+        <w:rPr>
+          <w:iCs/>
+          <w:i/>
+        </w:rPr>
+        <w:t xml:space="preserve">Lab-month association.</w:t>
+      </w:r>
+      <w:r>
+        <w:t xml:space="preserve"> </w:t>
+      </w:r>
+      <w:r>
+        <w:t xml:space="preserve">We regress log realized flagship price on the lab’s lead, with lab fixed effects and a trend. The coefficient is 0.0099 on the 171 lab-months that include the list-price fallback and 0.0068 on the 102 months with at least one live endpoint. Conventional clustered p-values are below 0.001 and 0.017, respectively. With so few lab clusters, these p-values probably overstate precision (Cameron et al. 2008), so we regard the estimates as suggestive. A first-difference cut on an older list-price snapshot series (</w:t>
+      </w:r>
+      <m:oMath>
+        <m:r>
+          <m:t>N</m:t>
+        </m:r>
+        <m:r>
+          <m:rPr>
+            <m:sty m:val="p"/>
+          </m:rPr>
+          <m:t>=</m:t>
+        </m:r>
+        <m:r>
+          <m:t>1</m:t>
+        </m:r>
+        <m:r>
+          <m:rPr>
+            <m:sty m:val="p"/>
+          </m:rPr>
+          <m:t>,</m:t>
+        </m:r>
+        <m:r>
+          <m:t>190</m:t>
+        </m:r>
+      </m:oMath>
+      <w:r>
+        <w:t xml:space="preserve">) gives a coefficient of 0.0049 (p = 0.081). We read it as directional only.</w:t>
+      </w:r>
+    </w:p>
+    <w:p>
+      <w:pPr>
+        <w:pStyle w:val="BodyText"/>
+      </w:pPr>
+      <w:r>
+        <w:rPr>
+          <w:iCs/>
+          <w:i/>
+        </w:rPr>
+        <w:t xml:space="preserve">What the lab-month estimates do not show.</w:t>
+      </w:r>
+      <w:r>
+        <w:t xml:space="preserve"> </w:t>
+      </w:r>
+      <w:r>
+        <w:t xml:space="preserve">New releases drive most of the identifying variation, so the estimates do not isolate the premium on a given model. They are associations between a lab’s lead and its flagship price and not tests of prediction 1, which concerns the price of a given model. A test needs a model-month panel and a release-level panel of launch prices, which we do not estimate here.</w:t>
+      </w:r>
+    </w:p>
+    <w:bookmarkEnd w:id="41"/>
+    <w:bookmarkStart w:id="42" w:name="adopter-side"/>
+    <w:p>
+      <w:pPr>
+        <w:pStyle w:val="Heading2"/>
+      </w:pPr>
+      <w:r>
+        <w:t xml:space="preserve">6.2 Adopter side</w:t>
+      </w:r>
+    </w:p>
+    <w:p>
+      <w:pPr>
+        <w:pStyle w:val="FirstParagraph"/>
+      </w:pPr>
+      <w:r>
+        <w:rPr>
+          <w:iCs/>
+          <w:i/>
+        </w:rPr>
+        <w:t xml:space="preserve">H1.</w:t>
+      </w:r>
+      <w:r>
+        <w:t xml:space="preserve"> </w:t>
+      </w:r>
+      <w:r>
+        <w:t xml:space="preserve">We regress operating margin on a post-GA indicator with firm and year fixed effects and standard errors clustered by firm. The post-GA margin increment is 5.3 percentage points (</w:t>
+      </w:r>
+      <m:oMath>
+        <m:r>
+          <m:t>β</m:t>
+        </m:r>
+        <m:r>
+          <m:rPr>
+            <m:sty m:val="p"/>
+          </m:rPr>
+          <m:t>=</m:t>
+        </m:r>
+        <m:r>
+          <m:t>0.053</m:t>
+        </m:r>
+      </m:oMath>
+      <w:r>
+        <w:t xml:space="preserve">,</w:t>
+      </w:r>
+      <w:r>
+        <w:t xml:space="preserve"> </w:t>
+      </w:r>
+      <m:oMath>
+        <m:r>
+          <m:t>p</m:t>
+        </m:r>
+        <m:r>
+          <m:rPr>
+            <m:sty m:val="p"/>
+          </m:rPr>
+          <m:t>=</m:t>
+        </m:r>
+        <m:r>
+          <m:t>0.007</m:t>
+        </m:r>
+      </m:oMath>
+      <w:r>
+        <w:t xml:space="preserve">;</w:t>
+      </w:r>
+      <w:r>
+        <w:t xml:space="preserve"> </w:t>
+      </w:r>
+      <m:oMath>
+        <m:r>
+          <m:t>N</m:t>
+        </m:r>
+        <m:r>
+          <m:rPr>
+            <m:sty m:val="p"/>
+          </m:rPr>
+          <m:t>=</m:t>
+        </m:r>
+        <m:r>
+          <m:t>520</m:t>
+        </m:r>
+      </m:oMath>
+      <w:r>
+        <w:t xml:space="preserve"> </w:t>
+      </w:r>
+      <w:r>
+        <w:t xml:space="preserve">firm-years, 21 treated firms). The treated firms are large software incumbents and treatment is staggered, so this estimate may be biased and may reflect margin trends unrelated to AI. We therefore do not read it as a stand-alone test of H1. An increment carried by the operating-expense ratio, or concentrated among the largest firms, would point to cost reduction or market power and not to a complement rent.</w:t>
+      </w:r>
+    </w:p>
+    <w:p>
+      <w:pPr>
+        <w:pStyle w:val="BodyText"/>
+      </w:pPr>
+      <w:r>
+        <w:rPr>
+          <w:iCs/>
+          <w:i/>
+        </w:rPr>
+        <w:t xml:space="preserve">H2.</w:t>
+      </w:r>
+      <w:r>
+        <w:t xml:space="preserve"> </w:t>
+      </w:r>
+      <w:r>
+        <w:t xml:space="preserve">In the baseline event study, with</w:t>
+      </w:r>
+      <w:r>
+        <w:t xml:space="preserve"> </w:t>
+      </w:r>
+      <m:oMath>
+        <m:r>
+          <m:t>t</m:t>
+        </m:r>
+        <m:r>
+          <m:rPr>
+            <m:sty m:val="p"/>
+          </m:rPr>
+          <m:t>=</m:t>
+        </m:r>
+        <m:r>
+          <m:rPr>
+            <m:sty m:val="p"/>
+          </m:rPr>
+          <m:t>−</m:t>
+        </m:r>
+        <m:r>
+          <m:t>1</m:t>
+        </m:r>
+      </m:oMath>
+      <w:r>
+        <w:t xml:space="preserve"> </w:t>
+      </w:r>
+      <w:r>
+        <w:t xml:space="preserve">omitted, the coefficient is −1.2 percentage points at</w:t>
+      </w:r>
+      <w:r>
+        <w:t xml:space="preserve"> </w:t>
+      </w:r>
+      <m:oMath>
+        <m:r>
+          <m:t>t</m:t>
+        </m:r>
+        <m:r>
+          <m:rPr>
+            <m:sty m:val="p"/>
+          </m:rPr>
+          <m:t>=</m:t>
+        </m:r>
+        <m:r>
+          <m:rPr>
+            <m:sty m:val="p"/>
+          </m:rPr>
+          <m:t>−</m:t>
+        </m:r>
+        <m:r>
+          <m:t>2</m:t>
+        </m:r>
+      </m:oMath>
+      <w:r>
+        <w:t xml:space="preserve"> </w:t>
+      </w:r>
+      <w:r>
+        <w:t xml:space="preserve">(</w:t>
+      </w:r>
+      <m:oMath>
+        <m:r>
+          <m:t>p</m:t>
+        </m:r>
+        <m:r>
+          <m:rPr>
+            <m:sty m:val="p"/>
+          </m:rPr>
+          <m:t>=</m:t>
+        </m:r>
+        <m:r>
+          <m:t>0.64</m:t>
+        </m:r>
+      </m:oMath>
+      <w:r>
+        <w:t xml:space="preserve">), +4.4 at the GA year (</w:t>
+      </w:r>
+      <m:oMath>
+        <m:r>
+          <m:t>p</m:t>
+        </m:r>
+        <m:r>
+          <m:rPr>
+            <m:sty m:val="p"/>
+          </m:rPr>
+          <m:t>=</m:t>
+        </m:r>
+        <m:r>
+          <m:t>0.037</m:t>
+        </m:r>
+      </m:oMath>
+      <w:r>
+        <w:t xml:space="preserve">), +6.1 at</w:t>
+      </w:r>
+      <w:r>
+        <w:t xml:space="preserve"> </w:t>
+      </w:r>
+      <m:oMath>
+        <m:r>
+          <m:t>t</m:t>
+        </m:r>
+        <m:r>
+          <m:rPr>
+            <m:sty m:val="p"/>
+          </m:rPr>
+          <m:t>+</m:t>
+        </m:r>
+        <m:r>
+          <m:t>1</m:t>
+        </m:r>
+      </m:oMath>
+      <w:r>
+        <w:t xml:space="preserve"> </w:t>
+      </w:r>
+      <w:r>
+        <w:t xml:space="preserve">(</w:t>
+      </w:r>
+      <m:oMath>
+        <m:r>
+          <m:t>p</m:t>
+        </m:r>
+        <m:r>
+          <m:rPr>
+            <m:sty m:val="p"/>
+          </m:rPr>
+          <m:t>=</m:t>
+        </m:r>
+        <m:r>
+          <m:t>0.021</m:t>
+        </m:r>
+      </m:oMath>
+      <w:r>
+        <w:t xml:space="preserve">), +5.3 at</w:t>
+      </w:r>
+      <w:r>
+        <w:t xml:space="preserve"> </w:t>
+      </w:r>
+      <m:oMath>
+        <m:r>
+          <m:t>t</m:t>
+        </m:r>
+        <m:r>
+          <m:rPr>
+            <m:sty m:val="p"/>
+          </m:rPr>
+          <m:t>+</m:t>
+        </m:r>
+        <m:r>
+          <m:t>2</m:t>
+        </m:r>
+      </m:oMath>
+      <w:r>
+        <w:t xml:space="preserve"> </w:t>
+      </w:r>
+      <w:r>
+        <w:t xml:space="preserve">(</w:t>
+      </w:r>
+      <m:oMath>
+        <m:r>
+          <m:t>p</m:t>
+        </m:r>
+        <m:r>
+          <m:rPr>
+            <m:sty m:val="p"/>
+          </m:rPr>
+          <m:t>=</m:t>
+        </m:r>
+        <m:r>
+          <m:t>0.16</m:t>
+        </m:r>
+      </m:oMath>
+      <w:r>
+        <w:t xml:space="preserve">), and +2.4 at</w:t>
+      </w:r>
+      <w:r>
+        <w:t xml:space="preserve"> </w:t>
+      </w:r>
+      <m:oMath>
+        <m:r>
+          <m:t>t</m:t>
+        </m:r>
+        <m:r>
+          <m:rPr>
+            <m:sty m:val="p"/>
+          </m:rPr>
+          <m:t>+</m:t>
+        </m:r>
+        <m:r>
+          <m:t>3</m:t>
+        </m:r>
+      </m:oMath>
+      <w:r>
+        <w:t xml:space="preserve"> </w:t>
+      </w:r>
+      <w:r>
+        <w:t xml:space="preserve">(</w:t>
+      </w:r>
+      <m:oMath>
+        <m:r>
+          <m:t>p</m:t>
+        </m:r>
+        <m:r>
+          <m:rPr>
+            <m:sty m:val="p"/>
+          </m:rPr>
+          <m:t>=</m:t>
+        </m:r>
+        <m:r>
+          <m:t>0.59</m:t>
+        </m:r>
+      </m:oMath>
+      <w:r>
+        <w:t xml:space="preserve">). The pre-period coefficient is small and indistinguishable from zero. The point estimates peak at</w:t>
+      </w:r>
+      <w:r>
+        <w:t xml:space="preserve"> </w:t>
+      </w:r>
+      <m:oMath>
+        <m:r>
+          <m:t>t</m:t>
+        </m:r>
+        <m:r>
+          <m:rPr>
+            <m:sty m:val="p"/>
+          </m:rPr>
+          <m:t>+</m:t>
+        </m:r>
+        <m:r>
+          <m:t>1</m:t>
+        </m:r>
+      </m:oMath>
+      <w:r>
+        <w:t xml:space="preserve"> </w:t>
+      </w:r>
+      <w:r>
+        <w:t xml:space="preserve">and fall afterward, which is the direction the theory predicts. But the</w:t>
+      </w:r>
+      <w:r>
+        <w:t xml:space="preserve"> </w:t>
+      </w:r>
+      <m:oMath>
+        <m:r>
+          <m:t>t</m:t>
+        </m:r>
+        <m:r>
+          <m:rPr>
+            <m:sty m:val="p"/>
+          </m:rPr>
+          <m:t>+</m:t>
+        </m:r>
+        <m:r>
+          <m:t>2</m:t>
+        </m:r>
+      </m:oMath>
+      <w:r>
+        <w:t xml:space="preserve"> </w:t>
+      </w:r>
+      <w:r>
+        <w:t xml:space="preserve">and</w:t>
+      </w:r>
+      <w:r>
+        <w:t xml:space="preserve"> </w:t>
+      </w:r>
+      <m:oMath>
+        <m:r>
+          <m:t>t</m:t>
+        </m:r>
+        <m:r>
+          <m:rPr>
+            <m:sty m:val="p"/>
+          </m:rPr>
+          <m:t>+</m:t>
+        </m:r>
+        <m:r>
+          <m:t>3</m:t>
+        </m:r>
+      </m:oMath>
+      <w:r>
+        <w:t xml:space="preserve"> </w:t>
+      </w:r>
+      <w:r>
+        <w:t xml:space="preserve">estimates are imprecise and rest on fewer treated firms, and we do not test whether the</w:t>
+      </w:r>
+      <w:r>
+        <w:t xml:space="preserve"> </w:t>
+      </w:r>
+      <m:oMath>
+        <m:r>
+          <m:t>t</m:t>
+        </m:r>
+        <m:r>
+          <m:rPr>
+            <m:sty m:val="p"/>
+          </m:rPr>
+          <m:t>+</m:t>
+        </m:r>
+        <m:r>
+          <m:t>1</m:t>
+        </m:r>
+      </m:oMath>
+      <w:r>
+        <w:t xml:space="preserve"> </w:t>
+      </w:r>
+      <w:r>
+        <w:t xml:space="preserve">coefficient equals that of the last post-GA bin. The data are therefore inconclusive on H2, and we do not claim that the margin increment decays.</w:t>
+      </w:r>
+    </w:p>
+    <w:bookmarkEnd w:id="42"/>
+    <w:bookmarkStart w:id="43" w:name="what-is-and-is-not-identified"/>
+    <w:p>
+      <w:pPr>
+        <w:pStyle w:val="Heading2"/>
+      </w:pPr>
+      <w:r>
+        <w:t xml:space="preserve">6.3 What is and is not identified</w:t>
+      </w:r>
+    </w:p>
+    <w:p>
+      <w:pPr>
+        <w:pStyle w:val="FirstParagraph"/>
+      </w:pPr>
+      <w:r>
+        <w:t xml:space="preserve">Six restrictions apply. First, the realized price is the mean of provider cards on OpenRouter, not a billed invoice and not a GAAP inference margin. Second, endpoint coverage is incomplete: 102 of the 171 priced months have a live endpoint. Third, GA years come from public product dates and do not measure token spend or retrieval intensity. Fourth, the figures in Table 1 are illustrative and are not regression inputs. Fifth, two-way fixed-effects estimates under staggered timing can be biased when effects differ across cohorts (Goodman-Bacon 2021), and they rest on parallel trends, which we examine only through the pre-GA coefficients of the event study. Sixth, operating margin is an accounting measure and not the economic profit of Proposition 2, and the GA date marks the launch of a product and not the start of organizational-capital accumulation.</w:t>
+      </w:r>
+    </w:p>
+    <w:bookmarkEnd w:id="43"/>
+    <w:bookmarkEnd w:id="44"/>
+    <w:bookmarkStart w:id="48" w:name="discussion"/>
+    <w:p>
+      <w:pPr>
+        <w:pStyle w:val="Heading1"/>
+      </w:pPr>
+      <w:r>
+        <w:t xml:space="preserve">7. Discussion</w:t>
+      </w:r>
+    </w:p>
+    <w:bookmarkStart w:id="45" w:name="contributions"/>
+    <w:p>
+      <w:pPr>
+        <w:pStyle w:val="Heading2"/>
+      </w:pPr>
+      <w:r>
+        <w:t xml:space="preserve">7.1 Contributions</w:t>
+      </w:r>
+    </w:p>
+    <w:p>
+      <w:pPr>
+        <w:pStyle w:val="FirstParagraph"/>
+      </w:pPr>
+      <w:r>
+        <w:t xml:space="preserve">The paper makes three contributions, in decreasing order of novelty. The first is the treatment of vendor encroachment. In the standard appropriability account, an adopter’s complement rent ends when rivals imitate its organizational capital. Proposition 5 shows that, when the supplier of the model can productize the adopter’s use, the rent depends on two clocks, imitation and encroachment. Propositions 6 to 11 endogenize the productization rate, add competition among vendors, and let adopters respond. They show four things. Contract terms that limit a vendor’s use of adopters’ data slow it and raise the adopter’s incentive to invest. Imitation by rivals and encroachment by vendors are strategic complements. Competition among vendors speeds productization and weakens the effect of a clause with any one supplier, and in the limit removes it. Concealment by the adopter retains its effect as vendors multiply, while switching to a neutral supplier loses it. These results connect the literature on platform-owner entry (Gawer and Henderson 2007, Zhu and Liu 2018) and the hold-up literature (Klein et al. 1978, Grossman and Hart 1986) to the supply of a general-purpose AI input.</w:t>
+      </w:r>
+    </w:p>
+    <w:p>
+      <w:pPr>
+        <w:pStyle w:val="BodyText"/>
+      </w:pPr>
+      <w:r>
+        <w:t xml:space="preserve">The second is an integrated benchmark. Modeling the developer, the adopter, and the consumer in one framework extends IT business value theory (Melville et al. 2004) from the adopting firm to the vertical structure of a general-purpose technology. It lets us say why developer losses, adopter productivity gains, and weak adopter profit effects are observed together. The same account separates the profitability paradox from the productivity paradox and derives the former from the zero-profit condition applied to an input with a common market price. The ex ante definition of appropriability applies to developers and adopters alike, which speaks to the tautology charge against resource-based IT research. It also shows how a model can be a source of rent at one date and a marginal-cost input at another.</w:t>
+      </w:r>
+    </w:p>
+    <w:p>
+      <w:pPr>
+        <w:pStyle w:val="BodyText"/>
+      </w:pPr>
+      <w:r>
+        <w:t xml:space="preserve">The third is illustrative evidence that the constructs can be measured from public sources. Section 6 shows that a lab’s flagship price is associated with its quality lead and that firms launching a first-party AI product report higher operating margins afterward. It does not test the theory, and it does not bear on Propositions 5 to 11.</w:t>
+      </w:r>
+    </w:p>
+    <w:p>
+      <w:pPr>
+        <w:pStyle w:val="BodyText"/>
+      </w:pPr>
+      <w:r>
+        <w:t xml:space="preserve">We should be clear about what is not new. The mechanisms in each layer are established in industrial organization and strategy (Section 2.4). What the paper adds is their combination under a single appropriability definition, the extension to vendor encroachment, and the specification of measurable counterparts for a technology in which those counterparts are observable.</w:t>
+      </w:r>
+    </w:p>
+    <w:bookmarkEnd w:id="45"/>
+    <w:bookmarkStart w:id="46" w:name="implications-for-practice"/>
+    <w:p>
+      <w:pPr>
+        <w:pStyle w:val="Heading2"/>
+      </w:pPr>
+      <w:r>
+        <w:t xml:space="preserve">7.2 Implications for practice</w:t>
+      </w:r>
+    </w:p>
+    <w:p>
+      <w:pPr>
+        <w:pStyle w:val="FirstParagraph"/>
+      </w:pPr>
+      <w:r>
+        <w:t xml:space="preserve">For adopters, the central question is not how much to spend on AI but what the firm owns that the model cannot supply, and how long competitors will take to own it too. The theory also says that spending on the model itself is not a source of advantage, since any rival can buy the same model. For developers, the next model is the source of value, not the current one. When leads last only a few months, much of the reported loss is economic (Corollary 4). The valuations of frontier labs are best read as prices for an option on a sequence of future leads and not as capitalized current earnings. For the relationship between the two sides, Propositions 5 to 11 imply that contractual terms covering data use, fine-tuning ownership, and on-premise deployment are strategic decisions, because they affect the rate at which a vendor can productize an adopter’s use and so the adopter’s incentive to invest in the capital that generates its rent. The illustration in Table A1 suggests that such terms may be hardest to obtain for the most valuable uses, which is a reason for adopters to negotiate them before a use proves valuable and not after. Tables A2 and A3 add that, when many vendors can build the use, a clause with one supplier or a move to a neutral supplier buys little, while concealing the use keeps its effect. The adopter’s protection then comes mainly from concealment and from the difficulty of replicating the use. The tables are illustrations and not estimates.</w:t>
+      </w:r>
+    </w:p>
+    <w:bookmarkEnd w:id="46"/>
+    <w:bookmarkStart w:id="47" w:name="boundary-conditions-and-limitations"/>
+    <w:p>
+      <w:pPr>
+        <w:pStyle w:val="Heading2"/>
+      </w:pPr>
+      <w:r>
+        <w:t xml:space="preserve">7.3 Boundary conditions and limitations</w:t>
+      </w:r>
+    </w:p>
+    <w:p>
+      <w:pPr>
+        <w:pStyle w:val="FirstParagraph"/>
+      </w:pPr>
+      <w:r>
+        <w:t xml:space="preserve">The theory assumes competitive downstream product markets. Where adopters hold market power, pass-through is incomplete, and commodity LLM use can raise profit. Evidence that IT intensity accompanies rising industry concentration suggests that this case is empirically relevant (Autor et al. 2020, Bessen 2020), and it is also an alternative reading of the margin increment in H1. The theory further assumes that the developer’s lead closes. Economies of scale in compute and data flywheels could prevent closure and shift surplus durably toward the developer, and sustained developer margins without a quality lead would run against Proposition 3 and indicate that this case dominates.</w:t>
+      </w:r>
+    </w:p>
+    <w:p>
+      <w:pPr>
+        <w:pStyle w:val="BodyText"/>
+      </w:pPr>
+      <w:r>
+        <w:t xml:space="preserve">The model abstracts from uncertainty in training outcomes, from purchasable organizational capital, and from strategic interaction in the quality race itself: the lead and the catch-up lag are treated as exogenous. Appendix A.2 introduces competition among vendors, but only in the race to productize a given use. Making the lead endogenous to a training race is the most natural extension, and it is where we would expect a more specifically LLM-based theory to develop. The extensions in Appendix A are reduced-form. The productization rate is constant, vendors are symmetric apart from their access to the adopter’s data, concealment costs the adopter a fixed share of its rent, and neutral suppliers are taken as given. We also do not model vendors’ responses to concealment. Propositions 6 to 11 are not tested, because contract terms, vendor entry, concealment, and switching are not publicly observed. The empirical proxies are imperfect, and misclassification biases the estimated difference between commodity and complementary use toward zero. The adopter sample is small and made up of large software incumbents, so the results should not be generalized to adopters in other industries. Finally, the evidence is observational and covers a short period in which the technology and its business models are still changing. Prediction 1 is not tested here, and the evidence on H2 is inconclusive. The evidence reported is best viewed as a first look at the constructs, and it is not a confirmation of the theory.</w:t>
+      </w:r>
+    </w:p>
+    <w:bookmarkEnd w:id="47"/>
+    <w:bookmarkEnd w:id="48"/>
+    <w:bookmarkStart w:id="49" w:name="conclusion"/>
+    <w:p>
+      <w:pPr>
+        <w:pStyle w:val="Heading1"/>
+      </w:pPr>
+      <w:r>
+        <w:t xml:space="preserve">8. Conclusion</w:t>
+      </w:r>
+    </w:p>
+    <w:p>
+      <w:pPr>
+        <w:pStyle w:val="FirstParagraph"/>
+      </w:pPr>
+      <w:r>
+        <w:t xml:space="preserve">LLMs create value, and the theory developed here says where it goes. Adopters that use a model available to every competitor on the same terms pass their gain to consumers. The frontier developer captures a share in proportion to its quality lead, and only until a competitor closes it. Adopters that combine the model with organizational capital that rivals cannot quickly build earn a rent while the capital remains unimitated and unproductized by a vendor. The remainder goes to consumers, and statistics that pool all three positions report an average close to zero.</w:t>
+      </w:r>
+    </w:p>
+    <w:p>
+      <w:pPr>
+        <w:pStyle w:val="BodyText"/>
+      </w:pPr>
+      <w:r>
+        <w:t xml:space="preserve">The public record makes the developer half of this account visible. Frontier labs combine large booked revenue with large operating losses and pay complement owners for compute. The price of matched capability falls several-fold each year, while the cost of frontier capability rises. Investors nonetheless value the same firms as if a release sequence will continue. These three facts are consistent with a single explanation: competition over a general-purpose input whose quality lead is short and must be bought again with each release.</w:t>
+      </w:r>
+    </w:p>
+    <w:p>
+      <w:pPr>
+        <w:pStyle w:val="BodyText"/>
+      </w:pPr>
+      <w:r>
+        <w:t xml:space="preserve">The adopter half is harder to see in the data, and it is where we think the theory adds most. An adopter’s profitable window is bounded by its suppliers as well as by its competitors. How fast vendors productize a successful use depends on the contract terms that limit their access to the adopter’s data, and on how many other vendors are in a position to build the same use. Where they are many, the difficulty of replicating the use matters more than any clause. Testing these claims requires data on contract terms and vendor entry that are not now public, and making the quality race itself endogenous is the next step for the theory. The profitability puzzle that accompanies every general-purpose technology is, on this account, what competition over a common input looks like from the inside.</w:t>
+      </w:r>
+    </w:p>
+    <w:bookmarkEnd w:id="49"/>
+    <w:bookmarkStart w:id="54" w:name="appendix-a.-extensions-of-the-model"/>
+    <w:p>
+      <w:pPr>
+        <w:pStyle w:val="Heading1"/>
+      </w:pPr>
+      <w:r>
+        <w:t xml:space="preserve">Appendix A. Extensions of the Model</w:t>
+      </w:r>
+    </w:p>
+    <w:p>
+      <w:pPr>
+        <w:pStyle w:val="FirstParagraph"/>
+      </w:pPr>
+      <w:r>
+        <w:t xml:space="preserve">This appendix develops the extensions summarized in Section 4.3. Proofs are in Appendix B.</w:t>
+      </w:r>
+    </w:p>
+    <w:bookmarkStart w:id="50" w:name="X3db5a5f42670fba2518a46cb98f9569a85f601c"/>
+    <w:p>
+      <w:pPr>
+        <w:pStyle w:val="Heading2"/>
+      </w:pPr>
+      <w:r>
+        <w:t xml:space="preserve">A.1 Endogenous encroachment and contract protection</w:t>
       </w:r>
     </w:p>
     <w:p>
@@ -6663,7 +8321,7 @@
         </m:sSup>
       </m:oMath>
       <w:r>
-        <w:t xml:space="preserve">. A contract can be agreed only if the first exceeds the second. Table 3 gives a numerical illustration. Protection clears for uses with small rents and fails for uses with large rents, because the vendor’s gain from productizing grows with the rent. The pattern depends on the parameters. In a simulation with randomly drawn parameters, the willingness to pay fell short of the vendor’s loss in about five percent of the draws. We therefore offer the pattern as an illustration and not as a proposition. If it held more generally, the uses most worth protecting would be the ones least likely to be protected.</w:t>
+        <w:t xml:space="preserve">. A contract can be agreed only if the first exceeds the second. Table A1 gives a numerical illustration. Protection clears for uses with small rents and fails for uses with large rents, because the vendor’s gain from productizing grows with the rent. The pattern depends on the parameters. In a simulation with randomly drawn parameters, the willingness to pay fell short of the vendor’s loss in about five percent of the draws. We therefore offer the pattern as an illustration and not as a proposition. If it held more generally, the uses most worth protecting would be the ones least likely to be protected.</w:t>
       </w:r>
     </w:p>
     <w:p>
@@ -6675,7 +8333,7 @@
           <w:bCs/>
           <w:b/>
         </w:rPr>
-        <w:t xml:space="preserve">Table 3. Willingness to pay for protection versus the vendor’s loss (illustration;</w:t>
+        <w:t xml:space="preserve">Table A1. Willingness to pay for protection versus the vendor’s loss (illustration;</w:t>
       </w:r>
       <w:r>
         <w:rPr>
@@ -7346,7 +9004,7 @@
         <w:t xml:space="preserve"> </w:t>
       </w:r>
       <w:r>
-        <w:t xml:space="preserve">is constant and chosen by a single vendor, and Section 4.4 adds competition among vendors. We still do not model the adopter’s responses, such as concealing the use or moving to another vendor, or bargaining over the contract. The functional form</w:t>
+        <w:t xml:space="preserve">is constant and chosen by a single vendor, and Section A.2 adds competition among vendors. We still do not model the adopter’s responses, such as concealing the use or moving to another vendor, or bargaining over the contract. The functional form</w:t>
       </w:r>
       <w:r>
         <w:t xml:space="preserve"> </w:t>
@@ -7436,14 +9094,14 @@
         <w:t xml:space="preserve">is a reduced-form parameter that says nothing about how the vendor earns from a productized offering. Contract terms are not publicly observed, so the propositions cannot be examined with the data in Section 6.</w:t>
       </w:r>
     </w:p>
-    <w:bookmarkEnd w:id="34"/>
-    <w:bookmarkStart w:id="35" w:name="competition-among-vendors"/>
+    <w:bookmarkEnd w:id="50"/>
+    <w:bookmarkStart w:id="51" w:name="a.2-competition-among-vendors"/>
     <w:p>
       <w:pPr>
         <w:pStyle w:val="Heading2"/>
       </w:pPr>
       <w:r>
-        <w:t xml:space="preserve">4.4 Competition among vendors</w:t>
+        <w:t xml:space="preserve">A.2 Competition among vendors</w:t>
       </w:r>
     </w:p>
     <w:p>
@@ -7451,7 +9109,7 @@
         <w:pStyle w:val="FirstParagraph"/>
       </w:pPr>
       <w:r>
-        <w:t xml:space="preserve">Section 4.3 has a single vendor decide whether to productize the adopter’s use. In practice, several vendors may see that a use is valuable and try to build it. We now let</w:t>
+        <w:t xml:space="preserve">Section A.1 has a single vendor decide whether to productize the adopter’s use. In practice, several vendors may see that a use is valuable and try to build it. We now let</w:t>
       </w:r>
       <w:r>
         <w:t xml:space="preserve"> </w:t>
@@ -7773,7 +9431,7 @@
         <w:pStyle w:val="FirstParagraph"/>
       </w:pPr>
       <w:r>
-        <w:t xml:space="preserve">For given rivals’ rates this is the problem of Section 4.3 with</w:t>
+        <w:t xml:space="preserve">For given rivals’ rates this is the problem of Section A.1 with</w:t>
       </w:r>
       <w:r>
         <w:t xml:space="preserve"> </w:t>
@@ -8492,7 +10150,7 @@
         </m:r>
       </m:oMath>
       <w:r>
-        <w:t xml:space="preserve">. Table 4 shows what protection achieves for different numbers of outsiders. With no outsiders, raising</w:t>
+        <w:t xml:space="preserve">. Table A2 shows what protection achieves for different numbers of outsiders. With no outsiders, raising</w:t>
       </w:r>
       <w:r>
         <w:t xml:space="preserve"> </w:t>
@@ -8506,7 +10164,7 @@
         <w:t xml:space="preserve"> </w:t>
       </w:r>
       <w:r>
-        <w:t xml:space="preserve">from 0 to 0.5 cuts the total productization rate by two thirds and raises the value of the adopter’s rent flow by more than half. With eight outsiders it cuts the rate by less than a tenth, and the value of the rent flow rises by under ten percent. Proposition 9 below shows that such protection does lower the total rate, so the pattern in Table 4 is not an artifact of the example. That the proportional effect falls with every added outsider we have verified only numerically: in simulations with randomly drawn parameters (3,000 draws, up to six outsiders), both the proportional reduction in the total rate and the gain in the adopter’s rent fell with every added outsider, without exception.</w:t>
+        <w:t xml:space="preserve">from 0 to 0.5 cuts the total productization rate by two thirds and raises the value of the adopter’s rent flow by more than half. With eight outsiders it cuts the rate by less than a tenth, and the value of the rent flow rises by under ten percent. Proposition 9 below shows that such protection does lower the total rate, so the pattern in Table A2 is not an artifact of the example. That the proportional effect falls with every added outsider we have verified only numerically: in simulations with randomly drawn parameters (3,000 draws, up to six outsiders), both the proportional reduction in the total rate and the gain in the adopter’s rent fell with every added outsider, without exception.</w:t>
       </w:r>
     </w:p>
     <w:p>
@@ -8518,7 +10176,7 @@
           <w:bCs/>
           <w:b/>
         </w:rPr>
-        <w:t xml:space="preserve">Table 4. Effect of protection from the adopter’s own supplier, by number of outsider vendors (illustration;</w:t>
+        <w:t xml:space="preserve">Table A2. Effect of protection from the adopter’s own supplier, by number of outsider vendors (illustration;</w:t>
       </w:r>
       <w:r>
         <w:rPr>
@@ -9697,7 +11355,7 @@
         <w:pStyle w:val="BodyText"/>
       </w:pPr>
       <w:r>
-        <w:t xml:space="preserve">Part (b) shows that the vendors’ rates are strategic complements: when the supplier is slowed, its rivals slow too, so the effect of protection on the total rate is larger than the supplier’s own reduction. Part (c) gives the limiting case. Complete protection from one supplier removes only that supplier’s marginal contribution to the race. Table 5 gives the proportional reduction for several values of</w:t>
+        <w:t xml:space="preserve">Part (b) shows that the vendors’ rates are strategic complements: when the supplier is slowed, its rivals slow too, so the effect of protection on the total rate is larger than the supplier’s own reduction. Part (c) gives the limiting case. Complete protection from one supplier removes only that supplier’s marginal contribution to the race. Table A3 gives the proportional reduction for several values of</w:t>
       </w:r>
       <w:r>
         <w:t xml:space="preserve"> </w:t>
@@ -9724,17 +11382,17 @@
         <w:pStyle w:val="BodyText"/>
       </w:pPr>
       <w:r>
-        <w:t xml:space="preserve">The limits noted in Section 4.3 apply here as well. Vendors are symmetric apart from their access to the adopter’s data, each vendor’s rate is constant, and a vendor whose rival wins earns nothing. Letting the winner share the use, or letting vendors differentiate their offerings, would soften the race.</w:t>
+        <w:t xml:space="preserve">The limits noted in Section A.1 apply here as well. Vendors are symmetric apart from their access to the adopter’s data, each vendor’s rate is constant, and a vendor whose rival wins earns nothing. Letting the winner share the use, or letting vendors differentiate their offerings, would soften the race.</w:t>
       </w:r>
     </w:p>
-    <w:bookmarkEnd w:id="35"/>
-    <w:bookmarkStart w:id="36" w:name="adopter-responses-concealment"/>
+    <w:bookmarkEnd w:id="51"/>
+    <w:bookmarkStart w:id="52" w:name="a.3-adopter-responses-concealment"/>
     <w:p>
       <w:pPr>
         <w:pStyle w:val="Heading2"/>
       </w:pPr>
       <w:r>
-        <w:t xml:space="preserve">4.5 Adopter responses: concealment</w:t>
+        <w:t xml:space="preserve">A.3 Adopter responses: concealment</w:t>
       </w:r>
     </w:p>
     <w:p>
@@ -9970,7 +11628,7 @@
         </m:sSup>
       </m:oMath>
       <w:r>
-        <w:t xml:space="preserve">. This is the same function as in Section 4.3 with</w:t>
+        <w:t xml:space="preserve">. This is the same function as in Section A.1 with</w:t>
       </w:r>
       <w:r>
         <w:t xml:space="preserve"> </w:t>
@@ -10626,7 +12284,7 @@
         <w:pStyle w:val="BodyText"/>
       </w:pPr>
       <w:r>
-        <w:t xml:space="preserve">Part (b) contrasts with Proposition 9(c). A contract with one supplier loses its effect as vendors multiply, while concealment keeps it, because concealment raises the cost of productizing for all of them. Table 5 shows both for the same parameters. With a single vendor the two instruments are identical (a contract with</w:t>
+        <w:t xml:space="preserve">Part (b) contrasts with Proposition 9(c). A contract with one supplier loses its effect as vendors multiply, while concealment keeps it, because concealment raises the cost of productizing for all of them. Table A3 shows both for the same parameters. With a single vendor the two instruments are identical (a contract with</w:t>
       </w:r>
       <w:r>
         <w:t xml:space="preserve"> </w:t>
@@ -10707,7 +12365,7 @@
           <w:bCs/>
           <w:b/>
         </w:rPr>
-        <w:t xml:space="preserve">Table 5. Proportional reduction in the total productization rate, by number of vendors and instrument (illustration;</w:t>
+        <w:t xml:space="preserve">Table A3. Proportional reduction in the total productization rate, by number of vendors and instrument (illustration;</w:t>
       </w:r>
       <w:r>
         <w:rPr>
@@ -11308,14 +12966,14 @@
         <w:t xml:space="preserve">), and it may sacrifice the data feedback that improves the model the adopter relies on. We do not model the choice of a different vendor, which would let the adopter move to a supplier with a lower productization rate, or the vendor’s response to concealment, such as investing in detection.</w:t>
       </w:r>
     </w:p>
-    <w:bookmarkEnd w:id="36"/>
-    <w:bookmarkStart w:id="37" w:name="adopter-responses-switching-supplier"/>
+    <w:bookmarkEnd w:id="52"/>
+    <w:bookmarkStart w:id="53" w:name="a.4-adopter-responses-switching-supplier"/>
     <w:p>
       <w:pPr>
         <w:pStyle w:val="Heading2"/>
       </w:pPr>
       <w:r>
-        <w:t xml:space="preserve">4.6 Adopter responses: switching supplier</w:t>
+        <w:t xml:space="preserve">A.4 Adopter responses: switching supplier</w:t>
       </w:r>
     </w:p>
     <w:p>
@@ -12100,7 +13758,7 @@
         <w:pStyle w:val="BodyText"/>
       </w:pPr>
       <w:r>
-        <w:t xml:space="preserve">Switching has the same weakness as a contract. It changes the position of one vendor, and the former supplier remains in the race. Table 5 shows that with</w:t>
+        <w:t xml:space="preserve">Switching has the same weakness as a contract. It changes the position of one vendor, and the former supplier remains in the race. Table A3 shows that with</w:t>
       </w:r>
       <w:r>
         <w:t xml:space="preserve"> </w:t>
@@ -12145,1575 +13803,15 @@
         <w:t xml:space="preserve">We do not model how the neutral supplier earns its position, or why neutral suppliers would not themselves begin to productize once they serve enough customers.</w:t>
       </w:r>
     </w:p>
-    <w:bookmarkEnd w:id="37"/>
-    <w:bookmarkStart w:id="38" w:name="comparative-statics"/>
-    <w:p>
-      <w:pPr>
-        <w:pStyle w:val="Heading2"/>
-      </w:pPr>
-      <w:r>
-        <w:t xml:space="preserve">4.7 Comparative statics</w:t>
-      </w:r>
-    </w:p>
-    <w:p>
-      <w:pPr>
-        <w:pStyle w:val="FirstParagraph"/>
-      </w:pPr>
-      <w:r>
-        <w:t xml:space="preserve">Nine predictions follow from the propositions. The empirical work in Sections 5 and 6 can address only the first three.</w:t>
-      </w:r>
-    </w:p>
-    <w:p>
-      <w:pPr>
-        <w:numPr>
-          <w:ilvl w:val="0"/>
-          <w:numId w:val="1001"/>
-        </w:numPr>
-        <w:pStyle w:val="Compact"/>
-      </w:pPr>
-      <w:r>
-        <w:t xml:space="preserve">Realized developer prices for inference rise with</w:t>
-      </w:r>
-      <w:r>
-        <w:t xml:space="preserve"> </w:t>
-      </w:r>
-      <m:oMath>
-        <m:r>
-          <m:t>Δ</m:t>
-        </m:r>
-        <m:r>
-          <m:t>θ</m:t>
-        </m:r>
-      </m:oMath>
-      <w:r>
-        <w:t xml:space="preserve"> </w:t>
-      </w:r>
-      <w:r>
-        <w:t xml:space="preserve">and fall toward serving cost as</w:t>
-      </w:r>
-      <w:r>
-        <w:t xml:space="preserve"> </w:t>
-      </w:r>
-      <m:oMath>
-        <m:r>
-          <m:t>Δ</m:t>
-        </m:r>
-        <m:r>
-          <m:t>θ</m:t>
-        </m:r>
-        <m:r>
-          <m:rPr>
-            <m:sty m:val="p"/>
-          </m:rPr>
-          <m:t>→</m:t>
-        </m:r>
-        <m:r>
-          <m:t>0</m:t>
-        </m:r>
-      </m:oMath>
-      <w:r>
-        <w:t xml:space="preserve"> </w:t>
-      </w:r>
-      <w:r>
-        <w:t xml:space="preserve">(Proposition 3).</w:t>
-      </w:r>
-    </w:p>
-    <w:p>
-      <w:pPr>
-        <w:numPr>
-          <w:ilvl w:val="0"/>
-          <w:numId w:val="1001"/>
-        </w:numPr>
-        <w:pStyle w:val="Compact"/>
-      </w:pPr>
-      <w:r>
-        <w:t xml:space="preserve">Developer rent is shortened by open-weight releases, compressed release intervals, and falling serving cost (Proposition 3 and Corollary 3).</w:t>
-      </w:r>
-    </w:p>
-    <w:p>
-      <w:pPr>
-        <w:numPr>
-          <w:ilvl w:val="0"/>
-          <w:numId w:val="1001"/>
-        </w:numPr>
-        <w:pStyle w:val="Compact"/>
-      </w:pPr>
-      <w:r>
-        <w:t xml:space="preserve">Adopter-side profit is predicted by a dated first-party product, which proxies</w:t>
-      </w:r>
-      <w:r>
-        <w:t xml:space="preserve"> </w:t>
-      </w:r>
-      <m:oMath>
-        <m:r>
-          <m:t>O</m:t>
-        </m:r>
-        <m:r>
-          <m:rPr>
-            <m:sty m:val="p"/>
-          </m:rPr>
-          <m:t>&gt;</m:t>
-        </m:r>
-        <m:r>
-          <m:t>0</m:t>
-        </m:r>
-      </m:oMath>
-      <w:r>
-        <w:t xml:space="preserve">, and not by pooled exposure to LLMs (Propositions 1 and 2).</w:t>
-      </w:r>
-    </w:p>
-    <w:p>
-      <w:pPr>
-        <w:numPr>
-          <w:ilvl w:val="0"/>
-          <w:numId w:val="1001"/>
-        </w:numPr>
-        <w:pStyle w:val="Compact"/>
-      </w:pPr>
-      <w:r>
-        <w:t xml:space="preserve">Industries with shorter</w:t>
-      </w:r>
-      <w:r>
-        <w:t xml:space="preserve"> </w:t>
-      </w:r>
-      <m:oMath>
-        <m:sSub>
-          <m:e>
-            <m:r>
-              <m:t>τ</m:t>
-            </m:r>
-          </m:e>
-          <m:sub>
-            <m:r>
-              <m:t>O</m:t>
-            </m:r>
-          </m:sub>
-        </m:sSub>
-      </m:oMath>
-      <w:r>
-        <w:t xml:space="preserve">, or with more vendor encroachment, show weaker associations between AI use and profit (Propositions 2 and 5).</w:t>
-      </w:r>
-    </w:p>
-    <w:p>
-      <w:pPr>
-        <w:numPr>
-          <w:ilvl w:val="0"/>
-          <w:numId w:val="1001"/>
-        </w:numPr>
-        <w:pStyle w:val="Compact"/>
-      </w:pPr>
-      <w:r>
-        <w:t xml:space="preserve">As downstream competition intensifies, the AI–profit association weakens while the AI–productivity association is unaffected (Propositions 1 and 4).</w:t>
-      </w:r>
-    </w:p>
-    <w:p>
-      <w:pPr>
-        <w:numPr>
-          <w:ilvl w:val="0"/>
-          <w:numId w:val="1001"/>
-        </w:numPr>
-        <w:pStyle w:val="Compact"/>
-      </w:pPr>
-      <w:r>
-        <w:t xml:space="preserve">Adopters invest more in co-specialized capital when contract terms limit vendors’ use of their data (Propositions 6 and 7).</w:t>
-      </w:r>
-    </w:p>
-    <w:p>
-      <w:pPr>
-        <w:numPr>
-          <w:ilvl w:val="0"/>
-          <w:numId w:val="1001"/>
-        </w:numPr>
-        <w:pStyle w:val="Compact"/>
-      </w:pPr>
-      <w:r>
-        <w:t xml:space="preserve">The effect of a clause with one supplier weakens as the number of vendors able to build the same use grows (Propositions 8 and 9 and Tables 4 and 5).</w:t>
-      </w:r>
-    </w:p>
-    <w:p>
-      <w:pPr>
-        <w:numPr>
-          <w:ilvl w:val="0"/>
-          <w:numId w:val="1001"/>
-        </w:numPr>
-        <w:pStyle w:val="Compact"/>
-      </w:pPr>
-      <w:r>
-        <w:t xml:space="preserve">Adopters conceal valuable uses when concealment is cheap relative to the threat of encroachment, and concealment retains its effect as vendors multiply (Proposition 10 and Table 5).</w:t>
-      </w:r>
-    </w:p>
-    <w:p>
-      <w:pPr>
-        <w:numPr>
-          <w:ilvl w:val="0"/>
-          <w:numId w:val="1001"/>
-        </w:numPr>
-        <w:pStyle w:val="Compact"/>
-      </w:pPr>
-      <w:r>
-        <w:t xml:space="preserve">Adopters switch to neutral suppliers only when the supplier’s advantage from seeing the use is large relative to the cost of switching, and switching loses its effect as vendors multiply (Proposition 11 and Table 5).</w:t>
-      </w:r>
-    </w:p>
-    <w:p>
-      <w:pPr>
-        <w:pStyle w:val="FirstParagraph"/>
-      </w:pPr>
-      <w:r>
-        <w:t xml:space="preserve">Predictions 4 to 9 are not tested here. Predictions 6 to 9 bear directly on managerial choices about data-use terms and fine-tuning ownership, which we take up in Section 7, but they cannot be examined with public data because contract terms are not observed.</w:t>
-      </w:r>
-    </w:p>
-    <w:bookmarkEnd w:id="38"/>
-    <w:bookmarkStart w:id="39" w:name="what-is-specific-to-llms"/>
-    <w:p>
-      <w:pPr>
-        <w:pStyle w:val="Heading2"/>
-      </w:pPr>
-      <w:r>
-        <w:t xml:space="preserve">4.8 What is specific to LLMs</w:t>
-      </w:r>
-    </w:p>
-    <w:p>
-      <w:pPr>
-        <w:pStyle w:val="FirstParagraph"/>
-      </w:pPr>
-      <w:r>
-        <w:t xml:space="preserve">A fair question is whether anything in the model is specific to LLMs, or whether the same propositions would describe any layered technology market. The structure is general. What is specific is the combination of values and measurement conditions that LLMs bring to it. Marginal inference cost</w:t>
-      </w:r>
-      <w:r>
-        <w:t xml:space="preserve"> </w:t>
-      </w:r>
-      <m:oMath>
-        <m:r>
-          <m:t>m</m:t>
-        </m:r>
-      </m:oMath>
-      <w:r>
-        <w:t xml:space="preserve"> </w:t>
-      </w:r>
-      <w:r>
-        <w:t xml:space="preserve">is low relative to the cost</w:t>
-      </w:r>
-      <w:r>
-        <w:t xml:space="preserve"> </w:t>
-      </w:r>
-      <m:oMath>
-        <m:sSub>
-          <m:e>
-            <m:r>
-              <m:t>F</m:t>
-            </m:r>
-          </m:e>
-          <m:sub>
-            <m:r>
-              <m:t>T</m:t>
-            </m:r>
-          </m:sub>
-        </m:sSub>
-      </m:oMath>
-      <w:r>
-        <w:t xml:space="preserve"> </w:t>
-      </w:r>
-      <w:r>
-        <w:t xml:space="preserve">of producing a frontier model, so profit depends almost entirely on the premium</w:t>
-      </w:r>
-      <w:r>
-        <w:t xml:space="preserve"> </w:t>
-      </w:r>
-      <m:oMath>
-        <m:r>
-          <m:t>κ</m:t>
-        </m:r>
-        <m:r>
-          <m:t>Δ</m:t>
-        </m:r>
-        <m:r>
-          <m:t>θ</m:t>
-        </m:r>
-      </m:oMath>
-      <w:r>
-        <w:t xml:space="preserve">. The catch-up lag</w:t>
-      </w:r>
-      <w:r>
-        <w:t xml:space="preserve"> </w:t>
-      </w:r>
-      <m:oMath>
-        <m:sSub>
-          <m:e>
-            <m:r>
-              <m:t>τ</m:t>
-            </m:r>
-          </m:e>
-          <m:sub>
-            <m:r>
-              <m:rPr>
-                <m:nor/>
-                <m:sty m:val="p"/>
-              </m:rPr>
-              <m:t>dev</m:t>
-            </m:r>
-          </m:sub>
-        </m:sSub>
-      </m:oMath>
-      <w:r>
-        <w:t xml:space="preserve"> </w:t>
-      </w:r>
-      <w:r>
-        <w:t xml:space="preserve">is short, about three to four months for open-weight models relative to the closed frontier (Emberson 2025, Epoch AI 2026), which places the developer close to the zero-rent corner of Proposition 3. The same model serves the complement builder and its competitors on posted terms, which is what makes the adopter’s position commodity-like in the first place. And vendors can and do move into the complement layer, which is the situation Propositions 5 to 11 describe: the productization rate is chosen by vendors, shaped by contract terms, and driven up by competition among them. In this sense the theory is less a new mechanism than a calibration of known mechanisms to a market in which the state variables can be observed. We return to the limits of this claim in Section 7.3.</w:t>
-      </w:r>
-    </w:p>
-    <w:bookmarkEnd w:id="39"/>
-    <w:bookmarkEnd w:id="40"/>
-    <w:bookmarkStart w:id="43" w:name="empirical-counterparts-and-implications"/>
+    <w:bookmarkEnd w:id="53"/>
+    <w:bookmarkEnd w:id="54"/>
+    <w:bookmarkStart w:id="55" w:name="appendix-b.-proofs"/>
     <w:p>
       <w:pPr>
         <w:pStyle w:val="Heading1"/>
       </w:pPr>
       <w:r>
-        <w:t xml:space="preserve">5. Empirical Counterparts and Implications</w:t>
-      </w:r>
-    </w:p>
-    <w:bookmarkStart w:id="41" w:name="mapping-model-objects-to-data"/>
-    <w:p>
-      <w:pPr>
-        <w:pStyle w:val="Heading2"/>
-      </w:pPr>
-      <w:r>
-        <w:t xml:space="preserve">5.1 Mapping model objects to data</w:t>
-      </w:r>
-    </w:p>
-    <w:p>
-      <w:pPr>
-        <w:pStyle w:val="FirstParagraph"/>
-      </w:pPr>
-      <w:r>
-        <w:t xml:space="preserve">Table 6 assigns each object of the model an empirical counterpart in public data. The mapping is interpretive. We do not recover structural parameters, and the figures in Table 1 are not regression inputs.</w:t>
-      </w:r>
-    </w:p>
-    <w:p>
-      <w:pPr>
-        <w:pStyle w:val="BodyText"/>
-      </w:pPr>
-      <w:r>
-        <w:rPr>
-          <w:bCs/>
-          <w:b/>
-        </w:rPr>
-        <w:t xml:space="preserve">Table 6. Model objects and empirical counterparts</w:t>
-      </w:r>
-    </w:p>
-    <w:tbl>
-      <w:tblPr>
-        <w:tblStyle w:val="Table"/>
-        <w:tblW w:type="pct" w:w="5000"/>
-        <w:tblLook w:firstRow="1" w:lastRow="0" w:firstColumn="0" w:lastColumn="0" w:noHBand="0" w:noVBand="0" w:val="0020"/>
-        <w:jc w:val="start"/>
-      </w:tblPr>
-      <w:tblGrid>
-        <w:gridCol w:w="2640"/>
-        <w:gridCol w:w="2640"/>
-        <w:gridCol w:w="2640"/>
-      </w:tblGrid>
-      <w:tr>
-        <w:trPr>
-          <w:tblHeader w:val="true"/>
-        </w:trPr>
-        <w:tc>
-          <w:tcPr/>
-          <w:p>
-            <w:pPr>
-              <w:pStyle w:val="Compact"/>
-              <w:jc w:val="left"/>
-            </w:pPr>
-            <w:r>
-              <w:t xml:space="preserve">Model object</w:t>
-            </w:r>
-          </w:p>
-        </w:tc>
-        <w:tc>
-          <w:tcPr/>
-          <w:p>
-            <w:pPr>
-              <w:pStyle w:val="Compact"/>
-              <w:jc w:val="left"/>
-            </w:pPr>
-            <w:r>
-              <w:t xml:space="preserve">Empirical counterpart</w:t>
-            </w:r>
-          </w:p>
-        </w:tc>
-        <w:tc>
-          <w:tcPr/>
-          <w:p>
-            <w:pPr>
-              <w:pStyle w:val="Compact"/>
-              <w:jc w:val="left"/>
-            </w:pPr>
-            <w:r>
-              <w:t xml:space="preserve">Source</w:t>
-            </w:r>
-          </w:p>
-        </w:tc>
-      </w:tr>
-      <w:tr>
-        <w:tc>
-          <w:tcPr/>
-          <w:p>
-            <w:pPr>
-              <w:pStyle w:val="Compact"/>
-              <w:jc w:val="left"/>
-            </w:pPr>
-            <m:oMath>
-              <m:r>
-                <m:t>Δ</m:t>
-              </m:r>
-              <m:r>
-                <m:t>θ</m:t>
-              </m:r>
-            </m:oMath>
-          </w:p>
-        </w:tc>
-        <w:tc>
-          <w:tcPr/>
-          <w:p>
-            <w:pPr>
-              <w:pStyle w:val="Compact"/>
-              <w:jc w:val="left"/>
-            </w:pPr>
-            <w:r>
-              <w:t xml:space="preserve">Gap between the top-ranked and second-ranked lab on the Arena overall leaderboard</w:t>
-            </w:r>
-          </w:p>
-        </w:tc>
-        <w:tc>
-          <w:tcPr/>
-          <w:p>
-            <w:pPr>
-              <w:pStyle w:val="Compact"/>
-              <w:jc w:val="left"/>
-            </w:pPr>
-            <w:r>
-              <w:t xml:space="preserve">Chiang et al. (2024)</w:t>
-            </w:r>
-          </w:p>
-        </w:tc>
-      </w:tr>
-      <w:tr>
-        <w:tc>
-          <w:tcPr/>
-          <w:p>
-            <w:pPr>
-              <w:pStyle w:val="Compact"/>
-              <w:jc w:val="left"/>
-            </w:pPr>
-            <m:oMath>
-              <m:r>
-                <m:t>κ</m:t>
-              </m:r>
-              <m:r>
-                <m:t>Δ</m:t>
-              </m:r>
-              <m:r>
-                <m:t>θ</m:t>
-              </m:r>
-            </m:oMath>
-          </w:p>
-        </w:tc>
-        <w:tc>
-          <w:tcPr/>
-          <w:p>
-            <w:pPr>
-              <w:pStyle w:val="Compact"/>
-              <w:jc w:val="left"/>
-            </w:pPr>
-            <w:r>
-              <w:t xml:space="preserve">Provider-mean blended flagship inference price, not a GAAP margin</w:t>
-            </w:r>
-          </w:p>
-        </w:tc>
-        <w:tc>
-          <w:tcPr/>
-          <w:p>
-            <w:pPr>
-              <w:pStyle w:val="Compact"/>
-              <w:jc w:val="left"/>
-            </w:pPr>
-            <w:r>
-              <w:t xml:space="preserve">OpenRouter (2026)</w:t>
-            </w:r>
-          </w:p>
-        </w:tc>
-      </w:tr>
-      <w:tr>
-        <w:tc>
-          <w:tcPr/>
-          <w:p>
-            <w:pPr>
-              <w:pStyle w:val="Compact"/>
-              <w:jc w:val="left"/>
-            </w:pPr>
-            <m:oMath>
-              <m:sSub>
-                <m:e>
-                  <m:r>
-                    <m:t>τ</m:t>
-                  </m:r>
-                </m:e>
-                <m:sub>
-                  <m:r>
-                    <m:rPr>
-                      <m:nor/>
-                      <m:sty m:val="p"/>
-                    </m:rPr>
-                    <m:t>dev</m:t>
-                  </m:r>
-                </m:sub>
-              </m:sSub>
-            </m:oMath>
-          </w:p>
-        </w:tc>
-        <w:tc>
-          <w:tcPr/>
-          <w:p>
-            <w:pPr>
-              <w:pStyle w:val="Compact"/>
-              <w:jc w:val="left"/>
-            </w:pPr>
-            <w:r>
-              <w:t xml:space="preserve">Time from a frontier release to the first competitor release matching its score</w:t>
-            </w:r>
-          </w:p>
-        </w:tc>
-        <w:tc>
-          <w:tcPr/>
-          <w:p>
-            <w:pPr>
-              <w:pStyle w:val="Compact"/>
-              <w:jc w:val="left"/>
-            </w:pPr>
-            <w:r>
-              <w:t xml:space="preserve">Arena series</w:t>
-            </w:r>
-          </w:p>
-        </w:tc>
-      </w:tr>
-      <w:tr>
-        <w:tc>
-          <w:tcPr/>
-          <w:p>
-            <w:pPr>
-              <w:pStyle w:val="Compact"/>
-              <w:jc w:val="left"/>
-            </w:pPr>
-            <m:oMath>
-              <m:r>
-                <m:t>φ</m:t>
-              </m:r>
-              <m:d>
-                <m:dPr>
-                  <m:begChr m:val="("/>
-                  <m:endChr m:val=")"/>
-                  <m:sepChr m:val=""/>
-                  <m:grow/>
-                </m:dPr>
-                <m:e>
-                  <m:r>
-                    <m:t>L</m:t>
-                  </m:r>
-                  <m:r>
-                    <m:rPr>
-                      <m:sty m:val="p"/>
-                    </m:rPr>
-                    <m:t>,</m:t>
-                  </m:r>
-                  <m:r>
-                    <m:t>O</m:t>
-                  </m:r>
-                </m:e>
-              </m:d>
-            </m:oMath>
-            <w:r>
-              <w:t xml:space="preserve"> </w:t>
-            </w:r>
-            <w:r>
-              <w:t xml:space="preserve">with</w:t>
-            </w:r>
-            <w:r>
-              <w:t xml:space="preserve"> </w:t>
-            </w:r>
-            <m:oMath>
-              <m:sSub>
-                <m:e>
-                  <m:r>
-                    <m:t>O</m:t>
-                  </m:r>
-                </m:e>
-                <m:sub>
-                  <m:r>
-                    <m:t>j</m:t>
-                  </m:r>
-                </m:sub>
-              </m:sSub>
-              <m:r>
-                <m:rPr>
-                  <m:sty m:val="p"/>
-                </m:rPr>
-                <m:t>&gt;</m:t>
-              </m:r>
-              <m:r>
-                <m:t>0</m:t>
-              </m:r>
-            </m:oMath>
-          </w:p>
-        </w:tc>
-        <w:tc>
-          <w:tcPr/>
-          <w:p>
-            <w:pPr>
-              <w:pStyle w:val="Compact"/>
-              <w:jc w:val="left"/>
-            </w:pPr>
-            <w:r>
-              <w:t xml:space="preserve">Dated general-availability (GA) year of a first-party AI product</w:t>
-            </w:r>
-          </w:p>
-        </w:tc>
-        <w:tc>
-          <w:tcPr/>
-          <w:p>
-            <w:pPr>
-              <w:pStyle w:val="Compact"/>
-              <w:jc w:val="left"/>
-            </w:pPr>
-            <w:r>
-              <w:t xml:space="preserve">Hand-coded from public product dates</w:t>
-            </w:r>
-          </w:p>
-        </w:tc>
-      </w:tr>
-      <w:tr>
-        <w:tc>
-          <w:tcPr/>
-          <w:p>
-            <w:pPr>
-              <w:pStyle w:val="Compact"/>
-              <w:jc w:val="left"/>
-            </w:pPr>
-            <m:oMath>
-              <m:sSub>
-                <m:e>
-                  <m:r>
-                    <m:t>O</m:t>
-                  </m:r>
-                </m:e>
-                <m:sub>
-                  <m:r>
-                    <m:t>j</m:t>
-                  </m:r>
-                </m:sub>
-              </m:sSub>
-              <m:r>
-                <m:rPr>
-                  <m:sty m:val="p"/>
-                </m:rPr>
-                <m:t>=</m:t>
-              </m:r>
-              <m:r>
-                <m:t>0</m:t>
-              </m:r>
-            </m:oMath>
-          </w:p>
-        </w:tc>
-        <w:tc>
-          <w:tcPr/>
-          <w:p>
-            <w:pPr>
-              <w:pStyle w:val="Compact"/>
-              <w:jc w:val="left"/>
-            </w:pPr>
-            <w:r>
-              <w:t xml:space="preserve">Pooled API use or mention without a coded GA year</w:t>
-            </w:r>
-          </w:p>
-        </w:tc>
-        <w:tc>
-          <w:tcPr/>
-          <w:p>
-            <w:pPr>
-              <w:pStyle w:val="Compact"/>
-              <w:jc w:val="left"/>
-            </w:pPr>
-            <w:r>
-              <w:t xml:space="preserve">SEC filings</w:t>
-            </w:r>
-          </w:p>
-        </w:tc>
-      </w:tr>
-      <w:tr>
-        <w:tc>
-          <w:tcPr/>
-          <w:p>
-            <w:pPr>
-              <w:pStyle w:val="Compact"/>
-              <w:jc w:val="left"/>
-            </w:pPr>
-            <w:r>
-              <w:t xml:space="preserve">Adopter profit</w:t>
-            </w:r>
-          </w:p>
-        </w:tc>
-        <w:tc>
-          <w:tcPr/>
-          <w:p>
-            <w:pPr>
-              <w:pStyle w:val="Compact"/>
-              <w:jc w:val="left"/>
-            </w:pPr>
-            <w:r>
-              <w:t xml:space="preserve">Operating margin</w:t>
-            </w:r>
-          </w:p>
-        </w:tc>
-        <w:tc>
-          <w:tcPr/>
-          <w:p>
-            <w:pPr>
-              <w:pStyle w:val="Compact"/>
-              <w:jc w:val="left"/>
-            </w:pPr>
-            <w:r>
-              <w:t xml:space="preserve">SEC EDGAR XBRL company facts</w:t>
-            </w:r>
-          </w:p>
-        </w:tc>
-      </w:tr>
-      <w:tr>
-        <w:tc>
-          <w:tcPr/>
-          <w:p>
-            <w:pPr>
-              <w:pStyle w:val="Compact"/>
-              <w:jc w:val="left"/>
-            </w:pPr>
-            <w:r>
-              <w:t xml:space="preserve">Compute payments</w:t>
-            </w:r>
-          </w:p>
-        </w:tc>
-        <w:tc>
-          <w:tcPr/>
-          <w:p>
-            <w:pPr>
-              <w:pStyle w:val="Compact"/>
-              <w:jc w:val="left"/>
-            </w:pPr>
-            <w:r>
-              <w:t xml:space="preserve">Factor payment outside the three-way split</w:t>
-            </w:r>
-          </w:p>
-        </w:tc>
-        <w:tc>
-          <w:tcPr/>
-          <w:p>
-            <w:pPr>
-              <w:pStyle w:val="Compact"/>
-              <w:jc w:val="left"/>
-            </w:pPr>
-            <w:r>
-              <w:t xml:space="preserve">Table 1 (illustrative)</w:t>
-            </w:r>
-          </w:p>
-        </w:tc>
-      </w:tr>
-      <w:tr>
-        <w:tc>
-          <w:tcPr/>
-          <w:p>
-            <w:pPr>
-              <w:pStyle w:val="Compact"/>
-              <w:jc w:val="left"/>
-            </w:pPr>
-            <m:oMath>
-              <m:r>
-                <m:t>η</m:t>
-              </m:r>
-            </m:oMath>
-            <w:r>
-              <w:t xml:space="preserve">,</w:t>
-            </w:r>
-            <w:r>
-              <w:t xml:space="preserve"> </w:t>
-            </w:r>
-            <m:oMath>
-              <m:r>
-                <m:t>s</m:t>
-              </m:r>
-            </m:oMath>
-            <w:r>
-              <w:t xml:space="preserve">,</w:t>
-            </w:r>
-            <w:r>
-              <w:t xml:space="preserve"> </w:t>
-            </w:r>
-            <m:oMath>
-              <m:r>
-                <m:t>N</m:t>
-              </m:r>
-            </m:oMath>
-          </w:p>
-        </w:tc>
-        <w:tc>
-          <w:tcPr/>
-          <w:p>
-            <w:pPr>
-              <w:pStyle w:val="Compact"/>
-              <w:jc w:val="left"/>
-            </w:pPr>
-            <w:r>
-              <w:t xml:space="preserve">No public counterpart (contract terms and vendor entry are not observed)</w:t>
-            </w:r>
-          </w:p>
-        </w:tc>
-        <w:tc>
-          <w:tcPr/>
-          <w:p>
-            <w:pPr>
-              <w:pStyle w:val="Compact"/>
-              <w:jc w:val="left"/>
-            </w:pPr>
-            <w:r>
-              <w:t xml:space="preserve">n/a</w:t>
-            </w:r>
-          </w:p>
-        </w:tc>
-      </w:tr>
-    </w:tbl>
-    <w:bookmarkEnd w:id="41"/>
-    <w:bookmarkStart w:id="42" w:name="empirical-implications"/>
-    <w:p>
-      <w:pPr>
-        <w:pStyle w:val="Heading2"/>
-      </w:pPr>
-      <w:r>
-        <w:t xml:space="preserve">5.2 Empirical implications</w:t>
-      </w:r>
-    </w:p>
-    <w:p>
-      <w:pPr>
-        <w:pStyle w:val="FirstParagraph"/>
-      </w:pPr>
-      <w:r>
-        <w:t xml:space="preserve">Prediction 3 of Section 4.7 and the transience of complement rents (Corollary 2) yield two hypotheses about adopters.</w:t>
-      </w:r>
-    </w:p>
-    <w:p>
-      <w:pPr>
-        <w:pStyle w:val="BodyText"/>
-      </w:pPr>
-      <w:r>
-        <w:rPr>
-          <w:bCs/>
-          <w:b/>
-        </w:rPr>
-        <w:t xml:space="preserve">H1.</w:t>
-      </w:r>
-      <w:r>
-        <w:t xml:space="preserve"> </w:t>
-      </w:r>
-      <w:r>
-        <w:t xml:space="preserve">Firms that ship a dated first-party AI product earn a higher operating margin after the GA year than before, relative to firms with no such product. Treatment is the calendar year of GA, not a time-invariant indicator. Examples are Copilot for Microsoft 365, Firefly, Now Assist, Cortex, AIP, watsonx, and Charlotte AI (all 2023), and Gemini for Workspace, Agentforce, and Bits AI (all 2024), together with analogues.</w:t>
-      </w:r>
-    </w:p>
-    <w:p>
-      <w:pPr>
-        <w:pStyle w:val="BodyText"/>
-      </w:pPr>
-      <w:r>
-        <w:rPr>
-          <w:bCs/>
-          <w:b/>
-        </w:rPr>
-        <w:t xml:space="preserve">H2.</w:t>
-      </w:r>
-      <w:r>
-        <w:t xml:space="preserve"> </w:t>
-      </w:r>
-      <w:r>
-        <w:t xml:space="preserve">The within-firm margin increment after GA declines as event time lengthens. The hypothesis is disconfirmed by a flat or rising post-GA path, or by a difference between the first post-GA year and the last post-GA bin that cannot be distinguished from zero.</w:t>
-      </w:r>
-    </w:p>
-    <w:p>
-      <w:pPr>
-        <w:pStyle w:val="BodyText"/>
-      </w:pPr>
-      <w:r>
-        <w:t xml:space="preserve">We do not state the developer-side predictions (1 and 2) as hypotheses, because testing them properly requires a model-month panel and release-level launch prices that we do not have. Section 6.1 reports a lab-month association related to prediction 1 as descriptive evidence. Predictions 4 to 9 concern industry variation, contract terms, vendor entry, concealment, and switching, none of which public data capture.</w:t>
-      </w:r>
-    </w:p>
-    <w:bookmarkEnd w:id="42"/>
-    <w:bookmarkEnd w:id="43"/>
-    <w:bookmarkStart w:id="47" w:name="illustrative-evidence"/>
-    <w:p>
-      <w:pPr>
-        <w:pStyle w:val="Heading1"/>
-      </w:pPr>
-      <w:r>
-        <w:t xml:space="preserve">6. Illustrative Evidence</w:t>
-      </w:r>
-    </w:p>
-    <w:p>
-      <w:pPr>
-        <w:pStyle w:val="FirstParagraph"/>
-      </w:pPr>
-      <w:r>
-        <w:t xml:space="preserve">This section relates the constructs of Section 5 to public data. It does not test the theory: the samples are small, the proxies are coarse, and several hypotheses go untested. Its purpose is to show that the constructs can be measured and to see whether the data are consistent with the predictions.</w:t>
-      </w:r>
-    </w:p>
-    <w:p>
-      <w:pPr>
-        <w:pStyle w:val="BodyText"/>
-      </w:pPr>
-      <w:r>
-        <w:t xml:space="preserve">The developer panel combines Arena overall leaderboard snapshots (Chiang et al. 2024) with OpenRouter endpoint prices (OpenRouter 2026). It contains 171 lab-months with a price. Of these, 102 have at least one live endpoint, and the remaining 69 rely on the list-price fallback. The adopter panel comes from SEC EDGAR XBRL company facts (SEC 2026) and covers 81 firms and 520 firm-years, with staggered GA-year treatment for 21 firms. We coded the GA years by hand from public product dates.</w:t>
-      </w:r>
-    </w:p>
-    <w:bookmarkStart w:id="44" w:name="developer-side"/>
-    <w:p>
-      <w:pPr>
-        <w:pStyle w:val="Heading2"/>
-      </w:pPr>
-      <w:r>
-        <w:t xml:space="preserve">6.1 Developer side</w:t>
-      </w:r>
-    </w:p>
-    <w:p>
-      <w:pPr>
-        <w:pStyle w:val="FirstParagraph"/>
-      </w:pPr>
-      <w:r>
-        <w:rPr>
-          <w:iCs/>
-          <w:i/>
-        </w:rPr>
-        <w:t xml:space="preserve">Lab-month association.</w:t>
-      </w:r>
-      <w:r>
-        <w:t xml:space="preserve"> </w:t>
-      </w:r>
-      <w:r>
-        <w:t xml:space="preserve">We regress log realized flagship price on the lab’s lead, with lab fixed effects and a trend. The coefficient is 0.0099 on the 171 lab-months that include the list-price fallback and 0.0068 on the 102 months with at least one live endpoint. Conventional clustered p-values are below 0.001 and 0.017, respectively. With so few lab clusters, these p-values probably overstate precision (Cameron et al. 2008), so we regard the estimates as suggestive. A first-difference cut on an older list-price snapshot series (</w:t>
-      </w:r>
-      <m:oMath>
-        <m:r>
-          <m:t>N</m:t>
-        </m:r>
-        <m:r>
-          <m:rPr>
-            <m:sty m:val="p"/>
-          </m:rPr>
-          <m:t>=</m:t>
-        </m:r>
-        <m:r>
-          <m:t>1</m:t>
-        </m:r>
-        <m:r>
-          <m:rPr>
-            <m:sty m:val="p"/>
-          </m:rPr>
-          <m:t>,</m:t>
-        </m:r>
-        <m:r>
-          <m:t>190</m:t>
-        </m:r>
-      </m:oMath>
-      <w:r>
-        <w:t xml:space="preserve">) gives a coefficient of 0.0049 (p = 0.081). We read it as directional only.</w:t>
-      </w:r>
-    </w:p>
-    <w:p>
-      <w:pPr>
-        <w:pStyle w:val="BodyText"/>
-      </w:pPr>
-      <w:r>
-        <w:rPr>
-          <w:iCs/>
-          <w:i/>
-        </w:rPr>
-        <w:t xml:space="preserve">What the lab-month estimates do not show.</w:t>
-      </w:r>
-      <w:r>
-        <w:t xml:space="preserve"> </w:t>
-      </w:r>
-      <w:r>
-        <w:t xml:space="preserve">New releases drive most of the identifying variation, so the estimates do not isolate the premium on a given model. They are associations between a lab’s lead and its flagship price and not tests of prediction 1, which concerns the price of a given model. A test needs a model-month panel and a release-level panel of launch prices, which we do not estimate here.</w:t>
-      </w:r>
-    </w:p>
-    <w:bookmarkEnd w:id="44"/>
-    <w:bookmarkStart w:id="45" w:name="adopter-side"/>
-    <w:p>
-      <w:pPr>
-        <w:pStyle w:val="Heading2"/>
-      </w:pPr>
-      <w:r>
-        <w:t xml:space="preserve">6.2 Adopter side</w:t>
-      </w:r>
-    </w:p>
-    <w:p>
-      <w:pPr>
-        <w:pStyle w:val="FirstParagraph"/>
-      </w:pPr>
-      <w:r>
-        <w:rPr>
-          <w:iCs/>
-          <w:i/>
-        </w:rPr>
-        <w:t xml:space="preserve">H1.</w:t>
-      </w:r>
-      <w:r>
-        <w:t xml:space="preserve"> </w:t>
-      </w:r>
-      <w:r>
-        <w:t xml:space="preserve">We regress operating margin on a post-GA indicator with firm and year fixed effects and standard errors clustered by firm. The post-GA margin increment is 5.3 percentage points (</w:t>
-      </w:r>
-      <m:oMath>
-        <m:r>
-          <m:t>β</m:t>
-        </m:r>
-        <m:r>
-          <m:rPr>
-            <m:sty m:val="p"/>
-          </m:rPr>
-          <m:t>=</m:t>
-        </m:r>
-        <m:r>
-          <m:t>0.053</m:t>
-        </m:r>
-      </m:oMath>
-      <w:r>
-        <w:t xml:space="preserve">,</w:t>
-      </w:r>
-      <w:r>
-        <w:t xml:space="preserve"> </w:t>
-      </w:r>
-      <m:oMath>
-        <m:r>
-          <m:t>p</m:t>
-        </m:r>
-        <m:r>
-          <m:rPr>
-            <m:sty m:val="p"/>
-          </m:rPr>
-          <m:t>=</m:t>
-        </m:r>
-        <m:r>
-          <m:t>0.007</m:t>
-        </m:r>
-      </m:oMath>
-      <w:r>
-        <w:t xml:space="preserve">;</w:t>
-      </w:r>
-      <w:r>
-        <w:t xml:space="preserve"> </w:t>
-      </w:r>
-      <m:oMath>
-        <m:r>
-          <m:t>N</m:t>
-        </m:r>
-        <m:r>
-          <m:rPr>
-            <m:sty m:val="p"/>
-          </m:rPr>
-          <m:t>=</m:t>
-        </m:r>
-        <m:r>
-          <m:t>520</m:t>
-        </m:r>
-      </m:oMath>
-      <w:r>
-        <w:t xml:space="preserve"> </w:t>
-      </w:r>
-      <w:r>
-        <w:t xml:space="preserve">firm-years, 21 treated firms). The treated firms are large software incumbents and treatment is staggered, so this estimate may be biased and may reflect margin trends unrelated to AI. We therefore do not read it as a stand-alone test of H1. An increment carried by the operating-expense ratio, or concentrated among the largest firms, would point to cost reduction or market power and not to a complement rent.</w:t>
-      </w:r>
-    </w:p>
-    <w:p>
-      <w:pPr>
-        <w:pStyle w:val="BodyText"/>
-      </w:pPr>
-      <w:r>
-        <w:rPr>
-          <w:iCs/>
-          <w:i/>
-        </w:rPr>
-        <w:t xml:space="preserve">H2.</w:t>
-      </w:r>
-      <w:r>
-        <w:t xml:space="preserve"> </w:t>
-      </w:r>
-      <w:r>
-        <w:t xml:space="preserve">In the baseline event study, with</w:t>
-      </w:r>
-      <w:r>
-        <w:t xml:space="preserve"> </w:t>
-      </w:r>
-      <m:oMath>
-        <m:r>
-          <m:t>t</m:t>
-        </m:r>
-        <m:r>
-          <m:rPr>
-            <m:sty m:val="p"/>
-          </m:rPr>
-          <m:t>=</m:t>
-        </m:r>
-        <m:r>
-          <m:rPr>
-            <m:sty m:val="p"/>
-          </m:rPr>
-          <m:t>−</m:t>
-        </m:r>
-        <m:r>
-          <m:t>1</m:t>
-        </m:r>
-      </m:oMath>
-      <w:r>
-        <w:t xml:space="preserve"> </w:t>
-      </w:r>
-      <w:r>
-        <w:t xml:space="preserve">omitted, the coefficient is −1.2 percentage points at</w:t>
-      </w:r>
-      <w:r>
-        <w:t xml:space="preserve"> </w:t>
-      </w:r>
-      <m:oMath>
-        <m:r>
-          <m:t>t</m:t>
-        </m:r>
-        <m:r>
-          <m:rPr>
-            <m:sty m:val="p"/>
-          </m:rPr>
-          <m:t>=</m:t>
-        </m:r>
-        <m:r>
-          <m:rPr>
-            <m:sty m:val="p"/>
-          </m:rPr>
-          <m:t>−</m:t>
-        </m:r>
-        <m:r>
-          <m:t>2</m:t>
-        </m:r>
-      </m:oMath>
-      <w:r>
-        <w:t xml:space="preserve"> </w:t>
-      </w:r>
-      <w:r>
-        <w:t xml:space="preserve">(</w:t>
-      </w:r>
-      <m:oMath>
-        <m:r>
-          <m:t>p</m:t>
-        </m:r>
-        <m:r>
-          <m:rPr>
-            <m:sty m:val="p"/>
-          </m:rPr>
-          <m:t>=</m:t>
-        </m:r>
-        <m:r>
-          <m:t>0.64</m:t>
-        </m:r>
-      </m:oMath>
-      <w:r>
-        <w:t xml:space="preserve">), +4.4 at the GA year (</w:t>
-      </w:r>
-      <m:oMath>
-        <m:r>
-          <m:t>p</m:t>
-        </m:r>
-        <m:r>
-          <m:rPr>
-            <m:sty m:val="p"/>
-          </m:rPr>
-          <m:t>=</m:t>
-        </m:r>
-        <m:r>
-          <m:t>0.037</m:t>
-        </m:r>
-      </m:oMath>
-      <w:r>
-        <w:t xml:space="preserve">), +6.1 at</w:t>
-      </w:r>
-      <w:r>
-        <w:t xml:space="preserve"> </w:t>
-      </w:r>
-      <m:oMath>
-        <m:r>
-          <m:t>t</m:t>
-        </m:r>
-        <m:r>
-          <m:rPr>
-            <m:sty m:val="p"/>
-          </m:rPr>
-          <m:t>+</m:t>
-        </m:r>
-        <m:r>
-          <m:t>1</m:t>
-        </m:r>
-      </m:oMath>
-      <w:r>
-        <w:t xml:space="preserve"> </w:t>
-      </w:r>
-      <w:r>
-        <w:t xml:space="preserve">(</w:t>
-      </w:r>
-      <m:oMath>
-        <m:r>
-          <m:t>p</m:t>
-        </m:r>
-        <m:r>
-          <m:rPr>
-            <m:sty m:val="p"/>
-          </m:rPr>
-          <m:t>=</m:t>
-        </m:r>
-        <m:r>
-          <m:t>0.021</m:t>
-        </m:r>
-      </m:oMath>
-      <w:r>
-        <w:t xml:space="preserve">), +5.3 at</w:t>
-      </w:r>
-      <w:r>
-        <w:t xml:space="preserve"> </w:t>
-      </w:r>
-      <m:oMath>
-        <m:r>
-          <m:t>t</m:t>
-        </m:r>
-        <m:r>
-          <m:rPr>
-            <m:sty m:val="p"/>
-          </m:rPr>
-          <m:t>+</m:t>
-        </m:r>
-        <m:r>
-          <m:t>2</m:t>
-        </m:r>
-      </m:oMath>
-      <w:r>
-        <w:t xml:space="preserve"> </w:t>
-      </w:r>
-      <w:r>
-        <w:t xml:space="preserve">(</w:t>
-      </w:r>
-      <m:oMath>
-        <m:r>
-          <m:t>p</m:t>
-        </m:r>
-        <m:r>
-          <m:rPr>
-            <m:sty m:val="p"/>
-          </m:rPr>
-          <m:t>=</m:t>
-        </m:r>
-        <m:r>
-          <m:t>0.16</m:t>
-        </m:r>
-      </m:oMath>
-      <w:r>
-        <w:t xml:space="preserve">), and +2.4 at</w:t>
-      </w:r>
-      <w:r>
-        <w:t xml:space="preserve"> </w:t>
-      </w:r>
-      <m:oMath>
-        <m:r>
-          <m:t>t</m:t>
-        </m:r>
-        <m:r>
-          <m:rPr>
-            <m:sty m:val="p"/>
-          </m:rPr>
-          <m:t>+</m:t>
-        </m:r>
-        <m:r>
-          <m:t>3</m:t>
-        </m:r>
-      </m:oMath>
-      <w:r>
-        <w:t xml:space="preserve"> </w:t>
-      </w:r>
-      <w:r>
-        <w:t xml:space="preserve">(</w:t>
-      </w:r>
-      <m:oMath>
-        <m:r>
-          <m:t>p</m:t>
-        </m:r>
-        <m:r>
-          <m:rPr>
-            <m:sty m:val="p"/>
-          </m:rPr>
-          <m:t>=</m:t>
-        </m:r>
-        <m:r>
-          <m:t>0.59</m:t>
-        </m:r>
-      </m:oMath>
-      <w:r>
-        <w:t xml:space="preserve">). The pre-period coefficient is small and indistinguishable from zero. The point estimates peak at</w:t>
-      </w:r>
-      <w:r>
-        <w:t xml:space="preserve"> </w:t>
-      </w:r>
-      <m:oMath>
-        <m:r>
-          <m:t>t</m:t>
-        </m:r>
-        <m:r>
-          <m:rPr>
-            <m:sty m:val="p"/>
-          </m:rPr>
-          <m:t>+</m:t>
-        </m:r>
-        <m:r>
-          <m:t>1</m:t>
-        </m:r>
-      </m:oMath>
-      <w:r>
-        <w:t xml:space="preserve"> </w:t>
-      </w:r>
-      <w:r>
-        <w:t xml:space="preserve">and fall afterward, which is the direction the theory predicts. But the</w:t>
-      </w:r>
-      <w:r>
-        <w:t xml:space="preserve"> </w:t>
-      </w:r>
-      <m:oMath>
-        <m:r>
-          <m:t>t</m:t>
-        </m:r>
-        <m:r>
-          <m:rPr>
-            <m:sty m:val="p"/>
-          </m:rPr>
-          <m:t>+</m:t>
-        </m:r>
-        <m:r>
-          <m:t>2</m:t>
-        </m:r>
-      </m:oMath>
-      <w:r>
-        <w:t xml:space="preserve"> </w:t>
-      </w:r>
-      <w:r>
-        <w:t xml:space="preserve">and</w:t>
-      </w:r>
-      <w:r>
-        <w:t xml:space="preserve"> </w:t>
-      </w:r>
-      <m:oMath>
-        <m:r>
-          <m:t>t</m:t>
-        </m:r>
-        <m:r>
-          <m:rPr>
-            <m:sty m:val="p"/>
-          </m:rPr>
-          <m:t>+</m:t>
-        </m:r>
-        <m:r>
-          <m:t>3</m:t>
-        </m:r>
-      </m:oMath>
-      <w:r>
-        <w:t xml:space="preserve"> </w:t>
-      </w:r>
-      <w:r>
-        <w:t xml:space="preserve">estimates are imprecise and rest on fewer treated firms, and we do not test whether the</w:t>
-      </w:r>
-      <w:r>
-        <w:t xml:space="preserve"> </w:t>
-      </w:r>
-      <m:oMath>
-        <m:r>
-          <m:t>t</m:t>
-        </m:r>
-        <m:r>
-          <m:rPr>
-            <m:sty m:val="p"/>
-          </m:rPr>
-          <m:t>+</m:t>
-        </m:r>
-        <m:r>
-          <m:t>1</m:t>
-        </m:r>
-      </m:oMath>
-      <w:r>
-        <w:t xml:space="preserve"> </w:t>
-      </w:r>
-      <w:r>
-        <w:t xml:space="preserve">coefficient equals that of the last post-GA bin. The data are therefore inconclusive on H2, and we do not claim that the margin increment decays.</w:t>
-      </w:r>
-    </w:p>
-    <w:bookmarkEnd w:id="45"/>
-    <w:bookmarkStart w:id="46" w:name="what-is-and-is-not-identified"/>
-    <w:p>
-      <w:pPr>
-        <w:pStyle w:val="Heading2"/>
-      </w:pPr>
-      <w:r>
-        <w:t xml:space="preserve">6.3 What is and is not identified</w:t>
-      </w:r>
-    </w:p>
-    <w:p>
-      <w:pPr>
-        <w:pStyle w:val="FirstParagraph"/>
-      </w:pPr>
-      <w:r>
-        <w:t xml:space="preserve">Six restrictions apply. First, the realized price is the mean of provider cards on OpenRouter, not a billed invoice and not a GAAP inference margin. Second, endpoint coverage is incomplete: 102 of the 171 priced months have a live endpoint. Third, GA years come from public product dates and do not measure token spend or retrieval intensity. Fourth, the figures in Table 1 are illustrative and are not regression inputs. Fifth, two-way fixed-effects estimates under staggered timing can be biased when effects differ across cohorts (Goodman-Bacon 2021), and they rest on parallel trends, which we examine only through the pre-GA coefficients of the event study. Sixth, operating margin is an accounting measure and not the economic profit of Proposition 2, and the GA date marks the launch of a product and not the start of organizational-capital accumulation.</w:t>
-      </w:r>
-    </w:p>
-    <w:bookmarkEnd w:id="46"/>
-    <w:bookmarkEnd w:id="47"/>
-    <w:bookmarkStart w:id="51" w:name="discussion"/>
-    <w:p>
-      <w:pPr>
-        <w:pStyle w:val="Heading1"/>
-      </w:pPr>
-      <w:r>
-        <w:t xml:space="preserve">7. Discussion</w:t>
-      </w:r>
-    </w:p>
-    <w:bookmarkStart w:id="48" w:name="contributions"/>
-    <w:p>
-      <w:pPr>
-        <w:pStyle w:val="Heading2"/>
-      </w:pPr>
-      <w:r>
-        <w:t xml:space="preserve">7.1 Contributions</w:t>
-      </w:r>
-    </w:p>
-    <w:p>
-      <w:pPr>
-        <w:pStyle w:val="FirstParagraph"/>
-      </w:pPr>
-      <w:r>
-        <w:t xml:space="preserve">The paper makes three contributions, in decreasing order of novelty. The first is the treatment of vendor encroachment. In the standard appropriability account, an adopter’s complement rent ends when rivals imitate its organizational capital. Proposition 5 shows that, when the supplier of the model can productize the adopter’s use, the rent depends on two clocks, imitation and encroachment. Propositions 6 to 11 endogenize the productization rate, add competition among vendors, and let adopters respond. They show four things. Contract terms that limit a vendor’s use of adopters’ data slow it and raise the adopter’s incentive to invest. Imitation by rivals and encroachment by vendors are strategic complements. Competition among vendors speeds productization and weakens the effect of a clause with any one supplier, and in the limit removes it. Concealment by the adopter retains its effect as vendors multiply, while switching to a neutral supplier loses it. These results connect the literature on platform-owner entry (Gawer and Henderson 2007, Zhu and Liu 2018) and the hold-up literature (Klein et al. 1978, Grossman and Hart 1986) to the supply of a general-purpose AI input.</w:t>
-      </w:r>
-    </w:p>
-    <w:p>
-      <w:pPr>
-        <w:pStyle w:val="BodyText"/>
-      </w:pPr>
-      <w:r>
-        <w:t xml:space="preserve">The second is an integrated benchmark. Modeling the developer, the adopter, and the consumer in one framework extends IT business value theory (Melville et al. 2004) from the adopting firm to the vertical structure of a general-purpose technology. It lets us say why developer losses, adopter productivity gains, and weak adopter profit effects are observed together. The same account separates the profitability paradox from the productivity paradox and derives the former from the zero-profit condition applied to an input with a common market price. The ex ante definition of appropriability applies to developers and adopters alike, which speaks to the tautology charge against resource-based IT research. It also shows how a model can be a source of rent at one date and a marginal-cost input at another.</w:t>
-      </w:r>
-    </w:p>
-    <w:p>
-      <w:pPr>
-        <w:pStyle w:val="BodyText"/>
-      </w:pPr>
-      <w:r>
-        <w:t xml:space="preserve">The third is illustrative evidence that the constructs can be measured from public sources. Section 6 shows that a lab’s flagship price is associated with its quality lead and that firms launching a first-party AI product report higher operating margins afterward. It does not test the theory, and it does not bear on Propositions 5 to 11.</w:t>
-      </w:r>
-    </w:p>
-    <w:p>
-      <w:pPr>
-        <w:pStyle w:val="BodyText"/>
-      </w:pPr>
-      <w:r>
-        <w:t xml:space="preserve">We should be clear about what is not new. The mechanisms in each layer are established in industrial organization and strategy (Section 2.4). What the paper adds is their combination under a single appropriability definition, the extension to vendor encroachment, and the specification of measurable counterparts for a technology in which those counterparts are observable.</w:t>
-      </w:r>
-    </w:p>
-    <w:bookmarkEnd w:id="48"/>
-    <w:bookmarkStart w:id="49" w:name="implications-for-practice"/>
-    <w:p>
-      <w:pPr>
-        <w:pStyle w:val="Heading2"/>
-      </w:pPr>
-      <w:r>
-        <w:t xml:space="preserve">7.2 Implications for practice</w:t>
-      </w:r>
-    </w:p>
-    <w:p>
-      <w:pPr>
-        <w:pStyle w:val="FirstParagraph"/>
-      </w:pPr>
-      <w:r>
-        <w:t xml:space="preserve">For adopters, the central question is not how much to spend on AI but what the firm owns that the model cannot supply, and how long competitors will take to own it too. The theory also says that spending on the model itself is not a source of advantage, since any rival can buy the same model. For developers, the next model is the source of value, not the current one. When leads last only a few months, much of the reported loss is economic (Corollary 4). The valuations of frontier labs are best read as prices for an option on a sequence of future leads and not as capitalized current earnings. For the relationship between the two sides, Propositions 5 to 11 imply that contractual terms covering data use, fine-tuning ownership, and on-premise deployment are strategic decisions, because they affect the rate at which a vendor can productize an adopter’s use and so the adopter’s incentive to invest in the capital that generates its rent. The illustration in Table 3 suggests that such terms may be hardest to obtain for the most valuable uses, which is a reason for adopters to negotiate them before a use proves valuable and not after. Tables 4 and 5 add that, when many vendors can build the use, a clause with one supplier or a move to a neutral supplier buys little, while concealing the use keeps its effect. The adopter’s protection then comes mainly from concealment and from the difficulty of replicating the use. The tables are illustrations and not estimates.</w:t>
-      </w:r>
-    </w:p>
-    <w:bookmarkEnd w:id="49"/>
-    <w:bookmarkStart w:id="50" w:name="boundary-conditions-and-limitations"/>
-    <w:p>
-      <w:pPr>
-        <w:pStyle w:val="Heading2"/>
-      </w:pPr>
-      <w:r>
-        <w:t xml:space="preserve">7.3 Boundary conditions and limitations</w:t>
-      </w:r>
-    </w:p>
-    <w:p>
-      <w:pPr>
-        <w:pStyle w:val="FirstParagraph"/>
-      </w:pPr>
-      <w:r>
-        <w:t xml:space="preserve">The theory assumes competitive downstream product markets. Where adopters hold market power, pass-through is incomplete, and commodity LLM use can raise profit. Evidence that IT intensity accompanies rising industry concentration suggests that this case is empirically relevant (Autor et al. 2020, Bessen 2020), and it is also an alternative reading of the margin increment in H1. The theory further assumes that the developer’s lead closes. Economies of scale in compute and data flywheels could prevent closure and shift surplus durably toward the developer, and sustained developer margins without a quality lead would run against Proposition 3 and indicate that this case dominates.</w:t>
-      </w:r>
-    </w:p>
-    <w:p>
-      <w:pPr>
-        <w:pStyle w:val="BodyText"/>
-      </w:pPr>
-      <w:r>
-        <w:t xml:space="preserve">The model abstracts from uncertainty in training outcomes, from purchasable organizational capital, and from strategic interaction in the quality race itself: the lead and the catch-up lag are treated as exogenous. Section 4.4 introduces competition among vendors, but only in the race to productize a given use. Making the lead endogenous to a training race is the most natural extension, and it is where we would expect a more specifically LLM-based theory to develop. The extensions in Sections 4.3 to 4.6 are reduced-form. The productization rate is constant, vendors are symmetric apart from their access to the adopter’s data, concealment costs the adopter a fixed share of its rent, and neutral suppliers are taken as given. We also do not model vendors’ responses to concealment. Propositions 6 to 11 are not tested, because contract terms, vendor entry, concealment, and switching are not publicly observed. The empirical proxies are imperfect, and misclassification biases the estimated difference between commodity and complementary use toward zero. The adopter sample is small and made up of large software incumbents, so the results should not be generalized to adopters in other industries. Finally, the evidence is observational and covers a short period in which the technology and its business models are still changing. Prediction 1 is not tested here, and the evidence on H2 is inconclusive. The evidence reported is best viewed as a first look at the constructs, and it is not a confirmation of the theory.</w:t>
-      </w:r>
-    </w:p>
-    <w:bookmarkEnd w:id="50"/>
-    <w:bookmarkEnd w:id="51"/>
-    <w:bookmarkStart w:id="52" w:name="conclusion"/>
-    <w:p>
-      <w:pPr>
-        <w:pStyle w:val="Heading1"/>
-      </w:pPr>
-      <w:r>
-        <w:t xml:space="preserve">8. Conclusion</w:t>
-      </w:r>
-    </w:p>
-    <w:p>
-      <w:pPr>
-        <w:pStyle w:val="FirstParagraph"/>
-      </w:pPr>
-      <w:r>
-        <w:t xml:space="preserve">LLMs create value, and the theory developed here says where it goes. Adopters that use a model available to every competitor on the same terms pass their gain to consumers. The frontier developer captures a share in proportion to its quality lead, and only until a competitor closes it. Adopters that combine the model with organizational capital that rivals cannot quickly build earn a rent while the capital remains unimitated and unproductized by a vendor. The remainder goes to consumers, and statistics that pool all three positions report an average close to zero.</w:t>
-      </w:r>
-    </w:p>
-    <w:p>
-      <w:pPr>
-        <w:pStyle w:val="BodyText"/>
-      </w:pPr>
-      <w:r>
-        <w:t xml:space="preserve">The public record makes the developer half of this account visible. Frontier labs combine large booked revenue with large operating losses and pay complement owners for compute. The price of matched capability falls several-fold each year, while the cost of frontier capability rises. Investors nonetheless value the same firms as if a release sequence will continue. These three facts are consistent with a single explanation: competition over a general-purpose input whose quality lead is short and must be bought again with each release.</w:t>
-      </w:r>
-    </w:p>
-    <w:p>
-      <w:pPr>
-        <w:pStyle w:val="BodyText"/>
-      </w:pPr>
-      <w:r>
-        <w:t xml:space="preserve">The adopter half is harder to see in the data, and it is where we think the theory adds most. An adopter’s profitable window is bounded by its suppliers as well as by its competitors. How fast vendors productize a successful use depends on the contract terms that limit their access to the adopter’s data, and on how many other vendors are in a position to build the same use. Where they are many, the difficulty of replicating the use matters more than any clause. Testing these claims requires data on contract terms and vendor entry that are not now public, and making the quality race itself endogenous is the next step for the theory. The profitability puzzle that accompanies every general-purpose technology is, on this account, what competition over a common input looks like from the inside.</w:t>
-      </w:r>
-    </w:p>
-    <w:bookmarkEnd w:id="52"/>
-    <w:bookmarkStart w:id="53" w:name="appendix-a.-proofs"/>
-    <w:p>
-      <w:pPr>
-        <w:pStyle w:val="Heading1"/>
-      </w:pPr>
-      <w:r>
-        <w:t xml:space="preserve">Appendix A. Proofs</w:t>
+        <w:t xml:space="preserve">Appendix B. Proofs</w:t>
       </w:r>
     </w:p>
     <w:p>
@@ -26748,8 +26846,8 @@
         </m:r>
       </m:oMath>
     </w:p>
-    <w:bookmarkEnd w:id="53"/>
-    <w:bookmarkStart w:id="54" w:name="references"/>
+    <w:bookmarkEnd w:id="55"/>
+    <w:bookmarkStart w:id="56" w:name="references"/>
     <w:p>
       <w:pPr>
         <w:pStyle w:val="Heading1"/>
@@ -27869,7 +27967,7 @@
         <w:t xml:space="preserve">, June 16. https://www.wheresyoured.at/exclusive-openai-financials/.</w:t>
       </w:r>
     </w:p>
-    <w:bookmarkEnd w:id="54"/>
+    <w:bookmarkEnd w:id="56"/>
     <w:sectPr/>
   </w:body>
 </w:document>

</xml_diff>

<commit_message>
Revert "Move model extensions to Appendix A; add summary Section 4.3; proofs now Appendix B"
This reverts commit 5144db5ffbb4820c661777103fe340d2548aab94.
</commit_message>
<xml_diff>
--- a/isr/ISR_Who_Profits_from_LLMs.docx
+++ b/isr/ISR_Who_Profits_from_LLMs.docx
@@ -204,7 +204,7 @@
         </m:r>
       </m:oMath>
       <w:r>
-        <w:t xml:space="preserve">. The rent runs on two clocks, not one. The result is deliberately simple, and the later propositions build on it in two ways. Appendix A.1 lets the vendor choose</w:t>
+        <w:t xml:space="preserve">. The rent runs on two clocks, not one. The result is deliberately simple, and the later propositions build on it in two ways. Section 4.3 lets the vendor choose</w:t>
       </w:r>
       <w:r>
         <w:t xml:space="preserve"> </w:t>
@@ -218,7 +218,7 @@
         <w:t xml:space="preserve"> </w:t>
       </w:r>
       <w:r>
-        <w:t xml:space="preserve">and shows how contract terms that limit its use of adopters’ data change that choice and, through it, the adopter’s incentive to invest. Appendix A.2 adds competition among vendors, which speeds productization and weakens the effect of any single contract. Appendix A.3 lets adopters respond by concealing the use, which protects against all vendors at once, and Appendix A.4 lets them switch supplier, which loses its effect as vendors multiply. Together with the benchmark results for developers, adopters, and consumers (Propositions 1 to 4), these results give a fuller account of where profit appears.</w:t>
+        <w:t xml:space="preserve">and shows how contract terms that limit its use of adopters’ data change that choice and, through it, the adopter’s incentive to invest. Section 4.4 adds competition among vendors, which speeds productization and weakens the effect of any single contract. Section 4.5 lets adopters respond by concealing the use, which protects against all vendors at once, and Section 4.6 lets them switch supplier, which loses its effect as vendors multiply. Together with the benchmark results for developers, adopters, and consumers (Propositions 1 to 4), these results give a fuller account of where profit appears.</w:t>
       </w:r>
     </w:p>
     <w:p>
@@ -1055,7 +1055,7 @@
     </w:p>
     <w:bookmarkEnd w:id="30"/>
     <w:bookmarkEnd w:id="31"/>
-    <w:bookmarkStart w:id="37" w:name="model-and-propositions"/>
+    <w:bookmarkStart w:id="40" w:name="model-and-propositions"/>
     <w:p>
       <w:pPr>
         <w:pStyle w:val="Heading1"/>
@@ -2025,7 +2025,7 @@
         <w:t xml:space="preserve"> </w:t>
       </w:r>
       <w:r>
-        <w:t xml:space="preserve">is a model developer that sells to adopters. The frontier developer is one such vendor, and Appendix A also considers others. Table 2 lists the notation.</w:t>
+        <w:t xml:space="preserve">is a model developer that sells to adopters. The frontier developer is one such vendor, and Sections 4.3 and 4.4 also consider others. Table 2 lists the notation.</w:t>
       </w:r>
     </w:p>
     <w:p>
@@ -2773,7 +2773,7 @@
               <w:t xml:space="preserve"> </w:t>
             </w:r>
             <w:r>
-              <w:t xml:space="preserve">(Appendix A.1);</w:t>
+              <w:t xml:space="preserve">(Section 4.3);</w:t>
             </w:r>
             <w:r>
               <w:t xml:space="preserve"> </w:t>
@@ -2827,7 +2827,7 @@
               <w:jc w:val="left"/>
             </w:pPr>
             <w:r>
-              <w:t xml:space="preserve">Number of vendors able to productize the same use (Appendix A.2)</w:t>
+              <w:t xml:space="preserve">Number of vendors able to productize the same use (Section 4.4)</w:t>
             </w:r>
           </w:p>
         </w:tc>
@@ -2926,7 +2926,7 @@
               <w:jc w:val="left"/>
             </w:pPr>
             <w:r>
-              <w:t xml:space="preserve">Visibility of the adopter’s use to vendors; cost of concealment as a share of the rent flow per unit of concealment (Appendix A.3)</w:t>
+              <w:t xml:space="preserve">Visibility of the adopter’s use to vendors; cost of concealment as a share of the rent flow per unit of concealment (Section 4.5)</w:t>
             </w:r>
           </w:p>
         </w:tc>
@@ -3037,7 +3037,7 @@
         <w:pStyle w:val="FirstParagraph"/>
       </w:pPr>
       <w:r>
-        <w:t xml:space="preserve">Propositions 1 to 5 are stated here. Section 4.3 summarizes Propositions 6 to 11, which endogenize the productization rate, add competition among vendors, and let adopters respond by concealing the use or switching supplier. They are stated in Appendix A. All proofs are in Appendix B.</w:t>
+        <w:t xml:space="preserve">Propositions 1 to 5 are stated here. Propositions 6 to 11, which endogenize the productization rate, add competition among vendors, and let adopters respond by concealing the use or switching supplier, follow in Sections 4.3 to 4.6. All proofs are in Appendix A.</w:t>
       </w:r>
     </w:p>
     <w:p>
@@ -5064,7 +5064,7 @@
         <w:pStyle w:val="BodyText"/>
       </w:pPr>
       <w:r>
-        <w:t xml:space="preserve">Appendix A.1 repeats this result with an exponential imitation lag, which makes it possible to solve for the vendor’s choice of</w:t>
+        <w:t xml:space="preserve">Section 4.3 repeats this result with an exponential imitation lag, which makes it possible to solve for the vendor’s choice of</w:t>
       </w:r>
       <w:r>
         <w:t xml:space="preserve"> </w:t>
@@ -5079,1671 +5079,13 @@
       </w:r>
     </w:p>
     <w:bookmarkEnd w:id="33"/>
-    <w:bookmarkStart w:id="34" w:name="X7ad4551bf0dd99263865b2e757ff8ce9ebf459b"/>
+    <w:bookmarkStart w:id="34" w:name="Xb251667487cf04b98c628b0f1577ec4895e93a1"/>
     <w:p>
       <w:pPr>
         <w:pStyle w:val="Heading2"/>
       </w:pPr>
       <w:r>
-        <w:t xml:space="preserve">4.3 Extensions: encroachment, competition, and adopter responses</w:t>
-      </w:r>
-    </w:p>
-    <w:p>
-      <w:pPr>
-        <w:pStyle w:val="FirstParagraph"/>
-      </w:pPr>
-      <w:r>
-        <w:t xml:space="preserve">Proposition 5 takes the productization rate as given. Appendix A relaxes this assumption in four steps and states Propositions 6 to 11. We summarize the results here.</w:t>
-      </w:r>
-    </w:p>
-    <w:p>
-      <w:pPr>
-        <w:pStyle w:val="BodyText"/>
-      </w:pPr>
-      <w:r>
-        <w:rPr>
-          <w:iCs/>
-          <w:i/>
-        </w:rPr>
-        <w:t xml:space="preserve">Endogenous encroachment.</w:t>
-      </w:r>
-      <w:r>
-        <w:t xml:space="preserve"> </w:t>
-      </w:r>
-      <w:r>
-        <w:t xml:space="preserve">When a vendor chooses its productization rate at a convex cost, the rate rises with the value of the use and falls with the cost that contract terms impose. It also rises when rivals imitate faster, so that imitation and encroachment are strategic complements (Proposition 6). Contract terms that limit the vendor’s use of the adopter’s data therefore raise the adopter’s expected rent and widen the set of complement investments worth making (Proposition 7).</w:t>
-      </w:r>
-    </w:p>
-    <w:p>
-      <w:pPr>
-        <w:pStyle w:val="BodyText"/>
-      </w:pPr>
-      <w:r>
-        <w:rPr>
-          <w:iCs/>
-          <w:i/>
-        </w:rPr>
-        <w:t xml:space="preserve">Competition among vendors.</w:t>
-      </w:r>
-      <w:r>
-        <w:t xml:space="preserve"> </w:t>
-      </w:r>
-      <w:r>
-        <w:t xml:space="preserve">When several vendors race to productize the same use, the equilibrium is unique. The rate of each vendor and the total rate rise with the number of vendors, and each vendor’s payoff falls (Proposition 8). A protection clause with the adopter’s own supplier lowers the total rate, but it removes only that supplier’s marginal contribution to the race, so its proportional effect vanishes as vendors multiply (Proposition 9).</w:t>
-      </w:r>
-    </w:p>
-    <w:p>
-      <w:pPr>
-        <w:pStyle w:val="BodyText"/>
-      </w:pPr>
-      <w:r>
-        <w:rPr>
-          <w:iCs/>
-          <w:i/>
-        </w:rPr>
-        <w:t xml:space="preserve">Adopter responses.</w:t>
-      </w:r>
-      <w:r>
-        <w:t xml:space="preserve"> </w:t>
-      </w:r>
-      <w:r>
-        <w:t xml:space="preserve">Concealing the use raises the cost of productizing for all vendors at once. Its proportional effect stays bounded away from zero as vendors multiply, and it is worthwhile when its cost is low relative to the threat (Proposition 10). Switching to a neutral supplier shares the weakness of a contract, because its effect also vanishes as vendors multiply (Proposition 11).</w:t>
-      </w:r>
-    </w:p>
-    <w:p>
-      <w:pPr>
-        <w:pStyle w:val="BodyText"/>
-      </w:pPr>
-      <w:r>
-        <w:t xml:space="preserve">Three conclusions follow. First, the profitable window of a complement builder depends on its suppliers as well as on its competitors. Second, protection that rests on a single counterparty weakens as the market for a use becomes crowded. Third, in a crowded market the adopter’s protection comes mainly from concealment and from the difficulty of replicating the use, which is why the organizational capital of Section 3 matters. The extensions are reduced-form, and Appendix A states their limits. Tables A1 to A3 in that appendix give numerical illustrations. The propositions are not tested with the data in Section 6.</w:t>
-      </w:r>
-    </w:p>
-    <w:bookmarkEnd w:id="34"/>
-    <w:bookmarkStart w:id="35" w:name="comparative-statics"/>
-    <w:p>
-      <w:pPr>
-        <w:pStyle w:val="Heading2"/>
-      </w:pPr>
-      <w:r>
-        <w:t xml:space="preserve">4.4 Comparative statics</w:t>
-      </w:r>
-    </w:p>
-    <w:p>
-      <w:pPr>
-        <w:pStyle w:val="FirstParagraph"/>
-      </w:pPr>
-      <w:r>
-        <w:t xml:space="preserve">Nine predictions follow from the propositions. The empirical work in Sections 5 and 6 can address only the first three.</w:t>
-      </w:r>
-    </w:p>
-    <w:p>
-      <w:pPr>
-        <w:numPr>
-          <w:ilvl w:val="0"/>
-          <w:numId w:val="1001"/>
-        </w:numPr>
-        <w:pStyle w:val="Compact"/>
-      </w:pPr>
-      <w:r>
-        <w:t xml:space="preserve">Realized developer prices for inference rise with</w:t>
-      </w:r>
-      <w:r>
-        <w:t xml:space="preserve"> </w:t>
-      </w:r>
-      <m:oMath>
-        <m:r>
-          <m:t>Δ</m:t>
-        </m:r>
-        <m:r>
-          <m:t>θ</m:t>
-        </m:r>
-      </m:oMath>
-      <w:r>
-        <w:t xml:space="preserve"> </w:t>
-      </w:r>
-      <w:r>
-        <w:t xml:space="preserve">and fall toward serving cost as</w:t>
-      </w:r>
-      <w:r>
-        <w:t xml:space="preserve"> </w:t>
-      </w:r>
-      <m:oMath>
-        <m:r>
-          <m:t>Δ</m:t>
-        </m:r>
-        <m:r>
-          <m:t>θ</m:t>
-        </m:r>
-        <m:r>
-          <m:rPr>
-            <m:sty m:val="p"/>
-          </m:rPr>
-          <m:t>→</m:t>
-        </m:r>
-        <m:r>
-          <m:t>0</m:t>
-        </m:r>
-      </m:oMath>
-      <w:r>
-        <w:t xml:space="preserve"> </w:t>
-      </w:r>
-      <w:r>
-        <w:t xml:space="preserve">(Proposition 3).</w:t>
-      </w:r>
-    </w:p>
-    <w:p>
-      <w:pPr>
-        <w:numPr>
-          <w:ilvl w:val="0"/>
-          <w:numId w:val="1001"/>
-        </w:numPr>
-        <w:pStyle w:val="Compact"/>
-      </w:pPr>
-      <w:r>
-        <w:t xml:space="preserve">Developer rent is shortened by open-weight releases, compressed release intervals, and falling serving cost (Proposition 3 and Corollary 3).</w:t>
-      </w:r>
-    </w:p>
-    <w:p>
-      <w:pPr>
-        <w:numPr>
-          <w:ilvl w:val="0"/>
-          <w:numId w:val="1001"/>
-        </w:numPr>
-        <w:pStyle w:val="Compact"/>
-      </w:pPr>
-      <w:r>
-        <w:t xml:space="preserve">Adopter-side profit is predicted by a dated first-party product, which proxies</w:t>
-      </w:r>
-      <w:r>
-        <w:t xml:space="preserve"> </w:t>
-      </w:r>
-      <m:oMath>
-        <m:r>
-          <m:t>O</m:t>
-        </m:r>
-        <m:r>
-          <m:rPr>
-            <m:sty m:val="p"/>
-          </m:rPr>
-          <m:t>&gt;</m:t>
-        </m:r>
-        <m:r>
-          <m:t>0</m:t>
-        </m:r>
-      </m:oMath>
-      <w:r>
-        <w:t xml:space="preserve">, and not by pooled exposure to LLMs (Propositions 1 and 2).</w:t>
-      </w:r>
-    </w:p>
-    <w:p>
-      <w:pPr>
-        <w:numPr>
-          <w:ilvl w:val="0"/>
-          <w:numId w:val="1001"/>
-        </w:numPr>
-        <w:pStyle w:val="Compact"/>
-      </w:pPr>
-      <w:r>
-        <w:t xml:space="preserve">Industries with shorter</w:t>
-      </w:r>
-      <w:r>
-        <w:t xml:space="preserve"> </w:t>
-      </w:r>
-      <m:oMath>
-        <m:sSub>
-          <m:e>
-            <m:r>
-              <m:t>τ</m:t>
-            </m:r>
-          </m:e>
-          <m:sub>
-            <m:r>
-              <m:t>O</m:t>
-            </m:r>
-          </m:sub>
-        </m:sSub>
-      </m:oMath>
-      <w:r>
-        <w:t xml:space="preserve">, or with more vendor encroachment, show weaker associations between AI use and profit (Propositions 2 and 5).</w:t>
-      </w:r>
-    </w:p>
-    <w:p>
-      <w:pPr>
-        <w:numPr>
-          <w:ilvl w:val="0"/>
-          <w:numId w:val="1001"/>
-        </w:numPr>
-        <w:pStyle w:val="Compact"/>
-      </w:pPr>
-      <w:r>
-        <w:t xml:space="preserve">As downstream competition intensifies, the AI–profit association weakens while the AI–productivity association is unaffected (Propositions 1 and 4).</w:t>
-      </w:r>
-    </w:p>
-    <w:p>
-      <w:pPr>
-        <w:numPr>
-          <w:ilvl w:val="0"/>
-          <w:numId w:val="1001"/>
-        </w:numPr>
-        <w:pStyle w:val="Compact"/>
-      </w:pPr>
-      <w:r>
-        <w:t xml:space="preserve">Adopters invest more in co-specialized capital when contract terms limit vendors’ use of their data (Propositions 6 and 7).</w:t>
-      </w:r>
-    </w:p>
-    <w:p>
-      <w:pPr>
-        <w:numPr>
-          <w:ilvl w:val="0"/>
-          <w:numId w:val="1001"/>
-        </w:numPr>
-        <w:pStyle w:val="Compact"/>
-      </w:pPr>
-      <w:r>
-        <w:t xml:space="preserve">The effect of a clause with one supplier weakens as the number of vendors able to build the same use grows (Propositions 8 and 9 and Tables A2 and A3).</w:t>
-      </w:r>
-    </w:p>
-    <w:p>
-      <w:pPr>
-        <w:numPr>
-          <w:ilvl w:val="0"/>
-          <w:numId w:val="1001"/>
-        </w:numPr>
-        <w:pStyle w:val="Compact"/>
-      </w:pPr>
-      <w:r>
-        <w:t xml:space="preserve">Adopters conceal valuable uses when concealment is cheap relative to the threat of encroachment, and concealment retains its effect as vendors multiply (Proposition 10 and Table A3).</w:t>
-      </w:r>
-    </w:p>
-    <w:p>
-      <w:pPr>
-        <w:numPr>
-          <w:ilvl w:val="0"/>
-          <w:numId w:val="1001"/>
-        </w:numPr>
-        <w:pStyle w:val="Compact"/>
-      </w:pPr>
-      <w:r>
-        <w:t xml:space="preserve">Adopters switch to neutral suppliers only when the supplier’s advantage from seeing the use is large relative to the cost of switching, and switching loses its effect as vendors multiply (Proposition 11 and Table A3).</w:t>
-      </w:r>
-    </w:p>
-    <w:p>
-      <w:pPr>
-        <w:pStyle w:val="FirstParagraph"/>
-      </w:pPr>
-      <w:r>
-        <w:t xml:space="preserve">Predictions 4 to 9 are not tested here. Predictions 6 to 9 bear directly on managerial choices about data-use terms and fine-tuning ownership, which we take up in Section 7, but they cannot be examined with public data because contract terms are not observed.</w:t>
-      </w:r>
-    </w:p>
-    <w:bookmarkEnd w:id="35"/>
-    <w:bookmarkStart w:id="36" w:name="what-is-specific-to-llms"/>
-    <w:p>
-      <w:pPr>
-        <w:pStyle w:val="Heading2"/>
-      </w:pPr>
-      <w:r>
-        <w:t xml:space="preserve">4.5 What is specific to LLMs</w:t>
-      </w:r>
-    </w:p>
-    <w:p>
-      <w:pPr>
-        <w:pStyle w:val="FirstParagraph"/>
-      </w:pPr>
-      <w:r>
-        <w:t xml:space="preserve">A fair question is whether anything in the model is specific to LLMs, or whether the same propositions would describe any layered technology market. The structure is general. What is specific is the combination of values and measurement conditions that LLMs bring to it. Marginal inference cost</w:t>
-      </w:r>
-      <w:r>
-        <w:t xml:space="preserve"> </w:t>
-      </w:r>
-      <m:oMath>
-        <m:r>
-          <m:t>m</m:t>
-        </m:r>
-      </m:oMath>
-      <w:r>
-        <w:t xml:space="preserve"> </w:t>
-      </w:r>
-      <w:r>
-        <w:t xml:space="preserve">is low relative to the cost</w:t>
-      </w:r>
-      <w:r>
-        <w:t xml:space="preserve"> </w:t>
-      </w:r>
-      <m:oMath>
-        <m:sSub>
-          <m:e>
-            <m:r>
-              <m:t>F</m:t>
-            </m:r>
-          </m:e>
-          <m:sub>
-            <m:r>
-              <m:t>T</m:t>
-            </m:r>
-          </m:sub>
-        </m:sSub>
-      </m:oMath>
-      <w:r>
-        <w:t xml:space="preserve"> </w:t>
-      </w:r>
-      <w:r>
-        <w:t xml:space="preserve">of producing a frontier model, so profit depends almost entirely on the premium</w:t>
-      </w:r>
-      <w:r>
-        <w:t xml:space="preserve"> </w:t>
-      </w:r>
-      <m:oMath>
-        <m:r>
-          <m:t>κ</m:t>
-        </m:r>
-        <m:r>
-          <m:t>Δ</m:t>
-        </m:r>
-        <m:r>
-          <m:t>θ</m:t>
-        </m:r>
-      </m:oMath>
-      <w:r>
-        <w:t xml:space="preserve">. The catch-up lag</w:t>
-      </w:r>
-      <w:r>
-        <w:t xml:space="preserve"> </w:t>
-      </w:r>
-      <m:oMath>
-        <m:sSub>
-          <m:e>
-            <m:r>
-              <m:t>τ</m:t>
-            </m:r>
-          </m:e>
-          <m:sub>
-            <m:r>
-              <m:rPr>
-                <m:nor/>
-                <m:sty m:val="p"/>
-              </m:rPr>
-              <m:t>dev</m:t>
-            </m:r>
-          </m:sub>
-        </m:sSub>
-      </m:oMath>
-      <w:r>
-        <w:t xml:space="preserve"> </w:t>
-      </w:r>
-      <w:r>
-        <w:t xml:space="preserve">is short, about three to four months for open-weight models relative to the closed frontier (Emberson 2025, Epoch AI 2026), which places the developer close to the zero-rent corner of Proposition 3. The same model serves the complement builder and its competitors on posted terms, which is what makes the adopter’s position commodity-like in the first place. And vendors can and do move into the complement layer, which is the situation Propositions 5 to 11 describe: the productization rate is chosen by vendors, shaped by contract terms, and driven up by competition among them. In this sense the theory is less a new mechanism than a calibration of known mechanisms to a market in which the state variables can be observed. We return to the limits of this claim in Section 7.3.</w:t>
-      </w:r>
-    </w:p>
-    <w:bookmarkEnd w:id="36"/>
-    <w:bookmarkEnd w:id="37"/>
-    <w:bookmarkStart w:id="40" w:name="empirical-counterparts-and-implications"/>
-    <w:p>
-      <w:pPr>
-        <w:pStyle w:val="Heading1"/>
-      </w:pPr>
-      <w:r>
-        <w:t xml:space="preserve">5. Empirical Counterparts and Implications</w:t>
-      </w:r>
-    </w:p>
-    <w:bookmarkStart w:id="38" w:name="mapping-model-objects-to-data"/>
-    <w:p>
-      <w:pPr>
-        <w:pStyle w:val="Heading2"/>
-      </w:pPr>
-      <w:r>
-        <w:t xml:space="preserve">5.1 Mapping model objects to data</w:t>
-      </w:r>
-    </w:p>
-    <w:p>
-      <w:pPr>
-        <w:pStyle w:val="FirstParagraph"/>
-      </w:pPr>
-      <w:r>
-        <w:t xml:space="preserve">Table 3 assigns each object of the model an empirical counterpart in public data. The mapping is interpretive. We do not recover structural parameters, and the figures in Table 1 are not regression inputs.</w:t>
-      </w:r>
-    </w:p>
-    <w:p>
-      <w:pPr>
-        <w:pStyle w:val="BodyText"/>
-      </w:pPr>
-      <w:r>
-        <w:rPr>
-          <w:bCs/>
-          <w:b/>
-        </w:rPr>
-        <w:t xml:space="preserve">Table 3. Model objects and empirical counterparts</w:t>
-      </w:r>
-    </w:p>
-    <w:tbl>
-      <w:tblPr>
-        <w:tblStyle w:val="Table"/>
-        <w:tblW w:type="pct" w:w="5000"/>
-        <w:tblLook w:firstRow="1" w:lastRow="0" w:firstColumn="0" w:lastColumn="0" w:noHBand="0" w:noVBand="0" w:val="0020"/>
-        <w:jc w:val="start"/>
-      </w:tblPr>
-      <w:tblGrid>
-        <w:gridCol w:w="2640"/>
-        <w:gridCol w:w="2640"/>
-        <w:gridCol w:w="2640"/>
-      </w:tblGrid>
-      <w:tr>
-        <w:trPr>
-          <w:tblHeader w:val="true"/>
-        </w:trPr>
-        <w:tc>
-          <w:tcPr/>
-          <w:p>
-            <w:pPr>
-              <w:pStyle w:val="Compact"/>
-              <w:jc w:val="left"/>
-            </w:pPr>
-            <w:r>
-              <w:t xml:space="preserve">Model object</w:t>
-            </w:r>
-          </w:p>
-        </w:tc>
-        <w:tc>
-          <w:tcPr/>
-          <w:p>
-            <w:pPr>
-              <w:pStyle w:val="Compact"/>
-              <w:jc w:val="left"/>
-            </w:pPr>
-            <w:r>
-              <w:t xml:space="preserve">Empirical counterpart</w:t>
-            </w:r>
-          </w:p>
-        </w:tc>
-        <w:tc>
-          <w:tcPr/>
-          <w:p>
-            <w:pPr>
-              <w:pStyle w:val="Compact"/>
-              <w:jc w:val="left"/>
-            </w:pPr>
-            <w:r>
-              <w:t xml:space="preserve">Source</w:t>
-            </w:r>
-          </w:p>
-        </w:tc>
-      </w:tr>
-      <w:tr>
-        <w:tc>
-          <w:tcPr/>
-          <w:p>
-            <w:pPr>
-              <w:pStyle w:val="Compact"/>
-              <w:jc w:val="left"/>
-            </w:pPr>
-            <m:oMath>
-              <m:r>
-                <m:t>Δ</m:t>
-              </m:r>
-              <m:r>
-                <m:t>θ</m:t>
-              </m:r>
-            </m:oMath>
-          </w:p>
-        </w:tc>
-        <w:tc>
-          <w:tcPr/>
-          <w:p>
-            <w:pPr>
-              <w:pStyle w:val="Compact"/>
-              <w:jc w:val="left"/>
-            </w:pPr>
-            <w:r>
-              <w:t xml:space="preserve">Gap between the top-ranked and second-ranked lab on the Arena overall leaderboard</w:t>
-            </w:r>
-          </w:p>
-        </w:tc>
-        <w:tc>
-          <w:tcPr/>
-          <w:p>
-            <w:pPr>
-              <w:pStyle w:val="Compact"/>
-              <w:jc w:val="left"/>
-            </w:pPr>
-            <w:r>
-              <w:t xml:space="preserve">Chiang et al. (2024)</w:t>
-            </w:r>
-          </w:p>
-        </w:tc>
-      </w:tr>
-      <w:tr>
-        <w:tc>
-          <w:tcPr/>
-          <w:p>
-            <w:pPr>
-              <w:pStyle w:val="Compact"/>
-              <w:jc w:val="left"/>
-            </w:pPr>
-            <m:oMath>
-              <m:r>
-                <m:t>κ</m:t>
-              </m:r>
-              <m:r>
-                <m:t>Δ</m:t>
-              </m:r>
-              <m:r>
-                <m:t>θ</m:t>
-              </m:r>
-            </m:oMath>
-          </w:p>
-        </w:tc>
-        <w:tc>
-          <w:tcPr/>
-          <w:p>
-            <w:pPr>
-              <w:pStyle w:val="Compact"/>
-              <w:jc w:val="left"/>
-            </w:pPr>
-            <w:r>
-              <w:t xml:space="preserve">Provider-mean blended flagship inference price, not a GAAP margin</w:t>
-            </w:r>
-          </w:p>
-        </w:tc>
-        <w:tc>
-          <w:tcPr/>
-          <w:p>
-            <w:pPr>
-              <w:pStyle w:val="Compact"/>
-              <w:jc w:val="left"/>
-            </w:pPr>
-            <w:r>
-              <w:t xml:space="preserve">OpenRouter (2026)</w:t>
-            </w:r>
-          </w:p>
-        </w:tc>
-      </w:tr>
-      <w:tr>
-        <w:tc>
-          <w:tcPr/>
-          <w:p>
-            <w:pPr>
-              <w:pStyle w:val="Compact"/>
-              <w:jc w:val="left"/>
-            </w:pPr>
-            <m:oMath>
-              <m:sSub>
-                <m:e>
-                  <m:r>
-                    <m:t>τ</m:t>
-                  </m:r>
-                </m:e>
-                <m:sub>
-                  <m:r>
-                    <m:rPr>
-                      <m:nor/>
-                      <m:sty m:val="p"/>
-                    </m:rPr>
-                    <m:t>dev</m:t>
-                  </m:r>
-                </m:sub>
-              </m:sSub>
-            </m:oMath>
-          </w:p>
-        </w:tc>
-        <w:tc>
-          <w:tcPr/>
-          <w:p>
-            <w:pPr>
-              <w:pStyle w:val="Compact"/>
-              <w:jc w:val="left"/>
-            </w:pPr>
-            <w:r>
-              <w:t xml:space="preserve">Time from a frontier release to the first competitor release matching its score</w:t>
-            </w:r>
-          </w:p>
-        </w:tc>
-        <w:tc>
-          <w:tcPr/>
-          <w:p>
-            <w:pPr>
-              <w:pStyle w:val="Compact"/>
-              <w:jc w:val="left"/>
-            </w:pPr>
-            <w:r>
-              <w:t xml:space="preserve">Arena series</w:t>
-            </w:r>
-          </w:p>
-        </w:tc>
-      </w:tr>
-      <w:tr>
-        <w:tc>
-          <w:tcPr/>
-          <w:p>
-            <w:pPr>
-              <w:pStyle w:val="Compact"/>
-              <w:jc w:val="left"/>
-            </w:pPr>
-            <m:oMath>
-              <m:r>
-                <m:t>φ</m:t>
-              </m:r>
-              <m:d>
-                <m:dPr>
-                  <m:begChr m:val="("/>
-                  <m:endChr m:val=")"/>
-                  <m:sepChr m:val=""/>
-                  <m:grow/>
-                </m:dPr>
-                <m:e>
-                  <m:r>
-                    <m:t>L</m:t>
-                  </m:r>
-                  <m:r>
-                    <m:rPr>
-                      <m:sty m:val="p"/>
-                    </m:rPr>
-                    <m:t>,</m:t>
-                  </m:r>
-                  <m:r>
-                    <m:t>O</m:t>
-                  </m:r>
-                </m:e>
-              </m:d>
-            </m:oMath>
-            <w:r>
-              <w:t xml:space="preserve"> </w:t>
-            </w:r>
-            <w:r>
-              <w:t xml:space="preserve">with</w:t>
-            </w:r>
-            <w:r>
-              <w:t xml:space="preserve"> </w:t>
-            </w:r>
-            <m:oMath>
-              <m:sSub>
-                <m:e>
-                  <m:r>
-                    <m:t>O</m:t>
-                  </m:r>
-                </m:e>
-                <m:sub>
-                  <m:r>
-                    <m:t>j</m:t>
-                  </m:r>
-                </m:sub>
-              </m:sSub>
-              <m:r>
-                <m:rPr>
-                  <m:sty m:val="p"/>
-                </m:rPr>
-                <m:t>&gt;</m:t>
-              </m:r>
-              <m:r>
-                <m:t>0</m:t>
-              </m:r>
-            </m:oMath>
-          </w:p>
-        </w:tc>
-        <w:tc>
-          <w:tcPr/>
-          <w:p>
-            <w:pPr>
-              <w:pStyle w:val="Compact"/>
-              <w:jc w:val="left"/>
-            </w:pPr>
-            <w:r>
-              <w:t xml:space="preserve">Dated general-availability (GA) year of a first-party AI product</w:t>
-            </w:r>
-          </w:p>
-        </w:tc>
-        <w:tc>
-          <w:tcPr/>
-          <w:p>
-            <w:pPr>
-              <w:pStyle w:val="Compact"/>
-              <w:jc w:val="left"/>
-            </w:pPr>
-            <w:r>
-              <w:t xml:space="preserve">Hand-coded from public product dates</w:t>
-            </w:r>
-          </w:p>
-        </w:tc>
-      </w:tr>
-      <w:tr>
-        <w:tc>
-          <w:tcPr/>
-          <w:p>
-            <w:pPr>
-              <w:pStyle w:val="Compact"/>
-              <w:jc w:val="left"/>
-            </w:pPr>
-            <m:oMath>
-              <m:sSub>
-                <m:e>
-                  <m:r>
-                    <m:t>O</m:t>
-                  </m:r>
-                </m:e>
-                <m:sub>
-                  <m:r>
-                    <m:t>j</m:t>
-                  </m:r>
-                </m:sub>
-              </m:sSub>
-              <m:r>
-                <m:rPr>
-                  <m:sty m:val="p"/>
-                </m:rPr>
-                <m:t>=</m:t>
-              </m:r>
-              <m:r>
-                <m:t>0</m:t>
-              </m:r>
-            </m:oMath>
-          </w:p>
-        </w:tc>
-        <w:tc>
-          <w:tcPr/>
-          <w:p>
-            <w:pPr>
-              <w:pStyle w:val="Compact"/>
-              <w:jc w:val="left"/>
-            </w:pPr>
-            <w:r>
-              <w:t xml:space="preserve">Pooled API use or mention without a coded GA year</w:t>
-            </w:r>
-          </w:p>
-        </w:tc>
-        <w:tc>
-          <w:tcPr/>
-          <w:p>
-            <w:pPr>
-              <w:pStyle w:val="Compact"/>
-              <w:jc w:val="left"/>
-            </w:pPr>
-            <w:r>
-              <w:t xml:space="preserve">SEC filings</w:t>
-            </w:r>
-          </w:p>
-        </w:tc>
-      </w:tr>
-      <w:tr>
-        <w:tc>
-          <w:tcPr/>
-          <w:p>
-            <w:pPr>
-              <w:pStyle w:val="Compact"/>
-              <w:jc w:val="left"/>
-            </w:pPr>
-            <w:r>
-              <w:t xml:space="preserve">Adopter profit</w:t>
-            </w:r>
-          </w:p>
-        </w:tc>
-        <w:tc>
-          <w:tcPr/>
-          <w:p>
-            <w:pPr>
-              <w:pStyle w:val="Compact"/>
-              <w:jc w:val="left"/>
-            </w:pPr>
-            <w:r>
-              <w:t xml:space="preserve">Operating margin</w:t>
-            </w:r>
-          </w:p>
-        </w:tc>
-        <w:tc>
-          <w:tcPr/>
-          <w:p>
-            <w:pPr>
-              <w:pStyle w:val="Compact"/>
-              <w:jc w:val="left"/>
-            </w:pPr>
-            <w:r>
-              <w:t xml:space="preserve">SEC EDGAR XBRL company facts</w:t>
-            </w:r>
-          </w:p>
-        </w:tc>
-      </w:tr>
-      <w:tr>
-        <w:tc>
-          <w:tcPr/>
-          <w:p>
-            <w:pPr>
-              <w:pStyle w:val="Compact"/>
-              <w:jc w:val="left"/>
-            </w:pPr>
-            <w:r>
-              <w:t xml:space="preserve">Compute payments</w:t>
-            </w:r>
-          </w:p>
-        </w:tc>
-        <w:tc>
-          <w:tcPr/>
-          <w:p>
-            <w:pPr>
-              <w:pStyle w:val="Compact"/>
-              <w:jc w:val="left"/>
-            </w:pPr>
-            <w:r>
-              <w:t xml:space="preserve">Factor payment outside the three-way split</w:t>
-            </w:r>
-          </w:p>
-        </w:tc>
-        <w:tc>
-          <w:tcPr/>
-          <w:p>
-            <w:pPr>
-              <w:pStyle w:val="Compact"/>
-              <w:jc w:val="left"/>
-            </w:pPr>
-            <w:r>
-              <w:t xml:space="preserve">Table 1 (illustrative)</w:t>
-            </w:r>
-          </w:p>
-        </w:tc>
-      </w:tr>
-      <w:tr>
-        <w:tc>
-          <w:tcPr/>
-          <w:p>
-            <w:pPr>
-              <w:pStyle w:val="Compact"/>
-              <w:jc w:val="left"/>
-            </w:pPr>
-            <m:oMath>
-              <m:r>
-                <m:t>η</m:t>
-              </m:r>
-            </m:oMath>
-            <w:r>
-              <w:t xml:space="preserve">,</w:t>
-            </w:r>
-            <w:r>
-              <w:t xml:space="preserve"> </w:t>
-            </w:r>
-            <m:oMath>
-              <m:r>
-                <m:t>s</m:t>
-              </m:r>
-            </m:oMath>
-            <w:r>
-              <w:t xml:space="preserve">,</w:t>
-            </w:r>
-            <w:r>
-              <w:t xml:space="preserve"> </w:t>
-            </w:r>
-            <m:oMath>
-              <m:r>
-                <m:t>N</m:t>
-              </m:r>
-            </m:oMath>
-          </w:p>
-        </w:tc>
-        <w:tc>
-          <w:tcPr/>
-          <w:p>
-            <w:pPr>
-              <w:pStyle w:val="Compact"/>
-              <w:jc w:val="left"/>
-            </w:pPr>
-            <w:r>
-              <w:t xml:space="preserve">No public counterpart (contract terms and vendor entry are not observed)</w:t>
-            </w:r>
-          </w:p>
-        </w:tc>
-        <w:tc>
-          <w:tcPr/>
-          <w:p>
-            <w:pPr>
-              <w:pStyle w:val="Compact"/>
-              <w:jc w:val="left"/>
-            </w:pPr>
-            <w:r>
-              <w:t xml:space="preserve">n/a</w:t>
-            </w:r>
-          </w:p>
-        </w:tc>
-      </w:tr>
-    </w:tbl>
-    <w:bookmarkEnd w:id="38"/>
-    <w:bookmarkStart w:id="39" w:name="empirical-implications"/>
-    <w:p>
-      <w:pPr>
-        <w:pStyle w:val="Heading2"/>
-      </w:pPr>
-      <w:r>
-        <w:t xml:space="preserve">5.2 Empirical implications</w:t>
-      </w:r>
-    </w:p>
-    <w:p>
-      <w:pPr>
-        <w:pStyle w:val="FirstParagraph"/>
-      </w:pPr>
-      <w:r>
-        <w:t xml:space="preserve">Prediction 3 of Section 4.4 and the transience of complement rents (Corollary 2) yield two hypotheses about adopters.</w:t>
-      </w:r>
-    </w:p>
-    <w:p>
-      <w:pPr>
-        <w:pStyle w:val="BodyText"/>
-      </w:pPr>
-      <w:r>
-        <w:rPr>
-          <w:bCs/>
-          <w:b/>
-        </w:rPr>
-        <w:t xml:space="preserve">H1.</w:t>
-      </w:r>
-      <w:r>
-        <w:t xml:space="preserve"> </w:t>
-      </w:r>
-      <w:r>
-        <w:t xml:space="preserve">Firms that ship a dated first-party AI product earn a higher operating margin after the GA year than before, relative to firms with no such product. Treatment is the calendar year of GA, not a time-invariant indicator. Examples are Copilot for Microsoft 365, Firefly, Now Assist, Cortex, AIP, watsonx, and Charlotte AI (all 2023), and Gemini for Workspace, Agentforce, and Bits AI (all 2024), together with analogues.</w:t>
-      </w:r>
-    </w:p>
-    <w:p>
-      <w:pPr>
-        <w:pStyle w:val="BodyText"/>
-      </w:pPr>
-      <w:r>
-        <w:rPr>
-          <w:bCs/>
-          <w:b/>
-        </w:rPr>
-        <w:t xml:space="preserve">H2.</w:t>
-      </w:r>
-      <w:r>
-        <w:t xml:space="preserve"> </w:t>
-      </w:r>
-      <w:r>
-        <w:t xml:space="preserve">The within-firm margin increment after GA declines as event time lengthens. The hypothesis is disconfirmed by a flat or rising post-GA path, or by a difference between the first post-GA year and the last post-GA bin that cannot be distinguished from zero.</w:t>
-      </w:r>
-    </w:p>
-    <w:p>
-      <w:pPr>
-        <w:pStyle w:val="BodyText"/>
-      </w:pPr>
-      <w:r>
-        <w:t xml:space="preserve">We do not state the developer-side predictions (1 and 2) as hypotheses, because testing them properly requires a model-month panel and release-level launch prices that we do not have. Section 6.1 reports a lab-month association related to prediction 1 as descriptive evidence. Predictions 4 to 9 concern industry variation, contract terms, vendor entry, concealment, and switching, none of which public data capture.</w:t>
-      </w:r>
-    </w:p>
-    <w:bookmarkEnd w:id="39"/>
-    <w:bookmarkEnd w:id="40"/>
-    <w:bookmarkStart w:id="44" w:name="illustrative-evidence"/>
-    <w:p>
-      <w:pPr>
-        <w:pStyle w:val="Heading1"/>
-      </w:pPr>
-      <w:r>
-        <w:t xml:space="preserve">6. Illustrative Evidence</w:t>
-      </w:r>
-    </w:p>
-    <w:p>
-      <w:pPr>
-        <w:pStyle w:val="FirstParagraph"/>
-      </w:pPr>
-      <w:r>
-        <w:t xml:space="preserve">This section relates the constructs of Section 5 to public data. It does not test the theory: the samples are small, the proxies are coarse, and several hypotheses go untested. Its purpose is to show that the constructs can be measured and to see whether the data are consistent with the predictions.</w:t>
-      </w:r>
-    </w:p>
-    <w:p>
-      <w:pPr>
-        <w:pStyle w:val="BodyText"/>
-      </w:pPr>
-      <w:r>
-        <w:t xml:space="preserve">The developer panel combines Arena overall leaderboard snapshots (Chiang et al. 2024) with OpenRouter endpoint prices (OpenRouter 2026). It contains 171 lab-months with a price. Of these, 102 have at least one live endpoint, and the remaining 69 rely on the list-price fallback. The adopter panel comes from SEC EDGAR XBRL company facts (SEC 2026) and covers 81 firms and 520 firm-years, with staggered GA-year treatment for 21 firms. We coded the GA years by hand from public product dates.</w:t>
-      </w:r>
-    </w:p>
-    <w:bookmarkStart w:id="41" w:name="developer-side"/>
-    <w:p>
-      <w:pPr>
-        <w:pStyle w:val="Heading2"/>
-      </w:pPr>
-      <w:r>
-        <w:t xml:space="preserve">6.1 Developer side</w:t>
-      </w:r>
-    </w:p>
-    <w:p>
-      <w:pPr>
-        <w:pStyle w:val="FirstParagraph"/>
-      </w:pPr>
-      <w:r>
-        <w:rPr>
-          <w:iCs/>
-          <w:i/>
-        </w:rPr>
-        <w:t xml:space="preserve">Lab-month association.</w:t>
-      </w:r>
-      <w:r>
-        <w:t xml:space="preserve"> </w:t>
-      </w:r>
-      <w:r>
-        <w:t xml:space="preserve">We regress log realized flagship price on the lab’s lead, with lab fixed effects and a trend. The coefficient is 0.0099 on the 171 lab-months that include the list-price fallback and 0.0068 on the 102 months with at least one live endpoint. Conventional clustered p-values are below 0.001 and 0.017, respectively. With so few lab clusters, these p-values probably overstate precision (Cameron et al. 2008), so we regard the estimates as suggestive. A first-difference cut on an older list-price snapshot series (</w:t>
-      </w:r>
-      <m:oMath>
-        <m:r>
-          <m:t>N</m:t>
-        </m:r>
-        <m:r>
-          <m:rPr>
-            <m:sty m:val="p"/>
-          </m:rPr>
-          <m:t>=</m:t>
-        </m:r>
-        <m:r>
-          <m:t>1</m:t>
-        </m:r>
-        <m:r>
-          <m:rPr>
-            <m:sty m:val="p"/>
-          </m:rPr>
-          <m:t>,</m:t>
-        </m:r>
-        <m:r>
-          <m:t>190</m:t>
-        </m:r>
-      </m:oMath>
-      <w:r>
-        <w:t xml:space="preserve">) gives a coefficient of 0.0049 (p = 0.081). We read it as directional only.</w:t>
-      </w:r>
-    </w:p>
-    <w:p>
-      <w:pPr>
-        <w:pStyle w:val="BodyText"/>
-      </w:pPr>
-      <w:r>
-        <w:rPr>
-          <w:iCs/>
-          <w:i/>
-        </w:rPr>
-        <w:t xml:space="preserve">What the lab-month estimates do not show.</w:t>
-      </w:r>
-      <w:r>
-        <w:t xml:space="preserve"> </w:t>
-      </w:r>
-      <w:r>
-        <w:t xml:space="preserve">New releases drive most of the identifying variation, so the estimates do not isolate the premium on a given model. They are associations between a lab’s lead and its flagship price and not tests of prediction 1, which concerns the price of a given model. A test needs a model-month panel and a release-level panel of launch prices, which we do not estimate here.</w:t>
-      </w:r>
-    </w:p>
-    <w:bookmarkEnd w:id="41"/>
-    <w:bookmarkStart w:id="42" w:name="adopter-side"/>
-    <w:p>
-      <w:pPr>
-        <w:pStyle w:val="Heading2"/>
-      </w:pPr>
-      <w:r>
-        <w:t xml:space="preserve">6.2 Adopter side</w:t>
-      </w:r>
-    </w:p>
-    <w:p>
-      <w:pPr>
-        <w:pStyle w:val="FirstParagraph"/>
-      </w:pPr>
-      <w:r>
-        <w:rPr>
-          <w:iCs/>
-          <w:i/>
-        </w:rPr>
-        <w:t xml:space="preserve">H1.</w:t>
-      </w:r>
-      <w:r>
-        <w:t xml:space="preserve"> </w:t>
-      </w:r>
-      <w:r>
-        <w:t xml:space="preserve">We regress operating margin on a post-GA indicator with firm and year fixed effects and standard errors clustered by firm. The post-GA margin increment is 5.3 percentage points (</w:t>
-      </w:r>
-      <m:oMath>
-        <m:r>
-          <m:t>β</m:t>
-        </m:r>
-        <m:r>
-          <m:rPr>
-            <m:sty m:val="p"/>
-          </m:rPr>
-          <m:t>=</m:t>
-        </m:r>
-        <m:r>
-          <m:t>0.053</m:t>
-        </m:r>
-      </m:oMath>
-      <w:r>
-        <w:t xml:space="preserve">,</w:t>
-      </w:r>
-      <w:r>
-        <w:t xml:space="preserve"> </w:t>
-      </w:r>
-      <m:oMath>
-        <m:r>
-          <m:t>p</m:t>
-        </m:r>
-        <m:r>
-          <m:rPr>
-            <m:sty m:val="p"/>
-          </m:rPr>
-          <m:t>=</m:t>
-        </m:r>
-        <m:r>
-          <m:t>0.007</m:t>
-        </m:r>
-      </m:oMath>
-      <w:r>
-        <w:t xml:space="preserve">;</w:t>
-      </w:r>
-      <w:r>
-        <w:t xml:space="preserve"> </w:t>
-      </w:r>
-      <m:oMath>
-        <m:r>
-          <m:t>N</m:t>
-        </m:r>
-        <m:r>
-          <m:rPr>
-            <m:sty m:val="p"/>
-          </m:rPr>
-          <m:t>=</m:t>
-        </m:r>
-        <m:r>
-          <m:t>520</m:t>
-        </m:r>
-      </m:oMath>
-      <w:r>
-        <w:t xml:space="preserve"> </w:t>
-      </w:r>
-      <w:r>
-        <w:t xml:space="preserve">firm-years, 21 treated firms). The treated firms are large software incumbents and treatment is staggered, so this estimate may be biased and may reflect margin trends unrelated to AI. We therefore do not read it as a stand-alone test of H1. An increment carried by the operating-expense ratio, or concentrated among the largest firms, would point to cost reduction or market power and not to a complement rent.</w:t>
-      </w:r>
-    </w:p>
-    <w:p>
-      <w:pPr>
-        <w:pStyle w:val="BodyText"/>
-      </w:pPr>
-      <w:r>
-        <w:rPr>
-          <w:iCs/>
-          <w:i/>
-        </w:rPr>
-        <w:t xml:space="preserve">H2.</w:t>
-      </w:r>
-      <w:r>
-        <w:t xml:space="preserve"> </w:t>
-      </w:r>
-      <w:r>
-        <w:t xml:space="preserve">In the baseline event study, with</w:t>
-      </w:r>
-      <w:r>
-        <w:t xml:space="preserve"> </w:t>
-      </w:r>
-      <m:oMath>
-        <m:r>
-          <m:t>t</m:t>
-        </m:r>
-        <m:r>
-          <m:rPr>
-            <m:sty m:val="p"/>
-          </m:rPr>
-          <m:t>=</m:t>
-        </m:r>
-        <m:r>
-          <m:rPr>
-            <m:sty m:val="p"/>
-          </m:rPr>
-          <m:t>−</m:t>
-        </m:r>
-        <m:r>
-          <m:t>1</m:t>
-        </m:r>
-      </m:oMath>
-      <w:r>
-        <w:t xml:space="preserve"> </w:t>
-      </w:r>
-      <w:r>
-        <w:t xml:space="preserve">omitted, the coefficient is −1.2 percentage points at</w:t>
-      </w:r>
-      <w:r>
-        <w:t xml:space="preserve"> </w:t>
-      </w:r>
-      <m:oMath>
-        <m:r>
-          <m:t>t</m:t>
-        </m:r>
-        <m:r>
-          <m:rPr>
-            <m:sty m:val="p"/>
-          </m:rPr>
-          <m:t>=</m:t>
-        </m:r>
-        <m:r>
-          <m:rPr>
-            <m:sty m:val="p"/>
-          </m:rPr>
-          <m:t>−</m:t>
-        </m:r>
-        <m:r>
-          <m:t>2</m:t>
-        </m:r>
-      </m:oMath>
-      <w:r>
-        <w:t xml:space="preserve"> </w:t>
-      </w:r>
-      <w:r>
-        <w:t xml:space="preserve">(</w:t>
-      </w:r>
-      <m:oMath>
-        <m:r>
-          <m:t>p</m:t>
-        </m:r>
-        <m:r>
-          <m:rPr>
-            <m:sty m:val="p"/>
-          </m:rPr>
-          <m:t>=</m:t>
-        </m:r>
-        <m:r>
-          <m:t>0.64</m:t>
-        </m:r>
-      </m:oMath>
-      <w:r>
-        <w:t xml:space="preserve">), +4.4 at the GA year (</w:t>
-      </w:r>
-      <m:oMath>
-        <m:r>
-          <m:t>p</m:t>
-        </m:r>
-        <m:r>
-          <m:rPr>
-            <m:sty m:val="p"/>
-          </m:rPr>
-          <m:t>=</m:t>
-        </m:r>
-        <m:r>
-          <m:t>0.037</m:t>
-        </m:r>
-      </m:oMath>
-      <w:r>
-        <w:t xml:space="preserve">), +6.1 at</w:t>
-      </w:r>
-      <w:r>
-        <w:t xml:space="preserve"> </w:t>
-      </w:r>
-      <m:oMath>
-        <m:r>
-          <m:t>t</m:t>
-        </m:r>
-        <m:r>
-          <m:rPr>
-            <m:sty m:val="p"/>
-          </m:rPr>
-          <m:t>+</m:t>
-        </m:r>
-        <m:r>
-          <m:t>1</m:t>
-        </m:r>
-      </m:oMath>
-      <w:r>
-        <w:t xml:space="preserve"> </w:t>
-      </w:r>
-      <w:r>
-        <w:t xml:space="preserve">(</w:t>
-      </w:r>
-      <m:oMath>
-        <m:r>
-          <m:t>p</m:t>
-        </m:r>
-        <m:r>
-          <m:rPr>
-            <m:sty m:val="p"/>
-          </m:rPr>
-          <m:t>=</m:t>
-        </m:r>
-        <m:r>
-          <m:t>0.021</m:t>
-        </m:r>
-      </m:oMath>
-      <w:r>
-        <w:t xml:space="preserve">), +5.3 at</w:t>
-      </w:r>
-      <w:r>
-        <w:t xml:space="preserve"> </w:t>
-      </w:r>
-      <m:oMath>
-        <m:r>
-          <m:t>t</m:t>
-        </m:r>
-        <m:r>
-          <m:rPr>
-            <m:sty m:val="p"/>
-          </m:rPr>
-          <m:t>+</m:t>
-        </m:r>
-        <m:r>
-          <m:t>2</m:t>
-        </m:r>
-      </m:oMath>
-      <w:r>
-        <w:t xml:space="preserve"> </w:t>
-      </w:r>
-      <w:r>
-        <w:t xml:space="preserve">(</w:t>
-      </w:r>
-      <m:oMath>
-        <m:r>
-          <m:t>p</m:t>
-        </m:r>
-        <m:r>
-          <m:rPr>
-            <m:sty m:val="p"/>
-          </m:rPr>
-          <m:t>=</m:t>
-        </m:r>
-        <m:r>
-          <m:t>0.16</m:t>
-        </m:r>
-      </m:oMath>
-      <w:r>
-        <w:t xml:space="preserve">), and +2.4 at</w:t>
-      </w:r>
-      <w:r>
-        <w:t xml:space="preserve"> </w:t>
-      </w:r>
-      <m:oMath>
-        <m:r>
-          <m:t>t</m:t>
-        </m:r>
-        <m:r>
-          <m:rPr>
-            <m:sty m:val="p"/>
-          </m:rPr>
-          <m:t>+</m:t>
-        </m:r>
-        <m:r>
-          <m:t>3</m:t>
-        </m:r>
-      </m:oMath>
-      <w:r>
-        <w:t xml:space="preserve"> </w:t>
-      </w:r>
-      <w:r>
-        <w:t xml:space="preserve">(</w:t>
-      </w:r>
-      <m:oMath>
-        <m:r>
-          <m:t>p</m:t>
-        </m:r>
-        <m:r>
-          <m:rPr>
-            <m:sty m:val="p"/>
-          </m:rPr>
-          <m:t>=</m:t>
-        </m:r>
-        <m:r>
-          <m:t>0.59</m:t>
-        </m:r>
-      </m:oMath>
-      <w:r>
-        <w:t xml:space="preserve">). The pre-period coefficient is small and indistinguishable from zero. The point estimates peak at</w:t>
-      </w:r>
-      <w:r>
-        <w:t xml:space="preserve"> </w:t>
-      </w:r>
-      <m:oMath>
-        <m:r>
-          <m:t>t</m:t>
-        </m:r>
-        <m:r>
-          <m:rPr>
-            <m:sty m:val="p"/>
-          </m:rPr>
-          <m:t>+</m:t>
-        </m:r>
-        <m:r>
-          <m:t>1</m:t>
-        </m:r>
-      </m:oMath>
-      <w:r>
-        <w:t xml:space="preserve"> </w:t>
-      </w:r>
-      <w:r>
-        <w:t xml:space="preserve">and fall afterward, which is the direction the theory predicts. But the</w:t>
-      </w:r>
-      <w:r>
-        <w:t xml:space="preserve"> </w:t>
-      </w:r>
-      <m:oMath>
-        <m:r>
-          <m:t>t</m:t>
-        </m:r>
-        <m:r>
-          <m:rPr>
-            <m:sty m:val="p"/>
-          </m:rPr>
-          <m:t>+</m:t>
-        </m:r>
-        <m:r>
-          <m:t>2</m:t>
-        </m:r>
-      </m:oMath>
-      <w:r>
-        <w:t xml:space="preserve"> </w:t>
-      </w:r>
-      <w:r>
-        <w:t xml:space="preserve">and</w:t>
-      </w:r>
-      <w:r>
-        <w:t xml:space="preserve"> </w:t>
-      </w:r>
-      <m:oMath>
-        <m:r>
-          <m:t>t</m:t>
-        </m:r>
-        <m:r>
-          <m:rPr>
-            <m:sty m:val="p"/>
-          </m:rPr>
-          <m:t>+</m:t>
-        </m:r>
-        <m:r>
-          <m:t>3</m:t>
-        </m:r>
-      </m:oMath>
-      <w:r>
-        <w:t xml:space="preserve"> </w:t>
-      </w:r>
-      <w:r>
-        <w:t xml:space="preserve">estimates are imprecise and rest on fewer treated firms, and we do not test whether the</w:t>
-      </w:r>
-      <w:r>
-        <w:t xml:space="preserve"> </w:t>
-      </w:r>
-      <m:oMath>
-        <m:r>
-          <m:t>t</m:t>
-        </m:r>
-        <m:r>
-          <m:rPr>
-            <m:sty m:val="p"/>
-          </m:rPr>
-          <m:t>+</m:t>
-        </m:r>
-        <m:r>
-          <m:t>1</m:t>
-        </m:r>
-      </m:oMath>
-      <w:r>
-        <w:t xml:space="preserve"> </w:t>
-      </w:r>
-      <w:r>
-        <w:t xml:space="preserve">coefficient equals that of the last post-GA bin. The data are therefore inconclusive on H2, and we do not claim that the margin increment decays.</w:t>
-      </w:r>
-    </w:p>
-    <w:bookmarkEnd w:id="42"/>
-    <w:bookmarkStart w:id="43" w:name="what-is-and-is-not-identified"/>
-    <w:p>
-      <w:pPr>
-        <w:pStyle w:val="Heading2"/>
-      </w:pPr>
-      <w:r>
-        <w:t xml:space="preserve">6.3 What is and is not identified</w:t>
-      </w:r>
-    </w:p>
-    <w:p>
-      <w:pPr>
-        <w:pStyle w:val="FirstParagraph"/>
-      </w:pPr>
-      <w:r>
-        <w:t xml:space="preserve">Six restrictions apply. First, the realized price is the mean of provider cards on OpenRouter, not a billed invoice and not a GAAP inference margin. Second, endpoint coverage is incomplete: 102 of the 171 priced months have a live endpoint. Third, GA years come from public product dates and do not measure token spend or retrieval intensity. Fourth, the figures in Table 1 are illustrative and are not regression inputs. Fifth, two-way fixed-effects estimates under staggered timing can be biased when effects differ across cohorts (Goodman-Bacon 2021), and they rest on parallel trends, which we examine only through the pre-GA coefficients of the event study. Sixth, operating margin is an accounting measure and not the economic profit of Proposition 2, and the GA date marks the launch of a product and not the start of organizational-capital accumulation.</w:t>
-      </w:r>
-    </w:p>
-    <w:bookmarkEnd w:id="43"/>
-    <w:bookmarkEnd w:id="44"/>
-    <w:bookmarkStart w:id="48" w:name="discussion"/>
-    <w:p>
-      <w:pPr>
-        <w:pStyle w:val="Heading1"/>
-      </w:pPr>
-      <w:r>
-        <w:t xml:space="preserve">7. Discussion</w:t>
-      </w:r>
-    </w:p>
-    <w:bookmarkStart w:id="45" w:name="contributions"/>
-    <w:p>
-      <w:pPr>
-        <w:pStyle w:val="Heading2"/>
-      </w:pPr>
-      <w:r>
-        <w:t xml:space="preserve">7.1 Contributions</w:t>
-      </w:r>
-    </w:p>
-    <w:p>
-      <w:pPr>
-        <w:pStyle w:val="FirstParagraph"/>
-      </w:pPr>
-      <w:r>
-        <w:t xml:space="preserve">The paper makes three contributions, in decreasing order of novelty. The first is the treatment of vendor encroachment. In the standard appropriability account, an adopter’s complement rent ends when rivals imitate its organizational capital. Proposition 5 shows that, when the supplier of the model can productize the adopter’s use, the rent depends on two clocks, imitation and encroachment. Propositions 6 to 11 endogenize the productization rate, add competition among vendors, and let adopters respond. They show four things. Contract terms that limit a vendor’s use of adopters’ data slow it and raise the adopter’s incentive to invest. Imitation by rivals and encroachment by vendors are strategic complements. Competition among vendors speeds productization and weakens the effect of a clause with any one supplier, and in the limit removes it. Concealment by the adopter retains its effect as vendors multiply, while switching to a neutral supplier loses it. These results connect the literature on platform-owner entry (Gawer and Henderson 2007, Zhu and Liu 2018) and the hold-up literature (Klein et al. 1978, Grossman and Hart 1986) to the supply of a general-purpose AI input.</w:t>
-      </w:r>
-    </w:p>
-    <w:p>
-      <w:pPr>
-        <w:pStyle w:val="BodyText"/>
-      </w:pPr>
-      <w:r>
-        <w:t xml:space="preserve">The second is an integrated benchmark. Modeling the developer, the adopter, and the consumer in one framework extends IT business value theory (Melville et al. 2004) from the adopting firm to the vertical structure of a general-purpose technology. It lets us say why developer losses, adopter productivity gains, and weak adopter profit effects are observed together. The same account separates the profitability paradox from the productivity paradox and derives the former from the zero-profit condition applied to an input with a common market price. The ex ante definition of appropriability applies to developers and adopters alike, which speaks to the tautology charge against resource-based IT research. It also shows how a model can be a source of rent at one date and a marginal-cost input at another.</w:t>
-      </w:r>
-    </w:p>
-    <w:p>
-      <w:pPr>
-        <w:pStyle w:val="BodyText"/>
-      </w:pPr>
-      <w:r>
-        <w:t xml:space="preserve">The third is illustrative evidence that the constructs can be measured from public sources. Section 6 shows that a lab’s flagship price is associated with its quality lead and that firms launching a first-party AI product report higher operating margins afterward. It does not test the theory, and it does not bear on Propositions 5 to 11.</w:t>
-      </w:r>
-    </w:p>
-    <w:p>
-      <w:pPr>
-        <w:pStyle w:val="BodyText"/>
-      </w:pPr>
-      <w:r>
-        <w:t xml:space="preserve">We should be clear about what is not new. The mechanisms in each layer are established in industrial organization and strategy (Section 2.4). What the paper adds is their combination under a single appropriability definition, the extension to vendor encroachment, and the specification of measurable counterparts for a technology in which those counterparts are observable.</w:t>
-      </w:r>
-    </w:p>
-    <w:bookmarkEnd w:id="45"/>
-    <w:bookmarkStart w:id="46" w:name="implications-for-practice"/>
-    <w:p>
-      <w:pPr>
-        <w:pStyle w:val="Heading2"/>
-      </w:pPr>
-      <w:r>
-        <w:t xml:space="preserve">7.2 Implications for practice</w:t>
-      </w:r>
-    </w:p>
-    <w:p>
-      <w:pPr>
-        <w:pStyle w:val="FirstParagraph"/>
-      </w:pPr>
-      <w:r>
-        <w:t xml:space="preserve">For adopters, the central question is not how much to spend on AI but what the firm owns that the model cannot supply, and how long competitors will take to own it too. The theory also says that spending on the model itself is not a source of advantage, since any rival can buy the same model. For developers, the next model is the source of value, not the current one. When leads last only a few months, much of the reported loss is economic (Corollary 4). The valuations of frontier labs are best read as prices for an option on a sequence of future leads and not as capitalized current earnings. For the relationship between the two sides, Propositions 5 to 11 imply that contractual terms covering data use, fine-tuning ownership, and on-premise deployment are strategic decisions, because they affect the rate at which a vendor can productize an adopter’s use and so the adopter’s incentive to invest in the capital that generates its rent. The illustration in Table A1 suggests that such terms may be hardest to obtain for the most valuable uses, which is a reason for adopters to negotiate them before a use proves valuable and not after. Tables A2 and A3 add that, when many vendors can build the use, a clause with one supplier or a move to a neutral supplier buys little, while concealing the use keeps its effect. The adopter’s protection then comes mainly from concealment and from the difficulty of replicating the use. The tables are illustrations and not estimates.</w:t>
-      </w:r>
-    </w:p>
-    <w:bookmarkEnd w:id="46"/>
-    <w:bookmarkStart w:id="47" w:name="boundary-conditions-and-limitations"/>
-    <w:p>
-      <w:pPr>
-        <w:pStyle w:val="Heading2"/>
-      </w:pPr>
-      <w:r>
-        <w:t xml:space="preserve">7.3 Boundary conditions and limitations</w:t>
-      </w:r>
-    </w:p>
-    <w:p>
-      <w:pPr>
-        <w:pStyle w:val="FirstParagraph"/>
-      </w:pPr>
-      <w:r>
-        <w:t xml:space="preserve">The theory assumes competitive downstream product markets. Where adopters hold market power, pass-through is incomplete, and commodity LLM use can raise profit. Evidence that IT intensity accompanies rising industry concentration suggests that this case is empirically relevant (Autor et al. 2020, Bessen 2020), and it is also an alternative reading of the margin increment in H1. The theory further assumes that the developer’s lead closes. Economies of scale in compute and data flywheels could prevent closure and shift surplus durably toward the developer, and sustained developer margins without a quality lead would run against Proposition 3 and indicate that this case dominates.</w:t>
-      </w:r>
-    </w:p>
-    <w:p>
-      <w:pPr>
-        <w:pStyle w:val="BodyText"/>
-      </w:pPr>
-      <w:r>
-        <w:t xml:space="preserve">The model abstracts from uncertainty in training outcomes, from purchasable organizational capital, and from strategic interaction in the quality race itself: the lead and the catch-up lag are treated as exogenous. Appendix A.2 introduces competition among vendors, but only in the race to productize a given use. Making the lead endogenous to a training race is the most natural extension, and it is where we would expect a more specifically LLM-based theory to develop. The extensions in Appendix A are reduced-form. The productization rate is constant, vendors are symmetric apart from their access to the adopter’s data, concealment costs the adopter a fixed share of its rent, and neutral suppliers are taken as given. We also do not model vendors’ responses to concealment. Propositions 6 to 11 are not tested, because contract terms, vendor entry, concealment, and switching are not publicly observed. The empirical proxies are imperfect, and misclassification biases the estimated difference between commodity and complementary use toward zero. The adopter sample is small and made up of large software incumbents, so the results should not be generalized to adopters in other industries. Finally, the evidence is observational and covers a short period in which the technology and its business models are still changing. Prediction 1 is not tested here, and the evidence on H2 is inconclusive. The evidence reported is best viewed as a first look at the constructs, and it is not a confirmation of the theory.</w:t>
-      </w:r>
-    </w:p>
-    <w:bookmarkEnd w:id="47"/>
-    <w:bookmarkEnd w:id="48"/>
-    <w:bookmarkStart w:id="49" w:name="conclusion"/>
-    <w:p>
-      <w:pPr>
-        <w:pStyle w:val="Heading1"/>
-      </w:pPr>
-      <w:r>
-        <w:t xml:space="preserve">8. Conclusion</w:t>
-      </w:r>
-    </w:p>
-    <w:p>
-      <w:pPr>
-        <w:pStyle w:val="FirstParagraph"/>
-      </w:pPr>
-      <w:r>
-        <w:t xml:space="preserve">LLMs create value, and the theory developed here says where it goes. Adopters that use a model available to every competitor on the same terms pass their gain to consumers. The frontier developer captures a share in proportion to its quality lead, and only until a competitor closes it. Adopters that combine the model with organizational capital that rivals cannot quickly build earn a rent while the capital remains unimitated and unproductized by a vendor. The remainder goes to consumers, and statistics that pool all three positions report an average close to zero.</w:t>
-      </w:r>
-    </w:p>
-    <w:p>
-      <w:pPr>
-        <w:pStyle w:val="BodyText"/>
-      </w:pPr>
-      <w:r>
-        <w:t xml:space="preserve">The public record makes the developer half of this account visible. Frontier labs combine large booked revenue with large operating losses and pay complement owners for compute. The price of matched capability falls several-fold each year, while the cost of frontier capability rises. Investors nonetheless value the same firms as if a release sequence will continue. These three facts are consistent with a single explanation: competition over a general-purpose input whose quality lead is short and must be bought again with each release.</w:t>
-      </w:r>
-    </w:p>
-    <w:p>
-      <w:pPr>
-        <w:pStyle w:val="BodyText"/>
-      </w:pPr>
-      <w:r>
-        <w:t xml:space="preserve">The adopter half is harder to see in the data, and it is where we think the theory adds most. An adopter’s profitable window is bounded by its suppliers as well as by its competitors. How fast vendors productize a successful use depends on the contract terms that limit their access to the adopter’s data, and on how many other vendors are in a position to build the same use. Where they are many, the difficulty of replicating the use matters more than any clause. Testing these claims requires data on contract terms and vendor entry that are not now public, and making the quality race itself endogenous is the next step for the theory. The profitability puzzle that accompanies every general-purpose technology is, on this account, what competition over a common input looks like from the inside.</w:t>
-      </w:r>
-    </w:p>
-    <w:bookmarkEnd w:id="49"/>
-    <w:bookmarkStart w:id="54" w:name="appendix-a.-extensions-of-the-model"/>
-    <w:p>
-      <w:pPr>
-        <w:pStyle w:val="Heading1"/>
-      </w:pPr>
-      <w:r>
-        <w:t xml:space="preserve">Appendix A. Extensions of the Model</w:t>
-      </w:r>
-    </w:p>
-    <w:p>
-      <w:pPr>
-        <w:pStyle w:val="FirstParagraph"/>
-      </w:pPr>
-      <w:r>
-        <w:t xml:space="preserve">This appendix develops the extensions summarized in Section 4.3. Proofs are in Appendix B.</w:t>
-      </w:r>
-    </w:p>
-    <w:bookmarkStart w:id="50" w:name="X3db5a5f42670fba2518a46cb98f9569a85f601c"/>
-    <w:p>
-      <w:pPr>
-        <w:pStyle w:val="Heading2"/>
-      </w:pPr>
-      <w:r>
-        <w:t xml:space="preserve">A.1 Endogenous encroachment and contract protection</w:t>
+        <w:t xml:space="preserve">4.3 Endogenous encroachment and contract protection</w:t>
       </w:r>
     </w:p>
     <w:p>
@@ -8321,7 +6663,7 @@
         </m:sSup>
       </m:oMath>
       <w:r>
-        <w:t xml:space="preserve">. A contract can be agreed only if the first exceeds the second. Table A1 gives a numerical illustration. Protection clears for uses with small rents and fails for uses with large rents, because the vendor’s gain from productizing grows with the rent. The pattern depends on the parameters. In a simulation with randomly drawn parameters, the willingness to pay fell short of the vendor’s loss in about five percent of the draws. We therefore offer the pattern as an illustration and not as a proposition. If it held more generally, the uses most worth protecting would be the ones least likely to be protected.</w:t>
+        <w:t xml:space="preserve">. A contract can be agreed only if the first exceeds the second. Table 3 gives a numerical illustration. Protection clears for uses with small rents and fails for uses with large rents, because the vendor’s gain from productizing grows with the rent. The pattern depends on the parameters. In a simulation with randomly drawn parameters, the willingness to pay fell short of the vendor’s loss in about five percent of the draws. We therefore offer the pattern as an illustration and not as a proposition. If it held more generally, the uses most worth protecting would be the ones least likely to be protected.</w:t>
       </w:r>
     </w:p>
     <w:p>
@@ -8333,7 +6675,7 @@
           <w:bCs/>
           <w:b/>
         </w:rPr>
-        <w:t xml:space="preserve">Table A1. Willingness to pay for protection versus the vendor’s loss (illustration;</w:t>
+        <w:t xml:space="preserve">Table 3. Willingness to pay for protection versus the vendor’s loss (illustration;</w:t>
       </w:r>
       <w:r>
         <w:rPr>
@@ -9004,7 +7346,7 @@
         <w:t xml:space="preserve"> </w:t>
       </w:r>
       <w:r>
-        <w:t xml:space="preserve">is constant and chosen by a single vendor, and Section A.2 adds competition among vendors. We still do not model the adopter’s responses, such as concealing the use or moving to another vendor, or bargaining over the contract. The functional form</w:t>
+        <w:t xml:space="preserve">is constant and chosen by a single vendor, and Section 4.4 adds competition among vendors. We still do not model the adopter’s responses, such as concealing the use or moving to another vendor, or bargaining over the contract. The functional form</w:t>
       </w:r>
       <w:r>
         <w:t xml:space="preserve"> </w:t>
@@ -9094,14 +7436,14 @@
         <w:t xml:space="preserve">is a reduced-form parameter that says nothing about how the vendor earns from a productized offering. Contract terms are not publicly observed, so the propositions cannot be examined with the data in Section 6.</w:t>
       </w:r>
     </w:p>
-    <w:bookmarkEnd w:id="50"/>
-    <w:bookmarkStart w:id="51" w:name="a.2-competition-among-vendors"/>
+    <w:bookmarkEnd w:id="34"/>
+    <w:bookmarkStart w:id="35" w:name="competition-among-vendors"/>
     <w:p>
       <w:pPr>
         <w:pStyle w:val="Heading2"/>
       </w:pPr>
       <w:r>
-        <w:t xml:space="preserve">A.2 Competition among vendors</w:t>
+        <w:t xml:space="preserve">4.4 Competition among vendors</w:t>
       </w:r>
     </w:p>
     <w:p>
@@ -9109,7 +7451,7 @@
         <w:pStyle w:val="FirstParagraph"/>
       </w:pPr>
       <w:r>
-        <w:t xml:space="preserve">Section A.1 has a single vendor decide whether to productize the adopter’s use. In practice, several vendors may see that a use is valuable and try to build it. We now let</w:t>
+        <w:t xml:space="preserve">Section 4.3 has a single vendor decide whether to productize the adopter’s use. In practice, several vendors may see that a use is valuable and try to build it. We now let</w:t>
       </w:r>
       <w:r>
         <w:t xml:space="preserve"> </w:t>
@@ -9431,7 +7773,7 @@
         <w:pStyle w:val="FirstParagraph"/>
       </w:pPr>
       <w:r>
-        <w:t xml:space="preserve">For given rivals’ rates this is the problem of Section A.1 with</w:t>
+        <w:t xml:space="preserve">For given rivals’ rates this is the problem of Section 4.3 with</w:t>
       </w:r>
       <w:r>
         <w:t xml:space="preserve"> </w:t>
@@ -10150,7 +8492,7 @@
         </m:r>
       </m:oMath>
       <w:r>
-        <w:t xml:space="preserve">. Table A2 shows what protection achieves for different numbers of outsiders. With no outsiders, raising</w:t>
+        <w:t xml:space="preserve">. Table 4 shows what protection achieves for different numbers of outsiders. With no outsiders, raising</w:t>
       </w:r>
       <w:r>
         <w:t xml:space="preserve"> </w:t>
@@ -10164,7 +8506,7 @@
         <w:t xml:space="preserve"> </w:t>
       </w:r>
       <w:r>
-        <w:t xml:space="preserve">from 0 to 0.5 cuts the total productization rate by two thirds and raises the value of the adopter’s rent flow by more than half. With eight outsiders it cuts the rate by less than a tenth, and the value of the rent flow rises by under ten percent. Proposition 9 below shows that such protection does lower the total rate, so the pattern in Table A2 is not an artifact of the example. That the proportional effect falls with every added outsider we have verified only numerically: in simulations with randomly drawn parameters (3,000 draws, up to six outsiders), both the proportional reduction in the total rate and the gain in the adopter’s rent fell with every added outsider, without exception.</w:t>
+        <w:t xml:space="preserve">from 0 to 0.5 cuts the total productization rate by two thirds and raises the value of the adopter’s rent flow by more than half. With eight outsiders it cuts the rate by less than a tenth, and the value of the rent flow rises by under ten percent. Proposition 9 below shows that such protection does lower the total rate, so the pattern in Table 4 is not an artifact of the example. That the proportional effect falls with every added outsider we have verified only numerically: in simulations with randomly drawn parameters (3,000 draws, up to six outsiders), both the proportional reduction in the total rate and the gain in the adopter’s rent fell with every added outsider, without exception.</w:t>
       </w:r>
     </w:p>
     <w:p>
@@ -10176,7 +8518,7 @@
           <w:bCs/>
           <w:b/>
         </w:rPr>
-        <w:t xml:space="preserve">Table A2. Effect of protection from the adopter’s own supplier, by number of outsider vendors (illustration;</w:t>
+        <w:t xml:space="preserve">Table 4. Effect of protection from the adopter’s own supplier, by number of outsider vendors (illustration;</w:t>
       </w:r>
       <w:r>
         <w:rPr>
@@ -11355,7 +9697,7 @@
         <w:pStyle w:val="BodyText"/>
       </w:pPr>
       <w:r>
-        <w:t xml:space="preserve">Part (b) shows that the vendors’ rates are strategic complements: when the supplier is slowed, its rivals slow too, so the effect of protection on the total rate is larger than the supplier’s own reduction. Part (c) gives the limiting case. Complete protection from one supplier removes only that supplier’s marginal contribution to the race. Table A3 gives the proportional reduction for several values of</w:t>
+        <w:t xml:space="preserve">Part (b) shows that the vendors’ rates are strategic complements: when the supplier is slowed, its rivals slow too, so the effect of protection on the total rate is larger than the supplier’s own reduction. Part (c) gives the limiting case. Complete protection from one supplier removes only that supplier’s marginal contribution to the race. Table 5 gives the proportional reduction for several values of</w:t>
       </w:r>
       <w:r>
         <w:t xml:space="preserve"> </w:t>
@@ -11382,17 +9724,17 @@
         <w:pStyle w:val="BodyText"/>
       </w:pPr>
       <w:r>
-        <w:t xml:space="preserve">The limits noted in Section A.1 apply here as well. Vendors are symmetric apart from their access to the adopter’s data, each vendor’s rate is constant, and a vendor whose rival wins earns nothing. Letting the winner share the use, or letting vendors differentiate their offerings, would soften the race.</w:t>
+        <w:t xml:space="preserve">The limits noted in Section 4.3 apply here as well. Vendors are symmetric apart from their access to the adopter’s data, each vendor’s rate is constant, and a vendor whose rival wins earns nothing. Letting the winner share the use, or letting vendors differentiate their offerings, would soften the race.</w:t>
       </w:r>
     </w:p>
-    <w:bookmarkEnd w:id="51"/>
-    <w:bookmarkStart w:id="52" w:name="a.3-adopter-responses-concealment"/>
+    <w:bookmarkEnd w:id="35"/>
+    <w:bookmarkStart w:id="36" w:name="adopter-responses-concealment"/>
     <w:p>
       <w:pPr>
         <w:pStyle w:val="Heading2"/>
       </w:pPr>
       <w:r>
-        <w:t xml:space="preserve">A.3 Adopter responses: concealment</w:t>
+        <w:t xml:space="preserve">4.5 Adopter responses: concealment</w:t>
       </w:r>
     </w:p>
     <w:p>
@@ -11628,7 +9970,7 @@
         </m:sSup>
       </m:oMath>
       <w:r>
-        <w:t xml:space="preserve">. This is the same function as in Section A.1 with</w:t>
+        <w:t xml:space="preserve">. This is the same function as in Section 4.3 with</w:t>
       </w:r>
       <w:r>
         <w:t xml:space="preserve"> </w:t>
@@ -12284,7 +10626,7 @@
         <w:pStyle w:val="BodyText"/>
       </w:pPr>
       <w:r>
-        <w:t xml:space="preserve">Part (b) contrasts with Proposition 9(c). A contract with one supplier loses its effect as vendors multiply, while concealment keeps it, because concealment raises the cost of productizing for all of them. Table A3 shows both for the same parameters. With a single vendor the two instruments are identical (a contract with</w:t>
+        <w:t xml:space="preserve">Part (b) contrasts with Proposition 9(c). A contract with one supplier loses its effect as vendors multiply, while concealment keeps it, because concealment raises the cost of productizing for all of them. Table 5 shows both for the same parameters. With a single vendor the two instruments are identical (a contract with</w:t>
       </w:r>
       <w:r>
         <w:t xml:space="preserve"> </w:t>
@@ -12365,7 +10707,7 @@
           <w:bCs/>
           <w:b/>
         </w:rPr>
-        <w:t xml:space="preserve">Table A3. Proportional reduction in the total productization rate, by number of vendors and instrument (illustration;</w:t>
+        <w:t xml:space="preserve">Table 5. Proportional reduction in the total productization rate, by number of vendors and instrument (illustration;</w:t>
       </w:r>
       <w:r>
         <w:rPr>
@@ -12966,14 +11308,14 @@
         <w:t xml:space="preserve">), and it may sacrifice the data feedback that improves the model the adopter relies on. We do not model the choice of a different vendor, which would let the adopter move to a supplier with a lower productization rate, or the vendor’s response to concealment, such as investing in detection.</w:t>
       </w:r>
     </w:p>
-    <w:bookmarkEnd w:id="52"/>
-    <w:bookmarkStart w:id="53" w:name="a.4-adopter-responses-switching-supplier"/>
+    <w:bookmarkEnd w:id="36"/>
+    <w:bookmarkStart w:id="37" w:name="adopter-responses-switching-supplier"/>
     <w:p>
       <w:pPr>
         <w:pStyle w:val="Heading2"/>
       </w:pPr>
       <w:r>
-        <w:t xml:space="preserve">A.4 Adopter responses: switching supplier</w:t>
+        <w:t xml:space="preserve">4.6 Adopter responses: switching supplier</w:t>
       </w:r>
     </w:p>
     <w:p>
@@ -13758,7 +12100,7 @@
         <w:pStyle w:val="BodyText"/>
       </w:pPr>
       <w:r>
-        <w:t xml:space="preserve">Switching has the same weakness as a contract. It changes the position of one vendor, and the former supplier remains in the race. Table A3 shows that with</w:t>
+        <w:t xml:space="preserve">Switching has the same weakness as a contract. It changes the position of one vendor, and the former supplier remains in the race. Table 5 shows that with</w:t>
       </w:r>
       <w:r>
         <w:t xml:space="preserve"> </w:t>
@@ -13803,15 +12145,1575 @@
         <w:t xml:space="preserve">We do not model how the neutral supplier earns its position, or why neutral suppliers would not themselves begin to productize once they serve enough customers.</w:t>
       </w:r>
     </w:p>
-    <w:bookmarkEnd w:id="53"/>
-    <w:bookmarkEnd w:id="54"/>
-    <w:bookmarkStart w:id="55" w:name="appendix-b.-proofs"/>
+    <w:bookmarkEnd w:id="37"/>
+    <w:bookmarkStart w:id="38" w:name="comparative-statics"/>
+    <w:p>
+      <w:pPr>
+        <w:pStyle w:val="Heading2"/>
+      </w:pPr>
+      <w:r>
+        <w:t xml:space="preserve">4.7 Comparative statics</w:t>
+      </w:r>
+    </w:p>
+    <w:p>
+      <w:pPr>
+        <w:pStyle w:val="FirstParagraph"/>
+      </w:pPr>
+      <w:r>
+        <w:t xml:space="preserve">Nine predictions follow from the propositions. The empirical work in Sections 5 and 6 can address only the first three.</w:t>
+      </w:r>
+    </w:p>
+    <w:p>
+      <w:pPr>
+        <w:numPr>
+          <w:ilvl w:val="0"/>
+          <w:numId w:val="1001"/>
+        </w:numPr>
+        <w:pStyle w:val="Compact"/>
+      </w:pPr>
+      <w:r>
+        <w:t xml:space="preserve">Realized developer prices for inference rise with</w:t>
+      </w:r>
+      <w:r>
+        <w:t xml:space="preserve"> </w:t>
+      </w:r>
+      <m:oMath>
+        <m:r>
+          <m:t>Δ</m:t>
+        </m:r>
+        <m:r>
+          <m:t>θ</m:t>
+        </m:r>
+      </m:oMath>
+      <w:r>
+        <w:t xml:space="preserve"> </w:t>
+      </w:r>
+      <w:r>
+        <w:t xml:space="preserve">and fall toward serving cost as</w:t>
+      </w:r>
+      <w:r>
+        <w:t xml:space="preserve"> </w:t>
+      </w:r>
+      <m:oMath>
+        <m:r>
+          <m:t>Δ</m:t>
+        </m:r>
+        <m:r>
+          <m:t>θ</m:t>
+        </m:r>
+        <m:r>
+          <m:rPr>
+            <m:sty m:val="p"/>
+          </m:rPr>
+          <m:t>→</m:t>
+        </m:r>
+        <m:r>
+          <m:t>0</m:t>
+        </m:r>
+      </m:oMath>
+      <w:r>
+        <w:t xml:space="preserve"> </w:t>
+      </w:r>
+      <w:r>
+        <w:t xml:space="preserve">(Proposition 3).</w:t>
+      </w:r>
+    </w:p>
+    <w:p>
+      <w:pPr>
+        <w:numPr>
+          <w:ilvl w:val="0"/>
+          <w:numId w:val="1001"/>
+        </w:numPr>
+        <w:pStyle w:val="Compact"/>
+      </w:pPr>
+      <w:r>
+        <w:t xml:space="preserve">Developer rent is shortened by open-weight releases, compressed release intervals, and falling serving cost (Proposition 3 and Corollary 3).</w:t>
+      </w:r>
+    </w:p>
+    <w:p>
+      <w:pPr>
+        <w:numPr>
+          <w:ilvl w:val="0"/>
+          <w:numId w:val="1001"/>
+        </w:numPr>
+        <w:pStyle w:val="Compact"/>
+      </w:pPr>
+      <w:r>
+        <w:t xml:space="preserve">Adopter-side profit is predicted by a dated first-party product, which proxies</w:t>
+      </w:r>
+      <w:r>
+        <w:t xml:space="preserve"> </w:t>
+      </w:r>
+      <m:oMath>
+        <m:r>
+          <m:t>O</m:t>
+        </m:r>
+        <m:r>
+          <m:rPr>
+            <m:sty m:val="p"/>
+          </m:rPr>
+          <m:t>&gt;</m:t>
+        </m:r>
+        <m:r>
+          <m:t>0</m:t>
+        </m:r>
+      </m:oMath>
+      <w:r>
+        <w:t xml:space="preserve">, and not by pooled exposure to LLMs (Propositions 1 and 2).</w:t>
+      </w:r>
+    </w:p>
+    <w:p>
+      <w:pPr>
+        <w:numPr>
+          <w:ilvl w:val="0"/>
+          <w:numId w:val="1001"/>
+        </w:numPr>
+        <w:pStyle w:val="Compact"/>
+      </w:pPr>
+      <w:r>
+        <w:t xml:space="preserve">Industries with shorter</w:t>
+      </w:r>
+      <w:r>
+        <w:t xml:space="preserve"> </w:t>
+      </w:r>
+      <m:oMath>
+        <m:sSub>
+          <m:e>
+            <m:r>
+              <m:t>τ</m:t>
+            </m:r>
+          </m:e>
+          <m:sub>
+            <m:r>
+              <m:t>O</m:t>
+            </m:r>
+          </m:sub>
+        </m:sSub>
+      </m:oMath>
+      <w:r>
+        <w:t xml:space="preserve">, or with more vendor encroachment, show weaker associations between AI use and profit (Propositions 2 and 5).</w:t>
+      </w:r>
+    </w:p>
+    <w:p>
+      <w:pPr>
+        <w:numPr>
+          <w:ilvl w:val="0"/>
+          <w:numId w:val="1001"/>
+        </w:numPr>
+        <w:pStyle w:val="Compact"/>
+      </w:pPr>
+      <w:r>
+        <w:t xml:space="preserve">As downstream competition intensifies, the AI–profit association weakens while the AI–productivity association is unaffected (Propositions 1 and 4).</w:t>
+      </w:r>
+    </w:p>
+    <w:p>
+      <w:pPr>
+        <w:numPr>
+          <w:ilvl w:val="0"/>
+          <w:numId w:val="1001"/>
+        </w:numPr>
+        <w:pStyle w:val="Compact"/>
+      </w:pPr>
+      <w:r>
+        <w:t xml:space="preserve">Adopters invest more in co-specialized capital when contract terms limit vendors’ use of their data (Propositions 6 and 7).</w:t>
+      </w:r>
+    </w:p>
+    <w:p>
+      <w:pPr>
+        <w:numPr>
+          <w:ilvl w:val="0"/>
+          <w:numId w:val="1001"/>
+        </w:numPr>
+        <w:pStyle w:val="Compact"/>
+      </w:pPr>
+      <w:r>
+        <w:t xml:space="preserve">The effect of a clause with one supplier weakens as the number of vendors able to build the same use grows (Propositions 8 and 9 and Tables 4 and 5).</w:t>
+      </w:r>
+    </w:p>
+    <w:p>
+      <w:pPr>
+        <w:numPr>
+          <w:ilvl w:val="0"/>
+          <w:numId w:val="1001"/>
+        </w:numPr>
+        <w:pStyle w:val="Compact"/>
+      </w:pPr>
+      <w:r>
+        <w:t xml:space="preserve">Adopters conceal valuable uses when concealment is cheap relative to the threat of encroachment, and concealment retains its effect as vendors multiply (Proposition 10 and Table 5).</w:t>
+      </w:r>
+    </w:p>
+    <w:p>
+      <w:pPr>
+        <w:numPr>
+          <w:ilvl w:val="0"/>
+          <w:numId w:val="1001"/>
+        </w:numPr>
+        <w:pStyle w:val="Compact"/>
+      </w:pPr>
+      <w:r>
+        <w:t xml:space="preserve">Adopters switch to neutral suppliers only when the supplier’s advantage from seeing the use is large relative to the cost of switching, and switching loses its effect as vendors multiply (Proposition 11 and Table 5).</w:t>
+      </w:r>
+    </w:p>
+    <w:p>
+      <w:pPr>
+        <w:pStyle w:val="FirstParagraph"/>
+      </w:pPr>
+      <w:r>
+        <w:t xml:space="preserve">Predictions 4 to 9 are not tested here. Predictions 6 to 9 bear directly on managerial choices about data-use terms and fine-tuning ownership, which we take up in Section 7, but they cannot be examined with public data because contract terms are not observed.</w:t>
+      </w:r>
+    </w:p>
+    <w:bookmarkEnd w:id="38"/>
+    <w:bookmarkStart w:id="39" w:name="what-is-specific-to-llms"/>
+    <w:p>
+      <w:pPr>
+        <w:pStyle w:val="Heading2"/>
+      </w:pPr>
+      <w:r>
+        <w:t xml:space="preserve">4.8 What is specific to LLMs</w:t>
+      </w:r>
+    </w:p>
+    <w:p>
+      <w:pPr>
+        <w:pStyle w:val="FirstParagraph"/>
+      </w:pPr>
+      <w:r>
+        <w:t xml:space="preserve">A fair question is whether anything in the model is specific to LLMs, or whether the same propositions would describe any layered technology market. The structure is general. What is specific is the combination of values and measurement conditions that LLMs bring to it. Marginal inference cost</w:t>
+      </w:r>
+      <w:r>
+        <w:t xml:space="preserve"> </w:t>
+      </w:r>
+      <m:oMath>
+        <m:r>
+          <m:t>m</m:t>
+        </m:r>
+      </m:oMath>
+      <w:r>
+        <w:t xml:space="preserve"> </w:t>
+      </w:r>
+      <w:r>
+        <w:t xml:space="preserve">is low relative to the cost</w:t>
+      </w:r>
+      <w:r>
+        <w:t xml:space="preserve"> </w:t>
+      </w:r>
+      <m:oMath>
+        <m:sSub>
+          <m:e>
+            <m:r>
+              <m:t>F</m:t>
+            </m:r>
+          </m:e>
+          <m:sub>
+            <m:r>
+              <m:t>T</m:t>
+            </m:r>
+          </m:sub>
+        </m:sSub>
+      </m:oMath>
+      <w:r>
+        <w:t xml:space="preserve"> </w:t>
+      </w:r>
+      <w:r>
+        <w:t xml:space="preserve">of producing a frontier model, so profit depends almost entirely on the premium</w:t>
+      </w:r>
+      <w:r>
+        <w:t xml:space="preserve"> </w:t>
+      </w:r>
+      <m:oMath>
+        <m:r>
+          <m:t>κ</m:t>
+        </m:r>
+        <m:r>
+          <m:t>Δ</m:t>
+        </m:r>
+        <m:r>
+          <m:t>θ</m:t>
+        </m:r>
+      </m:oMath>
+      <w:r>
+        <w:t xml:space="preserve">. The catch-up lag</w:t>
+      </w:r>
+      <w:r>
+        <w:t xml:space="preserve"> </w:t>
+      </w:r>
+      <m:oMath>
+        <m:sSub>
+          <m:e>
+            <m:r>
+              <m:t>τ</m:t>
+            </m:r>
+          </m:e>
+          <m:sub>
+            <m:r>
+              <m:rPr>
+                <m:nor/>
+                <m:sty m:val="p"/>
+              </m:rPr>
+              <m:t>dev</m:t>
+            </m:r>
+          </m:sub>
+        </m:sSub>
+      </m:oMath>
+      <w:r>
+        <w:t xml:space="preserve"> </w:t>
+      </w:r>
+      <w:r>
+        <w:t xml:space="preserve">is short, about three to four months for open-weight models relative to the closed frontier (Emberson 2025, Epoch AI 2026), which places the developer close to the zero-rent corner of Proposition 3. The same model serves the complement builder and its competitors on posted terms, which is what makes the adopter’s position commodity-like in the first place. And vendors can and do move into the complement layer, which is the situation Propositions 5 to 11 describe: the productization rate is chosen by vendors, shaped by contract terms, and driven up by competition among them. In this sense the theory is less a new mechanism than a calibration of known mechanisms to a market in which the state variables can be observed. We return to the limits of this claim in Section 7.3.</w:t>
+      </w:r>
+    </w:p>
+    <w:bookmarkEnd w:id="39"/>
+    <w:bookmarkEnd w:id="40"/>
+    <w:bookmarkStart w:id="43" w:name="empirical-counterparts-and-implications"/>
     <w:p>
       <w:pPr>
         <w:pStyle w:val="Heading1"/>
       </w:pPr>
       <w:r>
-        <w:t xml:space="preserve">Appendix B. Proofs</w:t>
+        <w:t xml:space="preserve">5. Empirical Counterparts and Implications</w:t>
+      </w:r>
+    </w:p>
+    <w:bookmarkStart w:id="41" w:name="mapping-model-objects-to-data"/>
+    <w:p>
+      <w:pPr>
+        <w:pStyle w:val="Heading2"/>
+      </w:pPr>
+      <w:r>
+        <w:t xml:space="preserve">5.1 Mapping model objects to data</w:t>
+      </w:r>
+    </w:p>
+    <w:p>
+      <w:pPr>
+        <w:pStyle w:val="FirstParagraph"/>
+      </w:pPr>
+      <w:r>
+        <w:t xml:space="preserve">Table 6 assigns each object of the model an empirical counterpart in public data. The mapping is interpretive. We do not recover structural parameters, and the figures in Table 1 are not regression inputs.</w:t>
+      </w:r>
+    </w:p>
+    <w:p>
+      <w:pPr>
+        <w:pStyle w:val="BodyText"/>
+      </w:pPr>
+      <w:r>
+        <w:rPr>
+          <w:bCs/>
+          <w:b/>
+        </w:rPr>
+        <w:t xml:space="preserve">Table 6. Model objects and empirical counterparts</w:t>
+      </w:r>
+    </w:p>
+    <w:tbl>
+      <w:tblPr>
+        <w:tblStyle w:val="Table"/>
+        <w:tblW w:type="pct" w:w="5000"/>
+        <w:tblLook w:firstRow="1" w:lastRow="0" w:firstColumn="0" w:lastColumn="0" w:noHBand="0" w:noVBand="0" w:val="0020"/>
+        <w:jc w:val="start"/>
+      </w:tblPr>
+      <w:tblGrid>
+        <w:gridCol w:w="2640"/>
+        <w:gridCol w:w="2640"/>
+        <w:gridCol w:w="2640"/>
+      </w:tblGrid>
+      <w:tr>
+        <w:trPr>
+          <w:tblHeader w:val="true"/>
+        </w:trPr>
+        <w:tc>
+          <w:tcPr/>
+          <w:p>
+            <w:pPr>
+              <w:pStyle w:val="Compact"/>
+              <w:jc w:val="left"/>
+            </w:pPr>
+            <w:r>
+              <w:t xml:space="preserve">Model object</w:t>
+            </w:r>
+          </w:p>
+        </w:tc>
+        <w:tc>
+          <w:tcPr/>
+          <w:p>
+            <w:pPr>
+              <w:pStyle w:val="Compact"/>
+              <w:jc w:val="left"/>
+            </w:pPr>
+            <w:r>
+              <w:t xml:space="preserve">Empirical counterpart</w:t>
+            </w:r>
+          </w:p>
+        </w:tc>
+        <w:tc>
+          <w:tcPr/>
+          <w:p>
+            <w:pPr>
+              <w:pStyle w:val="Compact"/>
+              <w:jc w:val="left"/>
+            </w:pPr>
+            <w:r>
+              <w:t xml:space="preserve">Source</w:t>
+            </w:r>
+          </w:p>
+        </w:tc>
+      </w:tr>
+      <w:tr>
+        <w:tc>
+          <w:tcPr/>
+          <w:p>
+            <w:pPr>
+              <w:pStyle w:val="Compact"/>
+              <w:jc w:val="left"/>
+            </w:pPr>
+            <m:oMath>
+              <m:r>
+                <m:t>Δ</m:t>
+              </m:r>
+              <m:r>
+                <m:t>θ</m:t>
+              </m:r>
+            </m:oMath>
+          </w:p>
+        </w:tc>
+        <w:tc>
+          <w:tcPr/>
+          <w:p>
+            <w:pPr>
+              <w:pStyle w:val="Compact"/>
+              <w:jc w:val="left"/>
+            </w:pPr>
+            <w:r>
+              <w:t xml:space="preserve">Gap between the top-ranked and second-ranked lab on the Arena overall leaderboard</w:t>
+            </w:r>
+          </w:p>
+        </w:tc>
+        <w:tc>
+          <w:tcPr/>
+          <w:p>
+            <w:pPr>
+              <w:pStyle w:val="Compact"/>
+              <w:jc w:val="left"/>
+            </w:pPr>
+            <w:r>
+              <w:t xml:space="preserve">Chiang et al. (2024)</w:t>
+            </w:r>
+          </w:p>
+        </w:tc>
+      </w:tr>
+      <w:tr>
+        <w:tc>
+          <w:tcPr/>
+          <w:p>
+            <w:pPr>
+              <w:pStyle w:val="Compact"/>
+              <w:jc w:val="left"/>
+            </w:pPr>
+            <m:oMath>
+              <m:r>
+                <m:t>κ</m:t>
+              </m:r>
+              <m:r>
+                <m:t>Δ</m:t>
+              </m:r>
+              <m:r>
+                <m:t>θ</m:t>
+              </m:r>
+            </m:oMath>
+          </w:p>
+        </w:tc>
+        <w:tc>
+          <w:tcPr/>
+          <w:p>
+            <w:pPr>
+              <w:pStyle w:val="Compact"/>
+              <w:jc w:val="left"/>
+            </w:pPr>
+            <w:r>
+              <w:t xml:space="preserve">Provider-mean blended flagship inference price, not a GAAP margin</w:t>
+            </w:r>
+          </w:p>
+        </w:tc>
+        <w:tc>
+          <w:tcPr/>
+          <w:p>
+            <w:pPr>
+              <w:pStyle w:val="Compact"/>
+              <w:jc w:val="left"/>
+            </w:pPr>
+            <w:r>
+              <w:t xml:space="preserve">OpenRouter (2026)</w:t>
+            </w:r>
+          </w:p>
+        </w:tc>
+      </w:tr>
+      <w:tr>
+        <w:tc>
+          <w:tcPr/>
+          <w:p>
+            <w:pPr>
+              <w:pStyle w:val="Compact"/>
+              <w:jc w:val="left"/>
+            </w:pPr>
+            <m:oMath>
+              <m:sSub>
+                <m:e>
+                  <m:r>
+                    <m:t>τ</m:t>
+                  </m:r>
+                </m:e>
+                <m:sub>
+                  <m:r>
+                    <m:rPr>
+                      <m:nor/>
+                      <m:sty m:val="p"/>
+                    </m:rPr>
+                    <m:t>dev</m:t>
+                  </m:r>
+                </m:sub>
+              </m:sSub>
+            </m:oMath>
+          </w:p>
+        </w:tc>
+        <w:tc>
+          <w:tcPr/>
+          <w:p>
+            <w:pPr>
+              <w:pStyle w:val="Compact"/>
+              <w:jc w:val="left"/>
+            </w:pPr>
+            <w:r>
+              <w:t xml:space="preserve">Time from a frontier release to the first competitor release matching its score</w:t>
+            </w:r>
+          </w:p>
+        </w:tc>
+        <w:tc>
+          <w:tcPr/>
+          <w:p>
+            <w:pPr>
+              <w:pStyle w:val="Compact"/>
+              <w:jc w:val="left"/>
+            </w:pPr>
+            <w:r>
+              <w:t xml:space="preserve">Arena series</w:t>
+            </w:r>
+          </w:p>
+        </w:tc>
+      </w:tr>
+      <w:tr>
+        <w:tc>
+          <w:tcPr/>
+          <w:p>
+            <w:pPr>
+              <w:pStyle w:val="Compact"/>
+              <w:jc w:val="left"/>
+            </w:pPr>
+            <m:oMath>
+              <m:r>
+                <m:t>φ</m:t>
+              </m:r>
+              <m:d>
+                <m:dPr>
+                  <m:begChr m:val="("/>
+                  <m:endChr m:val=")"/>
+                  <m:sepChr m:val=""/>
+                  <m:grow/>
+                </m:dPr>
+                <m:e>
+                  <m:r>
+                    <m:t>L</m:t>
+                  </m:r>
+                  <m:r>
+                    <m:rPr>
+                      <m:sty m:val="p"/>
+                    </m:rPr>
+                    <m:t>,</m:t>
+                  </m:r>
+                  <m:r>
+                    <m:t>O</m:t>
+                  </m:r>
+                </m:e>
+              </m:d>
+            </m:oMath>
+            <w:r>
+              <w:t xml:space="preserve"> </w:t>
+            </w:r>
+            <w:r>
+              <w:t xml:space="preserve">with</w:t>
+            </w:r>
+            <w:r>
+              <w:t xml:space="preserve"> </w:t>
+            </w:r>
+            <m:oMath>
+              <m:sSub>
+                <m:e>
+                  <m:r>
+                    <m:t>O</m:t>
+                  </m:r>
+                </m:e>
+                <m:sub>
+                  <m:r>
+                    <m:t>j</m:t>
+                  </m:r>
+                </m:sub>
+              </m:sSub>
+              <m:r>
+                <m:rPr>
+                  <m:sty m:val="p"/>
+                </m:rPr>
+                <m:t>&gt;</m:t>
+              </m:r>
+              <m:r>
+                <m:t>0</m:t>
+              </m:r>
+            </m:oMath>
+          </w:p>
+        </w:tc>
+        <w:tc>
+          <w:tcPr/>
+          <w:p>
+            <w:pPr>
+              <w:pStyle w:val="Compact"/>
+              <w:jc w:val="left"/>
+            </w:pPr>
+            <w:r>
+              <w:t xml:space="preserve">Dated general-availability (GA) year of a first-party AI product</w:t>
+            </w:r>
+          </w:p>
+        </w:tc>
+        <w:tc>
+          <w:tcPr/>
+          <w:p>
+            <w:pPr>
+              <w:pStyle w:val="Compact"/>
+              <w:jc w:val="left"/>
+            </w:pPr>
+            <w:r>
+              <w:t xml:space="preserve">Hand-coded from public product dates</w:t>
+            </w:r>
+          </w:p>
+        </w:tc>
+      </w:tr>
+      <w:tr>
+        <w:tc>
+          <w:tcPr/>
+          <w:p>
+            <w:pPr>
+              <w:pStyle w:val="Compact"/>
+              <w:jc w:val="left"/>
+            </w:pPr>
+            <m:oMath>
+              <m:sSub>
+                <m:e>
+                  <m:r>
+                    <m:t>O</m:t>
+                  </m:r>
+                </m:e>
+                <m:sub>
+                  <m:r>
+                    <m:t>j</m:t>
+                  </m:r>
+                </m:sub>
+              </m:sSub>
+              <m:r>
+                <m:rPr>
+                  <m:sty m:val="p"/>
+                </m:rPr>
+                <m:t>=</m:t>
+              </m:r>
+              <m:r>
+                <m:t>0</m:t>
+              </m:r>
+            </m:oMath>
+          </w:p>
+        </w:tc>
+        <w:tc>
+          <w:tcPr/>
+          <w:p>
+            <w:pPr>
+              <w:pStyle w:val="Compact"/>
+              <w:jc w:val="left"/>
+            </w:pPr>
+            <w:r>
+              <w:t xml:space="preserve">Pooled API use or mention without a coded GA year</w:t>
+            </w:r>
+          </w:p>
+        </w:tc>
+        <w:tc>
+          <w:tcPr/>
+          <w:p>
+            <w:pPr>
+              <w:pStyle w:val="Compact"/>
+              <w:jc w:val="left"/>
+            </w:pPr>
+            <w:r>
+              <w:t xml:space="preserve">SEC filings</w:t>
+            </w:r>
+          </w:p>
+        </w:tc>
+      </w:tr>
+      <w:tr>
+        <w:tc>
+          <w:tcPr/>
+          <w:p>
+            <w:pPr>
+              <w:pStyle w:val="Compact"/>
+              <w:jc w:val="left"/>
+            </w:pPr>
+            <w:r>
+              <w:t xml:space="preserve">Adopter profit</w:t>
+            </w:r>
+          </w:p>
+        </w:tc>
+        <w:tc>
+          <w:tcPr/>
+          <w:p>
+            <w:pPr>
+              <w:pStyle w:val="Compact"/>
+              <w:jc w:val="left"/>
+            </w:pPr>
+            <w:r>
+              <w:t xml:space="preserve">Operating margin</w:t>
+            </w:r>
+          </w:p>
+        </w:tc>
+        <w:tc>
+          <w:tcPr/>
+          <w:p>
+            <w:pPr>
+              <w:pStyle w:val="Compact"/>
+              <w:jc w:val="left"/>
+            </w:pPr>
+            <w:r>
+              <w:t xml:space="preserve">SEC EDGAR XBRL company facts</w:t>
+            </w:r>
+          </w:p>
+        </w:tc>
+      </w:tr>
+      <w:tr>
+        <w:tc>
+          <w:tcPr/>
+          <w:p>
+            <w:pPr>
+              <w:pStyle w:val="Compact"/>
+              <w:jc w:val="left"/>
+            </w:pPr>
+            <w:r>
+              <w:t xml:space="preserve">Compute payments</w:t>
+            </w:r>
+          </w:p>
+        </w:tc>
+        <w:tc>
+          <w:tcPr/>
+          <w:p>
+            <w:pPr>
+              <w:pStyle w:val="Compact"/>
+              <w:jc w:val="left"/>
+            </w:pPr>
+            <w:r>
+              <w:t xml:space="preserve">Factor payment outside the three-way split</w:t>
+            </w:r>
+          </w:p>
+        </w:tc>
+        <w:tc>
+          <w:tcPr/>
+          <w:p>
+            <w:pPr>
+              <w:pStyle w:val="Compact"/>
+              <w:jc w:val="left"/>
+            </w:pPr>
+            <w:r>
+              <w:t xml:space="preserve">Table 1 (illustrative)</w:t>
+            </w:r>
+          </w:p>
+        </w:tc>
+      </w:tr>
+      <w:tr>
+        <w:tc>
+          <w:tcPr/>
+          <w:p>
+            <w:pPr>
+              <w:pStyle w:val="Compact"/>
+              <w:jc w:val="left"/>
+            </w:pPr>
+            <m:oMath>
+              <m:r>
+                <m:t>η</m:t>
+              </m:r>
+            </m:oMath>
+            <w:r>
+              <w:t xml:space="preserve">,</w:t>
+            </w:r>
+            <w:r>
+              <w:t xml:space="preserve"> </w:t>
+            </w:r>
+            <m:oMath>
+              <m:r>
+                <m:t>s</m:t>
+              </m:r>
+            </m:oMath>
+            <w:r>
+              <w:t xml:space="preserve">,</w:t>
+            </w:r>
+            <w:r>
+              <w:t xml:space="preserve"> </w:t>
+            </w:r>
+            <m:oMath>
+              <m:r>
+                <m:t>N</m:t>
+              </m:r>
+            </m:oMath>
+          </w:p>
+        </w:tc>
+        <w:tc>
+          <w:tcPr/>
+          <w:p>
+            <w:pPr>
+              <w:pStyle w:val="Compact"/>
+              <w:jc w:val="left"/>
+            </w:pPr>
+            <w:r>
+              <w:t xml:space="preserve">No public counterpart (contract terms and vendor entry are not observed)</w:t>
+            </w:r>
+          </w:p>
+        </w:tc>
+        <w:tc>
+          <w:tcPr/>
+          <w:p>
+            <w:pPr>
+              <w:pStyle w:val="Compact"/>
+              <w:jc w:val="left"/>
+            </w:pPr>
+            <w:r>
+              <w:t xml:space="preserve">n/a</w:t>
+            </w:r>
+          </w:p>
+        </w:tc>
+      </w:tr>
+    </w:tbl>
+    <w:bookmarkEnd w:id="41"/>
+    <w:bookmarkStart w:id="42" w:name="empirical-implications"/>
+    <w:p>
+      <w:pPr>
+        <w:pStyle w:val="Heading2"/>
+      </w:pPr>
+      <w:r>
+        <w:t xml:space="preserve">5.2 Empirical implications</w:t>
+      </w:r>
+    </w:p>
+    <w:p>
+      <w:pPr>
+        <w:pStyle w:val="FirstParagraph"/>
+      </w:pPr>
+      <w:r>
+        <w:t xml:space="preserve">Prediction 3 of Section 4.7 and the transience of complement rents (Corollary 2) yield two hypotheses about adopters.</w:t>
+      </w:r>
+    </w:p>
+    <w:p>
+      <w:pPr>
+        <w:pStyle w:val="BodyText"/>
+      </w:pPr>
+      <w:r>
+        <w:rPr>
+          <w:bCs/>
+          <w:b/>
+        </w:rPr>
+        <w:t xml:space="preserve">H1.</w:t>
+      </w:r>
+      <w:r>
+        <w:t xml:space="preserve"> </w:t>
+      </w:r>
+      <w:r>
+        <w:t xml:space="preserve">Firms that ship a dated first-party AI product earn a higher operating margin after the GA year than before, relative to firms with no such product. Treatment is the calendar year of GA, not a time-invariant indicator. Examples are Copilot for Microsoft 365, Firefly, Now Assist, Cortex, AIP, watsonx, and Charlotte AI (all 2023), and Gemini for Workspace, Agentforce, and Bits AI (all 2024), together with analogues.</w:t>
+      </w:r>
+    </w:p>
+    <w:p>
+      <w:pPr>
+        <w:pStyle w:val="BodyText"/>
+      </w:pPr>
+      <w:r>
+        <w:rPr>
+          <w:bCs/>
+          <w:b/>
+        </w:rPr>
+        <w:t xml:space="preserve">H2.</w:t>
+      </w:r>
+      <w:r>
+        <w:t xml:space="preserve"> </w:t>
+      </w:r>
+      <w:r>
+        <w:t xml:space="preserve">The within-firm margin increment after GA declines as event time lengthens. The hypothesis is disconfirmed by a flat or rising post-GA path, or by a difference between the first post-GA year and the last post-GA bin that cannot be distinguished from zero.</w:t>
+      </w:r>
+    </w:p>
+    <w:p>
+      <w:pPr>
+        <w:pStyle w:val="BodyText"/>
+      </w:pPr>
+      <w:r>
+        <w:t xml:space="preserve">We do not state the developer-side predictions (1 and 2) as hypotheses, because testing them properly requires a model-month panel and release-level launch prices that we do not have. Section 6.1 reports a lab-month association related to prediction 1 as descriptive evidence. Predictions 4 to 9 concern industry variation, contract terms, vendor entry, concealment, and switching, none of which public data capture.</w:t>
+      </w:r>
+    </w:p>
+    <w:bookmarkEnd w:id="42"/>
+    <w:bookmarkEnd w:id="43"/>
+    <w:bookmarkStart w:id="47" w:name="illustrative-evidence"/>
+    <w:p>
+      <w:pPr>
+        <w:pStyle w:val="Heading1"/>
+      </w:pPr>
+      <w:r>
+        <w:t xml:space="preserve">6. Illustrative Evidence</w:t>
+      </w:r>
+    </w:p>
+    <w:p>
+      <w:pPr>
+        <w:pStyle w:val="FirstParagraph"/>
+      </w:pPr>
+      <w:r>
+        <w:t xml:space="preserve">This section relates the constructs of Section 5 to public data. It does not test the theory: the samples are small, the proxies are coarse, and several hypotheses go untested. Its purpose is to show that the constructs can be measured and to see whether the data are consistent with the predictions.</w:t>
+      </w:r>
+    </w:p>
+    <w:p>
+      <w:pPr>
+        <w:pStyle w:val="BodyText"/>
+      </w:pPr>
+      <w:r>
+        <w:t xml:space="preserve">The developer panel combines Arena overall leaderboard snapshots (Chiang et al. 2024) with OpenRouter endpoint prices (OpenRouter 2026). It contains 171 lab-months with a price. Of these, 102 have at least one live endpoint, and the remaining 69 rely on the list-price fallback. The adopter panel comes from SEC EDGAR XBRL company facts (SEC 2026) and covers 81 firms and 520 firm-years, with staggered GA-year treatment for 21 firms. We coded the GA years by hand from public product dates.</w:t>
+      </w:r>
+    </w:p>
+    <w:bookmarkStart w:id="44" w:name="developer-side"/>
+    <w:p>
+      <w:pPr>
+        <w:pStyle w:val="Heading2"/>
+      </w:pPr>
+      <w:r>
+        <w:t xml:space="preserve">6.1 Developer side</w:t>
+      </w:r>
+    </w:p>
+    <w:p>
+      <w:pPr>
+        <w:pStyle w:val="FirstParagraph"/>
+      </w:pPr>
+      <w:r>
+        <w:rPr>
+          <w:iCs/>
+          <w:i/>
+        </w:rPr>
+        <w:t xml:space="preserve">Lab-month association.</w:t>
+      </w:r>
+      <w:r>
+        <w:t xml:space="preserve"> </w:t>
+      </w:r>
+      <w:r>
+        <w:t xml:space="preserve">We regress log realized flagship price on the lab’s lead, with lab fixed effects and a trend. The coefficient is 0.0099 on the 171 lab-months that include the list-price fallback and 0.0068 on the 102 months with at least one live endpoint. Conventional clustered p-values are below 0.001 and 0.017, respectively. With so few lab clusters, these p-values probably overstate precision (Cameron et al. 2008), so we regard the estimates as suggestive. A first-difference cut on an older list-price snapshot series (</w:t>
+      </w:r>
+      <m:oMath>
+        <m:r>
+          <m:t>N</m:t>
+        </m:r>
+        <m:r>
+          <m:rPr>
+            <m:sty m:val="p"/>
+          </m:rPr>
+          <m:t>=</m:t>
+        </m:r>
+        <m:r>
+          <m:t>1</m:t>
+        </m:r>
+        <m:r>
+          <m:rPr>
+            <m:sty m:val="p"/>
+          </m:rPr>
+          <m:t>,</m:t>
+        </m:r>
+        <m:r>
+          <m:t>190</m:t>
+        </m:r>
+      </m:oMath>
+      <w:r>
+        <w:t xml:space="preserve">) gives a coefficient of 0.0049 (p = 0.081). We read it as directional only.</w:t>
+      </w:r>
+    </w:p>
+    <w:p>
+      <w:pPr>
+        <w:pStyle w:val="BodyText"/>
+      </w:pPr>
+      <w:r>
+        <w:rPr>
+          <w:iCs/>
+          <w:i/>
+        </w:rPr>
+        <w:t xml:space="preserve">What the lab-month estimates do not show.</w:t>
+      </w:r>
+      <w:r>
+        <w:t xml:space="preserve"> </w:t>
+      </w:r>
+      <w:r>
+        <w:t xml:space="preserve">New releases drive most of the identifying variation, so the estimates do not isolate the premium on a given model. They are associations between a lab’s lead and its flagship price and not tests of prediction 1, which concerns the price of a given model. A test needs a model-month panel and a release-level panel of launch prices, which we do not estimate here.</w:t>
+      </w:r>
+    </w:p>
+    <w:bookmarkEnd w:id="44"/>
+    <w:bookmarkStart w:id="45" w:name="adopter-side"/>
+    <w:p>
+      <w:pPr>
+        <w:pStyle w:val="Heading2"/>
+      </w:pPr>
+      <w:r>
+        <w:t xml:space="preserve">6.2 Adopter side</w:t>
+      </w:r>
+    </w:p>
+    <w:p>
+      <w:pPr>
+        <w:pStyle w:val="FirstParagraph"/>
+      </w:pPr>
+      <w:r>
+        <w:rPr>
+          <w:iCs/>
+          <w:i/>
+        </w:rPr>
+        <w:t xml:space="preserve">H1.</w:t>
+      </w:r>
+      <w:r>
+        <w:t xml:space="preserve"> </w:t>
+      </w:r>
+      <w:r>
+        <w:t xml:space="preserve">We regress operating margin on a post-GA indicator with firm and year fixed effects and standard errors clustered by firm. The post-GA margin increment is 5.3 percentage points (</w:t>
+      </w:r>
+      <m:oMath>
+        <m:r>
+          <m:t>β</m:t>
+        </m:r>
+        <m:r>
+          <m:rPr>
+            <m:sty m:val="p"/>
+          </m:rPr>
+          <m:t>=</m:t>
+        </m:r>
+        <m:r>
+          <m:t>0.053</m:t>
+        </m:r>
+      </m:oMath>
+      <w:r>
+        <w:t xml:space="preserve">,</w:t>
+      </w:r>
+      <w:r>
+        <w:t xml:space="preserve"> </w:t>
+      </w:r>
+      <m:oMath>
+        <m:r>
+          <m:t>p</m:t>
+        </m:r>
+        <m:r>
+          <m:rPr>
+            <m:sty m:val="p"/>
+          </m:rPr>
+          <m:t>=</m:t>
+        </m:r>
+        <m:r>
+          <m:t>0.007</m:t>
+        </m:r>
+      </m:oMath>
+      <w:r>
+        <w:t xml:space="preserve">;</w:t>
+      </w:r>
+      <w:r>
+        <w:t xml:space="preserve"> </w:t>
+      </w:r>
+      <m:oMath>
+        <m:r>
+          <m:t>N</m:t>
+        </m:r>
+        <m:r>
+          <m:rPr>
+            <m:sty m:val="p"/>
+          </m:rPr>
+          <m:t>=</m:t>
+        </m:r>
+        <m:r>
+          <m:t>520</m:t>
+        </m:r>
+      </m:oMath>
+      <w:r>
+        <w:t xml:space="preserve"> </w:t>
+      </w:r>
+      <w:r>
+        <w:t xml:space="preserve">firm-years, 21 treated firms). The treated firms are large software incumbents and treatment is staggered, so this estimate may be biased and may reflect margin trends unrelated to AI. We therefore do not read it as a stand-alone test of H1. An increment carried by the operating-expense ratio, or concentrated among the largest firms, would point to cost reduction or market power and not to a complement rent.</w:t>
+      </w:r>
+    </w:p>
+    <w:p>
+      <w:pPr>
+        <w:pStyle w:val="BodyText"/>
+      </w:pPr>
+      <w:r>
+        <w:rPr>
+          <w:iCs/>
+          <w:i/>
+        </w:rPr>
+        <w:t xml:space="preserve">H2.</w:t>
+      </w:r>
+      <w:r>
+        <w:t xml:space="preserve"> </w:t>
+      </w:r>
+      <w:r>
+        <w:t xml:space="preserve">In the baseline event study, with</w:t>
+      </w:r>
+      <w:r>
+        <w:t xml:space="preserve"> </w:t>
+      </w:r>
+      <m:oMath>
+        <m:r>
+          <m:t>t</m:t>
+        </m:r>
+        <m:r>
+          <m:rPr>
+            <m:sty m:val="p"/>
+          </m:rPr>
+          <m:t>=</m:t>
+        </m:r>
+        <m:r>
+          <m:rPr>
+            <m:sty m:val="p"/>
+          </m:rPr>
+          <m:t>−</m:t>
+        </m:r>
+        <m:r>
+          <m:t>1</m:t>
+        </m:r>
+      </m:oMath>
+      <w:r>
+        <w:t xml:space="preserve"> </w:t>
+      </w:r>
+      <w:r>
+        <w:t xml:space="preserve">omitted, the coefficient is −1.2 percentage points at</w:t>
+      </w:r>
+      <w:r>
+        <w:t xml:space="preserve"> </w:t>
+      </w:r>
+      <m:oMath>
+        <m:r>
+          <m:t>t</m:t>
+        </m:r>
+        <m:r>
+          <m:rPr>
+            <m:sty m:val="p"/>
+          </m:rPr>
+          <m:t>=</m:t>
+        </m:r>
+        <m:r>
+          <m:rPr>
+            <m:sty m:val="p"/>
+          </m:rPr>
+          <m:t>−</m:t>
+        </m:r>
+        <m:r>
+          <m:t>2</m:t>
+        </m:r>
+      </m:oMath>
+      <w:r>
+        <w:t xml:space="preserve"> </w:t>
+      </w:r>
+      <w:r>
+        <w:t xml:space="preserve">(</w:t>
+      </w:r>
+      <m:oMath>
+        <m:r>
+          <m:t>p</m:t>
+        </m:r>
+        <m:r>
+          <m:rPr>
+            <m:sty m:val="p"/>
+          </m:rPr>
+          <m:t>=</m:t>
+        </m:r>
+        <m:r>
+          <m:t>0.64</m:t>
+        </m:r>
+      </m:oMath>
+      <w:r>
+        <w:t xml:space="preserve">), +4.4 at the GA year (</w:t>
+      </w:r>
+      <m:oMath>
+        <m:r>
+          <m:t>p</m:t>
+        </m:r>
+        <m:r>
+          <m:rPr>
+            <m:sty m:val="p"/>
+          </m:rPr>
+          <m:t>=</m:t>
+        </m:r>
+        <m:r>
+          <m:t>0.037</m:t>
+        </m:r>
+      </m:oMath>
+      <w:r>
+        <w:t xml:space="preserve">), +6.1 at</w:t>
+      </w:r>
+      <w:r>
+        <w:t xml:space="preserve"> </w:t>
+      </w:r>
+      <m:oMath>
+        <m:r>
+          <m:t>t</m:t>
+        </m:r>
+        <m:r>
+          <m:rPr>
+            <m:sty m:val="p"/>
+          </m:rPr>
+          <m:t>+</m:t>
+        </m:r>
+        <m:r>
+          <m:t>1</m:t>
+        </m:r>
+      </m:oMath>
+      <w:r>
+        <w:t xml:space="preserve"> </w:t>
+      </w:r>
+      <w:r>
+        <w:t xml:space="preserve">(</w:t>
+      </w:r>
+      <m:oMath>
+        <m:r>
+          <m:t>p</m:t>
+        </m:r>
+        <m:r>
+          <m:rPr>
+            <m:sty m:val="p"/>
+          </m:rPr>
+          <m:t>=</m:t>
+        </m:r>
+        <m:r>
+          <m:t>0.021</m:t>
+        </m:r>
+      </m:oMath>
+      <w:r>
+        <w:t xml:space="preserve">), +5.3 at</w:t>
+      </w:r>
+      <w:r>
+        <w:t xml:space="preserve"> </w:t>
+      </w:r>
+      <m:oMath>
+        <m:r>
+          <m:t>t</m:t>
+        </m:r>
+        <m:r>
+          <m:rPr>
+            <m:sty m:val="p"/>
+          </m:rPr>
+          <m:t>+</m:t>
+        </m:r>
+        <m:r>
+          <m:t>2</m:t>
+        </m:r>
+      </m:oMath>
+      <w:r>
+        <w:t xml:space="preserve"> </w:t>
+      </w:r>
+      <w:r>
+        <w:t xml:space="preserve">(</w:t>
+      </w:r>
+      <m:oMath>
+        <m:r>
+          <m:t>p</m:t>
+        </m:r>
+        <m:r>
+          <m:rPr>
+            <m:sty m:val="p"/>
+          </m:rPr>
+          <m:t>=</m:t>
+        </m:r>
+        <m:r>
+          <m:t>0.16</m:t>
+        </m:r>
+      </m:oMath>
+      <w:r>
+        <w:t xml:space="preserve">), and +2.4 at</w:t>
+      </w:r>
+      <w:r>
+        <w:t xml:space="preserve"> </w:t>
+      </w:r>
+      <m:oMath>
+        <m:r>
+          <m:t>t</m:t>
+        </m:r>
+        <m:r>
+          <m:rPr>
+            <m:sty m:val="p"/>
+          </m:rPr>
+          <m:t>+</m:t>
+        </m:r>
+        <m:r>
+          <m:t>3</m:t>
+        </m:r>
+      </m:oMath>
+      <w:r>
+        <w:t xml:space="preserve"> </w:t>
+      </w:r>
+      <w:r>
+        <w:t xml:space="preserve">(</w:t>
+      </w:r>
+      <m:oMath>
+        <m:r>
+          <m:t>p</m:t>
+        </m:r>
+        <m:r>
+          <m:rPr>
+            <m:sty m:val="p"/>
+          </m:rPr>
+          <m:t>=</m:t>
+        </m:r>
+        <m:r>
+          <m:t>0.59</m:t>
+        </m:r>
+      </m:oMath>
+      <w:r>
+        <w:t xml:space="preserve">). The pre-period coefficient is small and indistinguishable from zero. The point estimates peak at</w:t>
+      </w:r>
+      <w:r>
+        <w:t xml:space="preserve"> </w:t>
+      </w:r>
+      <m:oMath>
+        <m:r>
+          <m:t>t</m:t>
+        </m:r>
+        <m:r>
+          <m:rPr>
+            <m:sty m:val="p"/>
+          </m:rPr>
+          <m:t>+</m:t>
+        </m:r>
+        <m:r>
+          <m:t>1</m:t>
+        </m:r>
+      </m:oMath>
+      <w:r>
+        <w:t xml:space="preserve"> </w:t>
+      </w:r>
+      <w:r>
+        <w:t xml:space="preserve">and fall afterward, which is the direction the theory predicts. But the</w:t>
+      </w:r>
+      <w:r>
+        <w:t xml:space="preserve"> </w:t>
+      </w:r>
+      <m:oMath>
+        <m:r>
+          <m:t>t</m:t>
+        </m:r>
+        <m:r>
+          <m:rPr>
+            <m:sty m:val="p"/>
+          </m:rPr>
+          <m:t>+</m:t>
+        </m:r>
+        <m:r>
+          <m:t>2</m:t>
+        </m:r>
+      </m:oMath>
+      <w:r>
+        <w:t xml:space="preserve"> </w:t>
+      </w:r>
+      <w:r>
+        <w:t xml:space="preserve">and</w:t>
+      </w:r>
+      <w:r>
+        <w:t xml:space="preserve"> </w:t>
+      </w:r>
+      <m:oMath>
+        <m:r>
+          <m:t>t</m:t>
+        </m:r>
+        <m:r>
+          <m:rPr>
+            <m:sty m:val="p"/>
+          </m:rPr>
+          <m:t>+</m:t>
+        </m:r>
+        <m:r>
+          <m:t>3</m:t>
+        </m:r>
+      </m:oMath>
+      <w:r>
+        <w:t xml:space="preserve"> </w:t>
+      </w:r>
+      <w:r>
+        <w:t xml:space="preserve">estimates are imprecise and rest on fewer treated firms, and we do not test whether the</w:t>
+      </w:r>
+      <w:r>
+        <w:t xml:space="preserve"> </w:t>
+      </w:r>
+      <m:oMath>
+        <m:r>
+          <m:t>t</m:t>
+        </m:r>
+        <m:r>
+          <m:rPr>
+            <m:sty m:val="p"/>
+          </m:rPr>
+          <m:t>+</m:t>
+        </m:r>
+        <m:r>
+          <m:t>1</m:t>
+        </m:r>
+      </m:oMath>
+      <w:r>
+        <w:t xml:space="preserve"> </w:t>
+      </w:r>
+      <w:r>
+        <w:t xml:space="preserve">coefficient equals that of the last post-GA bin. The data are therefore inconclusive on H2, and we do not claim that the margin increment decays.</w:t>
+      </w:r>
+    </w:p>
+    <w:bookmarkEnd w:id="45"/>
+    <w:bookmarkStart w:id="46" w:name="what-is-and-is-not-identified"/>
+    <w:p>
+      <w:pPr>
+        <w:pStyle w:val="Heading2"/>
+      </w:pPr>
+      <w:r>
+        <w:t xml:space="preserve">6.3 What is and is not identified</w:t>
+      </w:r>
+    </w:p>
+    <w:p>
+      <w:pPr>
+        <w:pStyle w:val="FirstParagraph"/>
+      </w:pPr>
+      <w:r>
+        <w:t xml:space="preserve">Six restrictions apply. First, the realized price is the mean of provider cards on OpenRouter, not a billed invoice and not a GAAP inference margin. Second, endpoint coverage is incomplete: 102 of the 171 priced months have a live endpoint. Third, GA years come from public product dates and do not measure token spend or retrieval intensity. Fourth, the figures in Table 1 are illustrative and are not regression inputs. Fifth, two-way fixed-effects estimates under staggered timing can be biased when effects differ across cohorts (Goodman-Bacon 2021), and they rest on parallel trends, which we examine only through the pre-GA coefficients of the event study. Sixth, operating margin is an accounting measure and not the economic profit of Proposition 2, and the GA date marks the launch of a product and not the start of organizational-capital accumulation.</w:t>
+      </w:r>
+    </w:p>
+    <w:bookmarkEnd w:id="46"/>
+    <w:bookmarkEnd w:id="47"/>
+    <w:bookmarkStart w:id="51" w:name="discussion"/>
+    <w:p>
+      <w:pPr>
+        <w:pStyle w:val="Heading1"/>
+      </w:pPr>
+      <w:r>
+        <w:t xml:space="preserve">7. Discussion</w:t>
+      </w:r>
+    </w:p>
+    <w:bookmarkStart w:id="48" w:name="contributions"/>
+    <w:p>
+      <w:pPr>
+        <w:pStyle w:val="Heading2"/>
+      </w:pPr>
+      <w:r>
+        <w:t xml:space="preserve">7.1 Contributions</w:t>
+      </w:r>
+    </w:p>
+    <w:p>
+      <w:pPr>
+        <w:pStyle w:val="FirstParagraph"/>
+      </w:pPr>
+      <w:r>
+        <w:t xml:space="preserve">The paper makes three contributions, in decreasing order of novelty. The first is the treatment of vendor encroachment. In the standard appropriability account, an adopter’s complement rent ends when rivals imitate its organizational capital. Proposition 5 shows that, when the supplier of the model can productize the adopter’s use, the rent depends on two clocks, imitation and encroachment. Propositions 6 to 11 endogenize the productization rate, add competition among vendors, and let adopters respond. They show four things. Contract terms that limit a vendor’s use of adopters’ data slow it and raise the adopter’s incentive to invest. Imitation by rivals and encroachment by vendors are strategic complements. Competition among vendors speeds productization and weakens the effect of a clause with any one supplier, and in the limit removes it. Concealment by the adopter retains its effect as vendors multiply, while switching to a neutral supplier loses it. These results connect the literature on platform-owner entry (Gawer and Henderson 2007, Zhu and Liu 2018) and the hold-up literature (Klein et al. 1978, Grossman and Hart 1986) to the supply of a general-purpose AI input.</w:t>
+      </w:r>
+    </w:p>
+    <w:p>
+      <w:pPr>
+        <w:pStyle w:val="BodyText"/>
+      </w:pPr>
+      <w:r>
+        <w:t xml:space="preserve">The second is an integrated benchmark. Modeling the developer, the adopter, and the consumer in one framework extends IT business value theory (Melville et al. 2004) from the adopting firm to the vertical structure of a general-purpose technology. It lets us say why developer losses, adopter productivity gains, and weak adopter profit effects are observed together. The same account separates the profitability paradox from the productivity paradox and derives the former from the zero-profit condition applied to an input with a common market price. The ex ante definition of appropriability applies to developers and adopters alike, which speaks to the tautology charge against resource-based IT research. It also shows how a model can be a source of rent at one date and a marginal-cost input at another.</w:t>
+      </w:r>
+    </w:p>
+    <w:p>
+      <w:pPr>
+        <w:pStyle w:val="BodyText"/>
+      </w:pPr>
+      <w:r>
+        <w:t xml:space="preserve">The third is illustrative evidence that the constructs can be measured from public sources. Section 6 shows that a lab’s flagship price is associated with its quality lead and that firms launching a first-party AI product report higher operating margins afterward. It does not test the theory, and it does not bear on Propositions 5 to 11.</w:t>
+      </w:r>
+    </w:p>
+    <w:p>
+      <w:pPr>
+        <w:pStyle w:val="BodyText"/>
+      </w:pPr>
+      <w:r>
+        <w:t xml:space="preserve">We should be clear about what is not new. The mechanisms in each layer are established in industrial organization and strategy (Section 2.4). What the paper adds is their combination under a single appropriability definition, the extension to vendor encroachment, and the specification of measurable counterparts for a technology in which those counterparts are observable.</w:t>
+      </w:r>
+    </w:p>
+    <w:bookmarkEnd w:id="48"/>
+    <w:bookmarkStart w:id="49" w:name="implications-for-practice"/>
+    <w:p>
+      <w:pPr>
+        <w:pStyle w:val="Heading2"/>
+      </w:pPr>
+      <w:r>
+        <w:t xml:space="preserve">7.2 Implications for practice</w:t>
+      </w:r>
+    </w:p>
+    <w:p>
+      <w:pPr>
+        <w:pStyle w:val="FirstParagraph"/>
+      </w:pPr>
+      <w:r>
+        <w:t xml:space="preserve">For adopters, the central question is not how much to spend on AI but what the firm owns that the model cannot supply, and how long competitors will take to own it too. The theory also says that spending on the model itself is not a source of advantage, since any rival can buy the same model. For developers, the next model is the source of value, not the current one. When leads last only a few months, much of the reported loss is economic (Corollary 4). The valuations of frontier labs are best read as prices for an option on a sequence of future leads and not as capitalized current earnings. For the relationship between the two sides, Propositions 5 to 11 imply that contractual terms covering data use, fine-tuning ownership, and on-premise deployment are strategic decisions, because they affect the rate at which a vendor can productize an adopter’s use and so the adopter’s incentive to invest in the capital that generates its rent. The illustration in Table 3 suggests that such terms may be hardest to obtain for the most valuable uses, which is a reason for adopters to negotiate them before a use proves valuable and not after. Tables 4 and 5 add that, when many vendors can build the use, a clause with one supplier or a move to a neutral supplier buys little, while concealing the use keeps its effect. The adopter’s protection then comes mainly from concealment and from the difficulty of replicating the use. The tables are illustrations and not estimates.</w:t>
+      </w:r>
+    </w:p>
+    <w:bookmarkEnd w:id="49"/>
+    <w:bookmarkStart w:id="50" w:name="boundary-conditions-and-limitations"/>
+    <w:p>
+      <w:pPr>
+        <w:pStyle w:val="Heading2"/>
+      </w:pPr>
+      <w:r>
+        <w:t xml:space="preserve">7.3 Boundary conditions and limitations</w:t>
+      </w:r>
+    </w:p>
+    <w:p>
+      <w:pPr>
+        <w:pStyle w:val="FirstParagraph"/>
+      </w:pPr>
+      <w:r>
+        <w:t xml:space="preserve">The theory assumes competitive downstream product markets. Where adopters hold market power, pass-through is incomplete, and commodity LLM use can raise profit. Evidence that IT intensity accompanies rising industry concentration suggests that this case is empirically relevant (Autor et al. 2020, Bessen 2020), and it is also an alternative reading of the margin increment in H1. The theory further assumes that the developer’s lead closes. Economies of scale in compute and data flywheels could prevent closure and shift surplus durably toward the developer, and sustained developer margins without a quality lead would run against Proposition 3 and indicate that this case dominates.</w:t>
+      </w:r>
+    </w:p>
+    <w:p>
+      <w:pPr>
+        <w:pStyle w:val="BodyText"/>
+      </w:pPr>
+      <w:r>
+        <w:t xml:space="preserve">The model abstracts from uncertainty in training outcomes, from purchasable organizational capital, and from strategic interaction in the quality race itself: the lead and the catch-up lag are treated as exogenous. Section 4.4 introduces competition among vendors, but only in the race to productize a given use. Making the lead endogenous to a training race is the most natural extension, and it is where we would expect a more specifically LLM-based theory to develop. The extensions in Sections 4.3 to 4.6 are reduced-form. The productization rate is constant, vendors are symmetric apart from their access to the adopter’s data, concealment costs the adopter a fixed share of its rent, and neutral suppliers are taken as given. We also do not model vendors’ responses to concealment. Propositions 6 to 11 are not tested, because contract terms, vendor entry, concealment, and switching are not publicly observed. The empirical proxies are imperfect, and misclassification biases the estimated difference between commodity and complementary use toward zero. The adopter sample is small and made up of large software incumbents, so the results should not be generalized to adopters in other industries. Finally, the evidence is observational and covers a short period in which the technology and its business models are still changing. Prediction 1 is not tested here, and the evidence on H2 is inconclusive. The evidence reported is best viewed as a first look at the constructs, and it is not a confirmation of the theory.</w:t>
+      </w:r>
+    </w:p>
+    <w:bookmarkEnd w:id="50"/>
+    <w:bookmarkEnd w:id="51"/>
+    <w:bookmarkStart w:id="52" w:name="conclusion"/>
+    <w:p>
+      <w:pPr>
+        <w:pStyle w:val="Heading1"/>
+      </w:pPr>
+      <w:r>
+        <w:t xml:space="preserve">8. Conclusion</w:t>
+      </w:r>
+    </w:p>
+    <w:p>
+      <w:pPr>
+        <w:pStyle w:val="FirstParagraph"/>
+      </w:pPr>
+      <w:r>
+        <w:t xml:space="preserve">LLMs create value, and the theory developed here says where it goes. Adopters that use a model available to every competitor on the same terms pass their gain to consumers. The frontier developer captures a share in proportion to its quality lead, and only until a competitor closes it. Adopters that combine the model with organizational capital that rivals cannot quickly build earn a rent while the capital remains unimitated and unproductized by a vendor. The remainder goes to consumers, and statistics that pool all three positions report an average close to zero.</w:t>
+      </w:r>
+    </w:p>
+    <w:p>
+      <w:pPr>
+        <w:pStyle w:val="BodyText"/>
+      </w:pPr>
+      <w:r>
+        <w:t xml:space="preserve">The public record makes the developer half of this account visible. Frontier labs combine large booked revenue with large operating losses and pay complement owners for compute. The price of matched capability falls several-fold each year, while the cost of frontier capability rises. Investors nonetheless value the same firms as if a release sequence will continue. These three facts are consistent with a single explanation: competition over a general-purpose input whose quality lead is short and must be bought again with each release.</w:t>
+      </w:r>
+    </w:p>
+    <w:p>
+      <w:pPr>
+        <w:pStyle w:val="BodyText"/>
+      </w:pPr>
+      <w:r>
+        <w:t xml:space="preserve">The adopter half is harder to see in the data, and it is where we think the theory adds most. An adopter’s profitable window is bounded by its suppliers as well as by its competitors. How fast vendors productize a successful use depends on the contract terms that limit their access to the adopter’s data, and on how many other vendors are in a position to build the same use. Where they are many, the difficulty of replicating the use matters more than any clause. Testing these claims requires data on contract terms and vendor entry that are not now public, and making the quality race itself endogenous is the next step for the theory. The profitability puzzle that accompanies every general-purpose technology is, on this account, what competition over a common input looks like from the inside.</w:t>
+      </w:r>
+    </w:p>
+    <w:bookmarkEnd w:id="52"/>
+    <w:bookmarkStart w:id="53" w:name="appendix-a.-proofs"/>
+    <w:p>
+      <w:pPr>
+        <w:pStyle w:val="Heading1"/>
+      </w:pPr>
+      <w:r>
+        <w:t xml:space="preserve">Appendix A. Proofs</w:t>
       </w:r>
     </w:p>
     <w:p>
@@ -26846,8 +26748,8 @@
         </m:r>
       </m:oMath>
     </w:p>
-    <w:bookmarkEnd w:id="55"/>
-    <w:bookmarkStart w:id="56" w:name="references"/>
+    <w:bookmarkEnd w:id="53"/>
+    <w:bookmarkStart w:id="54" w:name="references"/>
     <w:p>
       <w:pPr>
         <w:pStyle w:val="Heading1"/>
@@ -27967,7 +27869,7 @@
         <w:t xml:space="preserve">, June 16. https://www.wheresyoured.at/exclusive-openai-financials/.</w:t>
       </w:r>
     </w:p>
-    <w:bookmarkEnd w:id="56"/>
+    <w:bookmarkEnd w:id="54"/>
     <w:sectPr/>
   </w:body>
 </w:document>

</xml_diff>